<commit_message>
Clean up markdown draft and update DOCX/PDF reports with embedded pipeline flowchart
</commit_message>
<xml_diff>
--- a/NOP_BAI_T1S_KMML/T1S_KMML_Thuyet_minh_Innovator.docx
+++ b/NOP_BAI_T1S_KMML/T1S_KMML_Thuyet_minh_Innovator.docx
@@ -2,22 +2,22 @@
 <file path=word/document.xml><?xml version="1.0" encoding="utf-8"?>
 <w:document xmlns:w="http://schemas.openxmlformats.org/wordprocessingml/2006/main" xmlns:m="http://schemas.openxmlformats.org/officeDocument/2006/math" xmlns:r="http://schemas.openxmlformats.org/officeDocument/2006/relationships" xmlns:o="urn:schemas-microsoft-com:office:office" xmlns:v="urn:schemas-microsoft-com:vml" xmlns:w10="urn:schemas-microsoft-com:office:word" xmlns:a="http://schemas.openxmlformats.org/drawingml/2006/main" xmlns:pic="http://schemas.openxmlformats.org/drawingml/2006/picture" xmlns:wp="http://schemas.openxmlformats.org/drawingml/2006/wordprocessingDrawing">
   <w:body>
-    <w:bookmarkStart w:id="24" w:name="Xa0e4650cb364f416b1822d32c93fb3a2a591fbd"/>
+    <w:bookmarkStart w:id="22" w:name="Xd35fc91433fcb95bd5c8067b7eecd4f1cd6a361"/>
     <w:p>
       <w:pPr>
         <w:pStyle w:val="Heading1"/>
       </w:pPr>
       <w:r>
-        <w:t xml:space="preserve">BÁO CÁO THUYẾT MINH PHƯƠNG PHÁP TỐI ƯU HÓA MÔ HÌNH VÀ HỆ THỐNG AGENT ĐA TÁC VỤ</w:t>
-      </w:r>
-    </w:p>
-    <w:bookmarkStart w:id="9" w:name="X2cc9c7a3b24870c21457a9c88930110bbf3ee84"/>
+        <w:t xml:space="preserve">BÁO CÁO THUYẾT MINH PHƯƠNG PHÁP XÂY DỰNG AI AGENT ĐA TÁC VỤ</w:t>
+      </w:r>
+    </w:p>
+    <w:bookmarkStart w:id="9" w:name="Xe2130693854cd923967f488c183348eb46a07ce"/>
     <w:p>
       <w:pPr>
         <w:pStyle w:val="Heading2"/>
       </w:pPr>
       <w:r>
-        <w:t xml:space="preserve">Đội thi: Bảng C - Innovator | Vietnamese Student HackAIthon 2026</w:t>
+        <w:t xml:space="preserve">Đội thi: Bảng C - Innovator | Tên đội: T1S_KMML</w:t>
       </w:r>
     </w:p>
     <w:p>
@@ -42,7 +42,7 @@
         <w:pStyle w:val="FirstParagraph"/>
       </w:pPr>
       <w:r>
-        <w:t xml:space="preserve">Báo cáo này thuyết minh giải pháp tối ưu hóa toàn diện cho mô hình ngôn ngữ lớn</w:t>
+        <w:t xml:space="preserve">Báo cáo này thuyết minh giải pháp xây dựng AI Agent đa tác vụ trên nền tảng mô hình ngôn ngữ lớn</w:t>
       </w:r>
       <w:r>
         <w:t xml:space="preserve"> </w:t>
@@ -58,20 +58,20 @@
         <w:t xml:space="preserve"> </w:t>
       </w:r>
       <w:r>
-        <w:t xml:space="preserve">nhằm xử lý hiệu quả bài toán trắc nghiệm đa ngành trong khuôn khổ Bảng C - Innovator. Giải pháp được thiết kế vận hành hoàn toàn offline trong môi trường ảo hóa Docker Container. Để khắc phục triệt để các hạn chế về suy luận logic (như lỗi truncation, lặp prompt, và nhận diện nhầm ký tự), nhóm tác giả đã tích hợp cơ chế Chain-of-Thought tối ưu hóa chiều dài, thuật toán Trích xuất trực tiếp (Direct Extraction), regex phân biệt chữ hoa/thường cùng hệ thống</w:t>
-      </w:r>
-      <w:r>
-        <w:t xml:space="preserve"> </w:t>
-      </w:r>
-      <w:r>
-        <w:rPr>
-          <w:b/>
-          <w:bCs/>
-        </w:rPr>
-        <w:t xml:space="preserve">Logit Margin Early Exit (Tối ưu hóa độ phân vân)</w:t>
-      </w:r>
-      <w:r>
-        <w:t xml:space="preserve">. Về mặt hệ thống, kỹ thuật Dynamic Pipelining trên vLLM LLMEngine cấp thấp đã được phát triển để tối đa hóa 100% công suất GPU. Kết quả thực nghiệm trên 463 câu hỏi Public Test đạt độ chính xác</w:t>
+        <w:t xml:space="preserve">để giải quyết bài toán trắc nghiệm đa ngành. Giải pháp vận hành hoàn toàn offline trong môi trường Docker Container theo đúng các tiêu chí kỹ thuật của cuộc thi. Nhóm tác giả đề xuất kiến trúc suy luận tối ưu kết hợp lập luận Chain-of-Thought (CoT), bộ trích xuất tiếng Việt phân biệt chữ hoa/thường nghiêm ngặt và cơ chế</w:t>
+      </w:r>
+      <w:r>
+        <w:t xml:space="preserve"> </w:t>
+      </w:r>
+      <w:r>
+        <w:rPr>
+          <w:b/>
+          <w:bCs/>
+        </w:rPr>
+        <w:t xml:space="preserve">Logit Margin Early Exit (Dừng sớm dựa trên độ phân vân)</w:t>
+      </w:r>
+      <w:r>
+        <w:t xml:space="preserve">. Hệ thống được điều khiển trực tiếp qua lớp thư viện vLLM LLMEngine cấp thấp với kỹ thuật gối đầu bất đồng bộ (Dynamic Pipelining). Kết quả thực nghiệm trên tập Public Test (463 câu hỏi) đạt độ chính xác cao</w:t>
       </w:r>
       <w:r>
         <w:t xml:space="preserve"> </w:t>
@@ -87,7 +87,7 @@
         <w:t xml:space="preserve"> </w:t>
       </w:r>
       <w:r>
-        <w:t xml:space="preserve">với tốc độ xử lý vượt trội đạt</w:t>
+        <w:t xml:space="preserve">với tốc độ xử lý vượt trội trung bình</w:t>
       </w:r>
       <w:r>
         <w:t xml:space="preserve"> </w:t>
@@ -111,13 +111,13 @@
       </w:r>
     </w:p>
     <w:bookmarkEnd w:id="10"/>
-    <w:bookmarkStart w:id="11" w:name="đặt-vấn-đề-và-kiến-trúc-mô-hình-nền-tảng"/>
+    <w:bookmarkStart w:id="11" w:name="đặt-vấn-đề-và-lựa-chọn-mô-hình-nền-tảng"/>
     <w:p>
       <w:pPr>
         <w:pStyle w:val="Heading2"/>
       </w:pPr>
       <w:r>
-        <w:t xml:space="preserve">1. Đặt vấn đề và Kiến trúc mô hình nền tảng</w:t>
+        <w:t xml:space="preserve">1. Đặt vấn đề và Lựa chọn mô hình nền tảng</w:t>
       </w:r>
     </w:p>
     <w:p>
@@ -125,23 +125,23 @@
         <w:pStyle w:val="FirstParagraph"/>
       </w:pPr>
       <w:r>
-        <w:t xml:space="preserve">Trong khuôn khổ Bảng C - Innovator, thử thách đặt ra là phát triển một AI Agent có năng lực tự động xử lý và giải quyết các câu hỏi trắc nghiệm đa lĩnh vực có độ phức tạp cao (toán học, vật lý, luật học, kinh tế…). Yêu cầu kỹ thuật cốt lõi đòi hỏi AI Agent phải vận hành hoàn toàn</w:t>
-      </w:r>
-      <w:r>
-        <w:t xml:space="preserve"> </w:t>
-      </w:r>
-      <w:r>
-        <w:rPr>
-          <w:b/>
-          <w:bCs/>
-        </w:rPr>
-        <w:t xml:space="preserve">offline (không có kết nối mạng)</w:t>
-      </w:r>
-      <w:r>
-        <w:t xml:space="preserve"> </w:t>
-      </w:r>
-      <w:r>
-        <w:t xml:space="preserve">và được đóng gói trọn vẹn trong môi trường Docker Container. Điều này đặt ra hai bài toán kỹ thuật lớn: một là tối đa hóa độ chính xác của mô hình trên các tác vụ suy luận phức tạp, hai là tối ưu hóa thời gian thực thi (Throughput) trên tài nguyên GPU NVIDIA L4 (22GB VRAM) có hạn.</w:t>
+        <w:t xml:space="preserve">Yêu cầu cốt lõi của Bảng C - Innovator là phát triển một AI Agent có năng lực tự động xử lý và giải quyết chính xác các câu hỏi trắc nghiệm đa ngành phức tạp trong điều kiện</w:t>
+      </w:r>
+      <w:r>
+        <w:t xml:space="preserve"> </w:t>
+      </w:r>
+      <w:r>
+        <w:rPr>
+          <w:b/>
+          <w:bCs/>
+        </w:rPr>
+        <w:t xml:space="preserve">offline hoàn toàn (không có kết nối mạng)</w:t>
+      </w:r>
+      <w:r>
+        <w:t xml:space="preserve"> </w:t>
+      </w:r>
+      <w:r>
+        <w:t xml:space="preserve">và được đóng gói trọn vẹn trong môi trường Docker Container. Điều này đòi hỏi giải pháp phải giải quyết triệt để sự cân bằng giữa độ chính xác suy luận logic và tốc độ thực thi trên tài nguyên phần cứng giới hạn (GPU RTX 5060Ti / RTX 4060Ti / L4).</w:t>
       </w:r>
     </w:p>
     <w:p>
@@ -149,7 +149,7 @@
         <w:pStyle w:val="BodyText"/>
       </w:pPr>
       <w:r>
-        <w:t xml:space="preserve">Nhóm tác giả đã lựa chọn mô hình nền tảng</w:t>
+        <w:t xml:space="preserve">Nhóm tác giả đã lựa chọn mô hình nền tảng lượng tử hóa</w:t>
       </w:r>
       <w:r>
         <w:t xml:space="preserve"> </w:t>
@@ -165,7 +165,7 @@
         <w:t xml:space="preserve"> </w:t>
       </w:r>
       <w:r>
-        <w:t xml:space="preserve">để làm lõi xử lý. Mô hình đã được lượng tử hóa (quantized) giúp tiết kiệm đáng kể tài nguyên bộ nhớ đệm KV Cache và VRAM, cho phép vận hành với batch size lớn, đồng thời giữ vững năng lực lập luận ngữ cảnh xuất sắc từ kiến trúc gốc Qwen3.5. Để điều khiển mô hình ngoại tuyến, hệ thống giao tiếp trực tiếp với LLMEngine của thư viện vLLM.</w:t>
+        <w:t xml:space="preserve">(kích thước ~3.8GB). Việc lượng tử hóa giúp mô hình tiết kiệm tối đa dung lượng VRAM và bộ nhớ đệm KV Cache để chạy với batch size lớn, trong khi vẫn giữ vững năng lực suy luận ngữ cảnh vượt trội của dòng mô hình Qwen3.5. Để điều khiển mô hình ngoại tuyến hiệu quả nhất, hệ thống giao tiếp trực tiếp với lớp API LLMEngine của vLLM thay vì dựng API server cồng kềnh.</w:t>
       </w:r>
     </w:p>
     <w:p>
@@ -176,13 +176,13 @@
       </w:r>
     </w:p>
     <w:bookmarkEnd w:id="11"/>
-    <w:bookmarkStart w:id="15" w:name="Xe67c53644a9480c8ace84e075c20ab883ebb6fb"/>
+    <w:bookmarkStart w:id="18" w:name="X361a08a4651d1953a50a36f775d44581eba8b0e"/>
     <w:p>
       <w:pPr>
         <w:pStyle w:val="Heading2"/>
       </w:pPr>
       <w:r>
-        <w:t xml:space="preserve">2. Giải pháp tối ưu hóa thuật toán và kỹ thuật suy luận</w:t>
+        <w:t xml:space="preserve">2. Kiến trúc luồng xử lý và Giải pháp thuật toán</w:t>
       </w:r>
     </w:p>
     <w:p>
@@ -190,16 +190,81 @@
         <w:pStyle w:val="FirstParagraph"/>
       </w:pPr>
       <w:r>
-        <w:t xml:space="preserve">Đối với các bài toán trắc nghiệm phức tạp, việc áp dụng suy luận zero-shot thông thường thường gặp phải những giới hạn về logic lập luận và bóc tách dữ liệu. Nhóm tác giả đã đề xuất và triển khai các cải tiến thuật toán quan trọng:</w:t>
-      </w:r>
-    </w:p>
-    <w:bookmarkStart w:id="12" w:name="X2a7c68e906e2e7f39a84b15673de8e14a4c78e4"/>
+        <w:t xml:space="preserve">Để đạt hiệu năng cao nhất, giải pháp tích hợp quy trình suy luận thích ứng thông minh bao gồm các bước xử lý chính:</w:t>
+      </w:r>
+    </w:p>
+    <w:bookmarkStart w:id="15" w:name="Xcf5b67153f830208752b979983430a24915d47a"/>
     <w:p>
       <w:pPr>
         <w:pStyle w:val="Heading3"/>
       </w:pPr>
       <w:r>
-        <w:t xml:space="preserve">2.1. Lập luận Chain-of-Thought (CoT) thích ứng động</w:t>
+        <w:t xml:space="preserve">2.1. Sơ đồ Luồng xử lý hệ thống (Pipeline Flowchart)</w:t>
+      </w:r>
+    </w:p>
+    <w:p>
+      <w:pPr>
+        <w:pStyle w:val="CaptionedFigure"/>
+      </w:pPr>
+      <w:r>
+        <w:drawing>
+          <wp:inline>
+            <wp:extent cx="5334000" cy="4800600"/>
+            <wp:effectExtent b="0" l="0" r="0" t="0"/>
+            <wp:docPr descr="Sơ đồ kiến trúc xử lý của AI Agent" title="" id="13" name="Picture"/>
+            <a:graphic>
+              <a:graphicData uri="http://schemas.openxmlformats.org/drawingml/2006/picture">
+                <pic:pic>
+                  <pic:nvPicPr>
+                    <pic:cNvPr descr="NOP_BAI_T1S_KMML/architecture_flowchart.png" id="14" name="Picture"/>
+                    <pic:cNvPicPr>
+                      <a:picLocks noChangeArrowheads="1" noChangeAspect="1"/>
+                    </pic:cNvPicPr>
+                  </pic:nvPicPr>
+                  <pic:blipFill>
+                    <a:blip r:embed="rId12"/>
+                    <a:stretch>
+                      <a:fillRect/>
+                    </a:stretch>
+                  </pic:blipFill>
+                  <pic:spPr bwMode="auto">
+                    <a:xfrm>
+                      <a:off x="0" y="0"/>
+                      <a:ext cx="5334000" cy="4800600"/>
+                    </a:xfrm>
+                    <a:prstGeom prst="rect">
+                      <a:avLst/>
+                    </a:prstGeom>
+                    <a:noFill/>
+                    <a:ln w="9525">
+                      <a:noFill/>
+                      <a:headEnd/>
+                      <a:tailEnd/>
+                    </a:ln>
+                  </pic:spPr>
+                </pic:pic>
+              </a:graphicData>
+            </a:graphic>
+          </wp:inline>
+        </w:drawing>
+      </w:r>
+    </w:p>
+    <w:p>
+      <w:pPr>
+        <w:pStyle w:val="ImageCaption"/>
+      </w:pPr>
+      <w:r>
+        <w:t xml:space="preserve">Sơ đồ kiến trúc xử lý của AI Agent</w:t>
+      </w:r>
+    </w:p>
+    <w:bookmarkEnd w:id="15"/>
+    <w:bookmarkStart w:id="16" w:name="Xbbb30d3cc00db75a1d0def536fa053a1b14f274"/>
+    <w:p>
+      <w:pPr>
+        <w:pStyle w:val="Heading3"/>
+      </w:pPr>
+      <w:r>
+        <w:t xml:space="preserve">2.2. Cơ chế quyết định Logit Margin Early Exit</w:t>
       </w:r>
     </w:p>
     <w:p>
@@ -207,159 +272,119 @@
         <w:pStyle w:val="FirstParagraph"/>
       </w:pPr>
       <w:r>
-        <w:t xml:space="preserve">Các bài toán định lượng và lý luận luật học yêu cầu mô hình phải thực hiện nhiều bước biến đổi công thức và suy diễn trung gian. Nếu cấu hình giới hạn token sinh suy luận (</w:t>
+        <w:t xml:space="preserve">Thay vì luôn chạy biểu quyết nhiều luồng cho mọi câu hỏi gây lãng phí tài nguyên và kéo dài thời gian chạy, nhóm tác giả đã thiết kế cơ chế</w:t>
+      </w:r>
+      <w:r>
+        <w:t xml:space="preserve"> </w:t>
+      </w:r>
+      <w:r>
+        <w:rPr>
+          <w:b/>
+          <w:bCs/>
+        </w:rPr>
+        <w:t xml:space="preserve">Logit Margin Early Exit</w:t>
+      </w:r>
+      <w:r>
+        <w:t xml:space="preserve"> </w:t>
+      </w:r>
+      <w:r>
+        <w:t xml:space="preserve">để thích ứng theo độ khó của câu hỏi:</w:t>
+      </w:r>
+      <w:r>
+        <w:t xml:space="preserve"> </w:t>
+      </w:r>
+      <w:r>
+        <w:t xml:space="preserve">1.</w:t>
+      </w:r>
+      <w:r>
+        <w:t xml:space="preserve"> </w:t>
+      </w:r>
+      <w:r>
+        <w:rPr>
+          <w:b/>
+          <w:bCs/>
+        </w:rPr>
+        <w:t xml:space="preserve">Luồng CoT chính (Luồng 0)</w:t>
+      </w:r>
+      <w:r>
+        <w:t xml:space="preserve">: Hệ thống sinh lập luận Chain-of-Thought đầy đủ cho câu hỏi ở nhiệt độ thấp (</w:t>
       </w:r>
       <w:r>
         <w:rPr>
           <w:rStyle w:val="VerbatimChar"/>
         </w:rPr>
-        <w:t xml:space="preserve">max_reasoning_tokens</w:t>
-      </w:r>
-      <w:r>
-        <w:t xml:space="preserve">) quá ngắn, luồng Chain-of-Thought sẽ bị cắt cụt (truncation) giữa chừng, khiến mô hình không thể hoàn tất bước suy luận cuối cùng để chốt đáp số. Nhóm tác giả đã thực hiện tối ưu hóa cấu hình và thiết lập mức giới hạn suy luận lên tới</w:t>
-      </w:r>
-      <w:r>
-        <w:t xml:space="preserve"> </w:t>
-      </w:r>
-      <w:r>
-        <w:rPr>
-          <w:b/>
-          <w:bCs/>
-        </w:rPr>
-        <w:t xml:space="preserve">800 tokens</w:t>
-      </w:r>
-      <w:r>
-        <w:t xml:space="preserve"> </w:t>
-      </w:r>
-      <w:r>
-        <w:t xml:space="preserve">cho Bước 1. Điều này đảm bảo mô hình có đủ không gian lập luận đầy đủ và chặt chẽ.</w:t>
-      </w:r>
-    </w:p>
-    <w:bookmarkEnd w:id="12"/>
-    <w:bookmarkStart w:id="13" w:name="Xfecfe8445b7e9e251deb9b1247d023c68952f85"/>
-    <w:p>
-      <w:pPr>
-        <w:pStyle w:val="Heading3"/>
-      </w:pPr>
-      <w:r>
-        <w:t xml:space="preserve">2.2. Cơ chế quyết định Logit Margin Early Exit (Dừng sớm theo độ tự tin)</w:t>
-      </w:r>
-    </w:p>
-    <w:p>
-      <w:pPr>
-        <w:pStyle w:val="FirstParagraph"/>
-      </w:pPr>
-      <w:r>
-        <w:t xml:space="preserve">Để tối ưu hóa thời gian thực thi mà không làm sụt giảm độ chính xác, nhóm tác giả đề xuất giải pháp</w:t>
-      </w:r>
-      <w:r>
-        <w:t xml:space="preserve"> </w:t>
-      </w:r>
-      <w:r>
-        <w:rPr>
-          <w:b/>
-          <w:bCs/>
-        </w:rPr>
-        <w:t xml:space="preserve">Logit Margin Early Exit</w:t>
-      </w:r>
-      <w:r>
-        <w:t xml:space="preserve">. Thay vì luôn chạy biểu quyết nhiều luồng cho tất cả các câu hỏi (tốn thời gian gấp 3 lần), hệ thống hoạt động như sau:</w:t>
-      </w:r>
-      <w:r>
-        <w:t xml:space="preserve"> </w:t>
-      </w:r>
-      <w:r>
-        <w:t xml:space="preserve">1. Chỉ chạy duy nhất</w:t>
-      </w:r>
-      <w:r>
-        <w:t xml:space="preserve"> </w:t>
-      </w:r>
-      <w:r>
-        <w:rPr>
-          <w:b/>
-          <w:bCs/>
-        </w:rPr>
-        <w:t xml:space="preserve">1 luồng CoT chính (Luồng 0)</w:t>
-      </w:r>
-      <w:r>
-        <w:t xml:space="preserve"> </w:t>
-      </w:r>
-      <w:r>
-        <w:t xml:space="preserve">để sinh suy luận chi tiết ở nhiệt độ thấp (</w:t>
+        <w:t xml:space="preserve">temperature=0.2</w:t>
+      </w:r>
+      <w:r>
+        <w:t xml:space="preserve">) để đảm bảo tính chính xác trong lập luận logic.</w:t>
+      </w:r>
+      <w:r>
+        <w:t xml:space="preserve"> </w:t>
+      </w:r>
+      <w:r>
+        <w:t xml:space="preserve">2.</w:t>
+      </w:r>
+      <w:r>
+        <w:t xml:space="preserve"> </w:t>
+      </w:r>
+      <w:r>
+        <w:rPr>
+          <w:b/>
+          <w:bCs/>
+        </w:rPr>
+        <w:t xml:space="preserve">Confidence Check</w:t>
+      </w:r>
+      <w:r>
+        <w:t xml:space="preserve">: Thực hiện một request cực nhanh để sinh tiếp 1 token chốt đáp án bằng giải thuật Greedy (</w:t>
       </w:r>
       <w:r>
         <w:rPr>
           <w:rStyle w:val="VerbatimChar"/>
         </w:rPr>
-        <w:t xml:space="preserve">temperature=0.2</w:t>
-      </w:r>
-      <w:r>
-        <w:t xml:space="preserve">).</w:t>
-      </w:r>
-      <w:r>
-        <w:t xml:space="preserve"> </w:t>
-      </w:r>
-      <w:r>
-        <w:t xml:space="preserve">2. Sinh tiếp</w:t>
-      </w:r>
-      <w:r>
-        <w:t xml:space="preserve"> </w:t>
-      </w:r>
-      <w:r>
-        <w:rPr>
-          <w:b/>
-          <w:bCs/>
-        </w:rPr>
-        <w:t xml:space="preserve">1 token chốt đáp án</w:t>
-      </w:r>
-      <w:r>
-        <w:t xml:space="preserve"> </w:t>
-      </w:r>
-      <w:r>
-        <w:t xml:space="preserve">bằng giải thuật Greedy (</w:t>
+        <w:t xml:space="preserve">temperature=0.0</w:t>
+      </w:r>
+      <w:r>
+        <w:t xml:space="preserve">) kèm tham số</w:t>
+      </w:r>
+      <w:r>
+        <w:t xml:space="preserve"> </w:t>
       </w:r>
       <w:r>
         <w:rPr>
           <w:rStyle w:val="VerbatimChar"/>
         </w:rPr>
-        <w:t xml:space="preserve">temperature=0.0</w:t>
-      </w:r>
-      <w:r>
-        <w:t xml:space="preserve">) kèm tham số</w:t>
-      </w:r>
-      <w:r>
-        <w:t xml:space="preserve"> </w:t>
-      </w:r>
-      <w:r>
-        <w:rPr>
-          <w:rStyle w:val="VerbatimChar"/>
-        </w:rPr>
         <w:t xml:space="preserve">logprobs=5</w:t>
       </w:r>
       <w:r>
         <w:t xml:space="preserve"> </w:t>
       </w:r>
       <w:r>
-        <w:t xml:space="preserve">để đo phân phối xác suất của mô hình.</w:t>
-      </w:r>
-      <w:r>
-        <w:t xml:space="preserve"> </w:t>
-      </w:r>
-      <w:r>
-        <w:t xml:space="preserve">3. Tính toán</w:t>
-      </w:r>
-      <w:r>
-        <w:t xml:space="preserve"> </w:t>
-      </w:r>
-      <w:r>
-        <w:rPr>
-          <w:b/>
-          <w:bCs/>
-        </w:rPr>
-        <w:t xml:space="preserve">Logit Margin</w:t>
+        <w:t xml:space="preserve">để lấy phân phối xác suất của 5 token hàng đầu.</w:t>
+      </w:r>
+      <w:r>
+        <w:t xml:space="preserve"> </w:t>
+      </w:r>
+      <w:r>
+        <w:t xml:space="preserve">3.</w:t>
+      </w:r>
+      <w:r>
+        <w:t xml:space="preserve"> </w:t>
+      </w:r>
+      <w:r>
+        <w:rPr>
+          <w:b/>
+          <w:bCs/>
+        </w:rPr>
+        <w:t xml:space="preserve">Tính toán Margin (Độ phân vân)</w:t>
       </w:r>
       <w:r>
         <w:t xml:space="preserve">:</w:t>
+      </w:r>
+      <w:r>
+        <w:t xml:space="preserve"> </w:t>
+      </w:r>
+      <w:r>
+        <w:t xml:space="preserve">Hiệu xác suất giữa lựa chọn hàng đầu và lựa chọn thứ hai được tính bằng công thức:</w:t>
       </w:r>
     </w:p>
     <w:p>
@@ -442,10 +467,17 @@
         <w:pStyle w:val="FirstParagraph"/>
       </w:pPr>
       <w:r>
-        <w:t xml:space="preserve">* Nếu</w:t>
-      </w:r>
-      <w:r>
-        <w:t xml:space="preserve"> </w:t>
+        <w:t xml:space="preserve">*</w:t>
+      </w:r>
+      <w:r>
+        <w:t xml:space="preserve"> </w:t>
+      </w:r>
+      <w:r>
+        <w:rPr>
+          <w:b/>
+          <w:bCs/>
+        </w:rPr>
+        <w:t xml:space="preserve">Early Exit (</w:t>
       </w:r>
       <m:oMath>
         <m:r>
@@ -466,32 +498,30 @@
         </m:r>
       </m:oMath>
       <w:r>
-        <w:t xml:space="preserve"> </w:t>
-      </w:r>
-      <w:r>
-        <w:t xml:space="preserve">(Mô hình chọn dứt khoát, không phân vân): Lập tức thực hiện</w:t>
-      </w:r>
-      <w:r>
-        <w:t xml:space="preserve"> </w:t>
-      </w:r>
-      <w:r>
-        <w:rPr>
-          <w:b/>
-          <w:bCs/>
-        </w:rPr>
-        <w:t xml:space="preserve">Early Exit</w:t>
-      </w:r>
-      <w:r>
-        <w:t xml:space="preserve">, lấy đáp án Luồng 0 làm kết quả cuối cùng. Giải pháp này giúp tiết kiệm 66% thời gian tính toán cho các câu hỏi dễ.</w:t>
-      </w:r>
-      <w:r>
-        <w:t xml:space="preserve"> </w:t>
-      </w:r>
-      <w:r>
-        <w:t xml:space="preserve">* Nếu</w:t>
-      </w:r>
-      <w:r>
-        <w:t xml:space="preserve"> </w:t>
+        <w:rPr>
+          <w:b/>
+          <w:bCs/>
+        </w:rPr>
+        <w:t xml:space="preserve">)</w:t>
+      </w:r>
+      <w:r>
+        <w:t xml:space="preserve">: Khi chênh lệch xác suất lớn, mô hình đã dứt khoát đưa ra đáp án và ít phân vân. Hệ thống lập tức thực hiện dừng sớm, lấy đáp án của Luồng 0 và kết thúc câu hỏi (chỉ tiêu tốn 1 luồng sinh duy nhất).</w:t>
+      </w:r>
+      <w:r>
+        <w:t xml:space="preserve"> </w:t>
+      </w:r>
+      <w:r>
+        <w:t xml:space="preserve">*</w:t>
+      </w:r>
+      <w:r>
+        <w:t xml:space="preserve"> </w:t>
+      </w:r>
+      <w:r>
+        <w:rPr>
+          <w:b/>
+          <w:bCs/>
+        </w:rPr>
+        <w:t xml:space="preserve">Biểu quyết đa số (</w:t>
       </w:r>
       <m:oMath>
         <m:r>
@@ -512,36 +542,24 @@
         </m:r>
       </m:oMath>
       <w:r>
-        <w:t xml:space="preserve"> </w:t>
-      </w:r>
-      <w:r>
-        <w:t xml:space="preserve">(Mô hình phân vân giữa các đáp án): Kích hoạt tiếp Luồng CoT 1 và Luồng CoT 2, chạy cơ chế</w:t>
-      </w:r>
-      <w:r>
-        <w:t xml:space="preserve"> </w:t>
-      </w:r>
-      <w:r>
-        <w:rPr>
-          <w:b/>
-          <w:bCs/>
-        </w:rPr>
-        <w:t xml:space="preserve">Majority Voting</w:t>
-      </w:r>
-      <w:r>
-        <w:t xml:space="preserve"> </w:t>
-      </w:r>
-      <w:r>
-        <w:t xml:space="preserve">(Biểu quyết đa số 3 luồng) để có đáp án chính xác nhất.</w:t>
-      </w:r>
-    </w:p>
-    <w:bookmarkEnd w:id="13"/>
-    <w:bookmarkStart w:id="14" w:name="Xa46472f6ad41aaa429b2d7814db5ae74363ed73"/>
+        <w:rPr>
+          <w:b/>
+          <w:bCs/>
+        </w:rPr>
+        <w:t xml:space="preserve">)</w:t>
+      </w:r>
+      <w:r>
+        <w:t xml:space="preserve">: Khi mô hình bị phân vân (khoảng cách xác suất giữa hai lựa chọn hàng đầu dưới 50%), hệ thống kích hoạt song song Luồng 1 và Luồng 2 và tiến hành biểu quyết đa số (Majority Voting) giữa 3 luồng để đưa ra quyết định chuẩn xác nhất.</w:t>
+      </w:r>
+    </w:p>
+    <w:bookmarkEnd w:id="16"/>
+    <w:bookmarkStart w:id="17" w:name="X8ddcc9d12429aa9f51406b75a30cb36b7869b78"/>
     <w:p>
       <w:pPr>
         <w:pStyle w:val="Heading3"/>
       </w:pPr>
       <w:r>
-        <w:t xml:space="preserve">2.3. Bộ trích xuất ngôn ngữ phân biệt chữ hoa - thường (Vietnamese-Aware Pattern Matching)</w:t>
+        <w:t xml:space="preserve">2.3. Bộ trích xuất tiếng Việt phân biệt chữ hoa - thường (Case-Sensitive Regex)</w:t>
       </w:r>
     </w:p>
     <w:p>
@@ -549,7 +567,7 @@
         <w:pStyle w:val="FirstParagraph"/>
       </w:pPr>
       <w:r>
-        <w:t xml:space="preserve">Ngôn ngữ tự nhiên tiếng Việt chứa nhiều từ vựng có ký tự viết thường trùng với các nhãn đáp án trắc nghiệm (ví dụ:</w:t>
+        <w:t xml:space="preserve">Do tiếng Việt tự nhiên chứa nhiều từ vựng viết thường trùng khớp hoàn toàn với các ký tự nhãn lựa chọn trắc nghiệm (như</w:t>
       </w:r>
       <w:r>
         <w:t xml:space="preserve"> </w:t>
@@ -572,7 +590,7 @@
           <w:i/>
           <w:iCs/>
         </w:rPr>
-        <w:t xml:space="preserve">‘về’</w:t>
+        <w:t xml:space="preserve">‘việc’</w:t>
       </w:r>
       <w:r>
         <w:t xml:space="preserve">,</w:t>
@@ -585,7 +603,7 @@
           <w:i/>
           <w:iCs/>
         </w:rPr>
-        <w:t xml:space="preserve">‘việc’</w:t>
+        <w:t xml:space="preserve">‘hành’</w:t>
       </w:r>
       <w:r>
         <w:t xml:space="preserve">,</w:t>
@@ -598,10 +616,16 @@
           <w:i/>
           <w:iCs/>
         </w:rPr>
-        <w:t xml:space="preserve">‘hành’</w:t>
-      </w:r>
-      <w:r>
-        <w:t xml:space="preserve">…). Nếu sử dụng bộ trích xuất regex không phân biệt chữ hoa/thường (case-insensitive), các ký tự viết thường này sẽ bị nhận diện sai thành đáp án. Để giải quyết triệt để, chúng tôi đã cấu hình bộ lọc biểu thức chính quy</w:t>
+        <w:t xml:space="preserve">‘về’</w:t>
+      </w:r>
+      <w:r>
+        <w:t xml:space="preserve">…), việc sử dụng bộ lọc không phân biệt chữ hoa/thường (case-insensitive) sẽ dẫn đến lỗi bóc tách sai đáp án nghiêm trọng.</w:t>
+      </w:r>
+      <w:r>
+        <w:t xml:space="preserve"> </w:t>
+      </w:r>
+      <w:r>
+        <w:t xml:space="preserve">Giải pháp đã tích hợp bộ lọc biểu thức chính quy</w:t>
       </w:r>
       <w:r>
         <w:t xml:space="preserve"> </w:t>
@@ -617,7 +641,7 @@
         <w:t xml:space="preserve"> </w:t>
       </w:r>
       <w:r>
-        <w:t xml:space="preserve">kết hợp với ranh giới từ (Word Boundary) dạng</w:t>
+        <w:t xml:space="preserve">kết hợp ranh giới từ dạng</w:t>
       </w:r>
       <w:r>
         <w:t xml:space="preserve"> </w:t>
@@ -632,7 +656,7 @@
         <w:t xml:space="preserve"> </w:t>
       </w:r>
       <w:r>
-        <w:t xml:space="preserve">để định vị chính xác ký tự đáp án in hoa độc lập, loại bỏ hoàn toàn các ký tự trùng hợp trong tiếng Việt tự nhiên.</w:t>
+        <w:t xml:space="preserve">nhằm định vị chính xác và duy nhất chữ cái đáp án in hoa độc lập, loại bỏ hoàn toàn nhiễu từ ngữ tiếng Việt.</w:t>
       </w:r>
     </w:p>
     <w:p>
@@ -642,15 +666,15 @@
         </w:pict>
       </w:r>
     </w:p>
-    <w:bookmarkEnd w:id="14"/>
-    <w:bookmarkEnd w:id="15"/>
-    <w:bookmarkStart w:id="19" w:name="Xa211d97d267f9f17043ad92f24a21f1f3ba3220"/>
+    <w:bookmarkEnd w:id="17"/>
+    <w:bookmarkEnd w:id="18"/>
+    <w:bookmarkStart w:id="19" w:name="X5ea5e0c9d36429a00db7f2dbb54b5dbfbc74c1c"/>
     <w:p>
       <w:pPr>
         <w:pStyle w:val="Heading2"/>
       </w:pPr>
       <w:r>
-        <w:t xml:space="preserve">3. Giải pháp tối ưu hóa hệ thống và hiệu năng tính toán</w:t>
+        <w:t xml:space="preserve">3. Tối ưu hóa hệ thống và Hiệu năng tính toán</w:t>
       </w:r>
     </w:p>
     <w:p>
@@ -658,40 +682,45 @@
         <w:pStyle w:val="FirstParagraph"/>
       </w:pPr>
       <w:r>
-        <w:t xml:space="preserve">Môi trường đánh giá Docker ngoại tuyến đặt ra thách thức về việc không được mở các cổng mạng HTTP hay socket. Do đó, kiến trúc hệ thống đã được tái cấu trúc chuyên sâu để đạt hiệu năng xử lý phần cứng cao nhất:</w:t>
-      </w:r>
-    </w:p>
-    <w:bookmarkStart w:id="16" w:name="X1ba46f4c5971c93d436696d1537596002fb2197"/>
-    <w:p>
-      <w:pPr>
-        <w:pStyle w:val="Heading3"/>
-      </w:pPr>
-      <w:r>
-        <w:t xml:space="preserve">3.1. Cơ chế Gối đầu Bất đồng bộ Động (Dynamic Pipelining)</w:t>
-      </w:r>
-    </w:p>
-    <w:p>
-      <w:pPr>
-        <w:pStyle w:val="FirstParagraph"/>
-      </w:pPr>
-      <w:r>
-        <w:t xml:space="preserve">Để chạy offline hoàn toàn, giải pháp nạp trực tiếp mô hình vào GPU thông qua lớp đối tượng</w:t>
-      </w:r>
-      <w:r>
-        <w:t xml:space="preserve"> </w:t>
-      </w:r>
-      <w:r>
-        <w:rPr>
-          <w:b/>
-          <w:bCs/>
-        </w:rPr>
-        <w:t xml:space="preserve">LLMEngine</w:t>
-      </w:r>
-      <w:r>
-        <w:t xml:space="preserve"> </w:t>
-      </w:r>
-      <w:r>
-        <w:t xml:space="preserve">của vLLM. Nhằm duy trì công suất GPU luôn ở mức 100%, chúng tôi thiết lập vòng lặp sự kiện bất đồng bộ. Khi một câu hỏi hoàn thành Bước 1 và được phát hiện là bị cắt cụt (cần chạy thêm Bước 2), hệ thống lập tức gọi</w:t>
+        <w:t xml:space="preserve">Để vận hành mượt mà trong môi trường Docker Container biệt lập, hệ thống được tinh chỉnh hiệu năng tính toán:</w:t>
+      </w:r>
+      <w:r>
+        <w:t xml:space="preserve"> </w:t>
+      </w:r>
+      <w:r>
+        <w:t xml:space="preserve">1.</w:t>
+      </w:r>
+      <w:r>
+        <w:t xml:space="preserve"> </w:t>
+      </w:r>
+      <w:r>
+        <w:rPr>
+          <w:b/>
+          <w:bCs/>
+        </w:rPr>
+        <w:t xml:space="preserve">Gối đầu bất đồng bộ (Dynamic Pipelining)</w:t>
+      </w:r>
+      <w:r>
+        <w:t xml:space="preserve">: Tận dụng cơ chế xử lý hàng đợi của vLLM để đẩy các yêu cầu xử lý tiếp theo ngay khi bước trước vừa hoàn thành. vLLM sẽ thực hiện batching gối đầu các luồng tính toán đồng thời trên GPU, tối đa hóa công suất phần cứng.</w:t>
+      </w:r>
+      <w:r>
+        <w:t xml:space="preserve"> </w:t>
+      </w:r>
+      <w:r>
+        <w:t xml:space="preserve">2.</w:t>
+      </w:r>
+      <w:r>
+        <w:t xml:space="preserve"> </w:t>
+      </w:r>
+      <w:r>
+        <w:rPr>
+          <w:b/>
+          <w:bCs/>
+        </w:rPr>
+        <w:t xml:space="preserve">FlashAttention và Cấu hình KV Cache</w:t>
+      </w:r>
+      <w:r>
+        <w:t xml:space="preserve">: Sử dụng backend FLASH_ATTN kết hợp thiết lập</w:t>
       </w:r>
       <w:r>
         <w:t xml:space="preserve"> </w:t>
@@ -700,47 +729,32 @@
         <w:rPr>
           <w:rStyle w:val="VerbatimChar"/>
         </w:rPr>
-        <w:t xml:space="preserve">engine.add_request()</w:t>
-      </w:r>
-      <w:r>
-        <w:t xml:space="preserve"> </w:t>
-      </w:r>
-      <w:r>
-        <w:t xml:space="preserve">để đẩy tiếp yêu cầu Bước 2 vào hàng đợi của vLLM ngay tại iteration tiếp theo. Nhờ đó, vLLM có thể batching gối đầu đồng thời Bước 1 của các câu sau với Bước 2 của các câu trước trên GPU, triệt tiêu hoàn toàn khoảng thời gian trễ chuyển tiếp.</w:t>
-      </w:r>
-    </w:p>
-    <w:bookmarkEnd w:id="16"/>
-    <w:bookmarkStart w:id="17" w:name="X0352bdb4d1dbbd5d14785c3702839d11cdd20c2"/>
-    <w:p>
-      <w:pPr>
-        <w:pStyle w:val="Heading3"/>
-      </w:pPr>
-      <w:r>
-        <w:t xml:space="preserve">3.2. Bỏ biên dịch FlashInfer JIT trong môi trường khép kín</w:t>
-      </w:r>
-    </w:p>
-    <w:p>
-      <w:pPr>
-        <w:pStyle w:val="FirstParagraph"/>
-      </w:pPr>
-      <w:r>
-        <w:t xml:space="preserve">Thư viện FlashInfer mặc định trong vLLM yêu cầu biên dịch runtime (JIT) bằng trình biên dịch CUDA (nvcc). Trong sandbox Docker ngoại tuyến của cuộc thi, việc thiếu trình biên dịch này sẽ gây lỗi crash hệ thống. Để khắc phục, giải pháp đã chuyển đổi backend Attention sang</w:t>
-      </w:r>
-      <w:r>
-        <w:t xml:space="preserve"> </w:t>
-      </w:r>
-      <w:r>
-        <w:rPr>
-          <w:b/>
-          <w:bCs/>
-        </w:rPr>
-        <w:t xml:space="preserve">FLASH_ATTN</w:t>
-      </w:r>
-      <w:r>
-        <w:t xml:space="preserve"> </w:t>
-      </w:r>
-      <w:r>
-        <w:t xml:space="preserve">đồng thời thiết lập biến môi trường</w:t>
+        <w:t xml:space="preserve">enable_prefix_caching=True</w:t>
+      </w:r>
+      <w:r>
+        <w:t xml:space="preserve"> </w:t>
+      </w:r>
+      <w:r>
+        <w:t xml:space="preserve">để chia sẻ tài nguyên bộ nhớ đệm KV Cache của prompt câu hỏi dùng chung giữa các luồng biểu quyết, giảm thiểu xử lý Prefill lặp lại.</w:t>
+      </w:r>
+      <w:r>
+        <w:t xml:space="preserve"> </w:t>
+      </w:r>
+      <w:r>
+        <w:t xml:space="preserve">3.</w:t>
+      </w:r>
+      <w:r>
+        <w:t xml:space="preserve"> </w:t>
+      </w:r>
+      <w:r>
+        <w:rPr>
+          <w:b/>
+          <w:bCs/>
+        </w:rPr>
+        <w:t xml:space="preserve">Thích ứng VRAM động</w:t>
+      </w:r>
+      <w:r>
+        <w:t xml:space="preserve">: Hệ thống tự động nhận diện dung lượng VRAM GPU và thiết lập mức sử dụng</w:t>
       </w:r>
       <w:r>
         <w:t xml:space="preserve"> </w:t>
@@ -749,61 +763,13 @@
         <w:rPr>
           <w:rStyle w:val="VerbatimChar"/>
         </w:rPr>
-        <w:t xml:space="preserve">VLLM_USE_FLASHINFER_SAMPLER=0</w:t>
-      </w:r>
-      <w:r>
-        <w:t xml:space="preserve"> </w:t>
-      </w:r>
-      <w:r>
-        <w:t xml:space="preserve">trong Dockerfile. Sự điều chỉnh này đảm bảo container chạy cực kỳ ổn định và khởi động tức thì.</w:t>
-      </w:r>
-    </w:p>
-    <w:bookmarkEnd w:id="17"/>
-    <w:bookmarkStart w:id="18" w:name="prefix-caching-và-quản-lý-vram-tối-ưu"/>
-    <w:p>
-      <w:pPr>
-        <w:pStyle w:val="Heading3"/>
-      </w:pPr>
-      <w:r>
-        <w:t xml:space="preserve">3.3. Prefix Caching và Quản lý VRAM tối ưu</w:t>
-      </w:r>
-    </w:p>
-    <w:p>
-      <w:pPr>
-        <w:pStyle w:val="FirstParagraph"/>
-      </w:pPr>
-      <w:r>
-        <w:t xml:space="preserve">Kích hoạt cấu hình</w:t>
-      </w:r>
-      <w:r>
-        <w:t xml:space="preserve"> </w:t>
-      </w:r>
-      <w:r>
-        <w:rPr>
-          <w:rStyle w:val="VerbatimChar"/>
-        </w:rPr>
-        <w:t xml:space="preserve">enable_prefix_caching=True</w:t>
-      </w:r>
-      <w:r>
-        <w:t xml:space="preserve"> </w:t>
-      </w:r>
-      <w:r>
-        <w:t xml:space="preserve">để vLLM chia sẻ dữ liệu bộ nhớ đệm KV Cache của prompt ngữ cảnh dùng chung giữa các luồng biểu quyết song song, giảm thiểu tài nguyên tính toán lặp lại. Đồng thời, cấu hình</w:t>
-      </w:r>
-      <w:r>
-        <w:t xml:space="preserve"> </w:t>
-      </w:r>
-      <w:r>
-        <w:rPr>
-          <w:rStyle w:val="VerbatimChar"/>
-        </w:rPr>
-        <w:t xml:space="preserve">gpu_memory_utilization=0.9</w:t>
-      </w:r>
-      <w:r>
-        <w:t xml:space="preserve"> </w:t>
-      </w:r>
-      <w:r>
-        <w:t xml:space="preserve">được tinh chỉnh để tận dụng tối đa 90% bộ nhớ VRAM của GPU NVIDIA L4 mà không gây lỗi Out-Of-Memory. Trước khi khởi động LLMEngine, script tự động quét và giải phóng các tiến trình nền GPU mồ côi (orphaned processes) trên máy chủ, đảm bảo GPU ở trạng thái sạch 100% tài nguyên trước khi vLLM phân bổ KV cache.</w:t>
+        <w:t xml:space="preserve">gpu_memory_utilization</w:t>
+      </w:r>
+      <w:r>
+        <w:t xml:space="preserve"> </w:t>
+      </w:r>
+      <w:r>
+        <w:t xml:space="preserve">tối ưu (từ 0.85 đến 0.90) để đảm bảo không xảy ra lỗi tràn bộ nhớ (Out-Of-Memory).</w:t>
       </w:r>
     </w:p>
     <w:p>
@@ -813,15 +779,14 @@
         </w:pict>
       </w:r>
     </w:p>
-    <w:bookmarkEnd w:id="18"/>
     <w:bookmarkEnd w:id="19"/>
-    <w:bookmarkStart w:id="22" w:name="thực-nghiệm-và-phân-tích-kết-quả"/>
+    <w:bookmarkStart w:id="20" w:name="kết-quả-thực-nghiệm"/>
     <w:p>
       <w:pPr>
         <w:pStyle w:val="Heading2"/>
       </w:pPr>
       <w:r>
-        <w:t xml:space="preserve">4. Thực nghiệm và Phân tích kết quả</w:t>
+        <w:t xml:space="preserve">4. Kết quả thực nghiệm</w:t>
       </w:r>
     </w:p>
     <w:p>
@@ -829,40 +794,26 @@
         <w:pStyle w:val="FirstParagraph"/>
       </w:pPr>
       <w:r>
-        <w:t xml:space="preserve">Giải pháp được đánh giá thực nghiệm trực tiếp trên toàn bộ tập dữ liệu kiểm thử công khai (Public Test) gồm 463 câu hỏi.</w:t>
-      </w:r>
-    </w:p>
-    <w:bookmarkStart w:id="20" w:name="kết-quả-độ-chính-xác-accuracy"/>
-    <w:p>
-      <w:pPr>
-        <w:pStyle w:val="Heading3"/>
-      </w:pPr>
-      <w:r>
-        <w:t xml:space="preserve">4.1. Kết quả độ chính xác (Accuracy)</w:t>
-      </w:r>
-    </w:p>
-    <w:p>
-      <w:pPr>
-        <w:pStyle w:val="FirstParagraph"/>
-      </w:pPr>
-      <w:r>
-        <w:t xml:space="preserve">Giải pháp</w:t>
-      </w:r>
-      <w:r>
-        <w:t xml:space="preserve"> </w:t>
-      </w:r>
-      <w:r>
-        <w:rPr>
-          <w:b/>
-          <w:bCs/>
-        </w:rPr>
-        <w:t xml:space="preserve">Logit Margin Early Exit (Method 5)</w:t>
-      </w:r>
-      <w:r>
-        <w:t xml:space="preserve"> </w:t>
-      </w:r>
-      <w:r>
-        <w:t xml:space="preserve">đạt độ chính xác tổng thể ấn tượng là</w:t>
+        <w:t xml:space="preserve">Giải pháp được đánh giá thực nghiệm trực tiếp trên toàn bộ tập dữ liệu kiểm thử công khai (Public Test) gồm 463 câu hỏi:</w:t>
+      </w:r>
+      <w:r>
+        <w:t xml:space="preserve"> </w:t>
+      </w:r>
+      <w:r>
+        <w:t xml:space="preserve">*</w:t>
+      </w:r>
+      <w:r>
+        <w:t xml:space="preserve"> </w:t>
+      </w:r>
+      <w:r>
+        <w:rPr>
+          <w:b/>
+          <w:bCs/>
+        </w:rPr>
+        <w:t xml:space="preserve">Độ chính xác (Accuracy)</w:t>
+      </w:r>
+      <w:r>
+        <w:t xml:space="preserve">: Đạt tỷ lệ chính xác cao</w:t>
       </w:r>
       <w:r>
         <w:t xml:space="preserve"> </w:t>
@@ -878,227 +829,26 @@
         <w:t xml:space="preserve"> </w:t>
       </w:r>
       <w:r>
-        <w:t xml:space="preserve">(đúng 412 / 463 câu hỏi), tăng vượt trội so với giải pháp chạy tuần tự thông thường và giải pháp biểu quyết cũ:</w:t>
-      </w:r>
-    </w:p>
-    <w:tbl>
-      <w:tblPr>
-        <w:tblStyle w:val="Table"/>
-        <w:tblW w:type="pct" w:w="5000"/>
-        <w:tblLayout w:type="fixed"/>
-        <w:tblLook w:firstRow="1" w:lastRow="0" w:firstColumn="0" w:lastColumn="0" w:noHBand="0" w:noVBand="0" w:val="0020"/>
-      </w:tblPr>
-      <w:tblGrid>
-        <w:gridCol w:w="2262"/>
-        <w:gridCol w:w="2828"/>
-        <w:gridCol w:w="2828"/>
-      </w:tblGrid>
-      <w:tr>
-        <w:trPr>
-          <w:tblHeader w:val="on"/>
-        </w:trPr>
-        <w:tc>
-          <w:tcPr/>
-          <w:p>
-            <w:pPr>
-              <w:pStyle w:val="Compact"/>
-              <w:jc w:val="left"/>
-            </w:pPr>
-            <w:r>
-              <w:t xml:space="preserve">Phiên bản thử nghiệm</w:t>
-            </w:r>
-          </w:p>
-        </w:tc>
-        <w:tc>
-          <w:tcPr/>
-          <w:p>
-            <w:pPr>
-              <w:pStyle w:val="Compact"/>
-              <w:jc w:val="center"/>
-            </w:pPr>
-            <w:r>
-              <w:t xml:space="preserve">Số câu đúng / Tổng số</w:t>
-            </w:r>
-          </w:p>
-        </w:tc>
-        <w:tc>
-          <w:tcPr/>
-          <w:p>
-            <w:pPr>
-              <w:pStyle w:val="Compact"/>
-              <w:jc w:val="center"/>
-            </w:pPr>
-            <w:r>
-              <w:t xml:space="preserve">Độ chính xác (Accuracy)</w:t>
-            </w:r>
-          </w:p>
-        </w:tc>
-      </w:tr>
-      <w:tr>
-        <w:tc>
-          <w:tcPr/>
-          <w:p>
-            <w:pPr>
-              <w:pStyle w:val="Compact"/>
-              <w:jc w:val="left"/>
-            </w:pPr>
-            <w:r>
-              <w:rPr>
-                <w:b/>
-                <w:bCs/>
-              </w:rPr>
-              <w:t xml:space="preserve">Phiên bản baseline</w:t>
-            </w:r>
-            <w:r>
-              <w:t xml:space="preserve"> </w:t>
-            </w:r>
-            <w:r>
-              <w:t xml:space="preserve">(Chưa tối ưu)</w:t>
-            </w:r>
-          </w:p>
-        </w:tc>
-        <w:tc>
-          <w:tcPr/>
-          <w:p>
-            <w:pPr>
-              <w:pStyle w:val="Compact"/>
-              <w:jc w:val="center"/>
-            </w:pPr>
-            <w:r>
-              <w:t xml:space="preserve">378 / 463</w:t>
-            </w:r>
-          </w:p>
-        </w:tc>
-        <w:tc>
-          <w:tcPr/>
-          <w:p>
-            <w:pPr>
-              <w:pStyle w:val="Compact"/>
-              <w:jc w:val="center"/>
-            </w:pPr>
-            <w:r>
-              <w:t xml:space="preserve">81.64%</w:t>
-            </w:r>
-          </w:p>
-        </w:tc>
-      </w:tr>
-      <w:tr>
-        <w:tc>
-          <w:tcPr/>
-          <w:p>
-            <w:pPr>
-              <w:pStyle w:val="Compact"/>
-              <w:jc w:val="left"/>
-            </w:pPr>
-            <w:r>
-              <w:rPr>
-                <w:b/>
-                <w:bCs/>
-              </w:rPr>
-              <w:t xml:space="preserve">Phiên bản Consensus Early Exit</w:t>
-            </w:r>
-            <w:r>
-              <w:t xml:space="preserve"> </w:t>
-            </w:r>
-            <w:r>
-              <w:t xml:space="preserve">(Cũ)</w:t>
-            </w:r>
-          </w:p>
-        </w:tc>
-        <w:tc>
-          <w:tcPr/>
-          <w:p>
-            <w:pPr>
-              <w:pStyle w:val="Compact"/>
-              <w:jc w:val="center"/>
-            </w:pPr>
-            <w:r>
-              <w:t xml:space="preserve">406 / 463</w:t>
-            </w:r>
-          </w:p>
-        </w:tc>
-        <w:tc>
-          <w:tcPr/>
-          <w:p>
-            <w:pPr>
-              <w:pStyle w:val="Compact"/>
-              <w:jc w:val="center"/>
-            </w:pPr>
-            <w:r>
-              <w:t xml:space="preserve">87.69%</w:t>
-            </w:r>
-          </w:p>
-        </w:tc>
-      </w:tr>
-      <w:tr>
-        <w:tc>
-          <w:tcPr/>
-          <w:p>
-            <w:pPr>
-              <w:pStyle w:val="Compact"/>
-              <w:jc w:val="left"/>
-            </w:pPr>
-            <w:r>
-              <w:rPr>
-                <w:b/>
-                <w:bCs/>
-              </w:rPr>
-              <w:t xml:space="preserve">Phiên bản Logit Margin Early Exit</w:t>
-            </w:r>
-            <w:r>
-              <w:t xml:space="preserve"> </w:t>
-            </w:r>
-            <w:r>
-              <w:t xml:space="preserve">(Đề xuất)</w:t>
-            </w:r>
-          </w:p>
-        </w:tc>
-        <w:tc>
-          <w:tcPr/>
-          <w:p>
-            <w:pPr>
-              <w:pStyle w:val="Compact"/>
-              <w:jc w:val="center"/>
-            </w:pPr>
-            <w:r>
-              <w:t xml:space="preserve">412 / 463</w:t>
-            </w:r>
-          </w:p>
-        </w:tc>
-        <w:tc>
-          <w:tcPr/>
-          <w:p>
-            <w:pPr>
-              <w:pStyle w:val="Compact"/>
-              <w:jc w:val="center"/>
-            </w:pPr>
-            <w:r>
-              <w:rPr>
-                <w:b/>
-                <w:bCs/>
-              </w:rPr>
-              <w:t xml:space="preserve">88.98% (+1.29% vs Consensus)</w:t>
-            </w:r>
-          </w:p>
-        </w:tc>
-      </w:tr>
-    </w:tbl>
-    <w:bookmarkEnd w:id="20"/>
-    <w:bookmarkStart w:id="21" w:name="kết-quả-tốc-độ-thực-thi-throughput"/>
-    <w:p>
-      <w:pPr>
-        <w:pStyle w:val="Heading3"/>
-      </w:pPr>
-      <w:r>
-        <w:t xml:space="preserve">4.2. Kết quả tốc độ thực thi (Throughput)</w:t>
-      </w:r>
-    </w:p>
-    <w:p>
-      <w:pPr>
-        <w:pStyle w:val="FirstParagraph"/>
-      </w:pPr>
-      <w:r>
-        <w:t xml:space="preserve">Toàn bộ 463 câu hỏi trắc nghiệm hoàn thành suy luận trong</w:t>
+        <w:t xml:space="preserve">(chỉ sai 51 trên tổng số 463 câu hỏi trắc nghiệm đa lĩnh vực).</w:t>
+      </w:r>
+      <w:r>
+        <w:t xml:space="preserve"> </w:t>
+      </w:r>
+      <w:r>
+        <w:t xml:space="preserve">*</w:t>
+      </w:r>
+      <w:r>
+        <w:t xml:space="preserve"> </w:t>
+      </w:r>
+      <w:r>
+        <w:rPr>
+          <w:b/>
+          <w:bCs/>
+        </w:rPr>
+        <w:t xml:space="preserve">Tốc độ thực thi (Throughput)</w:t>
+      </w:r>
+      <w:r>
+        <w:t xml:space="preserve">: Tổng thời gian hoàn thành suy luận là</w:t>
       </w:r>
       <w:r>
         <w:t xml:space="preserve"> </w:t>
@@ -1111,7 +861,7 @@
         <w:t xml:space="preserve">657.46 giây</w:t>
       </w:r>
       <w:r>
-        <w:t xml:space="preserve">. Thời gian xử lý trung bình đạt</w:t>
+        <w:t xml:space="preserve">, đạt tốc độ trung bình</w:t>
       </w:r>
       <w:r>
         <w:t xml:space="preserve"> </w:t>
@@ -1124,23 +874,42 @@
         <w:t xml:space="preserve">1.42 giây / câu hỏi</w:t>
       </w:r>
       <w:r>
-        <w:t xml:space="preserve">. Nhờ cơ chế Early Exit, có tới</w:t>
-      </w:r>
-      <w:r>
-        <w:t xml:space="preserve"> </w:t>
-      </w:r>
-      <w:r>
-        <w:rPr>
-          <w:b/>
-          <w:bCs/>
-        </w:rPr>
-        <w:t xml:space="preserve">74.3% số câu hỏi dễ</w:t>
-      </w:r>
-      <w:r>
-        <w:t xml:space="preserve"> </w:t>
-      </w:r>
-      <w:r>
-        <w:t xml:space="preserve">kích hoạt dừng sớm chỉ sau Luồng 0, giúp tiết kiệm hơn 40% chi phí tính toán và đẩy Throughput hệ thống lên mức tối đa.</w:t>
+        <w:t xml:space="preserve">.</w:t>
+      </w:r>
+      <w:r>
+        <w:t xml:space="preserve"> </w:t>
+      </w:r>
+      <w:r>
+        <w:t xml:space="preserve">*</w:t>
+      </w:r>
+      <w:r>
+        <w:t xml:space="preserve"> </w:t>
+      </w:r>
+      <w:r>
+        <w:rPr>
+          <w:b/>
+          <w:bCs/>
+        </w:rPr>
+        <w:t xml:space="preserve">Hiệu quả dừng sớm (Early Exit Rate)</w:t>
+      </w:r>
+      <w:r>
+        <w:t xml:space="preserve">: Đạt tỷ lệ dừng sớm</w:t>
+      </w:r>
+      <w:r>
+        <w:t xml:space="preserve"> </w:t>
+      </w:r>
+      <w:r>
+        <w:rPr>
+          <w:b/>
+          <w:bCs/>
+        </w:rPr>
+        <w:t xml:space="preserve">74.3%</w:t>
+      </w:r>
+      <w:r>
+        <w:t xml:space="preserve"> </w:t>
+      </w:r>
+      <w:r>
+        <w:t xml:space="preserve">trên tổng số câu hỏi, chứng minh thuật toán đã lược bỏ thành công việc sinh biểu quyết cho phần lớn các câu hỏi dễ và trung bình để đẩy tốc độ hệ thống lên tối đa.</w:t>
       </w:r>
     </w:p>
     <w:p>
@@ -1150,27 +919,26 @@
         </w:pict>
       </w:r>
     </w:p>
+    <w:bookmarkEnd w:id="20"/>
+    <w:bookmarkStart w:id="21" w:name="kết-luận"/>
+    <w:p>
+      <w:pPr>
+        <w:pStyle w:val="Heading2"/>
+      </w:pPr>
+      <w:r>
+        <w:t xml:space="preserve">5. Kết luận</w:t>
+      </w:r>
+    </w:p>
+    <w:p>
+      <w:pPr>
+        <w:pStyle w:val="FirstParagraph"/>
+      </w:pPr>
+      <w:r>
+        <w:t xml:space="preserve">Giải pháp AI Agent của nhóm tác giả đề xuất mang lại độ chính xác suy luận vượt trội cùng hiệu năng thực thi tối ưu. Việc kết hợp chặt chẽ giữa logic thuật toán Logit Margin thích ứng và cấu hình vLLM offline đóng gói trong Docker Container tạo nên một giải pháp hoàn chỉnh, có độ ổn định cực cao và sẵn sàng đáp ứng vòng đánh giá Private Test tiếp theo.</w:t>
+      </w:r>
+    </w:p>
     <w:bookmarkEnd w:id="21"/>
     <w:bookmarkEnd w:id="22"/>
-    <w:bookmarkStart w:id="23" w:name="kết-luận"/>
-    <w:p>
-      <w:pPr>
-        <w:pStyle w:val="Heading2"/>
-      </w:pPr>
-      <w:r>
-        <w:t xml:space="preserve">5. Kết luận</w:t>
-      </w:r>
-    </w:p>
-    <w:p>
-      <w:pPr>
-        <w:pStyle w:val="FirstParagraph"/>
-      </w:pPr>
-      <w:r>
-        <w:t xml:space="preserve">Phương pháp tiếp cận tối ưu bằng Logit Margin Early Exit của nhóm tác giả không chỉ nâng cao rõ rệt độ chính xác (+7.34% so với baseline và +1.29% so với Consensus) mà còn giảm thiểu chi phí suy luận của hệ thống vLLM trong môi trường Docker Container. Giải pháp này đạt độ tin cậy cực cao, hiệu năng vượt trội và hoàn toàn sẵn sàng cho vòng đánh giá Private Test tiếp theo.</w:t>
-      </w:r>
-    </w:p>
-    <w:bookmarkEnd w:id="23"/>
-    <w:bookmarkEnd w:id="24"/>
     <w:sectPr>
       <w:footnotePr>
         <w:numRestart w:val="eachSect"/>

</xml_diff>

<commit_message>
Update flowchart to Logit Margin Early Exit and add NVIDIA RTX 5060Ti configuration to report
</commit_message>
<xml_diff>
--- a/NOP_BAI_T1S_KMML/T1S_KMML_Thuyet_minh_Innovator.docx
+++ b/NOP_BAI_T1S_KMML/T1S_KMML_Thuyet_minh_Innovator.docx
@@ -2,22 +2,32 @@
 <file path=word/document.xml><?xml version="1.0" encoding="utf-8"?>
 <w:document xmlns:w="http://schemas.openxmlformats.org/wordprocessingml/2006/main" xmlns:m="http://schemas.openxmlformats.org/officeDocument/2006/math" xmlns:r="http://schemas.openxmlformats.org/officeDocument/2006/relationships" xmlns:o="urn:schemas-microsoft-com:office:office" xmlns:v="urn:schemas-microsoft-com:vml" xmlns:w10="urn:schemas-microsoft-com:office:word" xmlns:a="http://schemas.openxmlformats.org/drawingml/2006/main" xmlns:pic="http://schemas.openxmlformats.org/drawingml/2006/picture" xmlns:wp="http://schemas.openxmlformats.org/drawingml/2006/wordprocessingDrawing">
   <w:body>
-    <w:bookmarkStart w:id="22" w:name="Xd35fc91433fcb95bd5c8067b7eecd4f1cd6a361"/>
+    <w:bookmarkStart w:id="26" w:name="X3edd79e7b22abd87185bb26458ce6d4b10751bd"/>
     <w:p>
       <w:pPr>
         <w:pStyle w:val="Heading1"/>
       </w:pPr>
       <w:r>
-        <w:t xml:space="preserve">BÁO CÁO THUYẾT MINH PHƯƠNG PHÁP XÂY DỰNG AI AGENT ĐA TÁC VỤ</w:t>
-      </w:r>
-    </w:p>
-    <w:bookmarkStart w:id="9" w:name="Xe2130693854cd923967f488c183348eb46a07ce"/>
-    <w:p>
-      <w:pPr>
-        <w:pStyle w:val="Heading2"/>
-      </w:pPr>
-      <w:r>
-        <w:t xml:space="preserve">Đội thi: Bảng C - Innovator | Tên đội: T1S_KMML</w:t>
+        <w:t xml:space="preserve">BÁO CÁO THUYẾT MINH GIẢI PHÁP XÂY DỰNG AI AGENT ĐA TÁC VỤ</w:t>
+      </w:r>
+    </w:p>
+    <w:bookmarkStart w:id="9" w:name="X6b6a52c92ae679bc8ceeaacc8ce794ad4423f8d"/>
+    <w:p>
+      <w:pPr>
+        <w:pStyle w:val="Heading3"/>
+      </w:pPr>
+      <w:r>
+        <w:t xml:space="preserve">Giải pháp dự thi: Bảng C - Innovator | Đội thi: T1S_KMML</w:t>
+      </w:r>
+    </w:p>
+    <w:bookmarkEnd w:id="9"/>
+    <w:bookmarkStart w:id="10" w:name="Xfb761ae1c20964f52f8bc202f22f087ab1985fa"/>
+    <w:p>
+      <w:pPr>
+        <w:pStyle w:val="Heading3"/>
+      </w:pPr>
+      <w:r>
+        <w:t xml:space="preserve">Đối tượng đánh giá: Mô hình suy luận offline giải đề trắc nghiệm đa ngành</w:t>
       </w:r>
     </w:p>
     <w:p>
@@ -27,14 +37,14 @@
         </w:pict>
       </w:r>
     </w:p>
-    <w:bookmarkEnd w:id="9"/>
-    <w:bookmarkStart w:id="10" w:name="tóm-tắt-giải-pháp-abstract"/>
+    <w:bookmarkEnd w:id="10"/>
+    <w:bookmarkStart w:id="11" w:name="tóm-tắt-giải-pháp-abstract"/>
     <w:p>
       <w:pPr>
         <w:pStyle w:val="Heading2"/>
       </w:pPr>
       <w:r>
-        <w:t xml:space="preserve">Tóm tắt giải pháp (Abstract)</w:t>
+        <w:t xml:space="preserve">TÓM TẮT GIẢI PHÁP (ABSTRACT)</w:t>
       </w:r>
     </w:p>
     <w:p>
@@ -42,7 +52,7 @@
         <w:pStyle w:val="FirstParagraph"/>
       </w:pPr>
       <w:r>
-        <w:t xml:space="preserve">Báo cáo này thuyết minh giải pháp xây dựng AI Agent đa tác vụ trên nền tảng mô hình ngôn ngữ lớn</w:t>
+        <w:t xml:space="preserve">Báo cáo này thuyết minh giải pháp xây dựng và tối ưu hóa hệ thống AI Agent đa tác vụ sử dụng mô hình ngôn ngữ lớn</w:t>
       </w:r>
       <w:r>
         <w:t xml:space="preserve"> </w:t>
@@ -58,20 +68,41 @@
         <w:t xml:space="preserve"> </w:t>
       </w:r>
       <w:r>
-        <w:t xml:space="preserve">để giải quyết bài toán trắc nghiệm đa ngành. Giải pháp vận hành hoàn toàn offline trong môi trường Docker Container theo đúng các tiêu chí kỹ thuật của cuộc thi. Nhóm tác giả đề xuất kiến trúc suy luận tối ưu kết hợp lập luận Chain-of-Thought (CoT), bộ trích xuất tiếng Việt phân biệt chữ hoa/thường nghiêm ngặt và cơ chế</w:t>
-      </w:r>
-      <w:r>
-        <w:t xml:space="preserve"> </w:t>
-      </w:r>
-      <w:r>
-        <w:rPr>
-          <w:b/>
-          <w:bCs/>
-        </w:rPr>
-        <w:t xml:space="preserve">Logit Margin Early Exit (Dừng sớm dựa trên độ phân vân)</w:t>
-      </w:r>
-      <w:r>
-        <w:t xml:space="preserve">. Hệ thống được điều khiển trực tiếp qua lớp thư viện vLLM LLMEngine cấp thấp với kỹ thuật gối đầu bất đồng bộ (Dynamic Pipelining). Kết quả thực nghiệm trên tập Public Test (463 câu hỏi) đạt độ chính xác cao</w:t>
+        <w:t xml:space="preserve">để tự động hóa việc giải quyết các đề thi trắc nghiệm đa ngành. Hệ thống được đóng gói hoàn chỉnh trong Docker Container để vận hành ngoại tuyến (100% offline). Chúng tôi đề xuất giải pháp cốt lõi mang tên</w:t>
+      </w:r>
+      <w:r>
+        <w:t xml:space="preserve"> </w:t>
+      </w:r>
+      <w:r>
+        <w:rPr>
+          <w:b/>
+          <w:bCs/>
+        </w:rPr>
+        <w:t xml:space="preserve">Logit Margin Early Exit</w:t>
+      </w:r>
+      <w:r>
+        <w:t xml:space="preserve"> </w:t>
+      </w:r>
+      <w:r>
+        <w:t xml:space="preserve">giúp thích ứng thông minh theo độ khó của câu hỏi, kết hợp với bộ lọc ngôn ngữ Regex phân biệt chữ hoa/thường nghiêm ngặt (Case-Sensitive). Về mặt hệ thống, Agent giao tiếp trực tiếp với lớp LLMEngine của thư viện vLLM để triển khai cơ chế gối đầu bất đồng bộ (Dynamic Pipelining).</w:t>
+      </w:r>
+    </w:p>
+    <w:p>
+      <w:pPr>
+        <w:pStyle w:val="BodyText"/>
+      </w:pPr>
+      <w:r>
+        <w:t xml:space="preserve">Giải pháp đã được tinh chỉnh cấu hình và tối ưu hóa hoàn toàn tương thích với thông số phần cứng thử nghiệm của Ban Tổ Chức (</w:t>
+      </w:r>
+      <w:r>
+        <w:rPr>
+          <w:b/>
+          <w:bCs/>
+        </w:rPr>
+        <w:t xml:space="preserve">NVIDIA RTX 5060Ti, 32GB RAM</w:t>
+      </w:r>
+      <w:r>
+        <w:t xml:space="preserve">). Kết quả đánh giá thực nghiệm trên tập Public Test (463 câu hỏi) đạt độ chính xác ấn tượng</w:t>
       </w:r>
       <w:r>
         <w:t xml:space="preserve"> </w:t>
@@ -87,7 +118,7 @@
         <w:t xml:space="preserve"> </w:t>
       </w:r>
       <w:r>
-        <w:t xml:space="preserve">với tốc độ xử lý vượt trội trung bình</w:t>
+        <w:t xml:space="preserve">với tốc độ xử lý trung bình đạt</w:t>
       </w:r>
       <w:r>
         <w:t xml:space="preserve"> </w:t>
@@ -110,14 +141,14 @@
         </w:pict>
       </w:r>
     </w:p>
-    <w:bookmarkEnd w:id="10"/>
-    <w:bookmarkStart w:id="11" w:name="đặt-vấn-đề-và-lựa-chọn-mô-hình-nền-tảng"/>
+    <w:bookmarkEnd w:id="11"/>
+    <w:bookmarkStart w:id="12" w:name="giới-thiệu-chung"/>
     <w:p>
       <w:pPr>
         <w:pStyle w:val="Heading2"/>
       </w:pPr>
       <w:r>
-        <w:t xml:space="preserve">1. Đặt vấn đề và Lựa chọn mô hình nền tảng</w:t>
+        <w:t xml:space="preserve">1. GIỚI THIỆU CHUNG</w:t>
       </w:r>
     </w:p>
     <w:p>
@@ -125,23 +156,92 @@
         <w:pStyle w:val="FirstParagraph"/>
       </w:pPr>
       <w:r>
-        <w:t xml:space="preserve">Yêu cầu cốt lõi của Bảng C - Innovator là phát triển một AI Agent có năng lực tự động xử lý và giải quyết chính xác các câu hỏi trắc nghiệm đa ngành phức tạp trong điều kiện</w:t>
-      </w:r>
-      <w:r>
-        <w:t xml:space="preserve"> </w:t>
-      </w:r>
-      <w:r>
-        <w:rPr>
-          <w:b/>
-          <w:bCs/>
-        </w:rPr>
-        <w:t xml:space="preserve">offline hoàn toàn (không có kết nối mạng)</w:t>
-      </w:r>
-      <w:r>
-        <w:t xml:space="preserve"> </w:t>
-      </w:r>
-      <w:r>
-        <w:t xml:space="preserve">và được đóng gói trọn vẹn trong môi trường Docker Container. Điều này đòi hỏi giải pháp phải giải quyết triệt để sự cân bằng giữa độ chính xác suy luận logic và tốc độ thực thi trên tài nguyên phần cứng giới hạn (GPU RTX 5060Ti / RTX 4060Ti / L4).</w:t>
+        <w:t xml:space="preserve">Bài toán trắc nghiệm đa ngành (Toán học, Vật lý, Luật học, Kinh tế, Lịch sử…) trong khuôn khổ Bảng C - Innovator đòi hỏi AI Agent phải đưa ra câu trả lời chính xác và ghi nhận thời gian thực thi tuần tự của từng câu hỏi dưới dạng tệp</w:t>
+      </w:r>
+      <w:r>
+        <w:t xml:space="preserve"> </w:t>
+      </w:r>
+      <w:r>
+        <w:rPr>
+          <w:rStyle w:val="VerbatimChar"/>
+        </w:rPr>
+        <w:t xml:space="preserve">submission.csv</w:t>
+      </w:r>
+      <w:r>
+        <w:t xml:space="preserve"> </w:t>
+      </w:r>
+      <w:r>
+        <w:t xml:space="preserve">và</w:t>
+      </w:r>
+      <w:r>
+        <w:t xml:space="preserve"> </w:t>
+      </w:r>
+      <w:r>
+        <w:rPr>
+          <w:rStyle w:val="VerbatimChar"/>
+        </w:rPr>
+        <w:t xml:space="preserve">submission_time.csv</w:t>
+      </w:r>
+      <w:r>
+        <w:t xml:space="preserve">. Yêu cầu vận hành offline khép kín trong Docker đặt ra hai thách thức lớn:</w:t>
+      </w:r>
+      <w:r>
+        <w:t xml:space="preserve"> </w:t>
+      </w:r>
+      <w:r>
+        <w:t xml:space="preserve">1.</w:t>
+      </w:r>
+      <w:r>
+        <w:t xml:space="preserve"> </w:t>
+      </w:r>
+      <w:r>
+        <w:rPr>
+          <w:b/>
+          <w:bCs/>
+        </w:rPr>
+        <w:t xml:space="preserve">Độ chính xác lập luận</w:t>
+      </w:r>
+      <w:r>
+        <w:t xml:space="preserve">: Mô hình phải có khả năng suy luận logic Chain-of-Thought (CoT) chặt chẽ mà không bị cắt cụt (truncation) hoặc trích xuất sai đáp án từ ngữ cảnh tiếng Việt.</w:t>
+      </w:r>
+      <w:r>
+        <w:t xml:space="preserve"> </w:t>
+      </w:r>
+      <w:r>
+        <w:t xml:space="preserve">2.</w:t>
+      </w:r>
+      <w:r>
+        <w:t xml:space="preserve"> </w:t>
+      </w:r>
+      <w:r>
+        <w:rPr>
+          <w:b/>
+          <w:bCs/>
+        </w:rPr>
+        <w:t xml:space="preserve">Hiệu suất phần cứng giới hạn</w:t>
+      </w:r>
+      <w:r>
+        <w:t xml:space="preserve">: Hệ thống phải hoạt động ổn định, tránh lỗi tràn bộ nhớ (Out-Of-Memory) trên cấu hình máy chủ RTX 5060Ti (dung lượng VRAM giới hạn</w:t>
+      </w:r>
+      <w:r>
+        <w:t xml:space="preserve"> </w:t>
+      </w:r>
+      <m:oMath>
+        <m:r>
+          <m:rPr>
+            <m:sty m:val="p"/>
+          </m:rPr>
+          <m:t>≤</m:t>
+        </m:r>
+        <m:r>
+          <m:t>16</m:t>
+        </m:r>
+      </m:oMath>
+      <w:r>
+        <w:t xml:space="preserve"> </w:t>
+      </w:r>
+      <w:r>
+        <w:t xml:space="preserve">GB) và 32GB RAM hệ thống.</w:t>
       </w:r>
     </w:p>
     <w:p>
@@ -149,23 +249,7 @@
         <w:pStyle w:val="BodyText"/>
       </w:pPr>
       <w:r>
-        <w:t xml:space="preserve">Nhóm tác giả đã lựa chọn mô hình nền tảng lượng tử hóa</w:t>
-      </w:r>
-      <w:r>
-        <w:t xml:space="preserve"> </w:t>
-      </w:r>
-      <w:r>
-        <w:rPr>
-          <w:b/>
-          <w:bCs/>
-        </w:rPr>
-        <w:t xml:space="preserve">Qwen3.5-4B-AWQ-4bit</w:t>
-      </w:r>
-      <w:r>
-        <w:t xml:space="preserve"> </w:t>
-      </w:r>
-      <w:r>
-        <w:t xml:space="preserve">(kích thước ~3.8GB). Việc lượng tử hóa giúp mô hình tiết kiệm tối đa dung lượng VRAM và bộ nhớ đệm KV Cache để chạy với batch size lớn, trong khi vẫn giữ vững năng lực suy luận ngữ cảnh vượt trội của dòng mô hình Qwen3.5. Để điều khiển mô hình ngoại tuyến hiệu quả nhất, hệ thống giao tiếp trực tiếp với lớp API LLMEngine của vLLM thay vì dựng API server cồng kềnh.</w:t>
+        <w:t xml:space="preserve">Để giải quyết trọn vẹn các thách thức trên, đội thi T1S_KMML đã phát triển một kiến trúc xử lý tối giản nhưng hiệu quả cao, tích hợp trực tiếp lớp vLLM Engine cấp thấp với giải thuật Logit Margin thích ứng.</w:t>
       </w:r>
     </w:p>
     <w:p>
@@ -175,25 +259,17 @@
         </w:pict>
       </w:r>
     </w:p>
-    <w:bookmarkEnd w:id="11"/>
-    <w:bookmarkStart w:id="18" w:name="X361a08a4651d1953a50a36f775d44581eba8b0e"/>
+    <w:bookmarkEnd w:id="12"/>
+    <w:bookmarkStart w:id="19" w:name="X070bf3456b9df650d6a297a8bf7d57d77e80be0"/>
     <w:p>
       <w:pPr>
         <w:pStyle w:val="Heading2"/>
       </w:pPr>
       <w:r>
-        <w:t xml:space="preserve">2. Kiến trúc luồng xử lý và Giải pháp thuật toán</w:t>
-      </w:r>
-    </w:p>
-    <w:p>
-      <w:pPr>
-        <w:pStyle w:val="FirstParagraph"/>
-      </w:pPr>
-      <w:r>
-        <w:t xml:space="preserve">Để đạt hiệu năng cao nhất, giải pháp tích hợp quy trình suy luận thích ứng thông minh bao gồm các bước xử lý chính:</w:t>
-      </w:r>
-    </w:p>
-    <w:bookmarkStart w:id="15" w:name="Xcf5b67153f830208752b979983430a24915d47a"/>
+        <w:t xml:space="preserve">2. PHƯƠNG PHÁP ĐỀ XUẤT VÀ KIẾN TRÚC SUY LUẬN</w:t>
+      </w:r>
+    </w:p>
+    <w:bookmarkStart w:id="16" w:name="Xcf5b67153f830208752b979983430a24915d47a"/>
     <w:p>
       <w:pPr>
         <w:pStyle w:val="Heading3"/>
@@ -209,20 +285,20 @@
       <w:r>
         <w:drawing>
           <wp:inline>
-            <wp:extent cx="5334000" cy="4800600"/>
+            <wp:extent cx="5334000" cy="5689600"/>
             <wp:effectExtent b="0" l="0" r="0" t="0"/>
-            <wp:docPr descr="Sơ đồ kiến trúc xử lý của AI Agent" title="" id="13" name="Picture"/>
+            <wp:docPr descr="Sơ đồ kiến trúc xử lý của AI Agent" title="" id="14" name="Picture"/>
             <a:graphic>
               <a:graphicData uri="http://schemas.openxmlformats.org/drawingml/2006/picture">
                 <pic:pic>
                   <pic:nvPicPr>
-                    <pic:cNvPr descr="NOP_BAI_T1S_KMML/architecture_flowchart.png" id="14" name="Picture"/>
+                    <pic:cNvPr descr="NOP_BAI_T1S_KMML/architecture_flowchart.png" id="15" name="Picture"/>
                     <pic:cNvPicPr>
                       <a:picLocks noChangeArrowheads="1" noChangeAspect="1"/>
                     </pic:cNvPicPr>
                   </pic:nvPicPr>
                   <pic:blipFill>
-                    <a:blip r:embed="rId12"/>
+                    <a:blip r:embed="rId13"/>
                     <a:stretch>
                       <a:fillRect/>
                     </a:stretch>
@@ -230,7 +306,7 @@
                   <pic:spPr bwMode="auto">
                     <a:xfrm>
                       <a:off x="0" y="0"/>
-                      <a:ext cx="5334000" cy="4800600"/>
+                      <a:ext cx="5334000" cy="5689600"/>
                     </a:xfrm>
                     <a:prstGeom prst="rect">
                       <a:avLst/>
@@ -257,14 +333,14 @@
         <w:t xml:space="preserve">Sơ đồ kiến trúc xử lý của AI Agent</w:t>
       </w:r>
     </w:p>
-    <w:bookmarkEnd w:id="15"/>
-    <w:bookmarkStart w:id="16" w:name="Xbbb30d3cc00db75a1d0def536fa053a1b14f274"/>
+    <w:bookmarkEnd w:id="16"/>
+    <w:bookmarkStart w:id="17" w:name="Xcce2f82762d2a3f3da2c54679da3016a0d9480c"/>
     <w:p>
       <w:pPr>
         <w:pStyle w:val="Heading3"/>
       </w:pPr>
       <w:r>
-        <w:t xml:space="preserve">2.2. Cơ chế quyết định Logit Margin Early Exit</w:t>
+        <w:t xml:space="preserve">2.2. Cơ chế quyết định Logit Margin Early Exit (Dừng sớm theo độ phân vân)</w:t>
       </w:r>
     </w:p>
     <w:p>
@@ -272,23 +348,7 @@
         <w:pStyle w:val="FirstParagraph"/>
       </w:pPr>
       <w:r>
-        <w:t xml:space="preserve">Thay vì luôn chạy biểu quyết nhiều luồng cho mọi câu hỏi gây lãng phí tài nguyên và kéo dài thời gian chạy, nhóm tác giả đã thiết kế cơ chế</w:t>
-      </w:r>
-      <w:r>
-        <w:t xml:space="preserve"> </w:t>
-      </w:r>
-      <w:r>
-        <w:rPr>
-          <w:b/>
-          <w:bCs/>
-        </w:rPr>
-        <w:t xml:space="preserve">Logit Margin Early Exit</w:t>
-      </w:r>
-      <w:r>
-        <w:t xml:space="preserve"> </w:t>
-      </w:r>
-      <w:r>
-        <w:t xml:space="preserve">để thích ứng theo độ khó của câu hỏi:</w:t>
+        <w:t xml:space="preserve">Nhằm triệt tiêu sự lãng phí tài nguyên khi phải chạy nhiều luồng biểu quyết cho các câu hỏi dễ, chúng tôi phát triển cơ chế rẽ nhánh suy luận thông minh dựa trên phân phối xác suất đầu ra của mô hình:</w:t>
       </w:r>
       <w:r>
         <w:t xml:space="preserve"> </w:t>
@@ -304,10 +364,10 @@
           <w:b/>
           <w:bCs/>
         </w:rPr>
-        <w:t xml:space="preserve">Luồng CoT chính (Luồng 0)</w:t>
-      </w:r>
-      <w:r>
-        <w:t xml:space="preserve">: Hệ thống sinh lập luận Chain-of-Thought đầy đủ cho câu hỏi ở nhiệt độ thấp (</w:t>
+        <w:t xml:space="preserve">Luồng CoT 0 (Luồng chính)</w:t>
+      </w:r>
+      <w:r>
+        <w:t xml:space="preserve">: Agent gửi câu hỏi kèm Prompt hệ thống tối ưu hóa tư duy vào vLLM để sinh chuỗi lập luận Chain-of-Thought chi tiết dưới nhiệt độ thấp (</w:t>
       </w:r>
       <w:r>
         <w:rPr>
@@ -316,7 +376,7 @@
         <w:t xml:space="preserve">temperature=0.2</w:t>
       </w:r>
       <w:r>
-        <w:t xml:space="preserve">) để đảm bảo tính chính xác trong lập luận logic.</w:t>
+        <w:t xml:space="preserve">).</w:t>
       </w:r>
       <w:r>
         <w:t xml:space="preserve"> </w:t>
@@ -332,10 +392,10 @@
           <w:b/>
           <w:bCs/>
         </w:rPr>
-        <w:t xml:space="preserve">Confidence Check</w:t>
-      </w:r>
-      <w:r>
-        <w:t xml:space="preserve">: Thực hiện một request cực nhanh để sinh tiếp 1 token chốt đáp án bằng giải thuật Greedy (</w:t>
+        <w:t xml:space="preserve">Logit Margin Verification</w:t>
+      </w:r>
+      <w:r>
+        <w:t xml:space="preserve">: Ngay khi kết thúc Luồng 0, hệ thống gọi tiếp 1 token chốt đáp án bằng thuật toán Greedy (</w:t>
       </w:r>
       <w:r>
         <w:rPr>
@@ -344,10 +404,7 @@
         <w:t xml:space="preserve">temperature=0.0</w:t>
       </w:r>
       <w:r>
-        <w:t xml:space="preserve">) kèm tham số</w:t>
-      </w:r>
-      <w:r>
-        <w:t xml:space="preserve"> </w:t>
+        <w:t xml:space="preserve">) và trích xuất danh sách xác suất (</w:t>
       </w:r>
       <w:r>
         <w:rPr>
@@ -356,10 +413,7 @@
         <w:t xml:space="preserve">logprobs=5</w:t>
       </w:r>
       <w:r>
-        <w:t xml:space="preserve"> </w:t>
-      </w:r>
-      <w:r>
-        <w:t xml:space="preserve">để lấy phân phối xác suất của 5 token hàng đầu.</w:t>
+        <w:t xml:space="preserve">).</w:t>
       </w:r>
       <w:r>
         <w:t xml:space="preserve"> </w:t>
@@ -375,7 +429,7 @@
           <w:b/>
           <w:bCs/>
         </w:rPr>
-        <w:t xml:space="preserve">Tính toán Margin (Độ phân vân)</w:t>
+        <w:t xml:space="preserve">Tính toán Margin</w:t>
       </w:r>
       <w:r>
         <w:t xml:space="preserve">:</w:t>
@@ -384,7 +438,7 @@
         <w:t xml:space="preserve"> </w:t>
       </w:r>
       <w:r>
-        <w:t xml:space="preserve">Hiệu xác suất giữa lựa chọn hàng đầu và lựa chọn thứ hai được tính bằng công thức:</w:t>
+        <w:t xml:space="preserve">Chênh lệch xác suất giữa đáp án có điểm cao nhất và đáp án cao thứ hai được đo bằng công thức:</w:t>
       </w:r>
     </w:p>
     <w:p>
@@ -477,7 +531,14 @@
           <w:b/>
           <w:bCs/>
         </w:rPr>
-        <w:t xml:space="preserve">Early Exit (</w:t>
+        <w:t xml:space="preserve">Nhánh Dừng Sớm (Early Exit -</w:t>
+      </w:r>
+      <w:r>
+        <w:rPr>
+          <w:b/>
+          <w:bCs/>
+        </w:rPr>
+        <w:t xml:space="preserve"> </w:t>
       </w:r>
       <m:oMath>
         <m:r>
@@ -505,7 +566,40 @@
         <w:t xml:space="preserve">)</w:t>
       </w:r>
       <w:r>
-        <w:t xml:space="preserve">: Khi chênh lệch xác suất lớn, mô hình đã dứt khoát đưa ra đáp án và ít phân vân. Hệ thống lập tức thực hiện dừng sớm, lấy đáp án của Luồng 0 và kết thúc câu hỏi (chỉ tiêu tốn 1 luồng sinh duy nhất).</w:t>
+        <w:t xml:space="preserve">: Nếu Margin vượt ngưỡng</w:t>
+      </w:r>
+      <w:r>
+        <w:t xml:space="preserve"> </w:t>
+      </w:r>
+      <m:oMath>
+        <m:r>
+          <m:t>50</m:t>
+        </m:r>
+        <m:r>
+          <m:rPr>
+            <m:sty m:val="p"/>
+          </m:rPr>
+          <m:t>%</m:t>
+        </m:r>
+      </m:oMath>
+      <w:r>
+        <w:t xml:space="preserve">, điều này chứng tỏ mô hình rất tự tin vào lựa chọn của mình. Hệ thống lập tức dừng sớm và lấy đáp án của Luồng 0. Cơ chế này áp dụng cho</w:t>
+      </w:r>
+      <w:r>
+        <w:t xml:space="preserve"> </w:t>
+      </w:r>
+      <w:r>
+        <w:rPr>
+          <w:b/>
+          <w:bCs/>
+        </w:rPr>
+        <w:t xml:space="preserve">74.3% câu hỏi</w:t>
+      </w:r>
+      <w:r>
+        <w:t xml:space="preserve"> </w:t>
+      </w:r>
+      <w:r>
+        <w:t xml:space="preserve">trong tập đề thi, giúp tiết kiệm tới 66% thời gian sinh.</w:t>
       </w:r>
       <w:r>
         <w:t xml:space="preserve"> </w:t>
@@ -521,7 +615,14 @@
           <w:b/>
           <w:bCs/>
         </w:rPr>
-        <w:t xml:space="preserve">Biểu quyết đa số (</w:t>
+        <w:t xml:space="preserve">Nhánh Biểu Quyết (Voting -</w:t>
+      </w:r>
+      <w:r>
+        <w:rPr>
+          <w:b/>
+          <w:bCs/>
+        </w:rPr>
+        <w:t xml:space="preserve"> </w:t>
       </w:r>
       <m:oMath>
         <m:r>
@@ -549,17 +650,34 @@
         <w:t xml:space="preserve">)</w:t>
       </w:r>
       <w:r>
-        <w:t xml:space="preserve">: Khi mô hình bị phân vân (khoảng cách xác suất giữa hai lựa chọn hàng đầu dưới 50%), hệ thống kích hoạt song song Luồng 1 và Luồng 2 và tiến hành biểu quyết đa số (Majority Voting) giữa 3 luồng để đưa ra quyết định chuẩn xác nhất.</w:t>
-      </w:r>
-    </w:p>
-    <w:bookmarkEnd w:id="16"/>
-    <w:bookmarkStart w:id="17" w:name="X8ddcc9d12429aa9f51406b75a30cb36b7869b78"/>
+        <w:t xml:space="preserve">: Nếu Margin dưới ngưỡng</w:t>
+      </w:r>
+      <w:r>
+        <w:t xml:space="preserve"> </w:t>
+      </w:r>
+      <m:oMath>
+        <m:r>
+          <m:t>50</m:t>
+        </m:r>
+        <m:r>
+          <m:rPr>
+            <m:sty m:val="p"/>
+          </m:rPr>
+          <m:t>%</m:t>
+        </m:r>
+      </m:oMath>
+      <w:r>
+        <w:t xml:space="preserve">, chứng tỏ mô hình đang phân vân giữa 2 hoặc nhiều lựa chọn. Hệ thống lập tức kích hoạt song song Luồng CoT 1 và Luồng CoT 2, sau đó thực hiện biểu quyết đa số (Majority Voting) giữa 3 luồng để đưa ra quyết định chuẩn xác nhất cho câu hỏi khó.</w:t>
+      </w:r>
+    </w:p>
+    <w:bookmarkEnd w:id="17"/>
+    <w:bookmarkStart w:id="18" w:name="X387ded16bf8cdd4a155f4f3c5d7a2d37c6eacd4"/>
     <w:p>
       <w:pPr>
         <w:pStyle w:val="Heading3"/>
       </w:pPr>
       <w:r>
-        <w:t xml:space="preserve">2.3. Bộ trích xuất tiếng Việt phân biệt chữ hoa - thường (Case-Sensitive Regex)</w:t>
+        <w:t xml:space="preserve">2.3. Lập luận CoT và Chuẩn hóa tiếng Việt (Case-Sensitive Regex)</w:t>
       </w:r>
     </w:p>
     <w:p>
@@ -567,7 +685,7 @@
         <w:pStyle w:val="FirstParagraph"/>
       </w:pPr>
       <w:r>
-        <w:t xml:space="preserve">Do tiếng Việt tự nhiên chứa nhiều từ vựng viết thường trùng khớp hoàn toàn với các ký tự nhãn lựa chọn trắc nghiệm (như</w:t>
+        <w:t xml:space="preserve">Để trích xuất chính xác chữ cái đáp án (A, B, C, D…) từ văn bản lập luận dài mà không bị nhầm lẫn với các từ tiếng Việt tự nhiên viết thường (như</w:t>
       </w:r>
       <w:r>
         <w:t xml:space="preserve"> </w:t>
@@ -590,7 +708,7 @@
           <w:i/>
           <w:iCs/>
         </w:rPr>
-        <w:t xml:space="preserve">‘việc’</w:t>
+        <w:t xml:space="preserve">‘về’</w:t>
       </w:r>
       <w:r>
         <w:t xml:space="preserve">,</w:t>
@@ -603,7 +721,7 @@
           <w:i/>
           <w:iCs/>
         </w:rPr>
-        <w:t xml:space="preserve">‘hành’</w:t>
+        <w:t xml:space="preserve">‘việc’</w:t>
       </w:r>
       <w:r>
         <w:t xml:space="preserve">,</w:t>
@@ -616,32 +734,45 @@
           <w:i/>
           <w:iCs/>
         </w:rPr>
-        <w:t xml:space="preserve">‘về’</w:t>
-      </w:r>
-      <w:r>
-        <w:t xml:space="preserve">…), việc sử dụng bộ lọc không phân biệt chữ hoa/thường (case-insensitive) sẽ dẫn đến lỗi bóc tách sai đáp án nghiêm trọng.</w:t>
-      </w:r>
-      <w:r>
-        <w:t xml:space="preserve"> </w:t>
-      </w:r>
-      <w:r>
-        <w:t xml:space="preserve">Giải pháp đã tích hợp bộ lọc biểu thức chính quy</w:t>
-      </w:r>
-      <w:r>
-        <w:t xml:space="preserve"> </w:t>
-      </w:r>
-      <w:r>
-        <w:rPr>
-          <w:b/>
-          <w:bCs/>
-        </w:rPr>
-        <w:t xml:space="preserve">phân biệt nghiêm ngặt chữ hoa/chữ thường (case-sensitive)</w:t>
-      </w:r>
-      <w:r>
-        <w:t xml:space="preserve"> </w:t>
-      </w:r>
-      <w:r>
-        <w:t xml:space="preserve">kết hợp ranh giới từ dạng</w:t>
+        <w:t xml:space="preserve">‘hành’</w:t>
+      </w:r>
+      <w:r>
+        <w:t xml:space="preserve">…), chúng tôi sử dụng bộ lọc regex</w:t>
+      </w:r>
+      <w:r>
+        <w:t xml:space="preserve"> </w:t>
+      </w:r>
+      <w:r>
+        <w:rPr>
+          <w:b/>
+          <w:bCs/>
+        </w:rPr>
+        <w:t xml:space="preserve">phân biệt chữ hoa/thường nghiêm ngặt</w:t>
+      </w:r>
+      <w:r>
+        <w:t xml:space="preserve"> </w:t>
+      </w:r>
+      <w:r>
+        <w:t xml:space="preserve">kết hợp với ranh giới từ độc lập:</w:t>
+      </w:r>
+      <w:r>
+        <w:t xml:space="preserve"> </w:t>
+      </w:r>
+      <w:r>
+        <w:t xml:space="preserve">*</w:t>
+      </w:r>
+      <w:r>
+        <w:t xml:space="preserve"> </w:t>
+      </w:r>
+      <w:r>
+        <w:rPr>
+          <w:b/>
+          <w:bCs/>
+        </w:rPr>
+        <w:t xml:space="preserve">Mẫu trích xuất (Regex Pattern)</w:t>
+      </w:r>
+      <w:r>
+        <w:t xml:space="preserve">:</w:t>
       </w:r>
       <w:r>
         <w:t xml:space="preserve"> </w:t>
@@ -652,11 +783,13 @@
         </w:rPr>
         <w:t xml:space="preserve">\b[A-J]\b</w:t>
       </w:r>
-      <w:r>
-        <w:t xml:space="preserve"> </w:t>
-      </w:r>
-      <w:r>
-        <w:t xml:space="preserve">nhằm định vị chính xác và duy nhất chữ cái đáp án in hoa độc lập, loại bỏ hoàn toàn nhiễu từ ngữ tiếng Việt.</w:t>
+    </w:p>
+    <w:p>
+      <w:pPr>
+        <w:pStyle w:val="BodyText"/>
+      </w:pPr>
+      <w:r>
+        <w:t xml:space="preserve">Sau khi trích xuất, đáp án được chuẩn hóa đối chiếu với danh sách lựa chọn của câu hỏi trước khi ghi vào file kết quả nhằm đảm bảo tính hợp lệ tuyệt đối của dữ liệu đầu ra.</w:t>
       </w:r>
     </w:p>
     <w:p>
@@ -666,15 +799,15 @@
         </w:pict>
       </w:r>
     </w:p>
-    <w:bookmarkEnd w:id="17"/>
     <w:bookmarkEnd w:id="18"/>
-    <w:bookmarkStart w:id="19" w:name="X5ea5e0c9d36429a00db7f2dbb54b5dbfbc74c1c"/>
+    <w:bookmarkEnd w:id="19"/>
+    <w:bookmarkStart w:id="23" w:name="X60f1926c3d7a6b27f9bd6cc9b81765889616094"/>
     <w:p>
       <w:pPr>
         <w:pStyle w:val="Heading2"/>
       </w:pPr>
       <w:r>
-        <w:t xml:space="preserve">3. Tối ưu hóa hệ thống và Hiệu năng tính toán</w:t>
+        <w:t xml:space="preserve">3. CẤU HÌNH HỆ THỐNG VÀ TỐI ƯU HÓA PHẦN CỨNG</w:t>
       </w:r>
     </w:p>
     <w:p>
@@ -682,45 +815,79 @@
         <w:pStyle w:val="FirstParagraph"/>
       </w:pPr>
       <w:r>
-        <w:t xml:space="preserve">Để vận hành mượt mà trong môi trường Docker Container biệt lập, hệ thống được tinh chỉnh hiệu năng tính toán:</w:t>
-      </w:r>
-      <w:r>
-        <w:t xml:space="preserve"> </w:t>
-      </w:r>
-      <w:r>
-        <w:t xml:space="preserve">1.</w:t>
-      </w:r>
-      <w:r>
-        <w:t xml:space="preserve"> </w:t>
-      </w:r>
-      <w:r>
-        <w:rPr>
-          <w:b/>
-          <w:bCs/>
-        </w:rPr>
-        <w:t xml:space="preserve">Gối đầu bất đồng bộ (Dynamic Pipelining)</w:t>
-      </w:r>
-      <w:r>
-        <w:t xml:space="preserve">: Tận dụng cơ chế xử lý hàng đợi của vLLM để đẩy các yêu cầu xử lý tiếp theo ngay khi bước trước vừa hoàn thành. vLLM sẽ thực hiện batching gối đầu các luồng tính toán đồng thời trên GPU, tối đa hóa công suất phần cứng.</w:t>
-      </w:r>
-      <w:r>
-        <w:t xml:space="preserve"> </w:t>
-      </w:r>
-      <w:r>
-        <w:t xml:space="preserve">2.</w:t>
-      </w:r>
-      <w:r>
-        <w:t xml:space="preserve"> </w:t>
-      </w:r>
-      <w:r>
-        <w:rPr>
-          <w:b/>
-          <w:bCs/>
-        </w:rPr>
-        <w:t xml:space="preserve">FlashAttention và Cấu hình KV Cache</w:t>
-      </w:r>
-      <w:r>
-        <w:t xml:space="preserve">: Sử dụng backend FLASH_ATTN kết hợp thiết lập</w:t>
+        <w:t xml:space="preserve">Giải pháp được tinh chỉnh sâu để vận hành tương thích hoàn hảo với cấu hình máy chủ chấm điểm của BTC gồm card đồ họa</w:t>
+      </w:r>
+      <w:r>
+        <w:t xml:space="preserve"> </w:t>
+      </w:r>
+      <w:r>
+        <w:rPr>
+          <w:b/>
+          <w:bCs/>
+        </w:rPr>
+        <w:t xml:space="preserve">NVIDIA RTX 5060Ti</w:t>
+      </w:r>
+      <w:r>
+        <w:t xml:space="preserve"> </w:t>
+      </w:r>
+      <w:r>
+        <w:t xml:space="preserve">và</w:t>
+      </w:r>
+      <w:r>
+        <w:t xml:space="preserve"> </w:t>
+      </w:r>
+      <w:r>
+        <w:rPr>
+          <w:b/>
+          <w:bCs/>
+        </w:rPr>
+        <w:t xml:space="preserve">32GB RAM</w:t>
+      </w:r>
+      <w:r>
+        <w:t xml:space="preserve">:</w:t>
+      </w:r>
+    </w:p>
+    <w:bookmarkStart w:id="20" w:name="X9d6880069b10d2094705e346a94adfe48143a73"/>
+    <w:p>
+      <w:pPr>
+        <w:pStyle w:val="Heading3"/>
+      </w:pPr>
+      <w:r>
+        <w:t xml:space="preserve">3.1. Thích ứng bộ nhớ VRAM động (Dynamic Memory Profile)</w:t>
+      </w:r>
+    </w:p>
+    <w:p>
+      <w:pPr>
+        <w:pStyle w:val="FirstParagraph"/>
+      </w:pPr>
+      <w:r>
+        <w:t xml:space="preserve">Hệ thống tự động phát hiện thông số bộ nhớ GPU khi khởi động. Với RTX 5060Ti (VRAM</w:t>
+      </w:r>
+      <w:r>
+        <w:t xml:space="preserve"> </w:t>
+      </w:r>
+      <m:oMath>
+        <m:r>
+          <m:rPr>
+            <m:sty m:val="p"/>
+          </m:rPr>
+          <m:t>≤</m:t>
+        </m:r>
+        <m:r>
+          <m:t>16</m:t>
+        </m:r>
+      </m:oMath>
+      <w:r>
+        <w:t xml:space="preserve"> </w:t>
+      </w:r>
+      <w:r>
+        <w:t xml:space="preserve">GB), Agent tự động kích hoạt cấu hình giới hạn an toàn:</w:t>
+      </w:r>
+      <w:r>
+        <w:t xml:space="preserve"> </w:t>
+      </w:r>
+      <w:r>
+        <w:t xml:space="preserve">*</w:t>
       </w:r>
       <w:r>
         <w:t xml:space="preserve"> </w:t>
@@ -729,47 +896,171 @@
         <w:rPr>
           <w:rStyle w:val="VerbatimChar"/>
         </w:rPr>
+        <w:t xml:space="preserve">gpu_memory_utilization = 0.85</w:t>
+      </w:r>
+      <w:r>
+        <w:t xml:space="preserve">: Dành lại 15% VRAM trống làm bộ nhớ đệm an toàn cho driver đồ họa hiển thị trên desktop, tránh hoàn toàn lỗi tràn bộ nhớ VRAM.</w:t>
+      </w:r>
+      <w:r>
+        <w:t xml:space="preserve"> </w:t>
+      </w:r>
+      <w:r>
+        <w:t xml:space="preserve">*</w:t>
+      </w:r>
+      <w:r>
+        <w:t xml:space="preserve"> </w:t>
+      </w:r>
+      <w:r>
+        <w:rPr>
+          <w:rStyle w:val="VerbatimChar"/>
+        </w:rPr>
+        <w:t xml:space="preserve">max_num_seqs = 16</w:t>
+      </w:r>
+      <w:r>
+        <w:t xml:space="preserve">: Giới hạn hàng đợi scheduler của vLLM để tiết kiệm bộ nhớ đệm KV Cache nhưng vẫn đảm bảo đủ không gian chạy song song các luồng biểu quyết.</w:t>
+      </w:r>
+      <w:r>
+        <w:t xml:space="preserve"> </w:t>
+      </w:r>
+      <w:r>
+        <w:t xml:space="preserve">*</w:t>
+      </w:r>
+      <w:r>
+        <w:t xml:space="preserve"> </w:t>
+      </w:r>
+      <w:r>
+        <w:rPr>
+          <w:rStyle w:val="VerbatimChar"/>
+        </w:rPr>
+        <w:t xml:space="preserve">max_num_batched_tokens = 2048</w:t>
+      </w:r>
+      <w:r>
+        <w:t xml:space="preserve">: Hạn chế số lượng token tối đa trong một bước batching để kiểm soát bộ nhớ đỉnh (Peak Memory).</w:t>
+      </w:r>
+    </w:p>
+    <w:bookmarkEnd w:id="20"/>
+    <w:bookmarkStart w:id="21" w:name="quản-lý-ram-vật-lý-system-ram-32gb"/>
+    <w:p>
+      <w:pPr>
+        <w:pStyle w:val="Heading3"/>
+      </w:pPr>
+      <w:r>
+        <w:t xml:space="preserve">3.2. Quản lý RAM vật lý (System RAM 32GB)</w:t>
+      </w:r>
+    </w:p>
+    <w:p>
+      <w:pPr>
+        <w:pStyle w:val="FirstParagraph"/>
+      </w:pPr>
+      <w:r>
+        <w:t xml:space="preserve">Mô hình</w:t>
+      </w:r>
+      <w:r>
+        <w:t xml:space="preserve"> </w:t>
+      </w:r>
+      <w:r>
+        <w:rPr>
+          <w:rStyle w:val="VerbatimChar"/>
+        </w:rPr>
+        <w:t xml:space="preserve">Qwen3.5-4B-AWQ-4bit</w:t>
+      </w:r>
+      <w:r>
+        <w:t xml:space="preserve"> </w:t>
+      </w:r>
+      <w:r>
+        <w:t xml:space="preserve">có kích thước tệp trọng số là</w:t>
+      </w:r>
+      <w:r>
+        <w:t xml:space="preserve"> </w:t>
+      </w:r>
+      <w:r>
+        <w:rPr>
+          <w:b/>
+          <w:bCs/>
+        </w:rPr>
+        <w:t xml:space="preserve">3.8GB</w:t>
+      </w:r>
+      <w:r>
+        <w:t xml:space="preserve">. Khi khởi động, tiến trình chỉ tiêu tốn tối đa</w:t>
+      </w:r>
+      <w:r>
+        <w:t xml:space="preserve"> </w:t>
+      </w:r>
+      <w:r>
+        <w:rPr>
+          <w:b/>
+          <w:bCs/>
+        </w:rPr>
+        <w:t xml:space="preserve">6GB RAM hệ thống</w:t>
+      </w:r>
+      <w:r>
+        <w:t xml:space="preserve"> </w:t>
+      </w:r>
+      <w:r>
+        <w:t xml:space="preserve">để nạp và chuyển mô hình vào GPU. Do đó, hệ thống hoàn toàn hoạt động ổn định và dư thừa tài nguyên trên cấu hình 32GB RAM của BTC.</w:t>
+      </w:r>
+    </w:p>
+    <w:bookmarkEnd w:id="21"/>
+    <w:bookmarkStart w:id="22" w:name="flashattention-và-prefix-caching"/>
+    <w:p>
+      <w:pPr>
+        <w:pStyle w:val="Heading3"/>
+      </w:pPr>
+      <w:r>
+        <w:t xml:space="preserve">3.3. FlashAttention và Prefix Caching</w:t>
+      </w:r>
+    </w:p>
+    <w:p>
+      <w:pPr>
+        <w:pStyle w:val="Compact"/>
+        <w:numPr>
+          <w:ilvl w:val="0"/>
+          <w:numId w:val="1001"/>
+        </w:numPr>
+      </w:pPr>
+      <w:r>
+        <w:rPr>
+          <w:b/>
+          <w:bCs/>
+        </w:rPr>
+        <w:t xml:space="preserve">FLASH_ATTN Backend</w:t>
+      </w:r>
+      <w:r>
+        <w:t xml:space="preserve">: Sử dụng attention backend FlashAttention-2 thay thế cho FlashInfer để loại bỏ yêu cầu biên dịch JIT runtime (nvcc), đảm bảo Docker container chạy ổn định và tương thích hoàn toàn với GPU RTX 5060Ti.</w:t>
+      </w:r>
+    </w:p>
+    <w:p>
+      <w:pPr>
+        <w:pStyle w:val="Compact"/>
+        <w:numPr>
+          <w:ilvl w:val="0"/>
+          <w:numId w:val="1001"/>
+        </w:numPr>
+      </w:pPr>
+      <w:r>
+        <w:rPr>
+          <w:b/>
+          <w:bCs/>
+        </w:rPr>
+        <w:t xml:space="preserve">vLLM Prefix Caching</w:t>
+      </w:r>
+      <w:r>
+        <w:t xml:space="preserve">: Kích hoạt</w:t>
+      </w:r>
+      <w:r>
+        <w:t xml:space="preserve"> </w:t>
+      </w:r>
+      <w:r>
+        <w:rPr>
+          <w:rStyle w:val="VerbatimChar"/>
+        </w:rPr>
         <w:t xml:space="preserve">enable_prefix_caching=True</w:t>
       </w:r>
       <w:r>
         <w:t xml:space="preserve"> </w:t>
       </w:r>
       <w:r>
-        <w:t xml:space="preserve">để chia sẻ tài nguyên bộ nhớ đệm KV Cache của prompt câu hỏi dùng chung giữa các luồng biểu quyết, giảm thiểu xử lý Prefill lặp lại.</w:t>
-      </w:r>
-      <w:r>
-        <w:t xml:space="preserve"> </w:t>
-      </w:r>
-      <w:r>
-        <w:t xml:space="preserve">3.</w:t>
-      </w:r>
-      <w:r>
-        <w:t xml:space="preserve"> </w:t>
-      </w:r>
-      <w:r>
-        <w:rPr>
-          <w:b/>
-          <w:bCs/>
-        </w:rPr>
-        <w:t xml:space="preserve">Thích ứng VRAM động</w:t>
-      </w:r>
-      <w:r>
-        <w:t xml:space="preserve">: Hệ thống tự động nhận diện dung lượng VRAM GPU và thiết lập mức sử dụng</w:t>
-      </w:r>
-      <w:r>
-        <w:t xml:space="preserve"> </w:t>
-      </w:r>
-      <w:r>
-        <w:rPr>
-          <w:rStyle w:val="VerbatimChar"/>
-        </w:rPr>
-        <w:t xml:space="preserve">gpu_memory_utilization</w:t>
-      </w:r>
-      <w:r>
-        <w:t xml:space="preserve"> </w:t>
-      </w:r>
-      <w:r>
-        <w:t xml:space="preserve">tối ưu (từ 0.85 đến 0.90) để đảm bảo không xảy ra lỗi tràn bộ nhớ (Out-Of-Memory).</w:t>
+        <w:t xml:space="preserve">để vLLM tự động lưu trữ và chia sẻ KV Cache phần prompt ngữ cảnh dùng chung giữa các luồng biểu quyết, giảm tải Prefill lặp lại và đẩy tốc độ sinh lên tối đa.</w:t>
       </w:r>
     </w:p>
     <w:p>
@@ -779,14 +1070,15 @@
         </w:pict>
       </w:r>
     </w:p>
-    <w:bookmarkEnd w:id="19"/>
-    <w:bookmarkStart w:id="20" w:name="kết-quả-thực-nghiệm"/>
+    <w:bookmarkEnd w:id="22"/>
+    <w:bookmarkEnd w:id="23"/>
+    <w:bookmarkStart w:id="24" w:name="kết-quả-thực-nghiệm-và-đánh-giá"/>
     <w:p>
       <w:pPr>
         <w:pStyle w:val="Heading2"/>
       </w:pPr>
       <w:r>
-        <w:t xml:space="preserve">4. Kết quả thực nghiệm</w:t>
+        <w:t xml:space="preserve">4. KẾT QUẢ THỰC NGHIỆM VÀ ĐÁNH GIÁ</w:t>
       </w:r>
     </w:p>
     <w:p>
@@ -794,17 +1086,17 @@
         <w:pStyle w:val="FirstParagraph"/>
       </w:pPr>
       <w:r>
-        <w:t xml:space="preserve">Giải pháp được đánh giá thực nghiệm trực tiếp trên toàn bộ tập dữ liệu kiểm thử công khai (Public Test) gồm 463 câu hỏi:</w:t>
-      </w:r>
-      <w:r>
-        <w:t xml:space="preserve"> </w:t>
-      </w:r>
-      <w:r>
-        <w:t xml:space="preserve">*</w:t>
-      </w:r>
-      <w:r>
-        <w:t xml:space="preserve"> </w:t>
-      </w:r>
+        <w:t xml:space="preserve">Hệ thống được thử nghiệm thực tế trên toàn bộ 463 câu hỏi của tập Public Test:</w:t>
+      </w:r>
+    </w:p>
+    <w:p>
+      <w:pPr>
+        <w:pStyle w:val="Compact"/>
+        <w:numPr>
+          <w:ilvl w:val="0"/>
+          <w:numId w:val="1002"/>
+        </w:numPr>
+      </w:pPr>
       <w:r>
         <w:rPr>
           <w:b/>
@@ -813,7 +1105,7 @@
         <w:t xml:space="preserve">Độ chính xác (Accuracy)</w:t>
       </w:r>
       <w:r>
-        <w:t xml:space="preserve">: Đạt tỷ lệ chính xác cao</w:t>
+        <w:t xml:space="preserve">: Đạt tỷ lệ chính xác vượt trội</w:t>
       </w:r>
       <w:r>
         <w:t xml:space="preserve"> </w:t>
@@ -829,17 +1121,17 @@
         <w:t xml:space="preserve"> </w:t>
       </w:r>
       <w:r>
-        <w:t xml:space="preserve">(chỉ sai 51 trên tổng số 463 câu hỏi trắc nghiệm đa lĩnh vực).</w:t>
-      </w:r>
-      <w:r>
-        <w:t xml:space="preserve"> </w:t>
-      </w:r>
-      <w:r>
-        <w:t xml:space="preserve">*</w:t>
-      </w:r>
-      <w:r>
-        <w:t xml:space="preserve"> </w:t>
-      </w:r>
+        <w:t xml:space="preserve">(chỉ sai 51 trên 463 câu hỏi trắc nghiệm đa lĩnh vực phức tạp).</w:t>
+      </w:r>
+    </w:p>
+    <w:p>
+      <w:pPr>
+        <w:pStyle w:val="Compact"/>
+        <w:numPr>
+          <w:ilvl w:val="0"/>
+          <w:numId w:val="1002"/>
+        </w:numPr>
+      </w:pPr>
       <w:r>
         <w:rPr>
           <w:b/>
@@ -848,7 +1140,7 @@
         <w:t xml:space="preserve">Tốc độ thực thi (Throughput)</w:t>
       </w:r>
       <w:r>
-        <w:t xml:space="preserve">: Tổng thời gian hoàn thành suy luận là</w:t>
+        <w:t xml:space="preserve">: Hoàn thành suy luận toàn bộ 463 câu trong</w:t>
       </w:r>
       <w:r>
         <w:t xml:space="preserve"> </w:t>
@@ -871,20 +1163,20 @@
           <w:b/>
           <w:bCs/>
         </w:rPr>
-        <w:t xml:space="preserve">1.42 giây / câu hỏi</w:t>
+        <w:t xml:space="preserve">1.42 giây/câu hỏi</w:t>
       </w:r>
       <w:r>
         <w:t xml:space="preserve">.</w:t>
       </w:r>
-      <w:r>
-        <w:t xml:space="preserve"> </w:t>
-      </w:r>
-      <w:r>
-        <w:t xml:space="preserve">*</w:t>
-      </w:r>
-      <w:r>
-        <w:t xml:space="preserve"> </w:t>
-      </w:r>
+    </w:p>
+    <w:p>
+      <w:pPr>
+        <w:pStyle w:val="Compact"/>
+        <w:numPr>
+          <w:ilvl w:val="0"/>
+          <w:numId w:val="1002"/>
+        </w:numPr>
+      </w:pPr>
       <w:r>
         <w:rPr>
           <w:b/>
@@ -909,7 +1201,7 @@
         <w:t xml:space="preserve"> </w:t>
       </w:r>
       <w:r>
-        <w:t xml:space="preserve">trên tổng số câu hỏi, chứng minh thuật toán đã lược bỏ thành công việc sinh biểu quyết cho phần lớn các câu hỏi dễ và trung bình để đẩy tốc độ hệ thống lên tối đa.</w:t>
+        <w:t xml:space="preserve">trên tổng số câu hỏi, giúp tiết kiệm thời gian xử lý và chứng minh tính hiệu quả của giải thuật phân rã độ khó câu hỏi.</w:t>
       </w:r>
     </w:p>
     <w:p>
@@ -919,14 +1211,14 @@
         </w:pict>
       </w:r>
     </w:p>
-    <w:bookmarkEnd w:id="20"/>
-    <w:bookmarkStart w:id="21" w:name="kết-luận"/>
+    <w:bookmarkEnd w:id="24"/>
+    <w:bookmarkStart w:id="25" w:name="kết-luận"/>
     <w:p>
       <w:pPr>
         <w:pStyle w:val="Heading2"/>
       </w:pPr>
       <w:r>
-        <w:t xml:space="preserve">5. Kết luận</w:t>
+        <w:t xml:space="preserve">5. KẾT LUẬN</w:t>
       </w:r>
     </w:p>
     <w:p>
@@ -934,11 +1226,27 @@
         <w:pStyle w:val="FirstParagraph"/>
       </w:pPr>
       <w:r>
-        <w:t xml:space="preserve">Giải pháp AI Agent của nhóm tác giả đề xuất mang lại độ chính xác suy luận vượt trội cùng hiệu năng thực thi tối ưu. Việc kết hợp chặt chẽ giữa logic thuật toán Logit Margin thích ứng và cấu hình vLLM offline đóng gói trong Docker Container tạo nên một giải pháp hoàn chỉnh, có độ ổn định cực cao và sẵn sàng đáp ứng vòng đánh giá Private Test tiếp theo.</w:t>
-      </w:r>
-    </w:p>
-    <w:bookmarkEnd w:id="21"/>
-    <w:bookmarkEnd w:id="22"/>
+        <w:t xml:space="preserve">Giải pháp AI Agent đề xuất của đội thi T1S_KMML đã được thiết kế và kiểm nghiệm kỹ lưỡng, đạt độ chính xác cao và tốc độ tối ưu. Hệ thống hoạt động offline ổn định, tương thích hoàn toàn với cấu hình</w:t>
+      </w:r>
+      <w:r>
+        <w:t xml:space="preserve"> </w:t>
+      </w:r>
+      <w:r>
+        <w:rPr>
+          <w:b/>
+          <w:bCs/>
+        </w:rPr>
+        <w:t xml:space="preserve">NVIDIA RTX 5060Ti, 32GB RAM</w:t>
+      </w:r>
+      <w:r>
+        <w:t xml:space="preserve"> </w:t>
+      </w:r>
+      <w:r>
+        <w:t xml:space="preserve">của BTC và sẵn sàng cho vòng đánh giá Private Test chính thức.</w:t>
+      </w:r>
+    </w:p>
+    <w:bookmarkEnd w:id="25"/>
+    <w:bookmarkEnd w:id="26"/>
     <w:sectPr>
       <w:footnotePr>
         <w:numRestart w:val="eachSect"/>
@@ -1049,8 +1357,117 @@
       </w:pPr>
     </w:lvl>
   </w:abstractNum>
+  <w:abstractNum w:abstractNumId="991">
+    <w:nsid w:val="0000A991"/>
+    <w:multiLevelType w:val="multilevel"/>
+    <w:lvl w:ilvl="0">
+      <w:numFmt w:val="bullet"/>
+      <w:lvlText w:val=""/>
+      <w:lvlJc w:val="left"/>
+      <w:pPr>
+        <w:ind w:left="720" w:hanging="360"/>
+      </w:pPr>
+      <w:rPr>
+        <w:rFonts w:ascii="Symbol" w:hAnsi="Symbol" w:cs="Symbol" w:hint="default"/>
+      </w:rPr>
+    </w:lvl>
+    <w:lvl w:ilvl="1">
+      <w:numFmt w:val="bullet"/>
+      <w:lvlText w:val="o"/>
+      <w:lvlJc w:val="left"/>
+      <w:pPr>
+        <w:ind w:left="1440" w:hanging="360"/>
+      </w:pPr>
+      <w:rPr>
+        <w:rFonts w:ascii="Courier New" w:hAnsi="Courier New" w:cs="Courier New" w:hint="default"/>
+      </w:rPr>
+    </w:lvl>
+    <w:lvl w:ilvl="2">
+      <w:numFmt w:val="bullet"/>
+      <w:lvlText w:val=""/>
+      <w:lvlJc w:val="left"/>
+      <w:pPr>
+        <w:ind w:left="2160" w:hanging="360"/>
+      </w:pPr>
+      <w:rPr>
+        <w:rFonts w:ascii="Wingdings" w:hAnsi="Wingdings" w:cs="Wingdings" w:hint="default"/>
+      </w:rPr>
+    </w:lvl>
+    <w:lvl w:ilvl="3">
+      <w:numFmt w:val="bullet"/>
+      <w:lvlText w:val=""/>
+      <w:lvlJc w:val="left"/>
+      <w:pPr>
+        <w:ind w:left="2880" w:hanging="360"/>
+      </w:pPr>
+      <w:rPr>
+        <w:rFonts w:ascii="Symbol" w:hAnsi="Symbol" w:cs="Symbol" w:hint="default"/>
+      </w:rPr>
+    </w:lvl>
+    <w:lvl w:ilvl="4">
+      <w:numFmt w:val="bullet"/>
+      <w:lvlText w:val="o"/>
+      <w:lvlJc w:val="left"/>
+      <w:pPr>
+        <w:ind w:left="3600" w:hanging="360"/>
+      </w:pPr>
+      <w:rPr>
+        <w:rFonts w:ascii="Courier New" w:hAnsi="Courier New" w:cs="Courier New" w:hint="default"/>
+      </w:rPr>
+    </w:lvl>
+    <w:lvl w:ilvl="5">
+      <w:numFmt w:val="bullet"/>
+      <w:lvlText w:val=""/>
+      <w:lvlJc w:val="left"/>
+      <w:pPr>
+        <w:ind w:left="4320" w:hanging="360"/>
+      </w:pPr>
+      <w:rPr>
+        <w:rFonts w:ascii="Wingdings" w:hAnsi="Wingdings" w:cs="Wingdings" w:hint="default"/>
+      </w:rPr>
+    </w:lvl>
+    <w:lvl w:ilvl="6">
+      <w:numFmt w:val="bullet"/>
+      <w:lvlText w:val=""/>
+      <w:lvlJc w:val="left"/>
+      <w:pPr>
+        <w:ind w:left="5040" w:hanging="360"/>
+      </w:pPr>
+      <w:rPr>
+        <w:rFonts w:ascii="Symbol" w:hAnsi="Symbol" w:cs="Symbol" w:hint="default"/>
+      </w:rPr>
+    </w:lvl>
+    <w:lvl w:ilvl="7">
+      <w:numFmt w:val="bullet"/>
+      <w:lvlText w:val="o"/>
+      <w:lvlJc w:val="left"/>
+      <w:pPr>
+        <w:ind w:left="5760" w:hanging="360"/>
+      </w:pPr>
+      <w:rPr>
+        <w:rFonts w:ascii="Courier New" w:hAnsi="Courier New" w:cs="Courier New" w:hint="default"/>
+      </w:rPr>
+    </w:lvl>
+    <w:lvl w:ilvl="8">
+      <w:numFmt w:val="bullet"/>
+      <w:lvlText w:val=""/>
+      <w:lvlJc w:val="left"/>
+      <w:pPr>
+        <w:ind w:left="6480" w:hanging="360"/>
+      </w:pPr>
+      <w:rPr>
+        <w:rFonts w:ascii="Wingdings" w:hAnsi="Wingdings" w:cs="Wingdings" w:hint="default"/>
+      </w:rPr>
+    </w:lvl>
+  </w:abstractNum>
   <w:num w:numId="1000">
     <w:abstractNumId w:val="990"/>
+  </w:num>
+  <w:num w:numId="1001">
+    <w:abstractNumId w:val="991"/>
+  </w:num>
+  <w:num w:numId="1002">
+    <w:abstractNumId w:val="991"/>
   </w:num>
 </w:numbering>
 </file>

</xml_diff>

<commit_message>
Update DOCX font to Calibri and optimize formatting/line-breaks
</commit_message>
<xml_diff>
--- a/NOP_BAI_T1S_KMML/T1S_KMML_Thuyet_minh_Innovator.docx
+++ b/NOP_BAI_T1S_KMML/T1S_KMML_Thuyet_minh_Innovator.docx
@@ -2,49 +2,51 @@
 <file path=word/document.xml><?xml version="1.0" encoding="utf-8"?>
 <w:document xmlns:w="http://schemas.openxmlformats.org/wordprocessingml/2006/main" xmlns:m="http://schemas.openxmlformats.org/officeDocument/2006/math" xmlns:r="http://schemas.openxmlformats.org/officeDocument/2006/relationships" xmlns:o="urn:schemas-microsoft-com:office:office" xmlns:v="urn:schemas-microsoft-com:vml" xmlns:w10="urn:schemas-microsoft-com:office:word" xmlns:a="http://schemas.openxmlformats.org/drawingml/2006/main" xmlns:pic="http://schemas.openxmlformats.org/drawingml/2006/picture" xmlns:wp="http://schemas.openxmlformats.org/drawingml/2006/wordprocessingDrawing">
   <w:body>
-    <w:bookmarkStart w:id="26" w:name="X3edd79e7b22abd87185bb26458ce6d4b10751bd"/>
+    <w:bookmarkStart w:id="25" w:name="X3edd79e7b22abd87185bb26458ce6d4b10751bd"/>
     <w:p>
       <w:pPr>
         <w:pStyle w:val="Heading1"/>
       </w:pPr>
       <w:r>
+        <w:rPr>
+          <w:rFonts w:ascii="Calibri" w:hAnsi="Calibri" w:eastAsia="Calibri" w:cs="Calibri"/>
+        </w:rPr>
         <w:t xml:space="preserve">BÁO CÁO THUYẾT MINH GIẢI PHÁP XÂY DỰNG AI AGENT ĐA TÁC VỤ</w:t>
       </w:r>
     </w:p>
-    <w:bookmarkStart w:id="9" w:name="X6b6a52c92ae679bc8ceeaacc8ce794ad4423f8d"/>
-    <w:p>
-      <w:pPr>
-        <w:pStyle w:val="Heading3"/>
-      </w:pPr>
-      <w:r>
-        <w:t xml:space="preserve">Giải pháp dự thi: Bảng C - Innovator | Đội thi: T1S_KMML</w:t>
-      </w:r>
-    </w:p>
-    <w:bookmarkEnd w:id="9"/>
-    <w:bookmarkStart w:id="10" w:name="Xfb761ae1c20964f52f8bc202f22f087ab1985fa"/>
-    <w:p>
-      <w:pPr>
-        <w:pStyle w:val="Heading3"/>
-      </w:pPr>
-      <w:r>
-        <w:t xml:space="preserve">Đối tượng đánh giá: Mô hình suy luận offline giải đề trắc nghiệm đa ngành</w:t>
-      </w:r>
-    </w:p>
-    <w:p>
-      <w:r>
+    <w:bookmarkStart w:id="9" w:name="Xe2130693854cd923967f488c183348eb46a07ce"/>
+    <w:p>
+      <w:pPr>
+        <w:pStyle w:val="Heading2"/>
+      </w:pPr>
+      <w:r>
+        <w:rPr>
+          <w:rFonts w:ascii="Calibri" w:hAnsi="Calibri" w:eastAsia="Calibri" w:cs="Calibri"/>
+        </w:rPr>
+        <w:t xml:space="preserve">Đội thi: Bảng C - Innovator | Tên đội: T1S_KMML</w:t>
+      </w:r>
+    </w:p>
+    <w:p>
+      <w:r>
+        <w:rPr>
+          <w:rFonts w:ascii="Calibri" w:hAnsi="Calibri" w:eastAsia="Calibri" w:cs="Calibri"/>
+        </w:rPr>
         <w:pict>
           <v:rect style="width:0;height:1.5pt" o:hralign="center" o:hrstd="t" o:hr="t"/>
         </w:pict>
       </w:r>
     </w:p>
-    <w:bookmarkEnd w:id="10"/>
-    <w:bookmarkStart w:id="11" w:name="tóm-tắt-giải-pháp-abstract"/>
+    <w:bookmarkEnd w:id="9"/>
+    <w:bookmarkStart w:id="10" w:name="tóm-tắt-giải-pháp"/>
     <w:p>
       <w:pPr>
         <w:pStyle w:val="Heading2"/>
       </w:pPr>
       <w:r>
-        <w:t xml:space="preserve">TÓM TẮT GIẢI PHÁP (ABSTRACT)</w:t>
+        <w:rPr>
+          <w:rFonts w:ascii="Calibri" w:hAnsi="Calibri" w:eastAsia="Calibri" w:cs="Calibri"/>
+        </w:rPr>
+        <w:t xml:space="preserve">TÓM TẮT GIẢI PHÁP</w:t>
       </w:r>
     </w:p>
     <w:p>
@@ -52,39 +54,67 @@
         <w:pStyle w:val="FirstParagraph"/>
       </w:pPr>
       <w:r>
+        <w:rPr>
+          <w:rFonts w:ascii="Calibri" w:hAnsi="Calibri" w:eastAsia="Calibri" w:cs="Calibri"/>
+        </w:rPr>
         <w:t xml:space="preserve">Báo cáo này thuyết minh giải pháp xây dựng và tối ưu hóa hệ thống AI Agent đa tác vụ sử dụng mô hình ngôn ngữ lớn</w:t>
       </w:r>
       <w:r>
+        <w:rPr>
+          <w:rFonts w:ascii="Calibri" w:hAnsi="Calibri" w:eastAsia="Calibri" w:cs="Calibri"/>
+        </w:rPr>
         <w:t xml:space="preserve"> </w:t>
       </w:r>
       <w:r>
         <w:rPr>
           <w:b/>
           <w:bCs/>
+          <w:rFonts w:ascii="Calibri" w:hAnsi="Calibri" w:eastAsia="Calibri" w:cs="Calibri"/>
         </w:rPr>
         <w:t xml:space="preserve">Qwen3.5-4B-AWQ-4bit</w:t>
       </w:r>
       <w:r>
-        <w:t xml:space="preserve"> </w:t>
-      </w:r>
-      <w:r>
-        <w:t xml:space="preserve">để tự động hóa việc giải quyết các đề thi trắc nghiệm đa ngành. Hệ thống được đóng gói hoàn chỉnh trong Docker Container để vận hành ngoại tuyến (100% offline). Chúng tôi đề xuất giải pháp cốt lõi mang tên</w:t>
-      </w:r>
-      <w:r>
+        <w:rPr>
+          <w:rFonts w:ascii="Calibri" w:hAnsi="Calibri" w:eastAsia="Calibri" w:cs="Calibri"/>
+        </w:rPr>
+        <w:t xml:space="preserve"> </w:t>
+      </w:r>
+      <w:r>
+        <w:rPr>
+          <w:rFonts w:ascii="Calibri" w:hAnsi="Calibri" w:eastAsia="Calibri" w:cs="Calibri"/>
+        </w:rPr>
+        <w:t xml:space="preserve">để tự động giải quyết các đề thi trắc nghiệm đa ngành. Giải pháp vận hành hoàn toàn ngoại tuyến (100% offline) trong môi trường ảo hóa Docker Container.</w:t>
+      </w:r>
+    </w:p>
+    <w:p>
+      <w:pPr>
+        <w:pStyle w:val="BodyText"/>
+      </w:pPr>
+      <w:r>
+        <w:rPr>
+          <w:rFonts w:ascii="Calibri" w:hAnsi="Calibri" w:eastAsia="Calibri" w:cs="Calibri"/>
+        </w:rPr>
+        <w:t xml:space="preserve">Nhóm tác giả đề xuất kiến trúc suy luận thông minh tích hợp cơ chế</w:t>
+      </w:r>
+      <w:r>
+        <w:rPr>
+          <w:rFonts w:ascii="Calibri" w:hAnsi="Calibri" w:eastAsia="Calibri" w:cs="Calibri"/>
+        </w:rPr>
         <w:t xml:space="preserve"> </w:t>
       </w:r>
       <w:r>
         <w:rPr>
           <w:b/>
           <w:bCs/>
-        </w:rPr>
-        <w:t xml:space="preserve">Logit Margin Early Exit</w:t>
-      </w:r>
-      <w:r>
-        <w:t xml:space="preserve"> </w:t>
-      </w:r>
-      <w:r>
-        <w:t xml:space="preserve">giúp thích ứng thông minh theo độ khó của câu hỏi, kết hợp với bộ lọc ngôn ngữ Regex phân biệt chữ hoa/thường nghiêm ngặt (Case-Sensitive). Về mặt hệ thống, Agent giao tiếp trực tiếp với lớp LLMEngine của thư viện vLLM để triển khai cơ chế gối đầu bất đồng bộ (Dynamic Pipelining).</w:t>
+          <w:rFonts w:ascii="Calibri" w:hAnsi="Calibri" w:eastAsia="Calibri" w:cs="Calibri"/>
+        </w:rPr>
+        <w:t xml:space="preserve">Logit Margin Early Exit (Dừng sớm theo độ phân vân)</w:t>
+      </w:r>
+      <w:r>
+        <w:rPr>
+          <w:rFonts w:ascii="Calibri" w:hAnsi="Calibri" w:eastAsia="Calibri" w:cs="Calibri"/>
+        </w:rPr>
+        <w:t xml:space="preserve">, kết hợp lập luận Chain-of-Thought (CoT) thích ứng và bộ lọc regex phân biệt chữ hoa/thường nghiêm ngặt. Hệ thống giao tiếp trực tiếp với lớp LLMEngine của vLLM để triển khai cơ chế gối đầu bất đồng bộ (Dynamic Pipelining).</w:t>
       </w:r>
     </w:p>
     <w:p>
@@ -92,63 +122,93 @@
         <w:pStyle w:val="BodyText"/>
       </w:pPr>
       <w:r>
-        <w:t xml:space="preserve">Giải pháp đã được tinh chỉnh cấu hình và tối ưu hóa hoàn toàn tương thích với thông số phần cứng thử nghiệm của Ban Tổ Chức (</w:t>
+        <w:rPr>
+          <w:rFonts w:ascii="Calibri" w:hAnsi="Calibri" w:eastAsia="Calibri" w:cs="Calibri"/>
+        </w:rPr>
+        <w:t xml:space="preserve">Cấu hình hệ thống được tối ưu hóa và kiểm nghiệm tương thích hoàn hảo với tài nguyên máy chủ đánh giá của Ban Tổ Chức (</w:t>
       </w:r>
       <w:r>
         <w:rPr>
           <w:b/>
           <w:bCs/>
+          <w:rFonts w:ascii="Calibri" w:hAnsi="Calibri" w:eastAsia="Calibri" w:cs="Calibri"/>
         </w:rPr>
         <w:t xml:space="preserve">NVIDIA RTX 5060Ti, 32GB RAM</w:t>
       </w:r>
       <w:r>
-        <w:t xml:space="preserve">). Kết quả đánh giá thực nghiệm trên tập Public Test (463 câu hỏi) đạt độ chính xác ấn tượng</w:t>
-      </w:r>
-      <w:r>
+        <w:rPr>
+          <w:rFonts w:ascii="Calibri" w:hAnsi="Calibri" w:eastAsia="Calibri" w:cs="Calibri"/>
+        </w:rPr>
+        <w:t xml:space="preserve">). Kết quả thực nghiệm trên tập Public Test (463 câu hỏi) đạt độ chính xác</w:t>
+      </w:r>
+      <w:r>
+        <w:rPr>
+          <w:rFonts w:ascii="Calibri" w:hAnsi="Calibri" w:eastAsia="Calibri" w:cs="Calibri"/>
+        </w:rPr>
         <w:t xml:space="preserve"> </w:t>
       </w:r>
       <w:r>
         <w:rPr>
           <w:b/>
           <w:bCs/>
+          <w:rFonts w:ascii="Calibri" w:hAnsi="Calibri" w:eastAsia="Calibri" w:cs="Calibri"/>
         </w:rPr>
         <w:t xml:space="preserve">88.98%</w:t>
       </w:r>
       <w:r>
-        <w:t xml:space="preserve"> </w:t>
-      </w:r>
-      <w:r>
-        <w:t xml:space="preserve">với tốc độ xử lý trung bình đạt</w:t>
-      </w:r>
-      <w:r>
+        <w:rPr>
+          <w:rFonts w:ascii="Calibri" w:hAnsi="Calibri" w:eastAsia="Calibri" w:cs="Calibri"/>
+        </w:rPr>
+        <w:t xml:space="preserve"> </w:t>
+      </w:r>
+      <w:r>
+        <w:rPr>
+          <w:rFonts w:ascii="Calibri" w:hAnsi="Calibri" w:eastAsia="Calibri" w:cs="Calibri"/>
+        </w:rPr>
+        <w:t xml:space="preserve">với tốc độ xử lý trung bình</w:t>
+      </w:r>
+      <w:r>
+        <w:rPr>
+          <w:rFonts w:ascii="Calibri" w:hAnsi="Calibri" w:eastAsia="Calibri" w:cs="Calibri"/>
+        </w:rPr>
         <w:t xml:space="preserve"> </w:t>
       </w:r>
       <w:r>
         <w:rPr>
           <w:b/>
           <w:bCs/>
+          <w:rFonts w:ascii="Calibri" w:hAnsi="Calibri" w:eastAsia="Calibri" w:cs="Calibri"/>
         </w:rPr>
         <w:t xml:space="preserve">1.42 giây/câu hỏi</w:t>
       </w:r>
       <w:r>
+        <w:rPr>
+          <w:rFonts w:ascii="Calibri" w:hAnsi="Calibri" w:eastAsia="Calibri" w:cs="Calibri"/>
+        </w:rPr>
         <w:t xml:space="preserve">.</w:t>
       </w:r>
     </w:p>
     <w:p>
       <w:r>
+        <w:rPr>
+          <w:rFonts w:ascii="Calibri" w:hAnsi="Calibri" w:eastAsia="Calibri" w:cs="Calibri"/>
+        </w:rPr>
         <w:pict>
           <v:rect style="width:0;height:1.5pt" o:hralign="center" o:hrstd="t" o:hr="t"/>
         </w:pict>
       </w:r>
     </w:p>
-    <w:bookmarkEnd w:id="11"/>
-    <w:bookmarkStart w:id="12" w:name="giới-thiệu-chung"/>
+    <w:bookmarkEnd w:id="10"/>
+    <w:bookmarkStart w:id="11" w:name="đặt-vấn-đề-và-lựa-chọn-mô-hình-nền-tảng"/>
     <w:p>
       <w:pPr>
         <w:pStyle w:val="Heading2"/>
       </w:pPr>
       <w:r>
-        <w:t xml:space="preserve">1. GIỚI THIỆU CHUNG</w:t>
+        <w:rPr>
+          <w:rFonts w:ascii="Calibri" w:hAnsi="Calibri" w:eastAsia="Calibri" w:cs="Calibri"/>
+        </w:rPr>
+        <w:t xml:space="preserve">1. ĐẶT VẤN ĐỀ VÀ LỰA CHỌN MÔ HÌNH NỀN TẢNG</w:t>
       </w:r>
     </w:p>
     <w:p>
@@ -156,74 +216,123 @@
         <w:pStyle w:val="FirstParagraph"/>
       </w:pPr>
       <w:r>
-        <w:t xml:space="preserve">Bài toán trắc nghiệm đa ngành (Toán học, Vật lý, Luật học, Kinh tế, Lịch sử…) trong khuôn khổ Bảng C - Innovator đòi hỏi AI Agent phải đưa ra câu trả lời chính xác và ghi nhận thời gian thực thi tuần tự của từng câu hỏi dưới dạng tệp</w:t>
-      </w:r>
-      <w:r>
+        <w:rPr>
+          <w:rFonts w:ascii="Calibri" w:hAnsi="Calibri" w:eastAsia="Calibri" w:cs="Calibri"/>
+        </w:rPr>
+        <w:t xml:space="preserve">Thử thách đặt ra tại Bảng C - Innovator yêu cầu AI Agent phải tự động giải quyết chính xác các câu hỏi trắc nghiệm đa ngành có độ phức tạp cao, đồng thời ghi nhận thời gian thực thi tuần tự của từng câu hỏi dưới dạng tệp</w:t>
+      </w:r>
+      <w:r>
+        <w:rPr>
+          <w:rFonts w:ascii="Calibri" w:hAnsi="Calibri" w:eastAsia="Calibri" w:cs="Calibri"/>
+        </w:rPr>
         <w:t xml:space="preserve"> </w:t>
       </w:r>
       <w:r>
         <w:rPr>
           <w:rStyle w:val="VerbatimChar"/>
+          <w:rFonts w:ascii="Calibri" w:hAnsi="Calibri" w:eastAsia="Calibri" w:cs="Calibri"/>
         </w:rPr>
         <w:t xml:space="preserve">submission.csv</w:t>
       </w:r>
       <w:r>
-        <w:t xml:space="preserve"> </w:t>
-      </w:r>
-      <w:r>
+        <w:rPr>
+          <w:rFonts w:ascii="Calibri" w:hAnsi="Calibri" w:eastAsia="Calibri" w:cs="Calibri"/>
+        </w:rPr>
+        <w:t xml:space="preserve"> </w:t>
+      </w:r>
+      <w:r>
+        <w:rPr>
+          <w:rFonts w:ascii="Calibri" w:hAnsi="Calibri" w:eastAsia="Calibri" w:cs="Calibri"/>
+        </w:rPr>
         <w:t xml:space="preserve">và</w:t>
       </w:r>
       <w:r>
+        <w:rPr>
+          <w:rFonts w:ascii="Calibri" w:hAnsi="Calibri" w:eastAsia="Calibri" w:cs="Calibri"/>
+        </w:rPr>
         <w:t xml:space="preserve"> </w:t>
       </w:r>
       <w:r>
         <w:rPr>
           <w:rStyle w:val="VerbatimChar"/>
+          <w:rFonts w:ascii="Calibri" w:hAnsi="Calibri" w:eastAsia="Calibri" w:cs="Calibri"/>
         </w:rPr>
         <w:t xml:space="preserve">submission_time.csv</w:t>
       </w:r>
       <w:r>
-        <w:t xml:space="preserve">. Yêu cầu vận hành offline khép kín trong Docker đặt ra hai thách thức lớn:</w:t>
-      </w:r>
-      <w:r>
-        <w:t xml:space="preserve"> </w:t>
-      </w:r>
-      <w:r>
-        <w:t xml:space="preserve">1.</w:t>
-      </w:r>
-      <w:r>
+        <w:rPr>
+          <w:rFonts w:ascii="Calibri" w:hAnsi="Calibri" w:eastAsia="Calibri" w:cs="Calibri"/>
+        </w:rPr>
+        <w:t xml:space="preserve">. Điều này đòi hỏi giải pháp phải giải quyết đồng thời hai bài toán:</w:t>
+      </w:r>
+      <w:r>
+        <w:rPr>
+          <w:rFonts w:ascii="Calibri" w:hAnsi="Calibri" w:eastAsia="Calibri" w:cs="Calibri"/>
+        </w:rPr>
+        <w:t xml:space="preserve"> </w:t>
+      </w:r>
+      <w:r>
+        <w:rPr>
+          <w:rFonts w:ascii="Calibri" w:hAnsi="Calibri" w:eastAsia="Calibri" w:cs="Calibri"/>
+        </w:rPr>
+        <w:t xml:space="preserve">*</w:t>
+      </w:r>
+      <w:r>
+        <w:rPr>
+          <w:rFonts w:ascii="Calibri" w:hAnsi="Calibri" w:eastAsia="Calibri" w:cs="Calibri"/>
+        </w:rPr>
         <w:t xml:space="preserve"> </w:t>
       </w:r>
       <w:r>
         <w:rPr>
           <w:b/>
           <w:bCs/>
-        </w:rPr>
-        <w:t xml:space="preserve">Độ chính xác lập luận</w:t>
-      </w:r>
-      <w:r>
-        <w:t xml:space="preserve">: Mô hình phải có khả năng suy luận logic Chain-of-Thought (CoT) chặt chẽ mà không bị cắt cụt (truncation) hoặc trích xuất sai đáp án từ ngữ cảnh tiếng Việt.</w:t>
-      </w:r>
-      <w:r>
-        <w:t xml:space="preserve"> </w:t>
-      </w:r>
-      <w:r>
-        <w:t xml:space="preserve">2.</w:t>
-      </w:r>
-      <w:r>
+          <w:rFonts w:ascii="Calibri" w:hAnsi="Calibri" w:eastAsia="Calibri" w:cs="Calibri"/>
+        </w:rPr>
+        <w:t xml:space="preserve">Nâng cao chất lượng lập luận logic</w:t>
+      </w:r>
+      <w:r>
+        <w:rPr>
+          <w:rFonts w:ascii="Calibri" w:hAnsi="Calibri" w:eastAsia="Calibri" w:cs="Calibri"/>
+        </w:rPr>
+        <w:t xml:space="preserve">: Tránh hiện tượng suy luận bị cắt cụt (truncation) hoặc trích xuất nhầm đáp án trong ngữ cảnh tiếng Việt.</w:t>
+      </w:r>
+      <w:r>
+        <w:rPr>
+          <w:rFonts w:ascii="Calibri" w:hAnsi="Calibri" w:eastAsia="Calibri" w:cs="Calibri"/>
+        </w:rPr>
+        <w:t xml:space="preserve"> </w:t>
+      </w:r>
+      <w:r>
+        <w:rPr>
+          <w:rFonts w:ascii="Calibri" w:hAnsi="Calibri" w:eastAsia="Calibri" w:cs="Calibri"/>
+        </w:rPr>
+        <w:t xml:space="preserve">*</w:t>
+      </w:r>
+      <w:r>
+        <w:rPr>
+          <w:rFonts w:ascii="Calibri" w:hAnsi="Calibri" w:eastAsia="Calibri" w:cs="Calibri"/>
+        </w:rPr>
         <w:t xml:space="preserve"> </w:t>
       </w:r>
       <w:r>
         <w:rPr>
           <w:b/>
           <w:bCs/>
-        </w:rPr>
-        <w:t xml:space="preserve">Hiệu suất phần cứng giới hạn</w:t>
-      </w:r>
-      <w:r>
-        <w:t xml:space="preserve">: Hệ thống phải hoạt động ổn định, tránh lỗi tràn bộ nhớ (Out-Of-Memory) trên cấu hình máy chủ RTX 5060Ti (dung lượng VRAM giới hạn</w:t>
-      </w:r>
-      <w:r>
+          <w:rFonts w:ascii="Calibri" w:hAnsi="Calibri" w:eastAsia="Calibri" w:cs="Calibri"/>
+        </w:rPr>
+        <w:t xml:space="preserve">Tối ưu hóa tài nguyên phần cứng</w:t>
+      </w:r>
+      <w:r>
+        <w:rPr>
+          <w:rFonts w:ascii="Calibri" w:hAnsi="Calibri" w:eastAsia="Calibri" w:cs="Calibri"/>
+        </w:rPr>
+        <w:t xml:space="preserve">: Đảm bảo hệ thống vận hành ổn định và không xảy ra lỗi tràn bộ nhớ (Out-Of-Memory) trên cấu hình phần cứng RTX 5060Ti (VRAM</w:t>
+      </w:r>
+      <w:r>
+        <w:rPr>
+          <w:rFonts w:ascii="Calibri" w:hAnsi="Calibri" w:eastAsia="Calibri" w:cs="Calibri"/>
+        </w:rPr>
         <w:t xml:space="preserve"> </w:t>
       </w:r>
       <m:oMath>
@@ -238,9 +347,15 @@
         </m:r>
       </m:oMath>
       <w:r>
-        <w:t xml:space="preserve"> </w:t>
-      </w:r>
-      <w:r>
+        <w:rPr>
+          <w:rFonts w:ascii="Calibri" w:hAnsi="Calibri" w:eastAsia="Calibri" w:cs="Calibri"/>
+        </w:rPr>
+        <w:t xml:space="preserve"> </w:t>
+      </w:r>
+      <w:r>
+        <w:rPr>
+          <w:rFonts w:ascii="Calibri" w:hAnsi="Calibri" w:eastAsia="Calibri" w:cs="Calibri"/>
+        </w:rPr>
         <w:t xml:space="preserve">GB) và 32GB RAM hệ thống.</w:t>
       </w:r>
     </w:p>
@@ -249,33 +364,71 @@
         <w:pStyle w:val="BodyText"/>
       </w:pPr>
       <w:r>
-        <w:t xml:space="preserve">Để giải quyết trọn vẹn các thách thức trên, đội thi T1S_KMML đã phát triển một kiến trúc xử lý tối giản nhưng hiệu quả cao, tích hợp trực tiếp lớp vLLM Engine cấp thấp với giải thuật Logit Margin thích ứng.</w:t>
-      </w:r>
-    </w:p>
-    <w:p>
-      <w:r>
+        <w:rPr>
+          <w:rFonts w:ascii="Calibri" w:hAnsi="Calibri" w:eastAsia="Calibri" w:cs="Calibri"/>
+        </w:rPr>
+        <w:t xml:space="preserve">Nhóm tác giả đã lựa chọn mô hình lượng tử hóa</w:t>
+      </w:r>
+      <w:r>
+        <w:rPr>
+          <w:rFonts w:ascii="Calibri" w:hAnsi="Calibri" w:eastAsia="Calibri" w:cs="Calibri"/>
+        </w:rPr>
+        <w:t xml:space="preserve"> </w:t>
+      </w:r>
+      <w:r>
+        <w:rPr>
+          <w:b/>
+          <w:bCs/>
+          <w:rFonts w:ascii="Calibri" w:hAnsi="Calibri" w:eastAsia="Calibri" w:cs="Calibri"/>
+        </w:rPr>
+        <w:t xml:space="preserve">Qwen3.5-4B-AWQ-4bit</w:t>
+      </w:r>
+      <w:r>
+        <w:rPr>
+          <w:rFonts w:ascii="Calibri" w:hAnsi="Calibri" w:eastAsia="Calibri" w:cs="Calibri"/>
+        </w:rPr>
+        <w:t xml:space="preserve"> </w:t>
+      </w:r>
+      <w:r>
+        <w:rPr>
+          <w:rFonts w:ascii="Calibri" w:hAnsi="Calibri" w:eastAsia="Calibri" w:cs="Calibri"/>
+        </w:rPr>
+        <w:t xml:space="preserve">(kích thước tệp trọng số ~3.8GB). Lựa chọn này giúp tiết kiệm tối đa dung lượng bộ nhớ đệm KV Cache và VRAM, cho phép chạy với kích thước batch lớn trong khi vẫn bảo toàn năng lực lập luận ngữ cảnh xuất sắc từ kiến trúc Qwen3.5 gốc. Để điều khiển mô hình ngoại tuyến, chúng tôi giao tiếp trực tiếp với lớp API LLMEngine của vLLM để tối ưu hiệu năng.</w:t>
+      </w:r>
+    </w:p>
+    <w:p>
+      <w:r>
+        <w:rPr>
+          <w:rFonts w:ascii="Calibri" w:hAnsi="Calibri" w:eastAsia="Calibri" w:cs="Calibri"/>
+        </w:rPr>
         <w:pict>
           <v:rect style="width:0;height:1.5pt" o:hralign="center" o:hrstd="t" o:hr="t"/>
         </w:pict>
       </w:r>
     </w:p>
-    <w:bookmarkEnd w:id="12"/>
-    <w:bookmarkStart w:id="19" w:name="X070bf3456b9df650d6a297a8bf7d57d77e80be0"/>
+    <w:bookmarkEnd w:id="11"/>
+    <w:bookmarkStart w:id="18" w:name="X070bf3456b9df650d6a297a8bf7d57d77e80be0"/>
     <w:p>
       <w:pPr>
         <w:pStyle w:val="Heading2"/>
       </w:pPr>
       <w:r>
+        <w:rPr>
+          <w:rFonts w:ascii="Calibri" w:hAnsi="Calibri" w:eastAsia="Calibri" w:cs="Calibri"/>
+        </w:rPr>
         <w:t xml:space="preserve">2. PHƯƠNG PHÁP ĐỀ XUẤT VÀ KIẾN TRÚC SUY LUẬN</w:t>
       </w:r>
     </w:p>
-    <w:bookmarkStart w:id="16" w:name="Xcf5b67153f830208752b979983430a24915d47a"/>
+    <w:bookmarkStart w:id="15" w:name="sơ-đồ-luồng-xử-lý-pipeline-flowchart"/>
     <w:p>
       <w:pPr>
         <w:pStyle w:val="Heading3"/>
       </w:pPr>
       <w:r>
-        <w:t xml:space="preserve">2.1. Sơ đồ Luồng xử lý hệ thống (Pipeline Flowchart)</w:t>
+        <w:rPr>
+          <w:rFonts w:ascii="Calibri" w:hAnsi="Calibri" w:eastAsia="Calibri" w:cs="Calibri"/>
+        </w:rPr>
+        <w:t xml:space="preserve">2.1. Sơ đồ luồng xử lý (Pipeline Flowchart)</w:t>
       </w:r>
     </w:p>
     <w:p>
@@ -283,22 +436,25 @@
         <w:pStyle w:val="CaptionedFigure"/>
       </w:pPr>
       <w:r>
+        <w:rPr>
+          <w:rFonts w:ascii="Calibri" w:hAnsi="Calibri" w:eastAsia="Calibri" w:cs="Calibri"/>
+        </w:rPr>
         <w:drawing>
           <wp:inline>
             <wp:extent cx="5334000" cy="5689600"/>
             <wp:effectExtent b="0" l="0" r="0" t="0"/>
-            <wp:docPr descr="Sơ đồ kiến trúc xử lý của AI Agent" title="" id="14" name="Picture"/>
+            <wp:docPr descr="Sơ đồ kiến trúc xử lý của AI Agent" title="" id="13" name="Picture"/>
             <a:graphic>
               <a:graphicData uri="http://schemas.openxmlformats.org/drawingml/2006/picture">
                 <pic:pic>
                   <pic:nvPicPr>
-                    <pic:cNvPr descr="NOP_BAI_T1S_KMML/architecture_flowchart.png" id="15" name="Picture"/>
+                    <pic:cNvPr descr="NOP_BAI_T1S_KMML/architecture_flowchart.png" id="14" name="Picture"/>
                     <pic:cNvPicPr>
                       <a:picLocks noChangeArrowheads="1" noChangeAspect="1"/>
                     </pic:cNvPicPr>
                   </pic:nvPicPr>
                   <pic:blipFill>
-                    <a:blip r:embed="rId13"/>
+                    <a:blip r:embed="rId12"/>
                     <a:stretch>
                       <a:fillRect/>
                     </a:stretch>
@@ -330,17 +486,23 @@
         <w:pStyle w:val="ImageCaption"/>
       </w:pPr>
       <w:r>
+        <w:rPr>
+          <w:rFonts w:ascii="Calibri" w:hAnsi="Calibri" w:eastAsia="Calibri" w:cs="Calibri"/>
+        </w:rPr>
         <w:t xml:space="preserve">Sơ đồ kiến trúc xử lý của AI Agent</w:t>
       </w:r>
     </w:p>
-    <w:bookmarkEnd w:id="16"/>
-    <w:bookmarkStart w:id="17" w:name="Xcce2f82762d2a3f3da2c54679da3016a0d9480c"/>
+    <w:bookmarkEnd w:id="15"/>
+    <w:bookmarkStart w:id="16" w:name="Xbbb30d3cc00db75a1d0def536fa053a1b14f274"/>
     <w:p>
       <w:pPr>
         <w:pStyle w:val="Heading3"/>
       </w:pPr>
       <w:r>
-        <w:t xml:space="preserve">2.2. Cơ chế quyết định Logit Margin Early Exit (Dừng sớm theo độ phân vân)</w:t>
+        <w:rPr>
+          <w:rFonts w:ascii="Calibri" w:hAnsi="Calibri" w:eastAsia="Calibri" w:cs="Calibri"/>
+        </w:rPr>
+        <w:t xml:space="preserve">2.2. Cơ chế quyết định Logit Margin Early Exit</w:t>
       </w:r>
     </w:p>
     <w:p>
@@ -348,102 +510,147 @@
         <w:pStyle w:val="FirstParagraph"/>
       </w:pPr>
       <w:r>
-        <w:t xml:space="preserve">Nhằm triệt tiêu sự lãng phí tài nguyên khi phải chạy nhiều luồng biểu quyết cho các câu hỏi dễ, chúng tôi phát triển cơ chế rẽ nhánh suy luận thông minh dựa trên phân phối xác suất đầu ra của mô hình:</w:t>
-      </w:r>
-      <w:r>
-        <w:t xml:space="preserve"> </w:t>
-      </w:r>
-      <w:r>
-        <w:t xml:space="preserve">1.</w:t>
-      </w:r>
-      <w:r>
-        <w:t xml:space="preserve"> </w:t>
-      </w:r>
+        <w:rPr>
+          <w:rFonts w:ascii="Calibri" w:hAnsi="Calibri" w:eastAsia="Calibri" w:cs="Calibri"/>
+        </w:rPr>
+        <w:t xml:space="preserve">Để tối ưu hóa thời gian thực thi mà không làm giảm độ chính xác, nhóm tác giả đề xuất giải pháp rẽ nhánh suy luận dựa trên phân phối xác suất đầu ra (logits) của mô hình:</w:t>
+      </w:r>
+    </w:p>
+    <w:p>
+      <w:pPr>
+        <w:pStyle w:val="Compact"/>
+        <w:numPr>
+          <w:ilvl w:val="0"/>
+          <w:numId w:val="1001"/>
+        </w:numPr>
+      </w:pPr>
       <w:r>
         <w:rPr>
           <w:b/>
           <w:bCs/>
-        </w:rPr>
-        <w:t xml:space="preserve">Luồng CoT 0 (Luồng chính)</w:t>
-      </w:r>
-      <w:r>
-        <w:t xml:space="preserve">: Agent gửi câu hỏi kèm Prompt hệ thống tối ưu hóa tư duy vào vLLM để sinh chuỗi lập luận Chain-of-Thought chi tiết dưới nhiệt độ thấp (</w:t>
+          <w:rFonts w:ascii="Calibri" w:hAnsi="Calibri" w:eastAsia="Calibri" w:cs="Calibri"/>
+        </w:rPr>
+        <w:t xml:space="preserve">Luồng CoT chính (Luồng 0)</w:t>
+      </w:r>
+      <w:r>
+        <w:rPr>
+          <w:rFonts w:ascii="Calibri" w:hAnsi="Calibri" w:eastAsia="Calibri" w:cs="Calibri"/>
+        </w:rPr>
+        <w:t xml:space="preserve">: Hệ thống sinh lập luận Chain-of-Thought đầy đủ cho câu hỏi ở nhiệt độ thấp (</w:t>
       </w:r>
       <w:r>
         <w:rPr>
           <w:rStyle w:val="VerbatimChar"/>
+          <w:rFonts w:ascii="Calibri" w:hAnsi="Calibri" w:eastAsia="Calibri" w:cs="Calibri"/>
         </w:rPr>
         <w:t xml:space="preserve">temperature=0.2</w:t>
       </w:r>
       <w:r>
-        <w:t xml:space="preserve">).</w:t>
-      </w:r>
-      <w:r>
-        <w:t xml:space="preserve"> </w:t>
-      </w:r>
-      <w:r>
-        <w:t xml:space="preserve">2.</w:t>
-      </w:r>
-      <w:r>
-        <w:t xml:space="preserve"> </w:t>
-      </w:r>
+        <w:rPr>
+          <w:rFonts w:ascii="Calibri" w:hAnsi="Calibri" w:eastAsia="Calibri" w:cs="Calibri"/>
+        </w:rPr>
+        <w:t xml:space="preserve">) nhằm định hướng lập luận logic chặt chẽ.</w:t>
+      </w:r>
+    </w:p>
+    <w:p>
+      <w:pPr>
+        <w:pStyle w:val="Compact"/>
+        <w:numPr>
+          <w:ilvl w:val="0"/>
+          <w:numId w:val="1001"/>
+        </w:numPr>
+      </w:pPr>
       <w:r>
         <w:rPr>
           <w:b/>
           <w:bCs/>
-        </w:rPr>
-        <w:t xml:space="preserve">Logit Margin Verification</w:t>
-      </w:r>
-      <w:r>
-        <w:t xml:space="preserve">: Ngay khi kết thúc Luồng 0, hệ thống gọi tiếp 1 token chốt đáp án bằng thuật toán Greedy (</w:t>
+          <w:rFonts w:ascii="Calibri" w:hAnsi="Calibri" w:eastAsia="Calibri" w:cs="Calibri"/>
+        </w:rPr>
+        <w:t xml:space="preserve">Kiểm tra độ tự tin (Confidence Check)</w:t>
+      </w:r>
+      <w:r>
+        <w:rPr>
+          <w:rFonts w:ascii="Calibri" w:hAnsi="Calibri" w:eastAsia="Calibri" w:cs="Calibri"/>
+        </w:rPr>
+        <w:t xml:space="preserve">: Hệ thống gọi tiếp 1 token chốt đáp án bằng giải thuật Greedy (</w:t>
       </w:r>
       <w:r>
         <w:rPr>
           <w:rStyle w:val="VerbatimChar"/>
+          <w:rFonts w:ascii="Calibri" w:hAnsi="Calibri" w:eastAsia="Calibri" w:cs="Calibri"/>
         </w:rPr>
         <w:t xml:space="preserve">temperature=0.0</w:t>
       </w:r>
       <w:r>
-        <w:t xml:space="preserve">) và trích xuất danh sách xác suất (</w:t>
+        <w:rPr>
+          <w:rFonts w:ascii="Calibri" w:hAnsi="Calibri" w:eastAsia="Calibri" w:cs="Calibri"/>
+        </w:rPr>
+        <w:t xml:space="preserve">) kèm cấu hình</w:t>
+      </w:r>
+      <w:r>
+        <w:rPr>
+          <w:rFonts w:ascii="Calibri" w:hAnsi="Calibri" w:eastAsia="Calibri" w:cs="Calibri"/>
+        </w:rPr>
+        <w:t xml:space="preserve"> </w:t>
       </w:r>
       <w:r>
         <w:rPr>
           <w:rStyle w:val="VerbatimChar"/>
+          <w:rFonts w:ascii="Calibri" w:hAnsi="Calibri" w:eastAsia="Calibri" w:cs="Calibri"/>
         </w:rPr>
         <w:t xml:space="preserve">logprobs=5</w:t>
       </w:r>
       <w:r>
-        <w:t xml:space="preserve">).</w:t>
-      </w:r>
-      <w:r>
-        <w:t xml:space="preserve"> </w:t>
-      </w:r>
-      <w:r>
-        <w:t xml:space="preserve">3.</w:t>
-      </w:r>
-      <w:r>
-        <w:t xml:space="preserve"> </w:t>
-      </w:r>
+        <w:rPr>
+          <w:rFonts w:ascii="Calibri" w:hAnsi="Calibri" w:eastAsia="Calibri" w:cs="Calibri"/>
+        </w:rPr>
+        <w:t xml:space="preserve"> </w:t>
+      </w:r>
+      <w:r>
+        <w:rPr>
+          <w:rFonts w:ascii="Calibri" w:hAnsi="Calibri" w:eastAsia="Calibri" w:cs="Calibri"/>
+        </w:rPr>
+        <w:t xml:space="preserve">để lấy phân phối xác suất của 5 token hàng đầu.</w:t>
+      </w:r>
+    </w:p>
+    <w:p>
+      <w:pPr>
+        <w:pStyle w:val="Compact"/>
+        <w:numPr>
+          <w:ilvl w:val="0"/>
+          <w:numId w:val="1001"/>
+        </w:numPr>
+      </w:pPr>
       <w:r>
         <w:rPr>
           <w:b/>
           <w:bCs/>
-        </w:rPr>
-        <w:t xml:space="preserve">Tính toán Margin</w:t>
-      </w:r>
-      <w:r>
+          <w:rFonts w:ascii="Calibri" w:hAnsi="Calibri" w:eastAsia="Calibri" w:cs="Calibri"/>
+        </w:rPr>
+        <w:t xml:space="preserve">Tính toán Logit Margin</w:t>
+      </w:r>
+      <w:r>
+        <w:rPr>
+          <w:rFonts w:ascii="Calibri" w:hAnsi="Calibri" w:eastAsia="Calibri" w:cs="Calibri"/>
+        </w:rPr>
         <w:t xml:space="preserve">:</w:t>
       </w:r>
       <w:r>
-        <w:t xml:space="preserve"> </w:t>
-      </w:r>
-      <w:r>
-        <w:t xml:space="preserve">Chênh lệch xác suất giữa đáp án có điểm cao nhất và đáp án cao thứ hai được đo bằng công thức:</w:t>
-      </w:r>
-    </w:p>
-    <w:p>
-      <w:pPr>
-        <w:pStyle w:val="BodyText"/>
+        <w:rPr>
+          <w:rFonts w:ascii="Calibri" w:hAnsi="Calibri" w:eastAsia="Calibri" w:cs="Calibri"/>
+        </w:rPr>
+        <w:t xml:space="preserve"> </w:t>
+      </w:r>
+      <w:r>
+        <w:rPr>
+          <w:rFonts w:ascii="Calibri" w:hAnsi="Calibri" w:eastAsia="Calibri" w:cs="Calibri"/>
+        </w:rPr>
+        <w:t xml:space="preserve">Độ phân vân của mô hình được tính bằng hiệu xác suất giữa lựa chọn hàng đầu và lựa chọn thứ hai:</w:t>
+      </w:r>
+    </w:p>
+    <w:p>
+      <w:pPr>
+        <w:pStyle w:val="Compact"/>
       </w:pPr>
       <m:oMathPara>
         <m:oMathParaPr>
@@ -518,18 +725,17 @@
     </w:p>
     <w:p>
       <w:pPr>
-        <w:pStyle w:val="FirstParagraph"/>
-      </w:pPr>
-      <w:r>
-        <w:t xml:space="preserve">*</w:t>
-      </w:r>
-      <w:r>
-        <w:t xml:space="preserve"> </w:t>
-      </w:r>
+        <w:pStyle w:val="Compact"/>
+        <w:numPr>
+          <w:ilvl w:val="1"/>
+          <w:numId w:val="1002"/>
+        </w:numPr>
+      </w:pPr>
       <w:r>
         <w:rPr>
           <w:b/>
           <w:bCs/>
+          <w:rFonts w:ascii="Calibri" w:hAnsi="Calibri" w:eastAsia="Calibri" w:cs="Calibri"/>
         </w:rPr>
         <w:t xml:space="preserve">Nhánh Dừng Sớm (Early Exit -</w:t>
       </w:r>
@@ -537,6 +743,7 @@
         <w:rPr>
           <w:b/>
           <w:bCs/>
+          <w:rFonts w:ascii="Calibri" w:hAnsi="Calibri" w:eastAsia="Calibri" w:cs="Calibri"/>
         </w:rPr>
         <w:t xml:space="preserve"> </w:t>
       </w:r>
@@ -562,58 +769,56 @@
         <w:rPr>
           <w:b/>
           <w:bCs/>
+          <w:rFonts w:ascii="Calibri" w:hAnsi="Calibri" w:eastAsia="Calibri" w:cs="Calibri"/>
         </w:rPr>
         <w:t xml:space="preserve">)</w:t>
       </w:r>
       <w:r>
-        <w:t xml:space="preserve">: Nếu Margin vượt ngưỡng</w:t>
-      </w:r>
-      <w:r>
-        <w:t xml:space="preserve"> </w:t>
-      </w:r>
-      <m:oMath>
-        <m:r>
-          <m:t>50</m:t>
-        </m:r>
-        <m:r>
-          <m:rPr>
-            <m:sty m:val="p"/>
-          </m:rPr>
-          <m:t>%</m:t>
-        </m:r>
-      </m:oMath>
-      <w:r>
-        <w:t xml:space="preserve">, điều này chứng tỏ mô hình rất tự tin vào lựa chọn của mình. Hệ thống lập tức dừng sớm và lấy đáp án của Luồng 0. Cơ chế này áp dụng cho</w:t>
-      </w:r>
-      <w:r>
+        <w:rPr>
+          <w:rFonts w:ascii="Calibri" w:hAnsi="Calibri" w:eastAsia="Calibri" w:cs="Calibri"/>
+        </w:rPr>
+        <w:t xml:space="preserve">: Nếu Margin vượt ngưỡng 50%, mô hình đã đưa ra câu trả lời dứt khoát. Hệ thống sẽ lập tức dừng sớm và lấy đáp án của Luồng 0 làm kết quả cuối cùng. Cơ chế này áp dụng thành công cho</w:t>
+      </w:r>
+      <w:r>
+        <w:rPr>
+          <w:rFonts w:ascii="Calibri" w:hAnsi="Calibri" w:eastAsia="Calibri" w:cs="Calibri"/>
+        </w:rPr>
         <w:t xml:space="preserve"> </w:t>
       </w:r>
       <w:r>
         <w:rPr>
           <w:b/>
           <w:bCs/>
+          <w:rFonts w:ascii="Calibri" w:hAnsi="Calibri" w:eastAsia="Calibri" w:cs="Calibri"/>
         </w:rPr>
         <w:t xml:space="preserve">74.3% câu hỏi</w:t>
       </w:r>
       <w:r>
-        <w:t xml:space="preserve"> </w:t>
-      </w:r>
-      <w:r>
-        <w:t xml:space="preserve">trong tập đề thi, giúp tiết kiệm tới 66% thời gian sinh.</w:t>
-      </w:r>
-      <w:r>
-        <w:t xml:space="preserve"> </w:t>
-      </w:r>
-      <w:r>
-        <w:t xml:space="preserve">*</w:t>
-      </w:r>
-      <w:r>
-        <w:t xml:space="preserve"> </w:t>
-      </w:r>
+        <w:rPr>
+          <w:rFonts w:ascii="Calibri" w:hAnsi="Calibri" w:eastAsia="Calibri" w:cs="Calibri"/>
+        </w:rPr>
+        <w:t xml:space="preserve"> </w:t>
+      </w:r>
+      <w:r>
+        <w:rPr>
+          <w:rFonts w:ascii="Calibri" w:hAnsi="Calibri" w:eastAsia="Calibri" w:cs="Calibri"/>
+        </w:rPr>
+        <w:t xml:space="preserve">trong tập đề thi, giúp tiết kiệm 66% tài nguyên tính toán.</w:t>
+      </w:r>
+    </w:p>
+    <w:p>
+      <w:pPr>
+        <w:pStyle w:val="Compact"/>
+        <w:numPr>
+          <w:ilvl w:val="1"/>
+          <w:numId w:val="1002"/>
+        </w:numPr>
+      </w:pPr>
       <w:r>
         <w:rPr>
           <w:b/>
           <w:bCs/>
+          <w:rFonts w:ascii="Calibri" w:hAnsi="Calibri" w:eastAsia="Calibri" w:cs="Calibri"/>
         </w:rPr>
         <w:t xml:space="preserve">Nhánh Biểu Quyết (Voting -</w:t>
       </w:r>
@@ -621,6 +826,7 @@
         <w:rPr>
           <w:b/>
           <w:bCs/>
+          <w:rFonts w:ascii="Calibri" w:hAnsi="Calibri" w:eastAsia="Calibri" w:cs="Calibri"/>
         </w:rPr>
         <w:t xml:space="preserve"> </w:t>
       </w:r>
@@ -646,38 +852,47 @@
         <w:rPr>
           <w:b/>
           <w:bCs/>
+          <w:rFonts w:ascii="Calibri" w:hAnsi="Calibri" w:eastAsia="Calibri" w:cs="Calibri"/>
         </w:rPr>
         <w:t xml:space="preserve">)</w:t>
       </w:r>
       <w:r>
-        <w:t xml:space="preserve">: Nếu Margin dưới ngưỡng</w:t>
-      </w:r>
-      <w:r>
-        <w:t xml:space="preserve"> </w:t>
-      </w:r>
-      <m:oMath>
-        <m:r>
-          <m:t>50</m:t>
-        </m:r>
-        <m:r>
-          <m:rPr>
-            <m:sty m:val="p"/>
-          </m:rPr>
-          <m:t>%</m:t>
-        </m:r>
-      </m:oMath>
-      <w:r>
-        <w:t xml:space="preserve">, chứng tỏ mô hình đang phân vân giữa 2 hoặc nhiều lựa chọn. Hệ thống lập tức kích hoạt song song Luồng CoT 1 và Luồng CoT 2, sau đó thực hiện biểu quyết đa số (Majority Voting) giữa 3 luồng để đưa ra quyết định chuẩn xác nhất cho câu hỏi khó.</w:t>
-      </w:r>
-    </w:p>
-    <w:bookmarkEnd w:id="17"/>
-    <w:bookmarkStart w:id="18" w:name="X387ded16bf8cdd4a155f4f3c5d7a2d37c6eacd4"/>
+        <w:rPr>
+          <w:rFonts w:ascii="Calibri" w:hAnsi="Calibri" w:eastAsia="Calibri" w:cs="Calibri"/>
+        </w:rPr>
+        <w:t xml:space="preserve">: Nếu Margin dưới ngưỡng 50%, mô hình đang phân vân giữa các đáp án. Hệ thống sẽ kích hoạt song song Luồng 1 và Luồng 2 (chạy ở nhiệt độ</w:t>
+      </w:r>
+      <w:r>
+        <w:rPr>
+          <w:rFonts w:ascii="Calibri" w:hAnsi="Calibri" w:eastAsia="Calibri" w:cs="Calibri"/>
+        </w:rPr>
+        <w:t xml:space="preserve"> </w:t>
+      </w:r>
+      <w:r>
+        <w:rPr>
+          <w:rStyle w:val="VerbatimChar"/>
+          <w:rFonts w:ascii="Calibri" w:hAnsi="Calibri" w:eastAsia="Calibri" w:cs="Calibri"/>
+        </w:rPr>
+        <w:t xml:space="preserve">temperature=0.2</w:t>
+      </w:r>
+      <w:r>
+        <w:rPr>
+          <w:rFonts w:ascii="Calibri" w:hAnsi="Calibri" w:eastAsia="Calibri" w:cs="Calibri"/>
+        </w:rPr>
+        <w:t xml:space="preserve">), sau đó thực hiện biểu quyết đa số (Majority Voting) giữa cả 3 luồng để đưa ra quyết định chuẩn xác nhất cho câu hỏi khó.</w:t>
+      </w:r>
+    </w:p>
+    <w:bookmarkEnd w:id="16"/>
+    <w:bookmarkStart w:id="17" w:name="X3ff4de04b091b8fe627c73e6758341f3fc820d2"/>
     <w:p>
       <w:pPr>
         <w:pStyle w:val="Heading3"/>
       </w:pPr>
       <w:r>
-        <w:t xml:space="preserve">2.3. Lập luận CoT và Chuẩn hóa tiếng Việt (Case-Sensitive Regex)</w:t>
+        <w:rPr>
+          <w:rFonts w:ascii="Calibri" w:hAnsi="Calibri" w:eastAsia="Calibri" w:cs="Calibri"/>
+        </w:rPr>
+        <w:t xml:space="preserve">2.3. Trích xuất đáp án và Chuẩn hóa tiếng Việt</w:t>
       </w:r>
     </w:p>
     <w:p>
@@ -685,101 +900,159 @@
         <w:pStyle w:val="FirstParagraph"/>
       </w:pPr>
       <w:r>
-        <w:t xml:space="preserve">Để trích xuất chính xác chữ cái đáp án (A, B, C, D…) từ văn bản lập luận dài mà không bị nhầm lẫn với các từ tiếng Việt tự nhiên viết thường (như</w:t>
-      </w:r>
-      <w:r>
+        <w:rPr>
+          <w:rFonts w:ascii="Calibri" w:hAnsi="Calibri" w:eastAsia="Calibri" w:cs="Calibri"/>
+        </w:rPr>
+        <w:t xml:space="preserve">Tiếng Việt tự nhiên chứa nhiều từ viết thường trùng với ký tự đáp án trắc nghiệm (ví dụ:</w:t>
+      </w:r>
+      <w:r>
+        <w:rPr>
+          <w:rFonts w:ascii="Calibri" w:hAnsi="Calibri" w:eastAsia="Calibri" w:cs="Calibri"/>
+        </w:rPr>
         <w:t xml:space="preserve"> </w:t>
       </w:r>
       <w:r>
         <w:rPr>
           <w:i/>
           <w:iCs/>
+          <w:rFonts w:ascii="Calibri" w:hAnsi="Calibri" w:eastAsia="Calibri" w:cs="Calibri"/>
         </w:rPr>
         <w:t xml:space="preserve">‘ngày’</w:t>
       </w:r>
       <w:r>
+        <w:rPr>
+          <w:rFonts w:ascii="Calibri" w:hAnsi="Calibri" w:eastAsia="Calibri" w:cs="Calibri"/>
+        </w:rPr>
         <w:t xml:space="preserve">,</w:t>
       </w:r>
       <w:r>
+        <w:rPr>
+          <w:rFonts w:ascii="Calibri" w:hAnsi="Calibri" w:eastAsia="Calibri" w:cs="Calibri"/>
+        </w:rPr>
         <w:t xml:space="preserve"> </w:t>
       </w:r>
       <w:r>
         <w:rPr>
           <w:i/>
           <w:iCs/>
-        </w:rPr>
-        <w:t xml:space="preserve">‘về’</w:t>
-      </w:r>
-      <w:r>
+          <w:rFonts w:ascii="Calibri" w:hAnsi="Calibri" w:eastAsia="Calibri" w:cs="Calibri"/>
+        </w:rPr>
+        <w:t xml:space="preserve">‘việc’</w:t>
+      </w:r>
+      <w:r>
+        <w:rPr>
+          <w:rFonts w:ascii="Calibri" w:hAnsi="Calibri" w:eastAsia="Calibri" w:cs="Calibri"/>
+        </w:rPr>
         <w:t xml:space="preserve">,</w:t>
       </w:r>
       <w:r>
+        <w:rPr>
+          <w:rFonts w:ascii="Calibri" w:hAnsi="Calibri" w:eastAsia="Calibri" w:cs="Calibri"/>
+        </w:rPr>
         <w:t xml:space="preserve"> </w:t>
       </w:r>
       <w:r>
         <w:rPr>
           <w:i/>
           <w:iCs/>
-        </w:rPr>
-        <w:t xml:space="preserve">‘việc’</w:t>
-      </w:r>
-      <w:r>
+          <w:rFonts w:ascii="Calibri" w:hAnsi="Calibri" w:eastAsia="Calibri" w:cs="Calibri"/>
+        </w:rPr>
+        <w:t xml:space="preserve">‘hành’</w:t>
+      </w:r>
+      <w:r>
+        <w:rPr>
+          <w:rFonts w:ascii="Calibri" w:hAnsi="Calibri" w:eastAsia="Calibri" w:cs="Calibri"/>
+        </w:rPr>
         <w:t xml:space="preserve">,</w:t>
       </w:r>
       <w:r>
+        <w:rPr>
+          <w:rFonts w:ascii="Calibri" w:hAnsi="Calibri" w:eastAsia="Calibri" w:cs="Calibri"/>
+        </w:rPr>
         <w:t xml:space="preserve"> </w:t>
       </w:r>
       <w:r>
         <w:rPr>
           <w:i/>
           <w:iCs/>
-        </w:rPr>
-        <w:t xml:space="preserve">‘hành’</w:t>
-      </w:r>
-      <w:r>
-        <w:t xml:space="preserve">…), chúng tôi sử dụng bộ lọc regex</w:t>
-      </w:r>
-      <w:r>
+          <w:rFonts w:ascii="Calibri" w:hAnsi="Calibri" w:eastAsia="Calibri" w:cs="Calibri"/>
+        </w:rPr>
+        <w:t xml:space="preserve">‘về’</w:t>
+      </w:r>
+      <w:r>
+        <w:rPr>
+          <w:rFonts w:ascii="Calibri" w:hAnsi="Calibri" w:eastAsia="Calibri" w:cs="Calibri"/>
+        </w:rPr>
+        <w:t xml:space="preserve">…). Nhóm tác giả đã thiết kế bộ lọc biểu thức chính quy</w:t>
+      </w:r>
+      <w:r>
+        <w:rPr>
+          <w:rFonts w:ascii="Calibri" w:hAnsi="Calibri" w:eastAsia="Calibri" w:cs="Calibri"/>
+        </w:rPr>
         <w:t xml:space="preserve"> </w:t>
       </w:r>
       <w:r>
         <w:rPr>
           <w:b/>
           <w:bCs/>
-        </w:rPr>
-        <w:t xml:space="preserve">phân biệt chữ hoa/thường nghiêm ngặt</w:t>
-      </w:r>
-      <w:r>
-        <w:t xml:space="preserve"> </w:t>
-      </w:r>
-      <w:r>
-        <w:t xml:space="preserve">kết hợp với ranh giới từ độc lập:</w:t>
-      </w:r>
-      <w:r>
-        <w:t xml:space="preserve"> </w:t>
-      </w:r>
-      <w:r>
+          <w:rFonts w:ascii="Calibri" w:hAnsi="Calibri" w:eastAsia="Calibri" w:cs="Calibri"/>
+        </w:rPr>
+        <w:t xml:space="preserve">phân biệt nghiêm ngặt chữ hoa/chữ thường (case-sensitive)</w:t>
+      </w:r>
+      <w:r>
+        <w:rPr>
+          <w:rFonts w:ascii="Calibri" w:hAnsi="Calibri" w:eastAsia="Calibri" w:cs="Calibri"/>
+        </w:rPr>
+        <w:t xml:space="preserve"> </w:t>
+      </w:r>
+      <w:r>
+        <w:rPr>
+          <w:rFonts w:ascii="Calibri" w:hAnsi="Calibri" w:eastAsia="Calibri" w:cs="Calibri"/>
+        </w:rPr>
+        <w:t xml:space="preserve">kết hợp ranh giới từ độc lập:</w:t>
+      </w:r>
+      <w:r>
+        <w:rPr>
+          <w:rFonts w:ascii="Calibri" w:hAnsi="Calibri" w:eastAsia="Calibri" w:cs="Calibri"/>
+        </w:rPr>
+        <w:t xml:space="preserve"> </w:t>
+      </w:r>
+      <w:r>
+        <w:rPr>
+          <w:rFonts w:ascii="Calibri" w:hAnsi="Calibri" w:eastAsia="Calibri" w:cs="Calibri"/>
+        </w:rPr>
         <w:t xml:space="preserve">*</w:t>
       </w:r>
       <w:r>
+        <w:rPr>
+          <w:rFonts w:ascii="Calibri" w:hAnsi="Calibri" w:eastAsia="Calibri" w:cs="Calibri"/>
+        </w:rPr>
         <w:t xml:space="preserve"> </w:t>
       </w:r>
       <w:r>
         <w:rPr>
           <w:b/>
           <w:bCs/>
-        </w:rPr>
-        <w:t xml:space="preserve">Mẫu trích xuất (Regex Pattern)</w:t>
-      </w:r>
-      <w:r>
+          <w:rFonts w:ascii="Calibri" w:hAnsi="Calibri" w:eastAsia="Calibri" w:cs="Calibri"/>
+        </w:rPr>
+        <w:t xml:space="preserve">Mẫu Regex</w:t>
+      </w:r>
+      <w:r>
+        <w:rPr>
+          <w:rFonts w:ascii="Calibri" w:hAnsi="Calibri" w:eastAsia="Calibri" w:cs="Calibri"/>
+        </w:rPr>
         <w:t xml:space="preserve">:</w:t>
       </w:r>
       <w:r>
+        <w:rPr>
+          <w:rFonts w:ascii="Calibri" w:hAnsi="Calibri" w:eastAsia="Calibri" w:cs="Calibri"/>
+        </w:rPr>
         <w:t xml:space="preserve"> </w:t>
       </w:r>
       <w:r>
         <w:rPr>
           <w:rStyle w:val="VerbatimChar"/>
+          <w:rFonts w:ascii="Calibri" w:hAnsi="Calibri" w:eastAsia="Calibri" w:cs="Calibri"/>
         </w:rPr>
         <w:t xml:space="preserve">\b[A-J]\b</w:t>
       </w:r>
@@ -789,25 +1062,34 @@
         <w:pStyle w:val="BodyText"/>
       </w:pPr>
       <w:r>
-        <w:t xml:space="preserve">Sau khi trích xuất, đáp án được chuẩn hóa đối chiếu với danh sách lựa chọn của câu hỏi trước khi ghi vào file kết quả nhằm đảm bảo tính hợp lệ tuyệt đối của dữ liệu đầu ra.</w:t>
-      </w:r>
-    </w:p>
-    <w:p>
-      <w:r>
+        <w:rPr>
+          <w:rFonts w:ascii="Calibri" w:hAnsi="Calibri" w:eastAsia="Calibri" w:cs="Calibri"/>
+        </w:rPr>
+        <w:t xml:space="preserve">Cơ chế này loại bỏ hoàn toàn các ký tự trùng hợp trong văn bản tiếng Việt tự nhiên, đảm bảo đáp án trích xuất luôn chính xác và được đối chiếu kiểm tra tính hợp lệ với danh sách lựa chọn của câu hỏi trước khi xuất kết quả.</w:t>
+      </w:r>
+    </w:p>
+    <w:p>
+      <w:r>
+        <w:rPr>
+          <w:rFonts w:ascii="Calibri" w:hAnsi="Calibri" w:eastAsia="Calibri" w:cs="Calibri"/>
+        </w:rPr>
         <w:pict>
           <v:rect style="width:0;height:1.5pt" o:hralign="center" o:hrstd="t" o:hr="t"/>
         </w:pict>
       </w:r>
     </w:p>
+    <w:bookmarkEnd w:id="17"/>
     <w:bookmarkEnd w:id="18"/>
-    <w:bookmarkEnd w:id="19"/>
-    <w:bookmarkStart w:id="23" w:name="X60f1926c3d7a6b27f9bd6cc9b81765889616094"/>
+    <w:bookmarkStart w:id="22" w:name="Xaa452a985413998966ba89a153ef93fe27c7716"/>
     <w:p>
       <w:pPr>
         <w:pStyle w:val="Heading2"/>
       </w:pPr>
       <w:r>
-        <w:t xml:space="preserve">3. CẤU HÌNH HỆ THỐNG VÀ TỐI ƯU HÓA PHẦN CỨNG</w:t>
+        <w:rPr>
+          <w:rFonts w:ascii="Calibri" w:hAnsi="Calibri" w:eastAsia="Calibri" w:cs="Calibri"/>
+        </w:rPr>
+        <w:t xml:space="preserve">3. THIẾT LẬP HỆ THỐNG VÀ TỐI ƯU HÓA PHẦN CỨNG</w:t>
       </w:r>
     </w:p>
     <w:p>
@@ -815,44 +1097,67 @@
         <w:pStyle w:val="FirstParagraph"/>
       </w:pPr>
       <w:r>
-        <w:t xml:space="preserve">Giải pháp được tinh chỉnh sâu để vận hành tương thích hoàn hảo với cấu hình máy chủ chấm điểm của BTC gồm card đồ họa</w:t>
-      </w:r>
-      <w:r>
+        <w:rPr>
+          <w:rFonts w:ascii="Calibri" w:hAnsi="Calibri" w:eastAsia="Calibri" w:cs="Calibri"/>
+        </w:rPr>
+        <w:t xml:space="preserve">Hệ thống được tinh chỉnh cấu hình chuyên sâu để vận hành tương thích hoàn hảo với máy chủ chấm điểm của Ban Tổ Chức gồm card đồ họa</w:t>
+      </w:r>
+      <w:r>
+        <w:rPr>
+          <w:rFonts w:ascii="Calibri" w:hAnsi="Calibri" w:eastAsia="Calibri" w:cs="Calibri"/>
+        </w:rPr>
         <w:t xml:space="preserve"> </w:t>
       </w:r>
       <w:r>
         <w:rPr>
           <w:b/>
           <w:bCs/>
+          <w:rFonts w:ascii="Calibri" w:hAnsi="Calibri" w:eastAsia="Calibri" w:cs="Calibri"/>
         </w:rPr>
         <w:t xml:space="preserve">NVIDIA RTX 5060Ti</w:t>
       </w:r>
       <w:r>
-        <w:t xml:space="preserve"> </w:t>
-      </w:r>
-      <w:r>
+        <w:rPr>
+          <w:rFonts w:ascii="Calibri" w:hAnsi="Calibri" w:eastAsia="Calibri" w:cs="Calibri"/>
+        </w:rPr>
+        <w:t xml:space="preserve"> </w:t>
+      </w:r>
+      <w:r>
+        <w:rPr>
+          <w:rFonts w:ascii="Calibri" w:hAnsi="Calibri" w:eastAsia="Calibri" w:cs="Calibri"/>
+        </w:rPr>
         <w:t xml:space="preserve">và</w:t>
       </w:r>
       <w:r>
+        <w:rPr>
+          <w:rFonts w:ascii="Calibri" w:hAnsi="Calibri" w:eastAsia="Calibri" w:cs="Calibri"/>
+        </w:rPr>
         <w:t xml:space="preserve"> </w:t>
       </w:r>
       <w:r>
         <w:rPr>
           <w:b/>
           <w:bCs/>
+          <w:rFonts w:ascii="Calibri" w:hAnsi="Calibri" w:eastAsia="Calibri" w:cs="Calibri"/>
         </w:rPr>
         <w:t xml:space="preserve">32GB RAM</w:t>
       </w:r>
       <w:r>
+        <w:rPr>
+          <w:rFonts w:ascii="Calibri" w:hAnsi="Calibri" w:eastAsia="Calibri" w:cs="Calibri"/>
+        </w:rPr>
         <w:t xml:space="preserve">:</w:t>
       </w:r>
     </w:p>
-    <w:bookmarkStart w:id="20" w:name="X9d6880069b10d2094705e346a94adfe48143a73"/>
+    <w:bookmarkStart w:id="19" w:name="X9d6880069b10d2094705e346a94adfe48143a73"/>
     <w:p>
       <w:pPr>
         <w:pStyle w:val="Heading3"/>
       </w:pPr>
       <w:r>
+        <w:rPr>
+          <w:rFonts w:ascii="Calibri" w:hAnsi="Calibri" w:eastAsia="Calibri" w:cs="Calibri"/>
+        </w:rPr>
         <w:t xml:space="preserve">3.1. Thích ứng bộ nhớ VRAM động (Dynamic Memory Profile)</w:t>
       </w:r>
     </w:p>
@@ -861,9 +1166,15 @@
         <w:pStyle w:val="FirstParagraph"/>
       </w:pPr>
       <w:r>
-        <w:t xml:space="preserve">Hệ thống tự động phát hiện thông số bộ nhớ GPU khi khởi động. Với RTX 5060Ti (VRAM</w:t>
-      </w:r>
-      <w:r>
+        <w:rPr>
+          <w:rFonts w:ascii="Calibri" w:hAnsi="Calibri" w:eastAsia="Calibri" w:cs="Calibri"/>
+        </w:rPr>
+        <w:t xml:space="preserve">Đối với card RTX 5060Ti (dung lượng VRAM</w:t>
+      </w:r>
+      <w:r>
+        <w:rPr>
+          <w:rFonts w:ascii="Calibri" w:hAnsi="Calibri" w:eastAsia="Calibri" w:cs="Calibri"/>
+        </w:rPr>
         <w:t xml:space="preserve"> </w:t>
       </w:r>
       <m:oMath>
@@ -878,73 +1189,121 @@
         </m:r>
       </m:oMath>
       <w:r>
-        <w:t xml:space="preserve"> </w:t>
-      </w:r>
-      <w:r>
-        <w:t xml:space="preserve">GB), Agent tự động kích hoạt cấu hình giới hạn an toàn:</w:t>
-      </w:r>
-      <w:r>
-        <w:t xml:space="preserve"> </w:t>
-      </w:r>
-      <w:r>
+        <w:rPr>
+          <w:rFonts w:ascii="Calibri" w:hAnsi="Calibri" w:eastAsia="Calibri" w:cs="Calibri"/>
+        </w:rPr>
+        <w:t xml:space="preserve"> </w:t>
+      </w:r>
+      <w:r>
+        <w:rPr>
+          <w:rFonts w:ascii="Calibri" w:hAnsi="Calibri" w:eastAsia="Calibri" w:cs="Calibri"/>
+        </w:rPr>
+        <w:t xml:space="preserve">GB), hệ thống tự động thiết lập cấu hình giới hạn an toàn:</w:t>
+      </w:r>
+      <w:r>
+        <w:rPr>
+          <w:rFonts w:ascii="Calibri" w:hAnsi="Calibri" w:eastAsia="Calibri" w:cs="Calibri"/>
+        </w:rPr>
+        <w:t xml:space="preserve"> </w:t>
+      </w:r>
+      <w:r>
+        <w:rPr>
+          <w:rFonts w:ascii="Calibri" w:hAnsi="Calibri" w:eastAsia="Calibri" w:cs="Calibri"/>
+        </w:rPr>
         <w:t xml:space="preserve">*</w:t>
       </w:r>
       <w:r>
+        <w:rPr>
+          <w:rFonts w:ascii="Calibri" w:hAnsi="Calibri" w:eastAsia="Calibri" w:cs="Calibri"/>
+        </w:rPr>
         <w:t xml:space="preserve"> </w:t>
       </w:r>
       <w:r>
         <w:rPr>
           <w:rStyle w:val="VerbatimChar"/>
+          <w:rFonts w:ascii="Calibri" w:hAnsi="Calibri" w:eastAsia="Calibri" w:cs="Calibri"/>
         </w:rPr>
         <w:t xml:space="preserve">gpu_memory_utilization = 0.85</w:t>
       </w:r>
       <w:r>
-        <w:t xml:space="preserve">: Dành lại 15% VRAM trống làm bộ nhớ đệm an toàn cho driver đồ họa hiển thị trên desktop, tránh hoàn toàn lỗi tràn bộ nhớ VRAM.</w:t>
-      </w:r>
-      <w:r>
-        <w:t xml:space="preserve"> </w:t>
-      </w:r>
-      <w:r>
+        <w:rPr>
+          <w:rFonts w:ascii="Calibri" w:hAnsi="Calibri" w:eastAsia="Calibri" w:cs="Calibri"/>
+        </w:rPr>
+        <w:t xml:space="preserve">: Giữ lại 15% VRAM trống làm bộ nhớ đệm an toàn cho driver đồ họa hiển thị của hệ điều hành, ngăn ngừa hoàn toàn lỗi tràn bộ nhớ VRAM.</w:t>
+      </w:r>
+      <w:r>
+        <w:rPr>
+          <w:rFonts w:ascii="Calibri" w:hAnsi="Calibri" w:eastAsia="Calibri" w:cs="Calibri"/>
+        </w:rPr>
+        <w:t xml:space="preserve"> </w:t>
+      </w:r>
+      <w:r>
+        <w:rPr>
+          <w:rFonts w:ascii="Calibri" w:hAnsi="Calibri" w:eastAsia="Calibri" w:cs="Calibri"/>
+        </w:rPr>
         <w:t xml:space="preserve">*</w:t>
       </w:r>
       <w:r>
+        <w:rPr>
+          <w:rFonts w:ascii="Calibri" w:hAnsi="Calibri" w:eastAsia="Calibri" w:cs="Calibri"/>
+        </w:rPr>
         <w:t xml:space="preserve"> </w:t>
       </w:r>
       <w:r>
         <w:rPr>
           <w:rStyle w:val="VerbatimChar"/>
+          <w:rFonts w:ascii="Calibri" w:hAnsi="Calibri" w:eastAsia="Calibri" w:cs="Calibri"/>
         </w:rPr>
         <w:t xml:space="preserve">max_num_seqs = 16</w:t>
       </w:r>
       <w:r>
-        <w:t xml:space="preserve">: Giới hạn hàng đợi scheduler của vLLM để tiết kiệm bộ nhớ đệm KV Cache nhưng vẫn đảm bảo đủ không gian chạy song song các luồng biểu quyết.</w:t>
-      </w:r>
-      <w:r>
-        <w:t xml:space="preserve"> </w:t>
-      </w:r>
-      <w:r>
+        <w:rPr>
+          <w:rFonts w:ascii="Calibri" w:hAnsi="Calibri" w:eastAsia="Calibri" w:cs="Calibri"/>
+        </w:rPr>
+        <w:t xml:space="preserve">: Giới hạn số lượng sequence hoạt động đồng thời trong scheduler để tiết kiệm KV Cache, đồng thời vẫn đáp ứng hoàn hảo việc chạy song song các luồng biểu quyết.</w:t>
+      </w:r>
+      <w:r>
+        <w:rPr>
+          <w:rFonts w:ascii="Calibri" w:hAnsi="Calibri" w:eastAsia="Calibri" w:cs="Calibri"/>
+        </w:rPr>
+        <w:t xml:space="preserve"> </w:t>
+      </w:r>
+      <w:r>
+        <w:rPr>
+          <w:rFonts w:ascii="Calibri" w:hAnsi="Calibri" w:eastAsia="Calibri" w:cs="Calibri"/>
+        </w:rPr>
         <w:t xml:space="preserve">*</w:t>
       </w:r>
       <w:r>
+        <w:rPr>
+          <w:rFonts w:ascii="Calibri" w:hAnsi="Calibri" w:eastAsia="Calibri" w:cs="Calibri"/>
+        </w:rPr>
         <w:t xml:space="preserve"> </w:t>
       </w:r>
       <w:r>
         <w:rPr>
           <w:rStyle w:val="VerbatimChar"/>
+          <w:rFonts w:ascii="Calibri" w:hAnsi="Calibri" w:eastAsia="Calibri" w:cs="Calibri"/>
         </w:rPr>
         <w:t xml:space="preserve">max_num_batched_tokens = 2048</w:t>
       </w:r>
       <w:r>
-        <w:t xml:space="preserve">: Hạn chế số lượng token tối đa trong một bước batching để kiểm soát bộ nhớ đỉnh (Peak Memory).</w:t>
-      </w:r>
-    </w:p>
-    <w:bookmarkEnd w:id="20"/>
-    <w:bookmarkStart w:id="21" w:name="quản-lý-ram-vật-lý-system-ram-32gb"/>
+        <w:rPr>
+          <w:rFonts w:ascii="Calibri" w:hAnsi="Calibri" w:eastAsia="Calibri" w:cs="Calibri"/>
+        </w:rPr>
+        <w:t xml:space="preserve">: Kiểm soát số lượng token tối đa trong một bước batching để kiểm soát bộ nhớ đỉnh (Peak Memory).</w:t>
+      </w:r>
+    </w:p>
+    <w:bookmarkEnd w:id="19"/>
+    <w:bookmarkStart w:id="20" w:name="quản-lý-ram-vật-lý-system-ram-32gb"/>
     <w:p>
       <w:pPr>
         <w:pStyle w:val="Heading3"/>
       </w:pPr>
       <w:r>
+        <w:rPr>
+          <w:rFonts w:ascii="Calibri" w:hAnsi="Calibri" w:eastAsia="Calibri" w:cs="Calibri"/>
+        </w:rPr>
         <w:t xml:space="preserve">3.2. Quản lý RAM vật lý (System RAM 32GB)</w:t>
       </w:r>
     </w:p>
@@ -953,60 +1312,93 @@
         <w:pStyle w:val="FirstParagraph"/>
       </w:pPr>
       <w:r>
+        <w:rPr>
+          <w:rFonts w:ascii="Calibri" w:hAnsi="Calibri" w:eastAsia="Calibri" w:cs="Calibri"/>
+        </w:rPr>
         <w:t xml:space="preserve">Mô hình</w:t>
       </w:r>
       <w:r>
+        <w:rPr>
+          <w:rFonts w:ascii="Calibri" w:hAnsi="Calibri" w:eastAsia="Calibri" w:cs="Calibri"/>
+        </w:rPr>
         <w:t xml:space="preserve"> </w:t>
       </w:r>
       <w:r>
         <w:rPr>
           <w:rStyle w:val="VerbatimChar"/>
+          <w:rFonts w:ascii="Calibri" w:hAnsi="Calibri" w:eastAsia="Calibri" w:cs="Calibri"/>
         </w:rPr>
         <w:t xml:space="preserve">Qwen3.5-4B-AWQ-4bit</w:t>
       </w:r>
       <w:r>
-        <w:t xml:space="preserve"> </w:t>
-      </w:r>
-      <w:r>
-        <w:t xml:space="preserve">có kích thước tệp trọng số là</w:t>
-      </w:r>
-      <w:r>
+        <w:rPr>
+          <w:rFonts w:ascii="Calibri" w:hAnsi="Calibri" w:eastAsia="Calibri" w:cs="Calibri"/>
+        </w:rPr>
+        <w:t xml:space="preserve"> </w:t>
+      </w:r>
+      <w:r>
+        <w:rPr>
+          <w:rFonts w:ascii="Calibri" w:hAnsi="Calibri" w:eastAsia="Calibri" w:cs="Calibri"/>
+        </w:rPr>
+        <w:t xml:space="preserve">có dung lượng tệp trọng số là</w:t>
+      </w:r>
+      <w:r>
+        <w:rPr>
+          <w:rFonts w:ascii="Calibri" w:hAnsi="Calibri" w:eastAsia="Calibri" w:cs="Calibri"/>
+        </w:rPr>
         <w:t xml:space="preserve"> </w:t>
       </w:r>
       <w:r>
         <w:rPr>
           <w:b/>
           <w:bCs/>
+          <w:rFonts w:ascii="Calibri" w:hAnsi="Calibri" w:eastAsia="Calibri" w:cs="Calibri"/>
         </w:rPr>
         <w:t xml:space="preserve">3.8GB</w:t>
       </w:r>
       <w:r>
-        <w:t xml:space="preserve">. Khi khởi động, tiến trình chỉ tiêu tốn tối đa</w:t>
-      </w:r>
-      <w:r>
+        <w:rPr>
+          <w:rFonts w:ascii="Calibri" w:hAnsi="Calibri" w:eastAsia="Calibri" w:cs="Calibri"/>
+        </w:rPr>
+        <w:t xml:space="preserve">. Khi khởi động, tiến trình nạp mô hình chỉ tiêu tốn tối đa</w:t>
+      </w:r>
+      <w:r>
+        <w:rPr>
+          <w:rFonts w:ascii="Calibri" w:hAnsi="Calibri" w:eastAsia="Calibri" w:cs="Calibri"/>
+        </w:rPr>
         <w:t xml:space="preserve"> </w:t>
       </w:r>
       <w:r>
         <w:rPr>
           <w:b/>
           <w:bCs/>
+          <w:rFonts w:ascii="Calibri" w:hAnsi="Calibri" w:eastAsia="Calibri" w:cs="Calibri"/>
         </w:rPr>
         <w:t xml:space="preserve">6GB RAM hệ thống</w:t>
       </w:r>
       <w:r>
-        <w:t xml:space="preserve"> </w:t>
-      </w:r>
-      <w:r>
-        <w:t xml:space="preserve">để nạp và chuyển mô hình vào GPU. Do đó, hệ thống hoàn toàn hoạt động ổn định và dư thừa tài nguyên trên cấu hình 32GB RAM của BTC.</w:t>
-      </w:r>
-    </w:p>
-    <w:bookmarkEnd w:id="21"/>
-    <w:bookmarkStart w:id="22" w:name="flashattention-và-prefix-caching"/>
+        <w:rPr>
+          <w:rFonts w:ascii="Calibri" w:hAnsi="Calibri" w:eastAsia="Calibri" w:cs="Calibri"/>
+        </w:rPr>
+        <w:t xml:space="preserve"> </w:t>
+      </w:r>
+      <w:r>
+        <w:rPr>
+          <w:rFonts w:ascii="Calibri" w:hAnsi="Calibri" w:eastAsia="Calibri" w:cs="Calibri"/>
+        </w:rPr>
+        <w:t xml:space="preserve">trước khi đẩy vào VRAM của GPU. Vì vậy, hệ thống hoàn toàn dư thừa tài nguyên và hoạt động cực kỳ ổn định trên cấu hình 32GB RAM của BTC.</w:t>
+      </w:r>
+    </w:p>
+    <w:bookmarkEnd w:id="20"/>
+    <w:bookmarkStart w:id="21" w:name="flashattention-và-prefix-caching"/>
     <w:p>
       <w:pPr>
         <w:pStyle w:val="Heading3"/>
       </w:pPr>
       <w:r>
+        <w:rPr>
+          <w:rFonts w:ascii="Calibri" w:hAnsi="Calibri" w:eastAsia="Calibri" w:cs="Calibri"/>
+        </w:rPr>
         <w:t xml:space="preserve">3.3. FlashAttention và Prefix Caching</w:t>
       </w:r>
     </w:p>
@@ -1015,18 +1407,22 @@
         <w:pStyle w:val="Compact"/>
         <w:numPr>
           <w:ilvl w:val="0"/>
-          <w:numId w:val="1001"/>
+          <w:numId w:val="1003"/>
         </w:numPr>
       </w:pPr>
       <w:r>
         <w:rPr>
           <w:b/>
           <w:bCs/>
+          <w:rFonts w:ascii="Calibri" w:hAnsi="Calibri" w:eastAsia="Calibri" w:cs="Calibri"/>
         </w:rPr>
         <w:t xml:space="preserve">FLASH_ATTN Backend</w:t>
       </w:r>
       <w:r>
-        <w:t xml:space="preserve">: Sử dụng attention backend FlashAttention-2 thay thế cho FlashInfer để loại bỏ yêu cầu biên dịch JIT runtime (nvcc), đảm bảo Docker container chạy ổn định và tương thích hoàn toàn với GPU RTX 5060Ti.</w:t>
+        <w:rPr>
+          <w:rFonts w:ascii="Calibri" w:hAnsi="Calibri" w:eastAsia="Calibri" w:cs="Calibri"/>
+        </w:rPr>
+        <w:t xml:space="preserve">: Sử dụng attention backend FlashAttention-2 thay thế cho FlashInfer để loại bỏ yêu cầu biên dịch JIT runtime (nvcc), đảm bảo Docker container khởi động tức thì và chạy ổn định trên GPU RTX 5060Ti.</w:t>
       </w:r>
     </w:p>
     <w:p>
@@ -1034,51 +1430,71 @@
         <w:pStyle w:val="Compact"/>
         <w:numPr>
           <w:ilvl w:val="0"/>
-          <w:numId w:val="1001"/>
+          <w:numId w:val="1003"/>
         </w:numPr>
       </w:pPr>
       <w:r>
         <w:rPr>
           <w:b/>
           <w:bCs/>
+          <w:rFonts w:ascii="Calibri" w:hAnsi="Calibri" w:eastAsia="Calibri" w:cs="Calibri"/>
         </w:rPr>
         <w:t xml:space="preserve">vLLM Prefix Caching</w:t>
       </w:r>
       <w:r>
+        <w:rPr>
+          <w:rFonts w:ascii="Calibri" w:hAnsi="Calibri" w:eastAsia="Calibri" w:cs="Calibri"/>
+        </w:rPr>
         <w:t xml:space="preserve">: Kích hoạt</w:t>
       </w:r>
       <w:r>
+        <w:rPr>
+          <w:rFonts w:ascii="Calibri" w:hAnsi="Calibri" w:eastAsia="Calibri" w:cs="Calibri"/>
+        </w:rPr>
         <w:t xml:space="preserve"> </w:t>
       </w:r>
       <w:r>
         <w:rPr>
           <w:rStyle w:val="VerbatimChar"/>
+          <w:rFonts w:ascii="Calibri" w:hAnsi="Calibri" w:eastAsia="Calibri" w:cs="Calibri"/>
         </w:rPr>
         <w:t xml:space="preserve">enable_prefix_caching=True</w:t>
       </w:r>
       <w:r>
-        <w:t xml:space="preserve"> </w:t>
-      </w:r>
-      <w:r>
-        <w:t xml:space="preserve">để vLLM tự động lưu trữ và chia sẻ KV Cache phần prompt ngữ cảnh dùng chung giữa các luồng biểu quyết, giảm tải Prefill lặp lại và đẩy tốc độ sinh lên tối đa.</w:t>
-      </w:r>
-    </w:p>
-    <w:p>
-      <w:r>
+        <w:rPr>
+          <w:rFonts w:ascii="Calibri" w:hAnsi="Calibri" w:eastAsia="Calibri" w:cs="Calibri"/>
+        </w:rPr>
+        <w:t xml:space="preserve"> </w:t>
+      </w:r>
+      <w:r>
+        <w:rPr>
+          <w:rFonts w:ascii="Calibri" w:hAnsi="Calibri" w:eastAsia="Calibri" w:cs="Calibri"/>
+        </w:rPr>
+        <w:t xml:space="preserve">để vLLM chia sẻ dữ liệu bộ nhớ đệm KV Cache của prompt ngữ cảnh dùng chung giữa các luồng biểu quyết, giảm thiểu tải Prefill lặp lại và đẩy tốc độ sinh lên mức tối đa.</w:t>
+      </w:r>
+    </w:p>
+    <w:p>
+      <w:r>
+        <w:rPr>
+          <w:rFonts w:ascii="Calibri" w:hAnsi="Calibri" w:eastAsia="Calibri" w:cs="Calibri"/>
+        </w:rPr>
         <w:pict>
           <v:rect style="width:0;height:1.5pt" o:hralign="center" o:hrstd="t" o:hr="t"/>
         </w:pict>
       </w:r>
     </w:p>
+    <w:bookmarkEnd w:id="21"/>
     <w:bookmarkEnd w:id="22"/>
-    <w:bookmarkEnd w:id="23"/>
-    <w:bookmarkStart w:id="24" w:name="kết-quả-thực-nghiệm-và-đánh-giá"/>
+    <w:bookmarkStart w:id="23" w:name="kết-quả-thực-nghiệm"/>
     <w:p>
       <w:pPr>
         <w:pStyle w:val="Heading2"/>
       </w:pPr>
       <w:r>
-        <w:t xml:space="preserve">4. KẾT QUẢ THỰC NGHIỆM VÀ ĐÁNH GIÁ</w:t>
+        <w:rPr>
+          <w:rFonts w:ascii="Calibri" w:hAnsi="Calibri" w:eastAsia="Calibri" w:cs="Calibri"/>
+        </w:rPr>
+        <w:t xml:space="preserve">4. KẾT QUẢ THỰC NGHIỆM</w:t>
       </w:r>
     </w:p>
     <w:p>
@@ -1086,167 +1502,236 @@
         <w:pStyle w:val="FirstParagraph"/>
       </w:pPr>
       <w:r>
-        <w:t xml:space="preserve">Hệ thống được thử nghiệm thực tế trên toàn bộ 463 câu hỏi của tập Public Test:</w:t>
-      </w:r>
-    </w:p>
-    <w:p>
-      <w:pPr>
-        <w:pStyle w:val="Compact"/>
-        <w:numPr>
-          <w:ilvl w:val="0"/>
-          <w:numId w:val="1002"/>
-        </w:numPr>
-      </w:pPr>
+        <w:rPr>
+          <w:rFonts w:ascii="Calibri" w:hAnsi="Calibri" w:eastAsia="Calibri" w:cs="Calibri"/>
+        </w:rPr>
+        <w:t xml:space="preserve">Giải pháp được đánh giá thực nghiệm trực tiếp trên toàn bộ tập dữ liệu kiểm thử công khai (Public Test) gồm 463 câu hỏi:</w:t>
+      </w:r>
+      <w:r>
+        <w:rPr>
+          <w:rFonts w:ascii="Calibri" w:hAnsi="Calibri" w:eastAsia="Calibri" w:cs="Calibri"/>
+        </w:rPr>
+        <w:t xml:space="preserve"> </w:t>
+      </w:r>
+      <w:r>
+        <w:rPr>
+          <w:rFonts w:ascii="Calibri" w:hAnsi="Calibri" w:eastAsia="Calibri" w:cs="Calibri"/>
+        </w:rPr>
+        <w:t xml:space="preserve">*</w:t>
+      </w:r>
+      <w:r>
+        <w:rPr>
+          <w:rFonts w:ascii="Calibri" w:hAnsi="Calibri" w:eastAsia="Calibri" w:cs="Calibri"/>
+        </w:rPr>
+        <w:t xml:space="preserve"> </w:t>
+      </w:r>
       <w:r>
         <w:rPr>
           <w:b/>
           <w:bCs/>
+          <w:rFonts w:ascii="Calibri" w:hAnsi="Calibri" w:eastAsia="Calibri" w:cs="Calibri"/>
         </w:rPr>
         <w:t xml:space="preserve">Độ chính xác (Accuracy)</w:t>
       </w:r>
       <w:r>
-        <w:t xml:space="preserve">: Đạt tỷ lệ chính xác vượt trội</w:t>
-      </w:r>
-      <w:r>
+        <w:rPr>
+          <w:rFonts w:ascii="Calibri" w:hAnsi="Calibri" w:eastAsia="Calibri" w:cs="Calibri"/>
+        </w:rPr>
+        <w:t xml:space="preserve">: Đạt tỷ lệ chính xác cao</w:t>
+      </w:r>
+      <w:r>
+        <w:rPr>
+          <w:rFonts w:ascii="Calibri" w:hAnsi="Calibri" w:eastAsia="Calibri" w:cs="Calibri"/>
+        </w:rPr>
         <w:t xml:space="preserve"> </w:t>
       </w:r>
       <w:r>
         <w:rPr>
           <w:b/>
           <w:bCs/>
+          <w:rFonts w:ascii="Calibri" w:hAnsi="Calibri" w:eastAsia="Calibri" w:cs="Calibri"/>
         </w:rPr>
         <w:t xml:space="preserve">88.98%</w:t>
       </w:r>
       <w:r>
-        <w:t xml:space="preserve"> </w:t>
-      </w:r>
-      <w:r>
-        <w:t xml:space="preserve">(chỉ sai 51 trên 463 câu hỏi trắc nghiệm đa lĩnh vực phức tạp).</w:t>
-      </w:r>
-    </w:p>
-    <w:p>
-      <w:pPr>
-        <w:pStyle w:val="Compact"/>
-        <w:numPr>
-          <w:ilvl w:val="0"/>
-          <w:numId w:val="1002"/>
-        </w:numPr>
-      </w:pPr>
+        <w:rPr>
+          <w:rFonts w:ascii="Calibri" w:hAnsi="Calibri" w:eastAsia="Calibri" w:cs="Calibri"/>
+        </w:rPr>
+        <w:t xml:space="preserve"> </w:t>
+      </w:r>
+      <w:r>
+        <w:rPr>
+          <w:rFonts w:ascii="Calibri" w:hAnsi="Calibri" w:eastAsia="Calibri" w:cs="Calibri"/>
+        </w:rPr>
+        <w:t xml:space="preserve">(chỉ trả lời sai 51 trên 463 câu hỏi trắc nghiệm đa lĩnh vực phức tạp).</w:t>
+      </w:r>
+      <w:r>
+        <w:rPr>
+          <w:rFonts w:ascii="Calibri" w:hAnsi="Calibri" w:eastAsia="Calibri" w:cs="Calibri"/>
+        </w:rPr>
+        <w:t xml:space="preserve"> </w:t>
+      </w:r>
+      <w:r>
+        <w:rPr>
+          <w:rFonts w:ascii="Calibri" w:hAnsi="Calibri" w:eastAsia="Calibri" w:cs="Calibri"/>
+        </w:rPr>
+        <w:t xml:space="preserve">*</w:t>
+      </w:r>
+      <w:r>
+        <w:rPr>
+          <w:rFonts w:ascii="Calibri" w:hAnsi="Calibri" w:eastAsia="Calibri" w:cs="Calibri"/>
+        </w:rPr>
+        <w:t xml:space="preserve"> </w:t>
+      </w:r>
       <w:r>
         <w:rPr>
           <w:b/>
           <w:bCs/>
+          <w:rFonts w:ascii="Calibri" w:hAnsi="Calibri" w:eastAsia="Calibri" w:cs="Calibri"/>
         </w:rPr>
         <w:t xml:space="preserve">Tốc độ thực thi (Throughput)</w:t>
       </w:r>
       <w:r>
-        <w:t xml:space="preserve">: Hoàn thành suy luận toàn bộ 463 câu trong</w:t>
-      </w:r>
-      <w:r>
+        <w:rPr>
+          <w:rFonts w:ascii="Calibri" w:hAnsi="Calibri" w:eastAsia="Calibri" w:cs="Calibri"/>
+        </w:rPr>
+        <w:t xml:space="preserve">: Hoàn thành suy luận toàn bộ 463 câu hỏi trong</w:t>
+      </w:r>
+      <w:r>
+        <w:rPr>
+          <w:rFonts w:ascii="Calibri" w:hAnsi="Calibri" w:eastAsia="Calibri" w:cs="Calibri"/>
+        </w:rPr>
         <w:t xml:space="preserve"> </w:t>
       </w:r>
       <w:r>
         <w:rPr>
           <w:b/>
           <w:bCs/>
+          <w:rFonts w:ascii="Calibri" w:hAnsi="Calibri" w:eastAsia="Calibri" w:cs="Calibri"/>
         </w:rPr>
         <w:t xml:space="preserve">657.46 giây</w:t>
       </w:r>
       <w:r>
+        <w:rPr>
+          <w:rFonts w:ascii="Calibri" w:hAnsi="Calibri" w:eastAsia="Calibri" w:cs="Calibri"/>
+        </w:rPr>
         <w:t xml:space="preserve">, đạt tốc độ trung bình</w:t>
       </w:r>
       <w:r>
+        <w:rPr>
+          <w:rFonts w:ascii="Calibri" w:hAnsi="Calibri" w:eastAsia="Calibri" w:cs="Calibri"/>
+        </w:rPr>
         <w:t xml:space="preserve"> </w:t>
       </w:r>
       <w:r>
         <w:rPr>
           <w:b/>
           <w:bCs/>
+          <w:rFonts w:ascii="Calibri" w:hAnsi="Calibri" w:eastAsia="Calibri" w:cs="Calibri"/>
         </w:rPr>
         <w:t xml:space="preserve">1.42 giây/câu hỏi</w:t>
       </w:r>
       <w:r>
+        <w:rPr>
+          <w:rFonts w:ascii="Calibri" w:hAnsi="Calibri" w:eastAsia="Calibri" w:cs="Calibri"/>
+        </w:rPr>
         <w:t xml:space="preserve">.</w:t>
       </w:r>
-    </w:p>
-    <w:p>
-      <w:pPr>
-        <w:pStyle w:val="Compact"/>
-        <w:numPr>
-          <w:ilvl w:val="0"/>
-          <w:numId w:val="1002"/>
-        </w:numPr>
-      </w:pPr>
+      <w:r>
+        <w:rPr>
+          <w:rFonts w:ascii="Calibri" w:hAnsi="Calibri" w:eastAsia="Calibri" w:cs="Calibri"/>
+        </w:rPr>
+        <w:t xml:space="preserve"> </w:t>
+      </w:r>
+      <w:r>
+        <w:rPr>
+          <w:rFonts w:ascii="Calibri" w:hAnsi="Calibri" w:eastAsia="Calibri" w:cs="Calibri"/>
+        </w:rPr>
+        <w:t xml:space="preserve">*</w:t>
+      </w:r>
+      <w:r>
+        <w:rPr>
+          <w:rFonts w:ascii="Calibri" w:hAnsi="Calibri" w:eastAsia="Calibri" w:cs="Calibri"/>
+        </w:rPr>
+        <w:t xml:space="preserve"> </w:t>
+      </w:r>
       <w:r>
         <w:rPr>
           <w:b/>
           <w:bCs/>
+          <w:rFonts w:ascii="Calibri" w:hAnsi="Calibri" w:eastAsia="Calibri" w:cs="Calibri"/>
         </w:rPr>
         <w:t xml:space="preserve">Hiệu quả dừng sớm (Early Exit Rate)</w:t>
       </w:r>
       <w:r>
+        <w:rPr>
+          <w:rFonts w:ascii="Calibri" w:hAnsi="Calibri" w:eastAsia="Calibri" w:cs="Calibri"/>
+        </w:rPr>
         <w:t xml:space="preserve">: Đạt tỷ lệ dừng sớm</w:t>
       </w:r>
       <w:r>
+        <w:rPr>
+          <w:rFonts w:ascii="Calibri" w:hAnsi="Calibri" w:eastAsia="Calibri" w:cs="Calibri"/>
+        </w:rPr>
         <w:t xml:space="preserve"> </w:t>
       </w:r>
       <w:r>
         <w:rPr>
           <w:b/>
           <w:bCs/>
+          <w:rFonts w:ascii="Calibri" w:hAnsi="Calibri" w:eastAsia="Calibri" w:cs="Calibri"/>
         </w:rPr>
         <w:t xml:space="preserve">74.3%</w:t>
       </w:r>
       <w:r>
-        <w:t xml:space="preserve"> </w:t>
-      </w:r>
-      <w:r>
-        <w:t xml:space="preserve">trên tổng số câu hỏi, giúp tiết kiệm thời gian xử lý và chứng minh tính hiệu quả của giải thuật phân rã độ khó câu hỏi.</w:t>
-      </w:r>
-    </w:p>
-    <w:p>
-      <w:r>
+        <w:rPr>
+          <w:rFonts w:ascii="Calibri" w:hAnsi="Calibri" w:eastAsia="Calibri" w:cs="Calibri"/>
+        </w:rPr>
+        <w:t xml:space="preserve"> </w:t>
+      </w:r>
+      <w:r>
+        <w:rPr>
+          <w:rFonts w:ascii="Calibri" w:hAnsi="Calibri" w:eastAsia="Calibri" w:cs="Calibri"/>
+        </w:rPr>
+        <w:t xml:space="preserve">trên tổng số câu hỏi, chứng minh thuật toán đã lược bỏ thành công việc sinh biểu quyết cho phần lớn các câu hỏi dễ và trung bình để đẩy tốc độ hệ thống lên mức tối đa.</w:t>
+      </w:r>
+    </w:p>
+    <w:p>
+      <w:r>
+        <w:rPr>
+          <w:rFonts w:ascii="Calibri" w:hAnsi="Calibri" w:eastAsia="Calibri" w:cs="Calibri"/>
+        </w:rPr>
         <w:pict>
           <v:rect style="width:0;height:1.5pt" o:hralign="center" o:hrstd="t" o:hr="t"/>
         </w:pict>
       </w:r>
     </w:p>
+    <w:bookmarkEnd w:id="23"/>
+    <w:bookmarkStart w:id="24" w:name="kết-luận"/>
+    <w:p>
+      <w:pPr>
+        <w:pStyle w:val="Heading2"/>
+      </w:pPr>
+      <w:r>
+        <w:rPr>
+          <w:rFonts w:ascii="Calibri" w:hAnsi="Calibri" w:eastAsia="Calibri" w:cs="Calibri"/>
+        </w:rPr>
+        <w:t xml:space="preserve">5. KẾT LUẬN</w:t>
+      </w:r>
+    </w:p>
+    <w:p>
+      <w:pPr>
+        <w:pStyle w:val="FirstParagraph"/>
+      </w:pPr>
+      <w:r>
+        <w:rPr>
+          <w:rFonts w:ascii="Calibri" w:hAnsi="Calibri" w:eastAsia="Calibri" w:cs="Calibri"/>
+        </w:rPr>
+        <w:t xml:space="preserve">Giải pháp AI Agent của nhóm tác giả đề xuất mang lại độ chính xác suy luận vượt trội cùng hiệu năng thực thi tối ưu. Việc kết hợp chặt chẽ giữa logic thuật toán Logit Margin thích ứng và cấu hình vLLM offline đóng gói trong Docker Container tạo nên một giải pháp hoàn chỉnh, có độ ổn định cực cao và sẵn sàng đáp ứng vòng đánh giá Private Test tiếp theo.</w:t>
+      </w:r>
+    </w:p>
     <w:bookmarkEnd w:id="24"/>
-    <w:bookmarkStart w:id="25" w:name="kết-luận"/>
-    <w:p>
-      <w:pPr>
-        <w:pStyle w:val="Heading2"/>
-      </w:pPr>
-      <w:r>
-        <w:t xml:space="preserve">5. KẾT LUẬN</w:t>
-      </w:r>
-    </w:p>
-    <w:p>
-      <w:pPr>
-        <w:pStyle w:val="FirstParagraph"/>
-      </w:pPr>
-      <w:r>
-        <w:t xml:space="preserve">Giải pháp AI Agent đề xuất của đội thi T1S_KMML đã được thiết kế và kiểm nghiệm kỹ lưỡng, đạt độ chính xác cao và tốc độ tối ưu. Hệ thống hoạt động offline ổn định, tương thích hoàn toàn với cấu hình</w:t>
-      </w:r>
-      <w:r>
-        <w:t xml:space="preserve"> </w:t>
-      </w:r>
-      <w:r>
-        <w:rPr>
-          <w:b/>
-          <w:bCs/>
-        </w:rPr>
-        <w:t xml:space="preserve">NVIDIA RTX 5060Ti, 32GB RAM</w:t>
-      </w:r>
-      <w:r>
-        <w:t xml:space="preserve"> </w:t>
-      </w:r>
-      <w:r>
-        <w:t xml:space="preserve">của BTC và sẵn sàng cho vòng đánh giá Private Test chính thức.</w:t>
-      </w:r>
-    </w:p>
     <w:bookmarkEnd w:id="25"/>
-    <w:bookmarkEnd w:id="26"/>
     <w:sectPr>
       <w:footnotePr>
         <w:numRestart w:val="eachSect"/>
@@ -1357,6 +1842,91 @@
       </w:pPr>
     </w:lvl>
   </w:abstractNum>
+  <w:abstractNum w:abstractNumId="99411">
+    <w:nsid w:val="00A99411"/>
+    <w:multiLevelType w:val="multilevel"/>
+    <w:lvl w:ilvl="0">
+      <w:start w:val="1"/>
+      <w:numFmt w:val="decimal"/>
+      <w:lvlText w:val="%1."/>
+      <w:lvlJc w:val="left"/>
+      <w:pPr>
+        <w:ind w:left="720" w:hanging="360"/>
+      </w:pPr>
+    </w:lvl>
+    <w:lvl w:ilvl="1">
+      <w:start w:val="1"/>
+      <w:numFmt w:val="decimal"/>
+      <w:lvlText w:val="%2."/>
+      <w:lvlJc w:val="left"/>
+      <w:pPr>
+        <w:ind w:left="1440" w:hanging="360"/>
+      </w:pPr>
+    </w:lvl>
+    <w:lvl w:ilvl="2">
+      <w:start w:val="1"/>
+      <w:numFmt w:val="decimal"/>
+      <w:lvlText w:val="%3."/>
+      <w:lvlJc w:val="left"/>
+      <w:pPr>
+        <w:ind w:left="2160" w:hanging="360"/>
+      </w:pPr>
+    </w:lvl>
+    <w:lvl w:ilvl="3">
+      <w:start w:val="1"/>
+      <w:numFmt w:val="decimal"/>
+      <w:lvlText w:val="%4."/>
+      <w:lvlJc w:val="left"/>
+      <w:pPr>
+        <w:ind w:left="2880" w:hanging="360"/>
+      </w:pPr>
+    </w:lvl>
+    <w:lvl w:ilvl="4">
+      <w:start w:val="1"/>
+      <w:numFmt w:val="decimal"/>
+      <w:lvlText w:val="%5."/>
+      <w:lvlJc w:val="left"/>
+      <w:pPr>
+        <w:ind w:left="3600" w:hanging="360"/>
+      </w:pPr>
+    </w:lvl>
+    <w:lvl w:ilvl="5">
+      <w:start w:val="1"/>
+      <w:numFmt w:val="decimal"/>
+      <w:lvlText w:val="%6."/>
+      <w:lvlJc w:val="left"/>
+      <w:pPr>
+        <w:ind w:left="4320" w:hanging="360"/>
+      </w:pPr>
+    </w:lvl>
+    <w:lvl w:ilvl="6">
+      <w:start w:val="1"/>
+      <w:numFmt w:val="decimal"/>
+      <w:lvlText w:val="%7."/>
+      <w:lvlJc w:val="left"/>
+      <w:pPr>
+        <w:ind w:left="5040" w:hanging="360"/>
+      </w:pPr>
+    </w:lvl>
+    <w:lvl w:ilvl="7">
+      <w:start w:val="1"/>
+      <w:numFmt w:val="decimal"/>
+      <w:lvlText w:val="%8."/>
+      <w:lvlJc w:val="left"/>
+      <w:pPr>
+        <w:ind w:left="5760" w:hanging="360"/>
+      </w:pPr>
+    </w:lvl>
+    <w:lvl w:ilvl="8">
+      <w:start w:val="1"/>
+      <w:numFmt w:val="decimal"/>
+      <w:lvlText w:val="%9."/>
+      <w:lvlJc w:val="left"/>
+      <w:pPr>
+        <w:ind w:left="6480" w:hanging="360"/>
+      </w:pPr>
+    </w:lvl>
+  </w:abstractNum>
   <w:abstractNum w:abstractNumId="991">
     <w:nsid w:val="0000A991"/>
     <w:multiLevelType w:val="multilevel"/>
@@ -1464,9 +2034,39 @@
     <w:abstractNumId w:val="990"/>
   </w:num>
   <w:num w:numId="1001">
+    <w:abstractNumId w:val="99411"/>
+    <w:lvlOverride w:ilvl="0">
+      <w:startOverride w:val="1"/>
+    </w:lvlOverride>
+    <w:lvlOverride w:ilvl="1">
+      <w:startOverride w:val="1"/>
+    </w:lvlOverride>
+    <w:lvlOverride w:ilvl="2">
+      <w:startOverride w:val="1"/>
+    </w:lvlOverride>
+    <w:lvlOverride w:ilvl="3">
+      <w:startOverride w:val="1"/>
+    </w:lvlOverride>
+    <w:lvlOverride w:ilvl="4">
+      <w:startOverride w:val="1"/>
+    </w:lvlOverride>
+    <w:lvlOverride w:ilvl="5">
+      <w:startOverride w:val="1"/>
+    </w:lvlOverride>
+    <w:lvlOverride w:ilvl="6">
+      <w:startOverride w:val="1"/>
+    </w:lvlOverride>
+    <w:lvlOverride w:ilvl="7">
+      <w:startOverride w:val="1"/>
+    </w:lvlOverride>
+    <w:lvlOverride w:ilvl="8">
+      <w:startOverride w:val="1"/>
+    </w:lvlOverride>
+  </w:num>
+  <w:num w:numId="1002">
     <w:abstractNumId w:val="991"/>
   </w:num>
-  <w:num w:numId="1002">
+  <w:num w:numId="1003">
     <w:abstractNumId w:val="991"/>
   </w:num>
 </w:numbering>
@@ -1493,6 +2093,9 @@
   <w:style w:default="1" w:styleId="Normal" w:type="paragraph">
     <w:name w:val="Normal"/>
     <w:qFormat/>
+    <w:rPr>
+      <w:rFonts w:ascii="Calibri" w:hAnsi="Calibri"/>
+    </w:rPr>
   </w:style>
   <w:style w:styleId="BodyText" w:type="paragraph">
     <w:name w:val="Body Text"/>
@@ -1665,7 +2268,7 @@
       <w:outlineLvl w:val="0"/>
     </w:pPr>
     <w:rPr>
-      <w:rFonts w:asciiTheme="majorHAnsi" w:cstheme="majorBidi" w:eastAsiaTheme="majorEastAsia" w:hAnsiTheme="majorHAnsi"/>
+      <w:rFonts w:asciiTheme="majorHAnsi" w:cstheme="majorBidi" w:eastAsiaTheme="majorEastAsia" w:hAnsiTheme="majorHAnsi" w:ascii="Calibri" w:hAnsi="Calibri"/>
       <w:color w:themeColor="accent1" w:themeShade="BF" w:val="0F4761"/>
       <w:sz w:val="40"/>
       <w:szCs w:val="40"/>
@@ -1688,7 +2291,7 @@
       <w:outlineLvl w:val="1"/>
     </w:pPr>
     <w:rPr>
-      <w:rFonts w:asciiTheme="majorHAnsi" w:cstheme="majorBidi" w:eastAsiaTheme="majorEastAsia" w:hAnsiTheme="majorHAnsi"/>
+      <w:rFonts w:asciiTheme="majorHAnsi" w:cstheme="majorBidi" w:eastAsiaTheme="majorEastAsia" w:hAnsiTheme="majorHAnsi" w:ascii="Calibri" w:hAnsi="Calibri"/>
       <w:color w:themeColor="accent1" w:themeShade="BF" w:val="0F4761"/>
       <w:sz w:val="32"/>
       <w:szCs w:val="32"/>
@@ -1711,7 +2314,7 @@
       <w:outlineLvl w:val="2"/>
     </w:pPr>
     <w:rPr>
-      <w:rFonts w:cstheme="majorBidi" w:eastAsiaTheme="majorEastAsia"/>
+      <w:rFonts w:cstheme="majorBidi" w:eastAsiaTheme="majorEastAsia" w:ascii="Calibri" w:hAnsi="Calibri"/>
       <w:color w:themeColor="accent1" w:themeShade="BF" w:val="0F4761"/>
       <w:sz w:val="28"/>
       <w:szCs w:val="28"/>
@@ -1734,7 +2337,7 @@
       <w:outlineLvl w:val="3"/>
     </w:pPr>
     <w:rPr>
-      <w:rFonts w:cstheme="majorBidi" w:eastAsiaTheme="majorEastAsia"/>
+      <w:rFonts w:cstheme="majorBidi" w:eastAsiaTheme="majorEastAsia" w:ascii="Calibri" w:hAnsi="Calibri"/>
       <w:i/>
       <w:iCs/>
       <w:color w:themeColor="accent1" w:themeShade="BF" w:val="0F4761"/>

</xml_diff>

<commit_message>
Fix list formatting block structure in DOCX file
</commit_message>
<xml_diff>
--- a/NOP_BAI_T1S_KMML/T1S_KMML_Thuyet_minh_Innovator.docx
+++ b/NOP_BAI_T1S_KMML/T1S_KMML_Thuyet_minh_Innovator.docx
@@ -265,24 +265,15 @@
         </w:rPr>
         <w:t xml:space="preserve">. Điều này đòi hỏi giải pháp phải giải quyết đồng thời hai bài toán:</w:t>
       </w:r>
-      <w:r>
-        <w:rPr>
-          <w:rFonts w:ascii="Calibri" w:hAnsi="Calibri" w:eastAsia="Calibri" w:cs="Calibri"/>
-        </w:rPr>
-        <w:t xml:space="preserve"> </w:t>
-      </w:r>
-      <w:r>
-        <w:rPr>
-          <w:rFonts w:ascii="Calibri" w:hAnsi="Calibri" w:eastAsia="Calibri" w:cs="Calibri"/>
-        </w:rPr>
-        <w:t xml:space="preserve">*</w:t>
-      </w:r>
-      <w:r>
-        <w:rPr>
-          <w:rFonts w:ascii="Calibri" w:hAnsi="Calibri" w:eastAsia="Calibri" w:cs="Calibri"/>
-        </w:rPr>
-        <w:t xml:space="preserve"> </w:t>
-      </w:r>
+    </w:p>
+    <w:p>
+      <w:pPr>
+        <w:pStyle w:val="Compact"/>
+        <w:numPr>
+          <w:ilvl w:val="0"/>
+          <w:numId w:val="1001"/>
+        </w:numPr>
+      </w:pPr>
       <w:r>
         <w:rPr>
           <w:b/>
@@ -297,24 +288,15 @@
         </w:rPr>
         <w:t xml:space="preserve">: Tránh hiện tượng suy luận bị cắt cụt (truncation) hoặc trích xuất nhầm đáp án trong ngữ cảnh tiếng Việt.</w:t>
       </w:r>
-      <w:r>
-        <w:rPr>
-          <w:rFonts w:ascii="Calibri" w:hAnsi="Calibri" w:eastAsia="Calibri" w:cs="Calibri"/>
-        </w:rPr>
-        <w:t xml:space="preserve"> </w:t>
-      </w:r>
-      <w:r>
-        <w:rPr>
-          <w:rFonts w:ascii="Calibri" w:hAnsi="Calibri" w:eastAsia="Calibri" w:cs="Calibri"/>
-        </w:rPr>
-        <w:t xml:space="preserve">*</w:t>
-      </w:r>
-      <w:r>
-        <w:rPr>
-          <w:rFonts w:ascii="Calibri" w:hAnsi="Calibri" w:eastAsia="Calibri" w:cs="Calibri"/>
-        </w:rPr>
-        <w:t xml:space="preserve"> </w:t>
-      </w:r>
+    </w:p>
+    <w:p>
+      <w:pPr>
+        <w:pStyle w:val="Compact"/>
+        <w:numPr>
+          <w:ilvl w:val="0"/>
+          <w:numId w:val="1001"/>
+        </w:numPr>
+      </w:pPr>
       <w:r>
         <w:rPr>
           <w:b/>
@@ -361,7 +343,7 @@
     </w:p>
     <w:p>
       <w:pPr>
-        <w:pStyle w:val="BodyText"/>
+        <w:pStyle w:val="FirstParagraph"/>
       </w:pPr>
       <w:r>
         <w:rPr>
@@ -521,7 +503,7 @@
         <w:pStyle w:val="Compact"/>
         <w:numPr>
           <w:ilvl w:val="0"/>
-          <w:numId w:val="1001"/>
+          <w:numId w:val="1002"/>
         </w:numPr>
       </w:pPr>
       <w:r>
@@ -557,7 +539,7 @@
         <w:pStyle w:val="Compact"/>
         <w:numPr>
           <w:ilvl w:val="0"/>
-          <w:numId w:val="1001"/>
+          <w:numId w:val="1002"/>
         </w:numPr>
       </w:pPr>
       <w:r>
@@ -618,7 +600,7 @@
         <w:pStyle w:val="Compact"/>
         <w:numPr>
           <w:ilvl w:val="0"/>
-          <w:numId w:val="1001"/>
+          <w:numId w:val="1002"/>
         </w:numPr>
       </w:pPr>
       <w:r>
@@ -728,7 +710,7 @@
         <w:pStyle w:val="Compact"/>
         <w:numPr>
           <w:ilvl w:val="1"/>
-          <w:numId w:val="1002"/>
+          <w:numId w:val="1003"/>
         </w:numPr>
       </w:pPr>
       <w:r>
@@ -811,7 +793,7 @@
         <w:pStyle w:val="Compact"/>
         <w:numPr>
           <w:ilvl w:val="1"/>
-          <w:numId w:val="1002"/>
+          <w:numId w:val="1003"/>
         </w:numPr>
       </w:pPr>
       <w:r>
@@ -1200,229 +1182,27 @@
         </w:rPr>
         <w:t xml:space="preserve">GB), hệ thống tự động thiết lập cấu hình giới hạn an toàn:</w:t>
       </w:r>
-      <w:r>
-        <w:rPr>
-          <w:rFonts w:ascii="Calibri" w:hAnsi="Calibri" w:eastAsia="Calibri" w:cs="Calibri"/>
-        </w:rPr>
-        <w:t xml:space="preserve"> </w:t>
-      </w:r>
-      <w:r>
-        <w:rPr>
-          <w:rFonts w:ascii="Calibri" w:hAnsi="Calibri" w:eastAsia="Calibri" w:cs="Calibri"/>
-        </w:rPr>
-        <w:t xml:space="preserve">*</w:t>
-      </w:r>
-      <w:r>
-        <w:rPr>
-          <w:rFonts w:ascii="Calibri" w:hAnsi="Calibri" w:eastAsia="Calibri" w:cs="Calibri"/>
-        </w:rPr>
-        <w:t xml:space="preserve"> </w:t>
-      </w:r>
-      <w:r>
-        <w:rPr>
-          <w:rStyle w:val="VerbatimChar"/>
-          <w:rFonts w:ascii="Calibri" w:hAnsi="Calibri" w:eastAsia="Calibri" w:cs="Calibri"/>
-        </w:rPr>
-        <w:t xml:space="preserve">gpu_memory_utilization = 0.85</w:t>
-      </w:r>
-      <w:r>
-        <w:rPr>
-          <w:rFonts w:ascii="Calibri" w:hAnsi="Calibri" w:eastAsia="Calibri" w:cs="Calibri"/>
-        </w:rPr>
-        <w:t xml:space="preserve">: Giữ lại 15% VRAM trống làm bộ nhớ đệm an toàn cho driver đồ họa hiển thị của hệ điều hành, ngăn ngừa hoàn toàn lỗi tràn bộ nhớ VRAM.</w:t>
-      </w:r>
-      <w:r>
-        <w:rPr>
-          <w:rFonts w:ascii="Calibri" w:hAnsi="Calibri" w:eastAsia="Calibri" w:cs="Calibri"/>
-        </w:rPr>
-        <w:t xml:space="preserve"> </w:t>
-      </w:r>
-      <w:r>
-        <w:rPr>
-          <w:rFonts w:ascii="Calibri" w:hAnsi="Calibri" w:eastAsia="Calibri" w:cs="Calibri"/>
-        </w:rPr>
-        <w:t xml:space="preserve">*</w:t>
-      </w:r>
-      <w:r>
-        <w:rPr>
-          <w:rFonts w:ascii="Calibri" w:hAnsi="Calibri" w:eastAsia="Calibri" w:cs="Calibri"/>
-        </w:rPr>
-        <w:t xml:space="preserve"> </w:t>
-      </w:r>
-      <w:r>
-        <w:rPr>
-          <w:rStyle w:val="VerbatimChar"/>
-          <w:rFonts w:ascii="Calibri" w:hAnsi="Calibri" w:eastAsia="Calibri" w:cs="Calibri"/>
-        </w:rPr>
-        <w:t xml:space="preserve">max_num_seqs = 16</w:t>
-      </w:r>
-      <w:r>
-        <w:rPr>
-          <w:rFonts w:ascii="Calibri" w:hAnsi="Calibri" w:eastAsia="Calibri" w:cs="Calibri"/>
-        </w:rPr>
-        <w:t xml:space="preserve">: Giới hạn số lượng sequence hoạt động đồng thời trong scheduler để tiết kiệm KV Cache, đồng thời vẫn đáp ứng hoàn hảo việc chạy song song các luồng biểu quyết.</w:t>
-      </w:r>
-      <w:r>
-        <w:rPr>
-          <w:rFonts w:ascii="Calibri" w:hAnsi="Calibri" w:eastAsia="Calibri" w:cs="Calibri"/>
-        </w:rPr>
-        <w:t xml:space="preserve"> </w:t>
-      </w:r>
-      <w:r>
-        <w:rPr>
-          <w:rFonts w:ascii="Calibri" w:hAnsi="Calibri" w:eastAsia="Calibri" w:cs="Calibri"/>
-        </w:rPr>
-        <w:t xml:space="preserve">*</w:t>
-      </w:r>
-      <w:r>
-        <w:rPr>
-          <w:rFonts w:ascii="Calibri" w:hAnsi="Calibri" w:eastAsia="Calibri" w:cs="Calibri"/>
-        </w:rPr>
-        <w:t xml:space="preserve"> </w:t>
-      </w:r>
-      <w:r>
-        <w:rPr>
-          <w:rStyle w:val="VerbatimChar"/>
-          <w:rFonts w:ascii="Calibri" w:hAnsi="Calibri" w:eastAsia="Calibri" w:cs="Calibri"/>
-        </w:rPr>
-        <w:t xml:space="preserve">max_num_batched_tokens = 2048</w:t>
-      </w:r>
-      <w:r>
-        <w:rPr>
-          <w:rFonts w:ascii="Calibri" w:hAnsi="Calibri" w:eastAsia="Calibri" w:cs="Calibri"/>
-        </w:rPr>
-        <w:t xml:space="preserve">: Kiểm soát số lượng token tối đa trong một bước batching để kiểm soát bộ nhớ đỉnh (Peak Memory).</w:t>
-      </w:r>
-    </w:p>
-    <w:bookmarkEnd w:id="19"/>
-    <w:bookmarkStart w:id="20" w:name="quản-lý-ram-vật-lý-system-ram-32gb"/>
-    <w:p>
-      <w:pPr>
-        <w:pStyle w:val="Heading3"/>
-      </w:pPr>
-      <w:r>
-        <w:rPr>
-          <w:rFonts w:ascii="Calibri" w:hAnsi="Calibri" w:eastAsia="Calibri" w:cs="Calibri"/>
-        </w:rPr>
-        <w:t xml:space="preserve">3.2. Quản lý RAM vật lý (System RAM 32GB)</w:t>
-      </w:r>
-    </w:p>
-    <w:p>
-      <w:pPr>
-        <w:pStyle w:val="FirstParagraph"/>
-      </w:pPr>
-      <w:r>
-        <w:rPr>
-          <w:rFonts w:ascii="Calibri" w:hAnsi="Calibri" w:eastAsia="Calibri" w:cs="Calibri"/>
-        </w:rPr>
-        <w:t xml:space="preserve">Mô hình</w:t>
-      </w:r>
-      <w:r>
-        <w:rPr>
-          <w:rFonts w:ascii="Calibri" w:hAnsi="Calibri" w:eastAsia="Calibri" w:cs="Calibri"/>
-        </w:rPr>
-        <w:t xml:space="preserve"> </w:t>
-      </w:r>
-      <w:r>
-        <w:rPr>
-          <w:rStyle w:val="VerbatimChar"/>
-          <w:rFonts w:ascii="Calibri" w:hAnsi="Calibri" w:eastAsia="Calibri" w:cs="Calibri"/>
-        </w:rPr>
-        <w:t xml:space="preserve">Qwen3.5-4B-AWQ-4bit</w:t>
-      </w:r>
-      <w:r>
-        <w:rPr>
-          <w:rFonts w:ascii="Calibri" w:hAnsi="Calibri" w:eastAsia="Calibri" w:cs="Calibri"/>
-        </w:rPr>
-        <w:t xml:space="preserve"> </w:t>
-      </w:r>
-      <w:r>
-        <w:rPr>
-          <w:rFonts w:ascii="Calibri" w:hAnsi="Calibri" w:eastAsia="Calibri" w:cs="Calibri"/>
-        </w:rPr>
-        <w:t xml:space="preserve">có dung lượng tệp trọng số là</w:t>
-      </w:r>
-      <w:r>
-        <w:rPr>
-          <w:rFonts w:ascii="Calibri" w:hAnsi="Calibri" w:eastAsia="Calibri" w:cs="Calibri"/>
-        </w:rPr>
-        <w:t xml:space="preserve"> </w:t>
-      </w:r>
-      <w:r>
-        <w:rPr>
-          <w:b/>
-          <w:bCs/>
-          <w:rFonts w:ascii="Calibri" w:hAnsi="Calibri" w:eastAsia="Calibri" w:cs="Calibri"/>
-        </w:rPr>
-        <w:t xml:space="preserve">3.8GB</w:t>
-      </w:r>
-      <w:r>
-        <w:rPr>
-          <w:rFonts w:ascii="Calibri" w:hAnsi="Calibri" w:eastAsia="Calibri" w:cs="Calibri"/>
-        </w:rPr>
-        <w:t xml:space="preserve">. Khi khởi động, tiến trình nạp mô hình chỉ tiêu tốn tối đa</w:t>
-      </w:r>
-      <w:r>
-        <w:rPr>
-          <w:rFonts w:ascii="Calibri" w:hAnsi="Calibri" w:eastAsia="Calibri" w:cs="Calibri"/>
-        </w:rPr>
-        <w:t xml:space="preserve"> </w:t>
-      </w:r>
-      <w:r>
-        <w:rPr>
-          <w:b/>
-          <w:bCs/>
-          <w:rFonts w:ascii="Calibri" w:hAnsi="Calibri" w:eastAsia="Calibri" w:cs="Calibri"/>
-        </w:rPr>
-        <w:t xml:space="preserve">6GB RAM hệ thống</w:t>
-      </w:r>
-      <w:r>
-        <w:rPr>
-          <w:rFonts w:ascii="Calibri" w:hAnsi="Calibri" w:eastAsia="Calibri" w:cs="Calibri"/>
-        </w:rPr>
-        <w:t xml:space="preserve"> </w:t>
-      </w:r>
-      <w:r>
-        <w:rPr>
-          <w:rFonts w:ascii="Calibri" w:hAnsi="Calibri" w:eastAsia="Calibri" w:cs="Calibri"/>
-        </w:rPr>
-        <w:t xml:space="preserve">trước khi đẩy vào VRAM của GPU. Vì vậy, hệ thống hoàn toàn dư thừa tài nguyên và hoạt động cực kỳ ổn định trên cấu hình 32GB RAM của BTC.</w:t>
-      </w:r>
-    </w:p>
-    <w:bookmarkEnd w:id="20"/>
-    <w:bookmarkStart w:id="21" w:name="flashattention-và-prefix-caching"/>
-    <w:p>
-      <w:pPr>
-        <w:pStyle w:val="Heading3"/>
-      </w:pPr>
-      <w:r>
-        <w:rPr>
-          <w:rFonts w:ascii="Calibri" w:hAnsi="Calibri" w:eastAsia="Calibri" w:cs="Calibri"/>
-        </w:rPr>
-        <w:t xml:space="preserve">3.3. FlashAttention và Prefix Caching</w:t>
-      </w:r>
     </w:p>
     <w:p>
       <w:pPr>
         <w:pStyle w:val="Compact"/>
         <w:numPr>
           <w:ilvl w:val="0"/>
-          <w:numId w:val="1003"/>
+          <w:numId w:val="1004"/>
         </w:numPr>
       </w:pPr>
       <w:r>
         <w:rPr>
-          <w:b/>
-          <w:bCs/>
-          <w:rFonts w:ascii="Calibri" w:hAnsi="Calibri" w:eastAsia="Calibri" w:cs="Calibri"/>
-        </w:rPr>
-        <w:t xml:space="preserve">FLASH_ATTN Backend</w:t>
-      </w:r>
-      <w:r>
-        <w:rPr>
-          <w:rFonts w:ascii="Calibri" w:hAnsi="Calibri" w:eastAsia="Calibri" w:cs="Calibri"/>
-        </w:rPr>
-        <w:t xml:space="preserve">: Sử dụng attention backend FlashAttention-2 thay thế cho FlashInfer để loại bỏ yêu cầu biên dịch JIT runtime (nvcc), đảm bảo Docker container khởi động tức thì và chạy ổn định trên GPU RTX 5060Ti.</w:t>
+          <w:rStyle w:val="VerbatimChar"/>
+          <w:rFonts w:ascii="Calibri" w:hAnsi="Calibri" w:eastAsia="Calibri" w:cs="Calibri"/>
+        </w:rPr>
+        <w:t xml:space="preserve">gpu_memory_utilization = 0.85</w:t>
+      </w:r>
+      <w:r>
+        <w:rPr>
+          <w:rFonts w:ascii="Calibri" w:hAnsi="Calibri" w:eastAsia="Calibri" w:cs="Calibri"/>
+        </w:rPr>
+        <w:t xml:space="preserve">: Giữ lại 15% VRAM trống làm bộ nhớ đệm an toàn cho driver đồ họa hiển thị của hệ điều hành, ngăn ngừa hoàn toàn lỗi tràn bộ nhớ VRAM.</w:t>
       </w:r>
     </w:p>
     <w:p>
@@ -1430,7 +1210,182 @@
         <w:pStyle w:val="Compact"/>
         <w:numPr>
           <w:ilvl w:val="0"/>
-          <w:numId w:val="1003"/>
+          <w:numId w:val="1004"/>
+        </w:numPr>
+      </w:pPr>
+      <w:r>
+        <w:rPr>
+          <w:rStyle w:val="VerbatimChar"/>
+          <w:rFonts w:ascii="Calibri" w:hAnsi="Calibri" w:eastAsia="Calibri" w:cs="Calibri"/>
+        </w:rPr>
+        <w:t xml:space="preserve">max_num_seqs = 16</w:t>
+      </w:r>
+      <w:r>
+        <w:rPr>
+          <w:rFonts w:ascii="Calibri" w:hAnsi="Calibri" w:eastAsia="Calibri" w:cs="Calibri"/>
+        </w:rPr>
+        <w:t xml:space="preserve">: Giới hạn số lượng sequence hoạt động đồng thời trong scheduler để tiết kiệm KV Cache, đồng thời vẫn đáp ứng hoàn hảo việc chạy song song các luồng biểu quyết.</w:t>
+      </w:r>
+    </w:p>
+    <w:p>
+      <w:pPr>
+        <w:pStyle w:val="Compact"/>
+        <w:numPr>
+          <w:ilvl w:val="0"/>
+          <w:numId w:val="1004"/>
+        </w:numPr>
+      </w:pPr>
+      <w:r>
+        <w:rPr>
+          <w:rStyle w:val="VerbatimChar"/>
+          <w:rFonts w:ascii="Calibri" w:hAnsi="Calibri" w:eastAsia="Calibri" w:cs="Calibri"/>
+        </w:rPr>
+        <w:t xml:space="preserve">max_num_batched_tokens = 2048</w:t>
+      </w:r>
+      <w:r>
+        <w:rPr>
+          <w:rFonts w:ascii="Calibri" w:hAnsi="Calibri" w:eastAsia="Calibri" w:cs="Calibri"/>
+        </w:rPr>
+        <w:t xml:space="preserve">: Kiểm soát số lượng token tối đa trong một bước batching để kiểm soát bộ nhớ đỉnh (Peak Memory).</w:t>
+      </w:r>
+    </w:p>
+    <w:bookmarkEnd w:id="19"/>
+    <w:bookmarkStart w:id="20" w:name="quản-lý-ram-vật-lý-system-ram-32gb"/>
+    <w:p>
+      <w:pPr>
+        <w:pStyle w:val="Heading3"/>
+      </w:pPr>
+      <w:r>
+        <w:rPr>
+          <w:rFonts w:ascii="Calibri" w:hAnsi="Calibri" w:eastAsia="Calibri" w:cs="Calibri"/>
+        </w:rPr>
+        <w:t xml:space="preserve">3.2. Quản lý RAM vật lý (System RAM 32GB)</w:t>
+      </w:r>
+    </w:p>
+    <w:p>
+      <w:pPr>
+        <w:pStyle w:val="FirstParagraph"/>
+      </w:pPr>
+      <w:r>
+        <w:rPr>
+          <w:rFonts w:ascii="Calibri" w:hAnsi="Calibri" w:eastAsia="Calibri" w:cs="Calibri"/>
+        </w:rPr>
+        <w:t xml:space="preserve">Mô hình</w:t>
+      </w:r>
+      <w:r>
+        <w:rPr>
+          <w:rFonts w:ascii="Calibri" w:hAnsi="Calibri" w:eastAsia="Calibri" w:cs="Calibri"/>
+        </w:rPr>
+        <w:t xml:space="preserve"> </w:t>
+      </w:r>
+      <w:r>
+        <w:rPr>
+          <w:rStyle w:val="VerbatimChar"/>
+          <w:rFonts w:ascii="Calibri" w:hAnsi="Calibri" w:eastAsia="Calibri" w:cs="Calibri"/>
+        </w:rPr>
+        <w:t xml:space="preserve">Qwen3.5-4B-AWQ-4bit</w:t>
+      </w:r>
+      <w:r>
+        <w:rPr>
+          <w:rFonts w:ascii="Calibri" w:hAnsi="Calibri" w:eastAsia="Calibri" w:cs="Calibri"/>
+        </w:rPr>
+        <w:t xml:space="preserve"> </w:t>
+      </w:r>
+      <w:r>
+        <w:rPr>
+          <w:rFonts w:ascii="Calibri" w:hAnsi="Calibri" w:eastAsia="Calibri" w:cs="Calibri"/>
+        </w:rPr>
+        <w:t xml:space="preserve">có dung lượng tệp trọng số là</w:t>
+      </w:r>
+      <w:r>
+        <w:rPr>
+          <w:rFonts w:ascii="Calibri" w:hAnsi="Calibri" w:eastAsia="Calibri" w:cs="Calibri"/>
+        </w:rPr>
+        <w:t xml:space="preserve"> </w:t>
+      </w:r>
+      <w:r>
+        <w:rPr>
+          <w:b/>
+          <w:bCs/>
+          <w:rFonts w:ascii="Calibri" w:hAnsi="Calibri" w:eastAsia="Calibri" w:cs="Calibri"/>
+        </w:rPr>
+        <w:t xml:space="preserve">3.8GB</w:t>
+      </w:r>
+      <w:r>
+        <w:rPr>
+          <w:rFonts w:ascii="Calibri" w:hAnsi="Calibri" w:eastAsia="Calibri" w:cs="Calibri"/>
+        </w:rPr>
+        <w:t xml:space="preserve">. Khi khởi động, tiến trình nạp mô hình chỉ tiêu tốn tối đa</w:t>
+      </w:r>
+      <w:r>
+        <w:rPr>
+          <w:rFonts w:ascii="Calibri" w:hAnsi="Calibri" w:eastAsia="Calibri" w:cs="Calibri"/>
+        </w:rPr>
+        <w:t xml:space="preserve"> </w:t>
+      </w:r>
+      <w:r>
+        <w:rPr>
+          <w:b/>
+          <w:bCs/>
+          <w:rFonts w:ascii="Calibri" w:hAnsi="Calibri" w:eastAsia="Calibri" w:cs="Calibri"/>
+        </w:rPr>
+        <w:t xml:space="preserve">6GB RAM hệ thống</w:t>
+      </w:r>
+      <w:r>
+        <w:rPr>
+          <w:rFonts w:ascii="Calibri" w:hAnsi="Calibri" w:eastAsia="Calibri" w:cs="Calibri"/>
+        </w:rPr>
+        <w:t xml:space="preserve"> </w:t>
+      </w:r>
+      <w:r>
+        <w:rPr>
+          <w:rFonts w:ascii="Calibri" w:hAnsi="Calibri" w:eastAsia="Calibri" w:cs="Calibri"/>
+        </w:rPr>
+        <w:t xml:space="preserve">trước khi đẩy vào VRAM của GPU. Vì vậy, hệ thống hoàn toàn dư thừa tài nguyên và hoạt động cực kỳ ổn định trên cấu hình 32GB RAM của BTC.</w:t>
+      </w:r>
+    </w:p>
+    <w:bookmarkEnd w:id="20"/>
+    <w:bookmarkStart w:id="21" w:name="flashattention-và-prefix-caching"/>
+    <w:p>
+      <w:pPr>
+        <w:pStyle w:val="Heading3"/>
+      </w:pPr>
+      <w:r>
+        <w:rPr>
+          <w:rFonts w:ascii="Calibri" w:hAnsi="Calibri" w:eastAsia="Calibri" w:cs="Calibri"/>
+        </w:rPr>
+        <w:t xml:space="preserve">3.3. FlashAttention và Prefix Caching</w:t>
+      </w:r>
+    </w:p>
+    <w:p>
+      <w:pPr>
+        <w:pStyle w:val="Compact"/>
+        <w:numPr>
+          <w:ilvl w:val="0"/>
+          <w:numId w:val="1005"/>
+        </w:numPr>
+      </w:pPr>
+      <w:r>
+        <w:rPr>
+          <w:b/>
+          <w:bCs/>
+          <w:rFonts w:ascii="Calibri" w:hAnsi="Calibri" w:eastAsia="Calibri" w:cs="Calibri"/>
+        </w:rPr>
+        <w:t xml:space="preserve">FLASH_ATTN Backend</w:t>
+      </w:r>
+      <w:r>
+        <w:rPr>
+          <w:rFonts w:ascii="Calibri" w:hAnsi="Calibri" w:eastAsia="Calibri" w:cs="Calibri"/>
+        </w:rPr>
+        <w:t xml:space="preserve">: Sử dụng attention backend FlashAttention-2 thay thế cho FlashInfer để loại bỏ yêu cầu biên dịch JIT runtime (nvcc), đảm bảo Docker container khởi động tức thì và chạy ổn định trên GPU RTX 5060Ti.</w:t>
+      </w:r>
+    </w:p>
+    <w:p>
+      <w:pPr>
+        <w:pStyle w:val="Compact"/>
+        <w:numPr>
+          <w:ilvl w:val="0"/>
+          <w:numId w:val="1005"/>
         </w:numPr>
       </w:pPr>
       <w:r>
@@ -1507,24 +1462,15 @@
         </w:rPr>
         <w:t xml:space="preserve">Giải pháp được đánh giá thực nghiệm trực tiếp trên toàn bộ tập dữ liệu kiểm thử công khai (Public Test) gồm 463 câu hỏi:</w:t>
       </w:r>
-      <w:r>
-        <w:rPr>
-          <w:rFonts w:ascii="Calibri" w:hAnsi="Calibri" w:eastAsia="Calibri" w:cs="Calibri"/>
-        </w:rPr>
-        <w:t xml:space="preserve"> </w:t>
-      </w:r>
-      <w:r>
-        <w:rPr>
-          <w:rFonts w:ascii="Calibri" w:hAnsi="Calibri" w:eastAsia="Calibri" w:cs="Calibri"/>
-        </w:rPr>
-        <w:t xml:space="preserve">*</w:t>
-      </w:r>
-      <w:r>
-        <w:rPr>
-          <w:rFonts w:ascii="Calibri" w:hAnsi="Calibri" w:eastAsia="Calibri" w:cs="Calibri"/>
-        </w:rPr>
-        <w:t xml:space="preserve"> </w:t>
-      </w:r>
+    </w:p>
+    <w:p>
+      <w:pPr>
+        <w:pStyle w:val="Compact"/>
+        <w:numPr>
+          <w:ilvl w:val="0"/>
+          <w:numId w:val="1006"/>
+        </w:numPr>
+      </w:pPr>
       <w:r>
         <w:rPr>
           <w:b/>
@@ -1565,24 +1511,15 @@
         </w:rPr>
         <w:t xml:space="preserve">(chỉ trả lời sai 51 trên 463 câu hỏi trắc nghiệm đa lĩnh vực phức tạp).</w:t>
       </w:r>
-      <w:r>
-        <w:rPr>
-          <w:rFonts w:ascii="Calibri" w:hAnsi="Calibri" w:eastAsia="Calibri" w:cs="Calibri"/>
-        </w:rPr>
-        <w:t xml:space="preserve"> </w:t>
-      </w:r>
-      <w:r>
-        <w:rPr>
-          <w:rFonts w:ascii="Calibri" w:hAnsi="Calibri" w:eastAsia="Calibri" w:cs="Calibri"/>
-        </w:rPr>
-        <w:t xml:space="preserve">*</w:t>
-      </w:r>
-      <w:r>
-        <w:rPr>
-          <w:rFonts w:ascii="Calibri" w:hAnsi="Calibri" w:eastAsia="Calibri" w:cs="Calibri"/>
-        </w:rPr>
-        <w:t xml:space="preserve"> </w:t>
-      </w:r>
+    </w:p>
+    <w:p>
+      <w:pPr>
+        <w:pStyle w:val="Compact"/>
+        <w:numPr>
+          <w:ilvl w:val="0"/>
+          <w:numId w:val="1006"/>
+        </w:numPr>
+      </w:pPr>
       <w:r>
         <w:rPr>
           <w:b/>
@@ -1637,24 +1574,15 @@
         </w:rPr>
         <w:t xml:space="preserve">.</w:t>
       </w:r>
-      <w:r>
-        <w:rPr>
-          <w:rFonts w:ascii="Calibri" w:hAnsi="Calibri" w:eastAsia="Calibri" w:cs="Calibri"/>
-        </w:rPr>
-        <w:t xml:space="preserve"> </w:t>
-      </w:r>
-      <w:r>
-        <w:rPr>
-          <w:rFonts w:ascii="Calibri" w:hAnsi="Calibri" w:eastAsia="Calibri" w:cs="Calibri"/>
-        </w:rPr>
-        <w:t xml:space="preserve">*</w:t>
-      </w:r>
-      <w:r>
-        <w:rPr>
-          <w:rFonts w:ascii="Calibri" w:hAnsi="Calibri" w:eastAsia="Calibri" w:cs="Calibri"/>
-        </w:rPr>
-        <w:t xml:space="preserve"> </w:t>
-      </w:r>
+    </w:p>
+    <w:p>
+      <w:pPr>
+        <w:pStyle w:val="Compact"/>
+        <w:numPr>
+          <w:ilvl w:val="0"/>
+          <w:numId w:val="1006"/>
+        </w:numPr>
+      </w:pPr>
       <w:r>
         <w:rPr>
           <w:b/>
@@ -1842,6 +1770,109 @@
       </w:pPr>
     </w:lvl>
   </w:abstractNum>
+  <w:abstractNum w:abstractNumId="991">
+    <w:nsid w:val="0000A991"/>
+    <w:multiLevelType w:val="multilevel"/>
+    <w:lvl w:ilvl="0">
+      <w:numFmt w:val="bullet"/>
+      <w:lvlText w:val=""/>
+      <w:lvlJc w:val="left"/>
+      <w:pPr>
+        <w:ind w:left="720" w:hanging="360"/>
+      </w:pPr>
+      <w:rPr>
+        <w:rFonts w:ascii="Symbol" w:hAnsi="Symbol" w:cs="Symbol" w:hint="default"/>
+      </w:rPr>
+    </w:lvl>
+    <w:lvl w:ilvl="1">
+      <w:numFmt w:val="bullet"/>
+      <w:lvlText w:val="o"/>
+      <w:lvlJc w:val="left"/>
+      <w:pPr>
+        <w:ind w:left="1440" w:hanging="360"/>
+      </w:pPr>
+      <w:rPr>
+        <w:rFonts w:ascii="Courier New" w:hAnsi="Courier New" w:cs="Courier New" w:hint="default"/>
+      </w:rPr>
+    </w:lvl>
+    <w:lvl w:ilvl="2">
+      <w:numFmt w:val="bullet"/>
+      <w:lvlText w:val=""/>
+      <w:lvlJc w:val="left"/>
+      <w:pPr>
+        <w:ind w:left="2160" w:hanging="360"/>
+      </w:pPr>
+      <w:rPr>
+        <w:rFonts w:ascii="Wingdings" w:hAnsi="Wingdings" w:cs="Wingdings" w:hint="default"/>
+      </w:rPr>
+    </w:lvl>
+    <w:lvl w:ilvl="3">
+      <w:numFmt w:val="bullet"/>
+      <w:lvlText w:val=""/>
+      <w:lvlJc w:val="left"/>
+      <w:pPr>
+        <w:ind w:left="2880" w:hanging="360"/>
+      </w:pPr>
+      <w:rPr>
+        <w:rFonts w:ascii="Symbol" w:hAnsi="Symbol" w:cs="Symbol" w:hint="default"/>
+      </w:rPr>
+    </w:lvl>
+    <w:lvl w:ilvl="4">
+      <w:numFmt w:val="bullet"/>
+      <w:lvlText w:val="o"/>
+      <w:lvlJc w:val="left"/>
+      <w:pPr>
+        <w:ind w:left="3600" w:hanging="360"/>
+      </w:pPr>
+      <w:rPr>
+        <w:rFonts w:ascii="Courier New" w:hAnsi="Courier New" w:cs="Courier New" w:hint="default"/>
+      </w:rPr>
+    </w:lvl>
+    <w:lvl w:ilvl="5">
+      <w:numFmt w:val="bullet"/>
+      <w:lvlText w:val=""/>
+      <w:lvlJc w:val="left"/>
+      <w:pPr>
+        <w:ind w:left="4320" w:hanging="360"/>
+      </w:pPr>
+      <w:rPr>
+        <w:rFonts w:ascii="Wingdings" w:hAnsi="Wingdings" w:cs="Wingdings" w:hint="default"/>
+      </w:rPr>
+    </w:lvl>
+    <w:lvl w:ilvl="6">
+      <w:numFmt w:val="bullet"/>
+      <w:lvlText w:val=""/>
+      <w:lvlJc w:val="left"/>
+      <w:pPr>
+        <w:ind w:left="5040" w:hanging="360"/>
+      </w:pPr>
+      <w:rPr>
+        <w:rFonts w:ascii="Symbol" w:hAnsi="Symbol" w:cs="Symbol" w:hint="default"/>
+      </w:rPr>
+    </w:lvl>
+    <w:lvl w:ilvl="7">
+      <w:numFmt w:val="bullet"/>
+      <w:lvlText w:val="o"/>
+      <w:lvlJc w:val="left"/>
+      <w:pPr>
+        <w:ind w:left="5760" w:hanging="360"/>
+      </w:pPr>
+      <w:rPr>
+        <w:rFonts w:ascii="Courier New" w:hAnsi="Courier New" w:cs="Courier New" w:hint="default"/>
+      </w:rPr>
+    </w:lvl>
+    <w:lvl w:ilvl="8">
+      <w:numFmt w:val="bullet"/>
+      <w:lvlText w:val=""/>
+      <w:lvlJc w:val="left"/>
+      <w:pPr>
+        <w:ind w:left="6480" w:hanging="360"/>
+      </w:pPr>
+      <w:rPr>
+        <w:rFonts w:ascii="Wingdings" w:hAnsi="Wingdings" w:cs="Wingdings" w:hint="default"/>
+      </w:rPr>
+    </w:lvl>
+  </w:abstractNum>
   <w:abstractNum w:abstractNumId="99411">
     <w:nsid w:val="00A99411"/>
     <w:multiLevelType w:val="multilevel"/>
@@ -1927,113 +1958,13 @@
       </w:pPr>
     </w:lvl>
   </w:abstractNum>
-  <w:abstractNum w:abstractNumId="991">
-    <w:nsid w:val="0000A991"/>
-    <w:multiLevelType w:val="multilevel"/>
-    <w:lvl w:ilvl="0">
-      <w:numFmt w:val="bullet"/>
-      <w:lvlText w:val=""/>
-      <w:lvlJc w:val="left"/>
-      <w:pPr>
-        <w:ind w:left="720" w:hanging="360"/>
-      </w:pPr>
-      <w:rPr>
-        <w:rFonts w:ascii="Symbol" w:hAnsi="Symbol" w:cs="Symbol" w:hint="default"/>
-      </w:rPr>
-    </w:lvl>
-    <w:lvl w:ilvl="1">
-      <w:numFmt w:val="bullet"/>
-      <w:lvlText w:val="o"/>
-      <w:lvlJc w:val="left"/>
-      <w:pPr>
-        <w:ind w:left="1440" w:hanging="360"/>
-      </w:pPr>
-      <w:rPr>
-        <w:rFonts w:ascii="Courier New" w:hAnsi="Courier New" w:cs="Courier New" w:hint="default"/>
-      </w:rPr>
-    </w:lvl>
-    <w:lvl w:ilvl="2">
-      <w:numFmt w:val="bullet"/>
-      <w:lvlText w:val=""/>
-      <w:lvlJc w:val="left"/>
-      <w:pPr>
-        <w:ind w:left="2160" w:hanging="360"/>
-      </w:pPr>
-      <w:rPr>
-        <w:rFonts w:ascii="Wingdings" w:hAnsi="Wingdings" w:cs="Wingdings" w:hint="default"/>
-      </w:rPr>
-    </w:lvl>
-    <w:lvl w:ilvl="3">
-      <w:numFmt w:val="bullet"/>
-      <w:lvlText w:val=""/>
-      <w:lvlJc w:val="left"/>
-      <w:pPr>
-        <w:ind w:left="2880" w:hanging="360"/>
-      </w:pPr>
-      <w:rPr>
-        <w:rFonts w:ascii="Symbol" w:hAnsi="Symbol" w:cs="Symbol" w:hint="default"/>
-      </w:rPr>
-    </w:lvl>
-    <w:lvl w:ilvl="4">
-      <w:numFmt w:val="bullet"/>
-      <w:lvlText w:val="o"/>
-      <w:lvlJc w:val="left"/>
-      <w:pPr>
-        <w:ind w:left="3600" w:hanging="360"/>
-      </w:pPr>
-      <w:rPr>
-        <w:rFonts w:ascii="Courier New" w:hAnsi="Courier New" w:cs="Courier New" w:hint="default"/>
-      </w:rPr>
-    </w:lvl>
-    <w:lvl w:ilvl="5">
-      <w:numFmt w:val="bullet"/>
-      <w:lvlText w:val=""/>
-      <w:lvlJc w:val="left"/>
-      <w:pPr>
-        <w:ind w:left="4320" w:hanging="360"/>
-      </w:pPr>
-      <w:rPr>
-        <w:rFonts w:ascii="Wingdings" w:hAnsi="Wingdings" w:cs="Wingdings" w:hint="default"/>
-      </w:rPr>
-    </w:lvl>
-    <w:lvl w:ilvl="6">
-      <w:numFmt w:val="bullet"/>
-      <w:lvlText w:val=""/>
-      <w:lvlJc w:val="left"/>
-      <w:pPr>
-        <w:ind w:left="5040" w:hanging="360"/>
-      </w:pPr>
-      <w:rPr>
-        <w:rFonts w:ascii="Symbol" w:hAnsi="Symbol" w:cs="Symbol" w:hint="default"/>
-      </w:rPr>
-    </w:lvl>
-    <w:lvl w:ilvl="7">
-      <w:numFmt w:val="bullet"/>
-      <w:lvlText w:val="o"/>
-      <w:lvlJc w:val="left"/>
-      <w:pPr>
-        <w:ind w:left="5760" w:hanging="360"/>
-      </w:pPr>
-      <w:rPr>
-        <w:rFonts w:ascii="Courier New" w:hAnsi="Courier New" w:cs="Courier New" w:hint="default"/>
-      </w:rPr>
-    </w:lvl>
-    <w:lvl w:ilvl="8">
-      <w:numFmt w:val="bullet"/>
-      <w:lvlText w:val=""/>
-      <w:lvlJc w:val="left"/>
-      <w:pPr>
-        <w:ind w:left="6480" w:hanging="360"/>
-      </w:pPr>
-      <w:rPr>
-        <w:rFonts w:ascii="Wingdings" w:hAnsi="Wingdings" w:cs="Wingdings" w:hint="default"/>
-      </w:rPr>
-    </w:lvl>
-  </w:abstractNum>
   <w:num w:numId="1000">
     <w:abstractNumId w:val="990"/>
   </w:num>
   <w:num w:numId="1001">
+    <w:abstractNumId w:val="991"/>
+  </w:num>
+  <w:num w:numId="1002">
     <w:abstractNumId w:val="99411"/>
     <w:lvlOverride w:ilvl="0">
       <w:startOverride w:val="1"/>
@@ -2063,10 +1994,16 @@
       <w:startOverride w:val="1"/>
     </w:lvlOverride>
   </w:num>
-  <w:num w:numId="1002">
+  <w:num w:numId="1003">
     <w:abstractNumId w:val="991"/>
   </w:num>
-  <w:num w:numId="1003">
+  <w:num w:numId="1004">
+    <w:abstractNumId w:val="991"/>
+  </w:num>
+  <w:num w:numId="1005">
+    <w:abstractNumId w:val="991"/>
+  </w:num>
+  <w:num w:numId="1006">
     <w:abstractNumId w:val="991"/>
   </w:num>
 </w:numbering>

</xml_diff>

<commit_message>
Update DOCX font to Times New Roman
</commit_message>
<xml_diff>
--- a/NOP_BAI_T1S_KMML/T1S_KMML_Thuyet_minh_Innovator.docx
+++ b/NOP_BAI_T1S_KMML/T1S_KMML_Thuyet_minh_Innovator.docx
@@ -9,7 +9,7 @@
       </w:pPr>
       <w:r>
         <w:rPr>
-          <w:rFonts w:ascii="Calibri" w:hAnsi="Calibri" w:eastAsia="Calibri" w:cs="Calibri"/>
+          <w:rFonts w:ascii="Times New Roman" w:hAnsi="Times New Roman" w:eastAsia="Times New Roman" w:cs="Times New Roman"/>
         </w:rPr>
         <w:t xml:space="preserve">BÁO CÁO THUYẾT MINH GIẢI PHÁP XÂY DỰNG AI AGENT ĐA TÁC VỤ</w:t>
       </w:r>
@@ -21,7 +21,7 @@
       </w:pPr>
       <w:r>
         <w:rPr>
-          <w:rFonts w:ascii="Calibri" w:hAnsi="Calibri" w:eastAsia="Calibri" w:cs="Calibri"/>
+          <w:rFonts w:ascii="Times New Roman" w:hAnsi="Times New Roman" w:eastAsia="Times New Roman" w:cs="Times New Roman"/>
         </w:rPr>
         <w:t xml:space="preserve">Đội thi: Bảng C - Innovator | Tên đội: T1S_KMML</w:t>
       </w:r>
@@ -29,7 +29,7 @@
     <w:p>
       <w:r>
         <w:rPr>
-          <w:rFonts w:ascii="Calibri" w:hAnsi="Calibri" w:eastAsia="Calibri" w:cs="Calibri"/>
+          <w:rFonts w:ascii="Times New Roman" w:hAnsi="Times New Roman" w:eastAsia="Times New Roman" w:cs="Times New Roman"/>
         </w:rPr>
         <w:pict>
           <v:rect style="width:0;height:1.5pt" o:hralign="center" o:hrstd="t" o:hr="t"/>
@@ -44,7 +44,7 @@
       </w:pPr>
       <w:r>
         <w:rPr>
-          <w:rFonts w:ascii="Calibri" w:hAnsi="Calibri" w:eastAsia="Calibri" w:cs="Calibri"/>
+          <w:rFonts w:ascii="Times New Roman" w:hAnsi="Times New Roman" w:eastAsia="Times New Roman" w:cs="Times New Roman"/>
         </w:rPr>
         <w:t xml:space="preserve">TÓM TẮT GIẢI PHÁP</w:t>
       </w:r>
@@ -55,13 +55,13 @@
       </w:pPr>
       <w:r>
         <w:rPr>
-          <w:rFonts w:ascii="Calibri" w:hAnsi="Calibri" w:eastAsia="Calibri" w:cs="Calibri"/>
+          <w:rFonts w:ascii="Times New Roman" w:hAnsi="Times New Roman" w:eastAsia="Times New Roman" w:cs="Times New Roman"/>
         </w:rPr>
         <w:t xml:space="preserve">Báo cáo này thuyết minh giải pháp xây dựng và tối ưu hóa hệ thống AI Agent đa tác vụ sử dụng mô hình ngôn ngữ lớn</w:t>
       </w:r>
       <w:r>
         <w:rPr>
-          <w:rFonts w:ascii="Calibri" w:hAnsi="Calibri" w:eastAsia="Calibri" w:cs="Calibri"/>
+          <w:rFonts w:ascii="Times New Roman" w:hAnsi="Times New Roman" w:eastAsia="Times New Roman" w:cs="Times New Roman"/>
         </w:rPr>
         <w:t xml:space="preserve"> </w:t>
       </w:r>
@@ -69,19 +69,19 @@
         <w:rPr>
           <w:b/>
           <w:bCs/>
-          <w:rFonts w:ascii="Calibri" w:hAnsi="Calibri" w:eastAsia="Calibri" w:cs="Calibri"/>
+          <w:rFonts w:ascii="Times New Roman" w:hAnsi="Times New Roman" w:eastAsia="Times New Roman" w:cs="Times New Roman"/>
         </w:rPr>
         <w:t xml:space="preserve">Qwen3.5-4B-AWQ-4bit</w:t>
       </w:r>
       <w:r>
         <w:rPr>
-          <w:rFonts w:ascii="Calibri" w:hAnsi="Calibri" w:eastAsia="Calibri" w:cs="Calibri"/>
-        </w:rPr>
-        <w:t xml:space="preserve"> </w:t>
-      </w:r>
-      <w:r>
-        <w:rPr>
-          <w:rFonts w:ascii="Calibri" w:hAnsi="Calibri" w:eastAsia="Calibri" w:cs="Calibri"/>
+          <w:rFonts w:ascii="Times New Roman" w:hAnsi="Times New Roman" w:eastAsia="Times New Roman" w:cs="Times New Roman"/>
+        </w:rPr>
+        <w:t xml:space="preserve"> </w:t>
+      </w:r>
+      <w:r>
+        <w:rPr>
+          <w:rFonts w:ascii="Times New Roman" w:hAnsi="Times New Roman" w:eastAsia="Times New Roman" w:cs="Times New Roman"/>
         </w:rPr>
         <w:t xml:space="preserve">để tự động giải quyết các đề thi trắc nghiệm đa ngành. Giải pháp vận hành hoàn toàn ngoại tuyến (100% offline) trong môi trường ảo hóa Docker Container.</w:t>
       </w:r>
@@ -92,13 +92,13 @@
       </w:pPr>
       <w:r>
         <w:rPr>
-          <w:rFonts w:ascii="Calibri" w:hAnsi="Calibri" w:eastAsia="Calibri" w:cs="Calibri"/>
+          <w:rFonts w:ascii="Times New Roman" w:hAnsi="Times New Roman" w:eastAsia="Times New Roman" w:cs="Times New Roman"/>
         </w:rPr>
         <w:t xml:space="preserve">Nhóm tác giả đề xuất kiến trúc suy luận thông minh tích hợp cơ chế</w:t>
       </w:r>
       <w:r>
         <w:rPr>
-          <w:rFonts w:ascii="Calibri" w:hAnsi="Calibri" w:eastAsia="Calibri" w:cs="Calibri"/>
+          <w:rFonts w:ascii="Times New Roman" w:hAnsi="Times New Roman" w:eastAsia="Times New Roman" w:cs="Times New Roman"/>
         </w:rPr>
         <w:t xml:space="preserve"> </w:t>
       </w:r>
@@ -106,13 +106,13 @@
         <w:rPr>
           <w:b/>
           <w:bCs/>
-          <w:rFonts w:ascii="Calibri" w:hAnsi="Calibri" w:eastAsia="Calibri" w:cs="Calibri"/>
+          <w:rFonts w:ascii="Times New Roman" w:hAnsi="Times New Roman" w:eastAsia="Times New Roman" w:cs="Times New Roman"/>
         </w:rPr>
         <w:t xml:space="preserve">Logit Margin Early Exit (Dừng sớm theo độ phân vân)</w:t>
       </w:r>
       <w:r>
         <w:rPr>
-          <w:rFonts w:ascii="Calibri" w:hAnsi="Calibri" w:eastAsia="Calibri" w:cs="Calibri"/>
+          <w:rFonts w:ascii="Times New Roman" w:hAnsi="Times New Roman" w:eastAsia="Times New Roman" w:cs="Times New Roman"/>
         </w:rPr>
         <w:t xml:space="preserve">, kết hợp lập luận Chain-of-Thought (CoT) thích ứng và bộ lọc regex phân biệt chữ hoa/thường nghiêm ngặt. Hệ thống giao tiếp trực tiếp với lớp LLMEngine của vLLM để triển khai cơ chế gối đầu bất đồng bộ (Dynamic Pipelining).</w:t>
       </w:r>
@@ -123,7 +123,7 @@
       </w:pPr>
       <w:r>
         <w:rPr>
-          <w:rFonts w:ascii="Calibri" w:hAnsi="Calibri" w:eastAsia="Calibri" w:cs="Calibri"/>
+          <w:rFonts w:ascii="Times New Roman" w:hAnsi="Times New Roman" w:eastAsia="Times New Roman" w:cs="Times New Roman"/>
         </w:rPr>
         <w:t xml:space="preserve">Cấu hình hệ thống được tối ưu hóa và kiểm nghiệm tương thích hoàn hảo với tài nguyên máy chủ đánh giá của Ban Tổ Chức (</w:t>
       </w:r>
@@ -131,19 +131,19 @@
         <w:rPr>
           <w:b/>
           <w:bCs/>
-          <w:rFonts w:ascii="Calibri" w:hAnsi="Calibri" w:eastAsia="Calibri" w:cs="Calibri"/>
+          <w:rFonts w:ascii="Times New Roman" w:hAnsi="Times New Roman" w:eastAsia="Times New Roman" w:cs="Times New Roman"/>
         </w:rPr>
         <w:t xml:space="preserve">NVIDIA RTX 5060Ti, 32GB RAM</w:t>
       </w:r>
       <w:r>
         <w:rPr>
-          <w:rFonts w:ascii="Calibri" w:hAnsi="Calibri" w:eastAsia="Calibri" w:cs="Calibri"/>
+          <w:rFonts w:ascii="Times New Roman" w:hAnsi="Times New Roman" w:eastAsia="Times New Roman" w:cs="Times New Roman"/>
         </w:rPr>
         <w:t xml:space="preserve">). Kết quả thực nghiệm trên tập Public Test (463 câu hỏi) đạt độ chính xác</w:t>
       </w:r>
       <w:r>
         <w:rPr>
-          <w:rFonts w:ascii="Calibri" w:hAnsi="Calibri" w:eastAsia="Calibri" w:cs="Calibri"/>
+          <w:rFonts w:ascii="Times New Roman" w:hAnsi="Times New Roman" w:eastAsia="Times New Roman" w:cs="Times New Roman"/>
         </w:rPr>
         <w:t xml:space="preserve"> </w:t>
       </w:r>
@@ -151,25 +151,25 @@
         <w:rPr>
           <w:b/>
           <w:bCs/>
-          <w:rFonts w:ascii="Calibri" w:hAnsi="Calibri" w:eastAsia="Calibri" w:cs="Calibri"/>
+          <w:rFonts w:ascii="Times New Roman" w:hAnsi="Times New Roman" w:eastAsia="Times New Roman" w:cs="Times New Roman"/>
         </w:rPr>
         <w:t xml:space="preserve">88.98%</w:t>
       </w:r>
       <w:r>
         <w:rPr>
-          <w:rFonts w:ascii="Calibri" w:hAnsi="Calibri" w:eastAsia="Calibri" w:cs="Calibri"/>
-        </w:rPr>
-        <w:t xml:space="preserve"> </w:t>
-      </w:r>
-      <w:r>
-        <w:rPr>
-          <w:rFonts w:ascii="Calibri" w:hAnsi="Calibri" w:eastAsia="Calibri" w:cs="Calibri"/>
+          <w:rFonts w:ascii="Times New Roman" w:hAnsi="Times New Roman" w:eastAsia="Times New Roman" w:cs="Times New Roman"/>
+        </w:rPr>
+        <w:t xml:space="preserve"> </w:t>
+      </w:r>
+      <w:r>
+        <w:rPr>
+          <w:rFonts w:ascii="Times New Roman" w:hAnsi="Times New Roman" w:eastAsia="Times New Roman" w:cs="Times New Roman"/>
         </w:rPr>
         <w:t xml:space="preserve">với tốc độ xử lý trung bình</w:t>
       </w:r>
       <w:r>
         <w:rPr>
-          <w:rFonts w:ascii="Calibri" w:hAnsi="Calibri" w:eastAsia="Calibri" w:cs="Calibri"/>
+          <w:rFonts w:ascii="Times New Roman" w:hAnsi="Times New Roman" w:eastAsia="Times New Roman" w:cs="Times New Roman"/>
         </w:rPr>
         <w:t xml:space="preserve"> </w:t>
       </w:r>
@@ -177,13 +177,13 @@
         <w:rPr>
           <w:b/>
           <w:bCs/>
-          <w:rFonts w:ascii="Calibri" w:hAnsi="Calibri" w:eastAsia="Calibri" w:cs="Calibri"/>
+          <w:rFonts w:ascii="Times New Roman" w:hAnsi="Times New Roman" w:eastAsia="Times New Roman" w:cs="Times New Roman"/>
         </w:rPr>
         <w:t xml:space="preserve">1.42 giây/câu hỏi</w:t>
       </w:r>
       <w:r>
         <w:rPr>
-          <w:rFonts w:ascii="Calibri" w:hAnsi="Calibri" w:eastAsia="Calibri" w:cs="Calibri"/>
+          <w:rFonts w:ascii="Times New Roman" w:hAnsi="Times New Roman" w:eastAsia="Times New Roman" w:cs="Times New Roman"/>
         </w:rPr>
         <w:t xml:space="preserve">.</w:t>
       </w:r>
@@ -191,7 +191,7 @@
     <w:p>
       <w:r>
         <w:rPr>
-          <w:rFonts w:ascii="Calibri" w:hAnsi="Calibri" w:eastAsia="Calibri" w:cs="Calibri"/>
+          <w:rFonts w:ascii="Times New Roman" w:hAnsi="Times New Roman" w:eastAsia="Times New Roman" w:cs="Times New Roman"/>
         </w:rPr>
         <w:pict>
           <v:rect style="width:0;height:1.5pt" o:hralign="center" o:hrstd="t" o:hr="t"/>
@@ -206,7 +206,7 @@
       </w:pPr>
       <w:r>
         <w:rPr>
-          <w:rFonts w:ascii="Calibri" w:hAnsi="Calibri" w:eastAsia="Calibri" w:cs="Calibri"/>
+          <w:rFonts w:ascii="Times New Roman" w:hAnsi="Times New Roman" w:eastAsia="Times New Roman" w:cs="Times New Roman"/>
         </w:rPr>
         <w:t xml:space="preserve">1. ĐẶT VẤN ĐỀ VÀ LỰA CHỌN MÔ HÌNH NỀN TẢNG</w:t>
       </w:r>
@@ -217,51 +217,51 @@
       </w:pPr>
       <w:r>
         <w:rPr>
-          <w:rFonts w:ascii="Calibri" w:hAnsi="Calibri" w:eastAsia="Calibri" w:cs="Calibri"/>
+          <w:rFonts w:ascii="Times New Roman" w:hAnsi="Times New Roman" w:eastAsia="Times New Roman" w:cs="Times New Roman"/>
         </w:rPr>
         <w:t xml:space="preserve">Thử thách đặt ra tại Bảng C - Innovator yêu cầu AI Agent phải tự động giải quyết chính xác các câu hỏi trắc nghiệm đa ngành có độ phức tạp cao, đồng thời ghi nhận thời gian thực thi tuần tự của từng câu hỏi dưới dạng tệp</w:t>
       </w:r>
       <w:r>
         <w:rPr>
-          <w:rFonts w:ascii="Calibri" w:hAnsi="Calibri" w:eastAsia="Calibri" w:cs="Calibri"/>
+          <w:rFonts w:ascii="Times New Roman" w:hAnsi="Times New Roman" w:eastAsia="Times New Roman" w:cs="Times New Roman"/>
         </w:rPr>
         <w:t xml:space="preserve"> </w:t>
       </w:r>
       <w:r>
         <w:rPr>
           <w:rStyle w:val="VerbatimChar"/>
-          <w:rFonts w:ascii="Calibri" w:hAnsi="Calibri" w:eastAsia="Calibri" w:cs="Calibri"/>
+          <w:rFonts w:ascii="Times New Roman" w:hAnsi="Times New Roman" w:eastAsia="Times New Roman" w:cs="Times New Roman"/>
         </w:rPr>
         <w:t xml:space="preserve">submission.csv</w:t>
       </w:r>
       <w:r>
         <w:rPr>
-          <w:rFonts w:ascii="Calibri" w:hAnsi="Calibri" w:eastAsia="Calibri" w:cs="Calibri"/>
-        </w:rPr>
-        <w:t xml:space="preserve"> </w:t>
-      </w:r>
-      <w:r>
-        <w:rPr>
-          <w:rFonts w:ascii="Calibri" w:hAnsi="Calibri" w:eastAsia="Calibri" w:cs="Calibri"/>
+          <w:rFonts w:ascii="Times New Roman" w:hAnsi="Times New Roman" w:eastAsia="Times New Roman" w:cs="Times New Roman"/>
+        </w:rPr>
+        <w:t xml:space="preserve"> </w:t>
+      </w:r>
+      <w:r>
+        <w:rPr>
+          <w:rFonts w:ascii="Times New Roman" w:hAnsi="Times New Roman" w:eastAsia="Times New Roman" w:cs="Times New Roman"/>
         </w:rPr>
         <w:t xml:space="preserve">và</w:t>
       </w:r>
       <w:r>
         <w:rPr>
-          <w:rFonts w:ascii="Calibri" w:hAnsi="Calibri" w:eastAsia="Calibri" w:cs="Calibri"/>
+          <w:rFonts w:ascii="Times New Roman" w:hAnsi="Times New Roman" w:eastAsia="Times New Roman" w:cs="Times New Roman"/>
         </w:rPr>
         <w:t xml:space="preserve"> </w:t>
       </w:r>
       <w:r>
         <w:rPr>
           <w:rStyle w:val="VerbatimChar"/>
-          <w:rFonts w:ascii="Calibri" w:hAnsi="Calibri" w:eastAsia="Calibri" w:cs="Calibri"/>
+          <w:rFonts w:ascii="Times New Roman" w:hAnsi="Times New Roman" w:eastAsia="Times New Roman" w:cs="Times New Roman"/>
         </w:rPr>
         <w:t xml:space="preserve">submission_time.csv</w:t>
       </w:r>
       <w:r>
         <w:rPr>
-          <w:rFonts w:ascii="Calibri" w:hAnsi="Calibri" w:eastAsia="Calibri" w:cs="Calibri"/>
+          <w:rFonts w:ascii="Times New Roman" w:hAnsi="Times New Roman" w:eastAsia="Times New Roman" w:cs="Times New Roman"/>
         </w:rPr>
         <w:t xml:space="preserve">. Điều này đòi hỏi giải pháp phải giải quyết đồng thời hai bài toán:</w:t>
       </w:r>
@@ -278,13 +278,13 @@
         <w:rPr>
           <w:b/>
           <w:bCs/>
-          <w:rFonts w:ascii="Calibri" w:hAnsi="Calibri" w:eastAsia="Calibri" w:cs="Calibri"/>
+          <w:rFonts w:ascii="Times New Roman" w:hAnsi="Times New Roman" w:eastAsia="Times New Roman" w:cs="Times New Roman"/>
         </w:rPr>
         <w:t xml:space="preserve">Nâng cao chất lượng lập luận logic</w:t>
       </w:r>
       <w:r>
         <w:rPr>
-          <w:rFonts w:ascii="Calibri" w:hAnsi="Calibri" w:eastAsia="Calibri" w:cs="Calibri"/>
+          <w:rFonts w:ascii="Times New Roman" w:hAnsi="Times New Roman" w:eastAsia="Times New Roman" w:cs="Times New Roman"/>
         </w:rPr>
         <w:t xml:space="preserve">: Tránh hiện tượng suy luận bị cắt cụt (truncation) hoặc trích xuất nhầm đáp án trong ngữ cảnh tiếng Việt.</w:t>
       </w:r>
@@ -301,19 +301,19 @@
         <w:rPr>
           <w:b/>
           <w:bCs/>
-          <w:rFonts w:ascii="Calibri" w:hAnsi="Calibri" w:eastAsia="Calibri" w:cs="Calibri"/>
+          <w:rFonts w:ascii="Times New Roman" w:hAnsi="Times New Roman" w:eastAsia="Times New Roman" w:cs="Times New Roman"/>
         </w:rPr>
         <w:t xml:space="preserve">Tối ưu hóa tài nguyên phần cứng</w:t>
       </w:r>
       <w:r>
         <w:rPr>
-          <w:rFonts w:ascii="Calibri" w:hAnsi="Calibri" w:eastAsia="Calibri" w:cs="Calibri"/>
+          <w:rFonts w:ascii="Times New Roman" w:hAnsi="Times New Roman" w:eastAsia="Times New Roman" w:cs="Times New Roman"/>
         </w:rPr>
         <w:t xml:space="preserve">: Đảm bảo hệ thống vận hành ổn định và không xảy ra lỗi tràn bộ nhớ (Out-Of-Memory) trên cấu hình phần cứng RTX 5060Ti (VRAM</w:t>
       </w:r>
       <w:r>
         <w:rPr>
-          <w:rFonts w:ascii="Calibri" w:hAnsi="Calibri" w:eastAsia="Calibri" w:cs="Calibri"/>
+          <w:rFonts w:ascii="Times New Roman" w:hAnsi="Times New Roman" w:eastAsia="Times New Roman" w:cs="Times New Roman"/>
         </w:rPr>
         <w:t xml:space="preserve"> </w:t>
       </w:r>
@@ -330,13 +330,13 @@
       </m:oMath>
       <w:r>
         <w:rPr>
-          <w:rFonts w:ascii="Calibri" w:hAnsi="Calibri" w:eastAsia="Calibri" w:cs="Calibri"/>
-        </w:rPr>
-        <w:t xml:space="preserve"> </w:t>
-      </w:r>
-      <w:r>
-        <w:rPr>
-          <w:rFonts w:ascii="Calibri" w:hAnsi="Calibri" w:eastAsia="Calibri" w:cs="Calibri"/>
+          <w:rFonts w:ascii="Times New Roman" w:hAnsi="Times New Roman" w:eastAsia="Times New Roman" w:cs="Times New Roman"/>
+        </w:rPr>
+        <w:t xml:space="preserve"> </w:t>
+      </w:r>
+      <w:r>
+        <w:rPr>
+          <w:rFonts w:ascii="Times New Roman" w:hAnsi="Times New Roman" w:eastAsia="Times New Roman" w:cs="Times New Roman"/>
         </w:rPr>
         <w:t xml:space="preserve">GB) và 32GB RAM hệ thống.</w:t>
       </w:r>
@@ -347,13 +347,13 @@
       </w:pPr>
       <w:r>
         <w:rPr>
-          <w:rFonts w:ascii="Calibri" w:hAnsi="Calibri" w:eastAsia="Calibri" w:cs="Calibri"/>
+          <w:rFonts w:ascii="Times New Roman" w:hAnsi="Times New Roman" w:eastAsia="Times New Roman" w:cs="Times New Roman"/>
         </w:rPr>
         <w:t xml:space="preserve">Nhóm tác giả đã lựa chọn mô hình lượng tử hóa</w:t>
       </w:r>
       <w:r>
         <w:rPr>
-          <w:rFonts w:ascii="Calibri" w:hAnsi="Calibri" w:eastAsia="Calibri" w:cs="Calibri"/>
+          <w:rFonts w:ascii="Times New Roman" w:hAnsi="Times New Roman" w:eastAsia="Times New Roman" w:cs="Times New Roman"/>
         </w:rPr>
         <w:t xml:space="preserve"> </w:t>
       </w:r>
@@ -361,19 +361,19 @@
         <w:rPr>
           <w:b/>
           <w:bCs/>
-          <w:rFonts w:ascii="Calibri" w:hAnsi="Calibri" w:eastAsia="Calibri" w:cs="Calibri"/>
+          <w:rFonts w:ascii="Times New Roman" w:hAnsi="Times New Roman" w:eastAsia="Times New Roman" w:cs="Times New Roman"/>
         </w:rPr>
         <w:t xml:space="preserve">Qwen3.5-4B-AWQ-4bit</w:t>
       </w:r>
       <w:r>
         <w:rPr>
-          <w:rFonts w:ascii="Calibri" w:hAnsi="Calibri" w:eastAsia="Calibri" w:cs="Calibri"/>
-        </w:rPr>
-        <w:t xml:space="preserve"> </w:t>
-      </w:r>
-      <w:r>
-        <w:rPr>
-          <w:rFonts w:ascii="Calibri" w:hAnsi="Calibri" w:eastAsia="Calibri" w:cs="Calibri"/>
+          <w:rFonts w:ascii="Times New Roman" w:hAnsi="Times New Roman" w:eastAsia="Times New Roman" w:cs="Times New Roman"/>
+        </w:rPr>
+        <w:t xml:space="preserve"> </w:t>
+      </w:r>
+      <w:r>
+        <w:rPr>
+          <w:rFonts w:ascii="Times New Roman" w:hAnsi="Times New Roman" w:eastAsia="Times New Roman" w:cs="Times New Roman"/>
         </w:rPr>
         <w:t xml:space="preserve">(kích thước tệp trọng số ~3.8GB). Lựa chọn này giúp tiết kiệm tối đa dung lượng bộ nhớ đệm KV Cache và VRAM, cho phép chạy với kích thước batch lớn trong khi vẫn bảo toàn năng lực lập luận ngữ cảnh xuất sắc từ kiến trúc Qwen3.5 gốc. Để điều khiển mô hình ngoại tuyến, chúng tôi giao tiếp trực tiếp với lớp API LLMEngine của vLLM để tối ưu hiệu năng.</w:t>
       </w:r>
@@ -381,7 +381,7 @@
     <w:p>
       <w:r>
         <w:rPr>
-          <w:rFonts w:ascii="Calibri" w:hAnsi="Calibri" w:eastAsia="Calibri" w:cs="Calibri"/>
+          <w:rFonts w:ascii="Times New Roman" w:hAnsi="Times New Roman" w:eastAsia="Times New Roman" w:cs="Times New Roman"/>
         </w:rPr>
         <w:pict>
           <v:rect style="width:0;height:1.5pt" o:hralign="center" o:hrstd="t" o:hr="t"/>
@@ -396,7 +396,7 @@
       </w:pPr>
       <w:r>
         <w:rPr>
-          <w:rFonts w:ascii="Calibri" w:hAnsi="Calibri" w:eastAsia="Calibri" w:cs="Calibri"/>
+          <w:rFonts w:ascii="Times New Roman" w:hAnsi="Times New Roman" w:eastAsia="Times New Roman" w:cs="Times New Roman"/>
         </w:rPr>
         <w:t xml:space="preserve">2. PHƯƠNG PHÁP ĐỀ XUẤT VÀ KIẾN TRÚC SUY LUẬN</w:t>
       </w:r>
@@ -408,7 +408,7 @@
       </w:pPr>
       <w:r>
         <w:rPr>
-          <w:rFonts w:ascii="Calibri" w:hAnsi="Calibri" w:eastAsia="Calibri" w:cs="Calibri"/>
+          <w:rFonts w:ascii="Times New Roman" w:hAnsi="Times New Roman" w:eastAsia="Times New Roman" w:cs="Times New Roman"/>
         </w:rPr>
         <w:t xml:space="preserve">2.1. Sơ đồ luồng xử lý (Pipeline Flowchart)</w:t>
       </w:r>
@@ -419,7 +419,7 @@
       </w:pPr>
       <w:r>
         <w:rPr>
-          <w:rFonts w:ascii="Calibri" w:hAnsi="Calibri" w:eastAsia="Calibri" w:cs="Calibri"/>
+          <w:rFonts w:ascii="Times New Roman" w:hAnsi="Times New Roman" w:eastAsia="Times New Roman" w:cs="Times New Roman"/>
         </w:rPr>
         <w:drawing>
           <wp:inline>
@@ -469,7 +469,7 @@
       </w:pPr>
       <w:r>
         <w:rPr>
-          <w:rFonts w:ascii="Calibri" w:hAnsi="Calibri" w:eastAsia="Calibri" w:cs="Calibri"/>
+          <w:rFonts w:ascii="Times New Roman" w:hAnsi="Times New Roman" w:eastAsia="Times New Roman" w:cs="Times New Roman"/>
         </w:rPr>
         <w:t xml:space="preserve">Sơ đồ kiến trúc xử lý của AI Agent</w:t>
       </w:r>
@@ -482,7 +482,7 @@
       </w:pPr>
       <w:r>
         <w:rPr>
-          <w:rFonts w:ascii="Calibri" w:hAnsi="Calibri" w:eastAsia="Calibri" w:cs="Calibri"/>
+          <w:rFonts w:ascii="Times New Roman" w:hAnsi="Times New Roman" w:eastAsia="Times New Roman" w:cs="Times New Roman"/>
         </w:rPr>
         <w:t xml:space="preserve">2.2. Cơ chế quyết định Logit Margin Early Exit</w:t>
       </w:r>
@@ -493,7 +493,7 @@
       </w:pPr>
       <w:r>
         <w:rPr>
-          <w:rFonts w:ascii="Calibri" w:hAnsi="Calibri" w:eastAsia="Calibri" w:cs="Calibri"/>
+          <w:rFonts w:ascii="Times New Roman" w:hAnsi="Times New Roman" w:eastAsia="Times New Roman" w:cs="Times New Roman"/>
         </w:rPr>
         <w:t xml:space="preserve">Để tối ưu hóa thời gian thực thi mà không làm giảm độ chính xác, nhóm tác giả đề xuất giải pháp rẽ nhánh suy luận dựa trên phân phối xác suất đầu ra (logits) của mô hình:</w:t>
       </w:r>
@@ -510,26 +510,26 @@
         <w:rPr>
           <w:b/>
           <w:bCs/>
-          <w:rFonts w:ascii="Calibri" w:hAnsi="Calibri" w:eastAsia="Calibri" w:cs="Calibri"/>
+          <w:rFonts w:ascii="Times New Roman" w:hAnsi="Times New Roman" w:eastAsia="Times New Roman" w:cs="Times New Roman"/>
         </w:rPr>
         <w:t xml:space="preserve">Luồng CoT chính (Luồng 0)</w:t>
       </w:r>
       <w:r>
         <w:rPr>
-          <w:rFonts w:ascii="Calibri" w:hAnsi="Calibri" w:eastAsia="Calibri" w:cs="Calibri"/>
+          <w:rFonts w:ascii="Times New Roman" w:hAnsi="Times New Roman" w:eastAsia="Times New Roman" w:cs="Times New Roman"/>
         </w:rPr>
         <w:t xml:space="preserve">: Hệ thống sinh lập luận Chain-of-Thought đầy đủ cho câu hỏi ở nhiệt độ thấp (</w:t>
       </w:r>
       <w:r>
         <w:rPr>
           <w:rStyle w:val="VerbatimChar"/>
-          <w:rFonts w:ascii="Calibri" w:hAnsi="Calibri" w:eastAsia="Calibri" w:cs="Calibri"/>
+          <w:rFonts w:ascii="Times New Roman" w:hAnsi="Times New Roman" w:eastAsia="Times New Roman" w:cs="Times New Roman"/>
         </w:rPr>
         <w:t xml:space="preserve">temperature=0.2</w:t>
       </w:r>
       <w:r>
         <w:rPr>
-          <w:rFonts w:ascii="Calibri" w:hAnsi="Calibri" w:eastAsia="Calibri" w:cs="Calibri"/>
+          <w:rFonts w:ascii="Times New Roman" w:hAnsi="Times New Roman" w:eastAsia="Times New Roman" w:cs="Times New Roman"/>
         </w:rPr>
         <w:t xml:space="preserve">) nhằm định hướng lập luận logic chặt chẽ.</w:t>
       </w:r>
@@ -546,51 +546,51 @@
         <w:rPr>
           <w:b/>
           <w:bCs/>
-          <w:rFonts w:ascii="Calibri" w:hAnsi="Calibri" w:eastAsia="Calibri" w:cs="Calibri"/>
+          <w:rFonts w:ascii="Times New Roman" w:hAnsi="Times New Roman" w:eastAsia="Times New Roman" w:cs="Times New Roman"/>
         </w:rPr>
         <w:t xml:space="preserve">Kiểm tra độ tự tin (Confidence Check)</w:t>
       </w:r>
       <w:r>
         <w:rPr>
-          <w:rFonts w:ascii="Calibri" w:hAnsi="Calibri" w:eastAsia="Calibri" w:cs="Calibri"/>
+          <w:rFonts w:ascii="Times New Roman" w:hAnsi="Times New Roman" w:eastAsia="Times New Roman" w:cs="Times New Roman"/>
         </w:rPr>
         <w:t xml:space="preserve">: Hệ thống gọi tiếp 1 token chốt đáp án bằng giải thuật Greedy (</w:t>
       </w:r>
       <w:r>
         <w:rPr>
           <w:rStyle w:val="VerbatimChar"/>
-          <w:rFonts w:ascii="Calibri" w:hAnsi="Calibri" w:eastAsia="Calibri" w:cs="Calibri"/>
+          <w:rFonts w:ascii="Times New Roman" w:hAnsi="Times New Roman" w:eastAsia="Times New Roman" w:cs="Times New Roman"/>
         </w:rPr>
         <w:t xml:space="preserve">temperature=0.0</w:t>
       </w:r>
       <w:r>
         <w:rPr>
-          <w:rFonts w:ascii="Calibri" w:hAnsi="Calibri" w:eastAsia="Calibri" w:cs="Calibri"/>
+          <w:rFonts w:ascii="Times New Roman" w:hAnsi="Times New Roman" w:eastAsia="Times New Roman" w:cs="Times New Roman"/>
         </w:rPr>
         <w:t xml:space="preserve">) kèm cấu hình</w:t>
       </w:r>
       <w:r>
         <w:rPr>
-          <w:rFonts w:ascii="Calibri" w:hAnsi="Calibri" w:eastAsia="Calibri" w:cs="Calibri"/>
+          <w:rFonts w:ascii="Times New Roman" w:hAnsi="Times New Roman" w:eastAsia="Times New Roman" w:cs="Times New Roman"/>
         </w:rPr>
         <w:t xml:space="preserve"> </w:t>
       </w:r>
       <w:r>
         <w:rPr>
           <w:rStyle w:val="VerbatimChar"/>
-          <w:rFonts w:ascii="Calibri" w:hAnsi="Calibri" w:eastAsia="Calibri" w:cs="Calibri"/>
+          <w:rFonts w:ascii="Times New Roman" w:hAnsi="Times New Roman" w:eastAsia="Times New Roman" w:cs="Times New Roman"/>
         </w:rPr>
         <w:t xml:space="preserve">logprobs=5</w:t>
       </w:r>
       <w:r>
         <w:rPr>
-          <w:rFonts w:ascii="Calibri" w:hAnsi="Calibri" w:eastAsia="Calibri" w:cs="Calibri"/>
-        </w:rPr>
-        <w:t xml:space="preserve"> </w:t>
-      </w:r>
-      <w:r>
-        <w:rPr>
-          <w:rFonts w:ascii="Calibri" w:hAnsi="Calibri" w:eastAsia="Calibri" w:cs="Calibri"/>
+          <w:rFonts w:ascii="Times New Roman" w:hAnsi="Times New Roman" w:eastAsia="Times New Roman" w:cs="Times New Roman"/>
+        </w:rPr>
+        <w:t xml:space="preserve"> </w:t>
+      </w:r>
+      <w:r>
+        <w:rPr>
+          <w:rFonts w:ascii="Times New Roman" w:hAnsi="Times New Roman" w:eastAsia="Times New Roman" w:cs="Times New Roman"/>
         </w:rPr>
         <w:t xml:space="preserve">để lấy phân phối xác suất của 5 token hàng đầu.</w:t>
       </w:r>
@@ -607,25 +607,25 @@
         <w:rPr>
           <w:b/>
           <w:bCs/>
-          <w:rFonts w:ascii="Calibri" w:hAnsi="Calibri" w:eastAsia="Calibri" w:cs="Calibri"/>
+          <w:rFonts w:ascii="Times New Roman" w:hAnsi="Times New Roman" w:eastAsia="Times New Roman" w:cs="Times New Roman"/>
         </w:rPr>
         <w:t xml:space="preserve">Tính toán Logit Margin</w:t>
       </w:r>
       <w:r>
         <w:rPr>
-          <w:rFonts w:ascii="Calibri" w:hAnsi="Calibri" w:eastAsia="Calibri" w:cs="Calibri"/>
+          <w:rFonts w:ascii="Times New Roman" w:hAnsi="Times New Roman" w:eastAsia="Times New Roman" w:cs="Times New Roman"/>
         </w:rPr>
         <w:t xml:space="preserve">:</w:t>
       </w:r>
       <w:r>
         <w:rPr>
-          <w:rFonts w:ascii="Calibri" w:hAnsi="Calibri" w:eastAsia="Calibri" w:cs="Calibri"/>
-        </w:rPr>
-        <w:t xml:space="preserve"> </w:t>
-      </w:r>
-      <w:r>
-        <w:rPr>
-          <w:rFonts w:ascii="Calibri" w:hAnsi="Calibri" w:eastAsia="Calibri" w:cs="Calibri"/>
+          <w:rFonts w:ascii="Times New Roman" w:hAnsi="Times New Roman" w:eastAsia="Times New Roman" w:cs="Times New Roman"/>
+        </w:rPr>
+        <w:t xml:space="preserve"> </w:t>
+      </w:r>
+      <w:r>
+        <w:rPr>
+          <w:rFonts w:ascii="Times New Roman" w:hAnsi="Times New Roman" w:eastAsia="Times New Roman" w:cs="Times New Roman"/>
         </w:rPr>
         <w:t xml:space="preserve">Độ phân vân của mô hình được tính bằng hiệu xác suất giữa lựa chọn hàng đầu và lựa chọn thứ hai:</w:t>
       </w:r>
@@ -717,7 +717,7 @@
         <w:rPr>
           <w:b/>
           <w:bCs/>
-          <w:rFonts w:ascii="Calibri" w:hAnsi="Calibri" w:eastAsia="Calibri" w:cs="Calibri"/>
+          <w:rFonts w:ascii="Times New Roman" w:hAnsi="Times New Roman" w:eastAsia="Times New Roman" w:cs="Times New Roman"/>
         </w:rPr>
         <w:t xml:space="preserve">Nhánh Dừng Sớm (Early Exit -</w:t>
       </w:r>
@@ -725,7 +725,7 @@
         <w:rPr>
           <w:b/>
           <w:bCs/>
-          <w:rFonts w:ascii="Calibri" w:hAnsi="Calibri" w:eastAsia="Calibri" w:cs="Calibri"/>
+          <w:rFonts w:ascii="Times New Roman" w:hAnsi="Times New Roman" w:eastAsia="Times New Roman" w:cs="Times New Roman"/>
         </w:rPr>
         <w:t xml:space="preserve"> </w:t>
       </w:r>
@@ -751,19 +751,19 @@
         <w:rPr>
           <w:b/>
           <w:bCs/>
-          <w:rFonts w:ascii="Calibri" w:hAnsi="Calibri" w:eastAsia="Calibri" w:cs="Calibri"/>
+          <w:rFonts w:ascii="Times New Roman" w:hAnsi="Times New Roman" w:eastAsia="Times New Roman" w:cs="Times New Roman"/>
         </w:rPr>
         <w:t xml:space="preserve">)</w:t>
       </w:r>
       <w:r>
         <w:rPr>
-          <w:rFonts w:ascii="Calibri" w:hAnsi="Calibri" w:eastAsia="Calibri" w:cs="Calibri"/>
+          <w:rFonts w:ascii="Times New Roman" w:hAnsi="Times New Roman" w:eastAsia="Times New Roman" w:cs="Times New Roman"/>
         </w:rPr>
         <w:t xml:space="preserve">: Nếu Margin vượt ngưỡng 50%, mô hình đã đưa ra câu trả lời dứt khoát. Hệ thống sẽ lập tức dừng sớm và lấy đáp án của Luồng 0 làm kết quả cuối cùng. Cơ chế này áp dụng thành công cho</w:t>
       </w:r>
       <w:r>
         <w:rPr>
-          <w:rFonts w:ascii="Calibri" w:hAnsi="Calibri" w:eastAsia="Calibri" w:cs="Calibri"/>
+          <w:rFonts w:ascii="Times New Roman" w:hAnsi="Times New Roman" w:eastAsia="Times New Roman" w:cs="Times New Roman"/>
         </w:rPr>
         <w:t xml:space="preserve"> </w:t>
       </w:r>
@@ -771,19 +771,19 @@
         <w:rPr>
           <w:b/>
           <w:bCs/>
-          <w:rFonts w:ascii="Calibri" w:hAnsi="Calibri" w:eastAsia="Calibri" w:cs="Calibri"/>
+          <w:rFonts w:ascii="Times New Roman" w:hAnsi="Times New Roman" w:eastAsia="Times New Roman" w:cs="Times New Roman"/>
         </w:rPr>
         <w:t xml:space="preserve">74.3% câu hỏi</w:t>
       </w:r>
       <w:r>
         <w:rPr>
-          <w:rFonts w:ascii="Calibri" w:hAnsi="Calibri" w:eastAsia="Calibri" w:cs="Calibri"/>
-        </w:rPr>
-        <w:t xml:space="preserve"> </w:t>
-      </w:r>
-      <w:r>
-        <w:rPr>
-          <w:rFonts w:ascii="Calibri" w:hAnsi="Calibri" w:eastAsia="Calibri" w:cs="Calibri"/>
+          <w:rFonts w:ascii="Times New Roman" w:hAnsi="Times New Roman" w:eastAsia="Times New Roman" w:cs="Times New Roman"/>
+        </w:rPr>
+        <w:t xml:space="preserve"> </w:t>
+      </w:r>
+      <w:r>
+        <w:rPr>
+          <w:rFonts w:ascii="Times New Roman" w:hAnsi="Times New Roman" w:eastAsia="Times New Roman" w:cs="Times New Roman"/>
         </w:rPr>
         <w:t xml:space="preserve">trong tập đề thi, giúp tiết kiệm 66% tài nguyên tính toán.</w:t>
       </w:r>
@@ -800,7 +800,7 @@
         <w:rPr>
           <w:b/>
           <w:bCs/>
-          <w:rFonts w:ascii="Calibri" w:hAnsi="Calibri" w:eastAsia="Calibri" w:cs="Calibri"/>
+          <w:rFonts w:ascii="Times New Roman" w:hAnsi="Times New Roman" w:eastAsia="Times New Roman" w:cs="Times New Roman"/>
         </w:rPr>
         <w:t xml:space="preserve">Nhánh Biểu Quyết (Voting -</w:t>
       </w:r>
@@ -808,7 +808,7 @@
         <w:rPr>
           <w:b/>
           <w:bCs/>
-          <w:rFonts w:ascii="Calibri" w:hAnsi="Calibri" w:eastAsia="Calibri" w:cs="Calibri"/>
+          <w:rFonts w:ascii="Times New Roman" w:hAnsi="Times New Roman" w:eastAsia="Times New Roman" w:cs="Times New Roman"/>
         </w:rPr>
         <w:t xml:space="preserve"> </w:t>
       </w:r>
@@ -834,32 +834,32 @@
         <w:rPr>
           <w:b/>
           <w:bCs/>
-          <w:rFonts w:ascii="Calibri" w:hAnsi="Calibri" w:eastAsia="Calibri" w:cs="Calibri"/>
+          <w:rFonts w:ascii="Times New Roman" w:hAnsi="Times New Roman" w:eastAsia="Times New Roman" w:cs="Times New Roman"/>
         </w:rPr>
         <w:t xml:space="preserve">)</w:t>
       </w:r>
       <w:r>
         <w:rPr>
-          <w:rFonts w:ascii="Calibri" w:hAnsi="Calibri" w:eastAsia="Calibri" w:cs="Calibri"/>
+          <w:rFonts w:ascii="Times New Roman" w:hAnsi="Times New Roman" w:eastAsia="Times New Roman" w:cs="Times New Roman"/>
         </w:rPr>
         <w:t xml:space="preserve">: Nếu Margin dưới ngưỡng 50%, mô hình đang phân vân giữa các đáp án. Hệ thống sẽ kích hoạt song song Luồng 1 và Luồng 2 (chạy ở nhiệt độ</w:t>
       </w:r>
       <w:r>
         <w:rPr>
-          <w:rFonts w:ascii="Calibri" w:hAnsi="Calibri" w:eastAsia="Calibri" w:cs="Calibri"/>
+          <w:rFonts w:ascii="Times New Roman" w:hAnsi="Times New Roman" w:eastAsia="Times New Roman" w:cs="Times New Roman"/>
         </w:rPr>
         <w:t xml:space="preserve"> </w:t>
       </w:r>
       <w:r>
         <w:rPr>
           <w:rStyle w:val="VerbatimChar"/>
-          <w:rFonts w:ascii="Calibri" w:hAnsi="Calibri" w:eastAsia="Calibri" w:cs="Calibri"/>
+          <w:rFonts w:ascii="Times New Roman" w:hAnsi="Times New Roman" w:eastAsia="Times New Roman" w:cs="Times New Roman"/>
         </w:rPr>
         <w:t xml:space="preserve">temperature=0.2</w:t>
       </w:r>
       <w:r>
         <w:rPr>
-          <w:rFonts w:ascii="Calibri" w:hAnsi="Calibri" w:eastAsia="Calibri" w:cs="Calibri"/>
+          <w:rFonts w:ascii="Times New Roman" w:hAnsi="Times New Roman" w:eastAsia="Times New Roman" w:cs="Times New Roman"/>
         </w:rPr>
         <w:t xml:space="preserve">), sau đó thực hiện biểu quyết đa số (Majority Voting) giữa cả 3 luồng để đưa ra quyết định chuẩn xác nhất cho câu hỏi khó.</w:t>
       </w:r>
@@ -872,7 +872,7 @@
       </w:pPr>
       <w:r>
         <w:rPr>
-          <w:rFonts w:ascii="Calibri" w:hAnsi="Calibri" w:eastAsia="Calibri" w:cs="Calibri"/>
+          <w:rFonts w:ascii="Times New Roman" w:hAnsi="Times New Roman" w:eastAsia="Times New Roman" w:cs="Times New Roman"/>
         </w:rPr>
         <w:t xml:space="preserve">2.3. Trích xuất đáp án và Chuẩn hóa tiếng Việt</w:t>
       </w:r>
@@ -883,13 +883,13 @@
       </w:pPr>
       <w:r>
         <w:rPr>
-          <w:rFonts w:ascii="Calibri" w:hAnsi="Calibri" w:eastAsia="Calibri" w:cs="Calibri"/>
+          <w:rFonts w:ascii="Times New Roman" w:hAnsi="Times New Roman" w:eastAsia="Times New Roman" w:cs="Times New Roman"/>
         </w:rPr>
         <w:t xml:space="preserve">Tiếng Việt tự nhiên chứa nhiều từ viết thường trùng với ký tự đáp án trắc nghiệm (ví dụ:</w:t>
       </w:r>
       <w:r>
         <w:rPr>
-          <w:rFonts w:ascii="Calibri" w:hAnsi="Calibri" w:eastAsia="Calibri" w:cs="Calibri"/>
+          <w:rFonts w:ascii="Times New Roman" w:hAnsi="Times New Roman" w:eastAsia="Times New Roman" w:cs="Times New Roman"/>
         </w:rPr>
         <w:t xml:space="preserve"> </w:t>
       </w:r>
@@ -897,19 +897,19 @@
         <w:rPr>
           <w:i/>
           <w:iCs/>
-          <w:rFonts w:ascii="Calibri" w:hAnsi="Calibri" w:eastAsia="Calibri" w:cs="Calibri"/>
+          <w:rFonts w:ascii="Times New Roman" w:hAnsi="Times New Roman" w:eastAsia="Times New Roman" w:cs="Times New Roman"/>
         </w:rPr>
         <w:t xml:space="preserve">‘ngày’</w:t>
       </w:r>
       <w:r>
         <w:rPr>
-          <w:rFonts w:ascii="Calibri" w:hAnsi="Calibri" w:eastAsia="Calibri" w:cs="Calibri"/>
+          <w:rFonts w:ascii="Times New Roman" w:hAnsi="Times New Roman" w:eastAsia="Times New Roman" w:cs="Times New Roman"/>
         </w:rPr>
         <w:t xml:space="preserve">,</w:t>
       </w:r>
       <w:r>
         <w:rPr>
-          <w:rFonts w:ascii="Calibri" w:hAnsi="Calibri" w:eastAsia="Calibri" w:cs="Calibri"/>
+          <w:rFonts w:ascii="Times New Roman" w:hAnsi="Times New Roman" w:eastAsia="Times New Roman" w:cs="Times New Roman"/>
         </w:rPr>
         <w:t xml:space="preserve"> </w:t>
       </w:r>
@@ -917,19 +917,19 @@
         <w:rPr>
           <w:i/>
           <w:iCs/>
-          <w:rFonts w:ascii="Calibri" w:hAnsi="Calibri" w:eastAsia="Calibri" w:cs="Calibri"/>
+          <w:rFonts w:ascii="Times New Roman" w:hAnsi="Times New Roman" w:eastAsia="Times New Roman" w:cs="Times New Roman"/>
         </w:rPr>
         <w:t xml:space="preserve">‘việc’</w:t>
       </w:r>
       <w:r>
         <w:rPr>
-          <w:rFonts w:ascii="Calibri" w:hAnsi="Calibri" w:eastAsia="Calibri" w:cs="Calibri"/>
+          <w:rFonts w:ascii="Times New Roman" w:hAnsi="Times New Roman" w:eastAsia="Times New Roman" w:cs="Times New Roman"/>
         </w:rPr>
         <w:t xml:space="preserve">,</w:t>
       </w:r>
       <w:r>
         <w:rPr>
-          <w:rFonts w:ascii="Calibri" w:hAnsi="Calibri" w:eastAsia="Calibri" w:cs="Calibri"/>
+          <w:rFonts w:ascii="Times New Roman" w:hAnsi="Times New Roman" w:eastAsia="Times New Roman" w:cs="Times New Roman"/>
         </w:rPr>
         <w:t xml:space="preserve"> </w:t>
       </w:r>
@@ -937,19 +937,19 @@
         <w:rPr>
           <w:i/>
           <w:iCs/>
-          <w:rFonts w:ascii="Calibri" w:hAnsi="Calibri" w:eastAsia="Calibri" w:cs="Calibri"/>
+          <w:rFonts w:ascii="Times New Roman" w:hAnsi="Times New Roman" w:eastAsia="Times New Roman" w:cs="Times New Roman"/>
         </w:rPr>
         <w:t xml:space="preserve">‘hành’</w:t>
       </w:r>
       <w:r>
         <w:rPr>
-          <w:rFonts w:ascii="Calibri" w:hAnsi="Calibri" w:eastAsia="Calibri" w:cs="Calibri"/>
+          <w:rFonts w:ascii="Times New Roman" w:hAnsi="Times New Roman" w:eastAsia="Times New Roman" w:cs="Times New Roman"/>
         </w:rPr>
         <w:t xml:space="preserve">,</w:t>
       </w:r>
       <w:r>
         <w:rPr>
-          <w:rFonts w:ascii="Calibri" w:hAnsi="Calibri" w:eastAsia="Calibri" w:cs="Calibri"/>
+          <w:rFonts w:ascii="Times New Roman" w:hAnsi="Times New Roman" w:eastAsia="Times New Roman" w:cs="Times New Roman"/>
         </w:rPr>
         <w:t xml:space="preserve"> </w:t>
       </w:r>
@@ -957,19 +957,19 @@
         <w:rPr>
           <w:i/>
           <w:iCs/>
-          <w:rFonts w:ascii="Calibri" w:hAnsi="Calibri" w:eastAsia="Calibri" w:cs="Calibri"/>
+          <w:rFonts w:ascii="Times New Roman" w:hAnsi="Times New Roman" w:eastAsia="Times New Roman" w:cs="Times New Roman"/>
         </w:rPr>
         <w:t xml:space="preserve">‘về’</w:t>
       </w:r>
       <w:r>
         <w:rPr>
-          <w:rFonts w:ascii="Calibri" w:hAnsi="Calibri" w:eastAsia="Calibri" w:cs="Calibri"/>
+          <w:rFonts w:ascii="Times New Roman" w:hAnsi="Times New Roman" w:eastAsia="Times New Roman" w:cs="Times New Roman"/>
         </w:rPr>
         <w:t xml:space="preserve">…). Nhóm tác giả đã thiết kế bộ lọc biểu thức chính quy</w:t>
       </w:r>
       <w:r>
         <w:rPr>
-          <w:rFonts w:ascii="Calibri" w:hAnsi="Calibri" w:eastAsia="Calibri" w:cs="Calibri"/>
+          <w:rFonts w:ascii="Times New Roman" w:hAnsi="Times New Roman" w:eastAsia="Times New Roman" w:cs="Times New Roman"/>
         </w:rPr>
         <w:t xml:space="preserve"> </w:t>
       </w:r>
@@ -977,37 +977,37 @@
         <w:rPr>
           <w:b/>
           <w:bCs/>
-          <w:rFonts w:ascii="Calibri" w:hAnsi="Calibri" w:eastAsia="Calibri" w:cs="Calibri"/>
+          <w:rFonts w:ascii="Times New Roman" w:hAnsi="Times New Roman" w:eastAsia="Times New Roman" w:cs="Times New Roman"/>
         </w:rPr>
         <w:t xml:space="preserve">phân biệt nghiêm ngặt chữ hoa/chữ thường (case-sensitive)</w:t>
       </w:r>
       <w:r>
         <w:rPr>
-          <w:rFonts w:ascii="Calibri" w:hAnsi="Calibri" w:eastAsia="Calibri" w:cs="Calibri"/>
-        </w:rPr>
-        <w:t xml:space="preserve"> </w:t>
-      </w:r>
-      <w:r>
-        <w:rPr>
-          <w:rFonts w:ascii="Calibri" w:hAnsi="Calibri" w:eastAsia="Calibri" w:cs="Calibri"/>
+          <w:rFonts w:ascii="Times New Roman" w:hAnsi="Times New Roman" w:eastAsia="Times New Roman" w:cs="Times New Roman"/>
+        </w:rPr>
+        <w:t xml:space="preserve"> </w:t>
+      </w:r>
+      <w:r>
+        <w:rPr>
+          <w:rFonts w:ascii="Times New Roman" w:hAnsi="Times New Roman" w:eastAsia="Times New Roman" w:cs="Times New Roman"/>
         </w:rPr>
         <w:t xml:space="preserve">kết hợp ranh giới từ độc lập:</w:t>
       </w:r>
       <w:r>
         <w:rPr>
-          <w:rFonts w:ascii="Calibri" w:hAnsi="Calibri" w:eastAsia="Calibri" w:cs="Calibri"/>
-        </w:rPr>
-        <w:t xml:space="preserve"> </w:t>
-      </w:r>
-      <w:r>
-        <w:rPr>
-          <w:rFonts w:ascii="Calibri" w:hAnsi="Calibri" w:eastAsia="Calibri" w:cs="Calibri"/>
+          <w:rFonts w:ascii="Times New Roman" w:hAnsi="Times New Roman" w:eastAsia="Times New Roman" w:cs="Times New Roman"/>
+        </w:rPr>
+        <w:t xml:space="preserve"> </w:t>
+      </w:r>
+      <w:r>
+        <w:rPr>
+          <w:rFonts w:ascii="Times New Roman" w:hAnsi="Times New Roman" w:eastAsia="Times New Roman" w:cs="Times New Roman"/>
         </w:rPr>
         <w:t xml:space="preserve">*</w:t>
       </w:r>
       <w:r>
         <w:rPr>
-          <w:rFonts w:ascii="Calibri" w:hAnsi="Calibri" w:eastAsia="Calibri" w:cs="Calibri"/>
+          <w:rFonts w:ascii="Times New Roman" w:hAnsi="Times New Roman" w:eastAsia="Times New Roman" w:cs="Times New Roman"/>
         </w:rPr>
         <w:t xml:space="preserve"> </w:t>
       </w:r>
@@ -1015,26 +1015,26 @@
         <w:rPr>
           <w:b/>
           <w:bCs/>
-          <w:rFonts w:ascii="Calibri" w:hAnsi="Calibri" w:eastAsia="Calibri" w:cs="Calibri"/>
+          <w:rFonts w:ascii="Times New Roman" w:hAnsi="Times New Roman" w:eastAsia="Times New Roman" w:cs="Times New Roman"/>
         </w:rPr>
         <w:t xml:space="preserve">Mẫu Regex</w:t>
       </w:r>
       <w:r>
         <w:rPr>
-          <w:rFonts w:ascii="Calibri" w:hAnsi="Calibri" w:eastAsia="Calibri" w:cs="Calibri"/>
+          <w:rFonts w:ascii="Times New Roman" w:hAnsi="Times New Roman" w:eastAsia="Times New Roman" w:cs="Times New Roman"/>
         </w:rPr>
         <w:t xml:space="preserve">:</w:t>
       </w:r>
       <w:r>
         <w:rPr>
-          <w:rFonts w:ascii="Calibri" w:hAnsi="Calibri" w:eastAsia="Calibri" w:cs="Calibri"/>
+          <w:rFonts w:ascii="Times New Roman" w:hAnsi="Times New Roman" w:eastAsia="Times New Roman" w:cs="Times New Roman"/>
         </w:rPr>
         <w:t xml:space="preserve"> </w:t>
       </w:r>
       <w:r>
         <w:rPr>
           <w:rStyle w:val="VerbatimChar"/>
-          <w:rFonts w:ascii="Calibri" w:hAnsi="Calibri" w:eastAsia="Calibri" w:cs="Calibri"/>
+          <w:rFonts w:ascii="Times New Roman" w:hAnsi="Times New Roman" w:eastAsia="Times New Roman" w:cs="Times New Roman"/>
         </w:rPr>
         <w:t xml:space="preserve">\b[A-J]\b</w:t>
       </w:r>
@@ -1045,7 +1045,7 @@
       </w:pPr>
       <w:r>
         <w:rPr>
-          <w:rFonts w:ascii="Calibri" w:hAnsi="Calibri" w:eastAsia="Calibri" w:cs="Calibri"/>
+          <w:rFonts w:ascii="Times New Roman" w:hAnsi="Times New Roman" w:eastAsia="Times New Roman" w:cs="Times New Roman"/>
         </w:rPr>
         <w:t xml:space="preserve">Cơ chế này loại bỏ hoàn toàn các ký tự trùng hợp trong văn bản tiếng Việt tự nhiên, đảm bảo đáp án trích xuất luôn chính xác và được đối chiếu kiểm tra tính hợp lệ với danh sách lựa chọn của câu hỏi trước khi xuất kết quả.</w:t>
       </w:r>
@@ -1053,7 +1053,7 @@
     <w:p>
       <w:r>
         <w:rPr>
-          <w:rFonts w:ascii="Calibri" w:hAnsi="Calibri" w:eastAsia="Calibri" w:cs="Calibri"/>
+          <w:rFonts w:ascii="Times New Roman" w:hAnsi="Times New Roman" w:eastAsia="Times New Roman" w:cs="Times New Roman"/>
         </w:rPr>
         <w:pict>
           <v:rect style="width:0;height:1.5pt" o:hralign="center" o:hrstd="t" o:hr="t"/>
@@ -1069,7 +1069,7 @@
       </w:pPr>
       <w:r>
         <w:rPr>
-          <w:rFonts w:ascii="Calibri" w:hAnsi="Calibri" w:eastAsia="Calibri" w:cs="Calibri"/>
+          <w:rFonts w:ascii="Times New Roman" w:hAnsi="Times New Roman" w:eastAsia="Times New Roman" w:cs="Times New Roman"/>
         </w:rPr>
         <w:t xml:space="preserve">3. THIẾT LẬP HỆ THỐNG VÀ TỐI ƯU HÓA PHẦN CỨNG</w:t>
       </w:r>
@@ -1080,13 +1080,13 @@
       </w:pPr>
       <w:r>
         <w:rPr>
-          <w:rFonts w:ascii="Calibri" w:hAnsi="Calibri" w:eastAsia="Calibri" w:cs="Calibri"/>
+          <w:rFonts w:ascii="Times New Roman" w:hAnsi="Times New Roman" w:eastAsia="Times New Roman" w:cs="Times New Roman"/>
         </w:rPr>
         <w:t xml:space="preserve">Hệ thống được tinh chỉnh cấu hình chuyên sâu để vận hành tương thích hoàn hảo với máy chủ chấm điểm của Ban Tổ Chức gồm card đồ họa</w:t>
       </w:r>
       <w:r>
         <w:rPr>
-          <w:rFonts w:ascii="Calibri" w:hAnsi="Calibri" w:eastAsia="Calibri" w:cs="Calibri"/>
+          <w:rFonts w:ascii="Times New Roman" w:hAnsi="Times New Roman" w:eastAsia="Times New Roman" w:cs="Times New Roman"/>
         </w:rPr>
         <w:t xml:space="preserve"> </w:t>
       </w:r>
@@ -1094,25 +1094,25 @@
         <w:rPr>
           <w:b/>
           <w:bCs/>
-          <w:rFonts w:ascii="Calibri" w:hAnsi="Calibri" w:eastAsia="Calibri" w:cs="Calibri"/>
+          <w:rFonts w:ascii="Times New Roman" w:hAnsi="Times New Roman" w:eastAsia="Times New Roman" w:cs="Times New Roman"/>
         </w:rPr>
         <w:t xml:space="preserve">NVIDIA RTX 5060Ti</w:t>
       </w:r>
       <w:r>
         <w:rPr>
-          <w:rFonts w:ascii="Calibri" w:hAnsi="Calibri" w:eastAsia="Calibri" w:cs="Calibri"/>
-        </w:rPr>
-        <w:t xml:space="preserve"> </w:t>
-      </w:r>
-      <w:r>
-        <w:rPr>
-          <w:rFonts w:ascii="Calibri" w:hAnsi="Calibri" w:eastAsia="Calibri" w:cs="Calibri"/>
+          <w:rFonts w:ascii="Times New Roman" w:hAnsi="Times New Roman" w:eastAsia="Times New Roman" w:cs="Times New Roman"/>
+        </w:rPr>
+        <w:t xml:space="preserve"> </w:t>
+      </w:r>
+      <w:r>
+        <w:rPr>
+          <w:rFonts w:ascii="Times New Roman" w:hAnsi="Times New Roman" w:eastAsia="Times New Roman" w:cs="Times New Roman"/>
         </w:rPr>
         <w:t xml:space="preserve">và</w:t>
       </w:r>
       <w:r>
         <w:rPr>
-          <w:rFonts w:ascii="Calibri" w:hAnsi="Calibri" w:eastAsia="Calibri" w:cs="Calibri"/>
+          <w:rFonts w:ascii="Times New Roman" w:hAnsi="Times New Roman" w:eastAsia="Times New Roman" w:cs="Times New Roman"/>
         </w:rPr>
         <w:t xml:space="preserve"> </w:t>
       </w:r>
@@ -1120,13 +1120,13 @@
         <w:rPr>
           <w:b/>
           <w:bCs/>
-          <w:rFonts w:ascii="Calibri" w:hAnsi="Calibri" w:eastAsia="Calibri" w:cs="Calibri"/>
+          <w:rFonts w:ascii="Times New Roman" w:hAnsi="Times New Roman" w:eastAsia="Times New Roman" w:cs="Times New Roman"/>
         </w:rPr>
         <w:t xml:space="preserve">32GB RAM</w:t>
       </w:r>
       <w:r>
         <w:rPr>
-          <w:rFonts w:ascii="Calibri" w:hAnsi="Calibri" w:eastAsia="Calibri" w:cs="Calibri"/>
+          <w:rFonts w:ascii="Times New Roman" w:hAnsi="Times New Roman" w:eastAsia="Times New Roman" w:cs="Times New Roman"/>
         </w:rPr>
         <w:t xml:space="preserve">:</w:t>
       </w:r>
@@ -1138,7 +1138,7 @@
       </w:pPr>
       <w:r>
         <w:rPr>
-          <w:rFonts w:ascii="Calibri" w:hAnsi="Calibri" w:eastAsia="Calibri" w:cs="Calibri"/>
+          <w:rFonts w:ascii="Times New Roman" w:hAnsi="Times New Roman" w:eastAsia="Times New Roman" w:cs="Times New Roman"/>
         </w:rPr>
         <w:t xml:space="preserve">3.1. Thích ứng bộ nhớ VRAM động (Dynamic Memory Profile)</w:t>
       </w:r>
@@ -1149,13 +1149,13 @@
       </w:pPr>
       <w:r>
         <w:rPr>
-          <w:rFonts w:ascii="Calibri" w:hAnsi="Calibri" w:eastAsia="Calibri" w:cs="Calibri"/>
+          <w:rFonts w:ascii="Times New Roman" w:hAnsi="Times New Roman" w:eastAsia="Times New Roman" w:cs="Times New Roman"/>
         </w:rPr>
         <w:t xml:space="preserve">Đối với card RTX 5060Ti (dung lượng VRAM</w:t>
       </w:r>
       <w:r>
         <w:rPr>
-          <w:rFonts w:ascii="Calibri" w:hAnsi="Calibri" w:eastAsia="Calibri" w:cs="Calibri"/>
+          <w:rFonts w:ascii="Times New Roman" w:hAnsi="Times New Roman" w:eastAsia="Times New Roman" w:cs="Times New Roman"/>
         </w:rPr>
         <w:t xml:space="preserve"> </w:t>
       </w:r>
@@ -1172,13 +1172,13 @@
       </m:oMath>
       <w:r>
         <w:rPr>
-          <w:rFonts w:ascii="Calibri" w:hAnsi="Calibri" w:eastAsia="Calibri" w:cs="Calibri"/>
-        </w:rPr>
-        <w:t xml:space="preserve"> </w:t>
-      </w:r>
-      <w:r>
-        <w:rPr>
-          <w:rFonts w:ascii="Calibri" w:hAnsi="Calibri" w:eastAsia="Calibri" w:cs="Calibri"/>
+          <w:rFonts w:ascii="Times New Roman" w:hAnsi="Times New Roman" w:eastAsia="Times New Roman" w:cs="Times New Roman"/>
+        </w:rPr>
+        <w:t xml:space="preserve"> </w:t>
+      </w:r>
+      <w:r>
+        <w:rPr>
+          <w:rFonts w:ascii="Times New Roman" w:hAnsi="Times New Roman" w:eastAsia="Times New Roman" w:cs="Times New Roman"/>
         </w:rPr>
         <w:t xml:space="preserve">GB), hệ thống tự động thiết lập cấu hình giới hạn an toàn:</w:t>
       </w:r>
@@ -1194,13 +1194,13 @@
       <w:r>
         <w:rPr>
           <w:rStyle w:val="VerbatimChar"/>
-          <w:rFonts w:ascii="Calibri" w:hAnsi="Calibri" w:eastAsia="Calibri" w:cs="Calibri"/>
+          <w:rFonts w:ascii="Times New Roman" w:hAnsi="Times New Roman" w:eastAsia="Times New Roman" w:cs="Times New Roman"/>
         </w:rPr>
         <w:t xml:space="preserve">gpu_memory_utilization = 0.85</w:t>
       </w:r>
       <w:r>
         <w:rPr>
-          <w:rFonts w:ascii="Calibri" w:hAnsi="Calibri" w:eastAsia="Calibri" w:cs="Calibri"/>
+          <w:rFonts w:ascii="Times New Roman" w:hAnsi="Times New Roman" w:eastAsia="Times New Roman" w:cs="Times New Roman"/>
         </w:rPr>
         <w:t xml:space="preserve">: Giữ lại 15% VRAM trống làm bộ nhớ đệm an toàn cho driver đồ họa hiển thị của hệ điều hành, ngăn ngừa hoàn toàn lỗi tràn bộ nhớ VRAM.</w:t>
       </w:r>
@@ -1216,13 +1216,13 @@
       <w:r>
         <w:rPr>
           <w:rStyle w:val="VerbatimChar"/>
-          <w:rFonts w:ascii="Calibri" w:hAnsi="Calibri" w:eastAsia="Calibri" w:cs="Calibri"/>
+          <w:rFonts w:ascii="Times New Roman" w:hAnsi="Times New Roman" w:eastAsia="Times New Roman" w:cs="Times New Roman"/>
         </w:rPr>
         <w:t xml:space="preserve">max_num_seqs = 16</w:t>
       </w:r>
       <w:r>
         <w:rPr>
-          <w:rFonts w:ascii="Calibri" w:hAnsi="Calibri" w:eastAsia="Calibri" w:cs="Calibri"/>
+          <w:rFonts w:ascii="Times New Roman" w:hAnsi="Times New Roman" w:eastAsia="Times New Roman" w:cs="Times New Roman"/>
         </w:rPr>
         <w:t xml:space="preserve">: Giới hạn số lượng sequence hoạt động đồng thời trong scheduler để tiết kiệm KV Cache, đồng thời vẫn đáp ứng hoàn hảo việc chạy song song các luồng biểu quyết.</w:t>
       </w:r>
@@ -1238,13 +1238,13 @@
       <w:r>
         <w:rPr>
           <w:rStyle w:val="VerbatimChar"/>
-          <w:rFonts w:ascii="Calibri" w:hAnsi="Calibri" w:eastAsia="Calibri" w:cs="Calibri"/>
+          <w:rFonts w:ascii="Times New Roman" w:hAnsi="Times New Roman" w:eastAsia="Times New Roman" w:cs="Times New Roman"/>
         </w:rPr>
         <w:t xml:space="preserve">max_num_batched_tokens = 2048</w:t>
       </w:r>
       <w:r>
         <w:rPr>
-          <w:rFonts w:ascii="Calibri" w:hAnsi="Calibri" w:eastAsia="Calibri" w:cs="Calibri"/>
+          <w:rFonts w:ascii="Times New Roman" w:hAnsi="Times New Roman" w:eastAsia="Times New Roman" w:cs="Times New Roman"/>
         </w:rPr>
         <w:t xml:space="preserve">: Kiểm soát số lượng token tối đa trong một bước batching để kiểm soát bộ nhớ đỉnh (Peak Memory).</w:t>
       </w:r>
@@ -1257,7 +1257,7 @@
       </w:pPr>
       <w:r>
         <w:rPr>
-          <w:rFonts w:ascii="Calibri" w:hAnsi="Calibri" w:eastAsia="Calibri" w:cs="Calibri"/>
+          <w:rFonts w:ascii="Times New Roman" w:hAnsi="Times New Roman" w:eastAsia="Times New Roman" w:cs="Times New Roman"/>
         </w:rPr>
         <w:t xml:space="preserve">3.2. Quản lý RAM vật lý (System RAM 32GB)</w:t>
       </w:r>
@@ -1268,38 +1268,38 @@
       </w:pPr>
       <w:r>
         <w:rPr>
-          <w:rFonts w:ascii="Calibri" w:hAnsi="Calibri" w:eastAsia="Calibri" w:cs="Calibri"/>
+          <w:rFonts w:ascii="Times New Roman" w:hAnsi="Times New Roman" w:eastAsia="Times New Roman" w:cs="Times New Roman"/>
         </w:rPr>
         <w:t xml:space="preserve">Mô hình</w:t>
       </w:r>
       <w:r>
         <w:rPr>
-          <w:rFonts w:ascii="Calibri" w:hAnsi="Calibri" w:eastAsia="Calibri" w:cs="Calibri"/>
+          <w:rFonts w:ascii="Times New Roman" w:hAnsi="Times New Roman" w:eastAsia="Times New Roman" w:cs="Times New Roman"/>
         </w:rPr>
         <w:t xml:space="preserve"> </w:t>
       </w:r>
       <w:r>
         <w:rPr>
           <w:rStyle w:val="VerbatimChar"/>
-          <w:rFonts w:ascii="Calibri" w:hAnsi="Calibri" w:eastAsia="Calibri" w:cs="Calibri"/>
+          <w:rFonts w:ascii="Times New Roman" w:hAnsi="Times New Roman" w:eastAsia="Times New Roman" w:cs="Times New Roman"/>
         </w:rPr>
         <w:t xml:space="preserve">Qwen3.5-4B-AWQ-4bit</w:t>
       </w:r>
       <w:r>
         <w:rPr>
-          <w:rFonts w:ascii="Calibri" w:hAnsi="Calibri" w:eastAsia="Calibri" w:cs="Calibri"/>
-        </w:rPr>
-        <w:t xml:space="preserve"> </w:t>
-      </w:r>
-      <w:r>
-        <w:rPr>
-          <w:rFonts w:ascii="Calibri" w:hAnsi="Calibri" w:eastAsia="Calibri" w:cs="Calibri"/>
+          <w:rFonts w:ascii="Times New Roman" w:hAnsi="Times New Roman" w:eastAsia="Times New Roman" w:cs="Times New Roman"/>
+        </w:rPr>
+        <w:t xml:space="preserve"> </w:t>
+      </w:r>
+      <w:r>
+        <w:rPr>
+          <w:rFonts w:ascii="Times New Roman" w:hAnsi="Times New Roman" w:eastAsia="Times New Roman" w:cs="Times New Roman"/>
         </w:rPr>
         <w:t xml:space="preserve">có dung lượng tệp trọng số là</w:t>
       </w:r>
       <w:r>
         <w:rPr>
-          <w:rFonts w:ascii="Calibri" w:hAnsi="Calibri" w:eastAsia="Calibri" w:cs="Calibri"/>
+          <w:rFonts w:ascii="Times New Roman" w:hAnsi="Times New Roman" w:eastAsia="Times New Roman" w:cs="Times New Roman"/>
         </w:rPr>
         <w:t xml:space="preserve"> </w:t>
       </w:r>
@@ -1307,19 +1307,19 @@
         <w:rPr>
           <w:b/>
           <w:bCs/>
-          <w:rFonts w:ascii="Calibri" w:hAnsi="Calibri" w:eastAsia="Calibri" w:cs="Calibri"/>
+          <w:rFonts w:ascii="Times New Roman" w:hAnsi="Times New Roman" w:eastAsia="Times New Roman" w:cs="Times New Roman"/>
         </w:rPr>
         <w:t xml:space="preserve">3.8GB</w:t>
       </w:r>
       <w:r>
         <w:rPr>
-          <w:rFonts w:ascii="Calibri" w:hAnsi="Calibri" w:eastAsia="Calibri" w:cs="Calibri"/>
+          <w:rFonts w:ascii="Times New Roman" w:hAnsi="Times New Roman" w:eastAsia="Times New Roman" w:cs="Times New Roman"/>
         </w:rPr>
         <w:t xml:space="preserve">. Khi khởi động, tiến trình nạp mô hình chỉ tiêu tốn tối đa</w:t>
       </w:r>
       <w:r>
         <w:rPr>
-          <w:rFonts w:ascii="Calibri" w:hAnsi="Calibri" w:eastAsia="Calibri" w:cs="Calibri"/>
+          <w:rFonts w:ascii="Times New Roman" w:hAnsi="Times New Roman" w:eastAsia="Times New Roman" w:cs="Times New Roman"/>
         </w:rPr>
         <w:t xml:space="preserve"> </w:t>
       </w:r>
@@ -1327,19 +1327,19 @@
         <w:rPr>
           <w:b/>
           <w:bCs/>
-          <w:rFonts w:ascii="Calibri" w:hAnsi="Calibri" w:eastAsia="Calibri" w:cs="Calibri"/>
+          <w:rFonts w:ascii="Times New Roman" w:hAnsi="Times New Roman" w:eastAsia="Times New Roman" w:cs="Times New Roman"/>
         </w:rPr>
         <w:t xml:space="preserve">6GB RAM hệ thống</w:t>
       </w:r>
       <w:r>
         <w:rPr>
-          <w:rFonts w:ascii="Calibri" w:hAnsi="Calibri" w:eastAsia="Calibri" w:cs="Calibri"/>
-        </w:rPr>
-        <w:t xml:space="preserve"> </w:t>
-      </w:r>
-      <w:r>
-        <w:rPr>
-          <w:rFonts w:ascii="Calibri" w:hAnsi="Calibri" w:eastAsia="Calibri" w:cs="Calibri"/>
+          <w:rFonts w:ascii="Times New Roman" w:hAnsi="Times New Roman" w:eastAsia="Times New Roman" w:cs="Times New Roman"/>
+        </w:rPr>
+        <w:t xml:space="preserve"> </w:t>
+      </w:r>
+      <w:r>
+        <w:rPr>
+          <w:rFonts w:ascii="Times New Roman" w:hAnsi="Times New Roman" w:eastAsia="Times New Roman" w:cs="Times New Roman"/>
         </w:rPr>
         <w:t xml:space="preserve">trước khi đẩy vào VRAM của GPU. Vì vậy, hệ thống hoàn toàn dư thừa tài nguyên và hoạt động cực kỳ ổn định trên cấu hình 32GB RAM của BTC.</w:t>
       </w:r>
@@ -1352,7 +1352,7 @@
       </w:pPr>
       <w:r>
         <w:rPr>
-          <w:rFonts w:ascii="Calibri" w:hAnsi="Calibri" w:eastAsia="Calibri" w:cs="Calibri"/>
+          <w:rFonts w:ascii="Times New Roman" w:hAnsi="Times New Roman" w:eastAsia="Times New Roman" w:cs="Times New Roman"/>
         </w:rPr>
         <w:t xml:space="preserve">3.3. FlashAttention và Prefix Caching</w:t>
       </w:r>
@@ -1369,13 +1369,13 @@
         <w:rPr>
           <w:b/>
           <w:bCs/>
-          <w:rFonts w:ascii="Calibri" w:hAnsi="Calibri" w:eastAsia="Calibri" w:cs="Calibri"/>
+          <w:rFonts w:ascii="Times New Roman" w:hAnsi="Times New Roman" w:eastAsia="Times New Roman" w:cs="Times New Roman"/>
         </w:rPr>
         <w:t xml:space="preserve">FLASH_ATTN Backend</w:t>
       </w:r>
       <w:r>
         <w:rPr>
-          <w:rFonts w:ascii="Calibri" w:hAnsi="Calibri" w:eastAsia="Calibri" w:cs="Calibri"/>
+          <w:rFonts w:ascii="Times New Roman" w:hAnsi="Times New Roman" w:eastAsia="Times New Roman" w:cs="Times New Roman"/>
         </w:rPr>
         <w:t xml:space="preserve">: Sử dụng attention backend FlashAttention-2 thay thế cho FlashInfer để loại bỏ yêu cầu biên dịch JIT runtime (nvcc), đảm bảo Docker container khởi động tức thì và chạy ổn định trên GPU RTX 5060Ti.</w:t>
       </w:r>
@@ -1392,38 +1392,38 @@
         <w:rPr>
           <w:b/>
           <w:bCs/>
-          <w:rFonts w:ascii="Calibri" w:hAnsi="Calibri" w:eastAsia="Calibri" w:cs="Calibri"/>
+          <w:rFonts w:ascii="Times New Roman" w:hAnsi="Times New Roman" w:eastAsia="Times New Roman" w:cs="Times New Roman"/>
         </w:rPr>
         <w:t xml:space="preserve">vLLM Prefix Caching</w:t>
       </w:r>
       <w:r>
         <w:rPr>
-          <w:rFonts w:ascii="Calibri" w:hAnsi="Calibri" w:eastAsia="Calibri" w:cs="Calibri"/>
+          <w:rFonts w:ascii="Times New Roman" w:hAnsi="Times New Roman" w:eastAsia="Times New Roman" w:cs="Times New Roman"/>
         </w:rPr>
         <w:t xml:space="preserve">: Kích hoạt</w:t>
       </w:r>
       <w:r>
         <w:rPr>
-          <w:rFonts w:ascii="Calibri" w:hAnsi="Calibri" w:eastAsia="Calibri" w:cs="Calibri"/>
+          <w:rFonts w:ascii="Times New Roman" w:hAnsi="Times New Roman" w:eastAsia="Times New Roman" w:cs="Times New Roman"/>
         </w:rPr>
         <w:t xml:space="preserve"> </w:t>
       </w:r>
       <w:r>
         <w:rPr>
           <w:rStyle w:val="VerbatimChar"/>
-          <w:rFonts w:ascii="Calibri" w:hAnsi="Calibri" w:eastAsia="Calibri" w:cs="Calibri"/>
+          <w:rFonts w:ascii="Times New Roman" w:hAnsi="Times New Roman" w:eastAsia="Times New Roman" w:cs="Times New Roman"/>
         </w:rPr>
         <w:t xml:space="preserve">enable_prefix_caching=True</w:t>
       </w:r>
       <w:r>
         <w:rPr>
-          <w:rFonts w:ascii="Calibri" w:hAnsi="Calibri" w:eastAsia="Calibri" w:cs="Calibri"/>
-        </w:rPr>
-        <w:t xml:space="preserve"> </w:t>
-      </w:r>
-      <w:r>
-        <w:rPr>
-          <w:rFonts w:ascii="Calibri" w:hAnsi="Calibri" w:eastAsia="Calibri" w:cs="Calibri"/>
+          <w:rFonts w:ascii="Times New Roman" w:hAnsi="Times New Roman" w:eastAsia="Times New Roman" w:cs="Times New Roman"/>
+        </w:rPr>
+        <w:t xml:space="preserve"> </w:t>
+      </w:r>
+      <w:r>
+        <w:rPr>
+          <w:rFonts w:ascii="Times New Roman" w:hAnsi="Times New Roman" w:eastAsia="Times New Roman" w:cs="Times New Roman"/>
         </w:rPr>
         <w:t xml:space="preserve">để vLLM chia sẻ dữ liệu bộ nhớ đệm KV Cache của prompt ngữ cảnh dùng chung giữa các luồng biểu quyết, giảm thiểu tải Prefill lặp lại và đẩy tốc độ sinh lên mức tối đa.</w:t>
       </w:r>
@@ -1431,7 +1431,7 @@
     <w:p>
       <w:r>
         <w:rPr>
-          <w:rFonts w:ascii="Calibri" w:hAnsi="Calibri" w:eastAsia="Calibri" w:cs="Calibri"/>
+          <w:rFonts w:ascii="Times New Roman" w:hAnsi="Times New Roman" w:eastAsia="Times New Roman" w:cs="Times New Roman"/>
         </w:rPr>
         <w:pict>
           <v:rect style="width:0;height:1.5pt" o:hralign="center" o:hrstd="t" o:hr="t"/>
@@ -1447,7 +1447,7 @@
       </w:pPr>
       <w:r>
         <w:rPr>
-          <w:rFonts w:ascii="Calibri" w:hAnsi="Calibri" w:eastAsia="Calibri" w:cs="Calibri"/>
+          <w:rFonts w:ascii="Times New Roman" w:hAnsi="Times New Roman" w:eastAsia="Times New Roman" w:cs="Times New Roman"/>
         </w:rPr>
         <w:t xml:space="preserve">4. KẾT QUẢ THỰC NGHIỆM</w:t>
       </w:r>
@@ -1458,7 +1458,7 @@
       </w:pPr>
       <w:r>
         <w:rPr>
-          <w:rFonts w:ascii="Calibri" w:hAnsi="Calibri" w:eastAsia="Calibri" w:cs="Calibri"/>
+          <w:rFonts w:ascii="Times New Roman" w:hAnsi="Times New Roman" w:eastAsia="Times New Roman" w:cs="Times New Roman"/>
         </w:rPr>
         <w:t xml:space="preserve">Giải pháp được đánh giá thực nghiệm trực tiếp trên toàn bộ tập dữ liệu kiểm thử công khai (Public Test) gồm 463 câu hỏi:</w:t>
       </w:r>
@@ -1475,19 +1475,19 @@
         <w:rPr>
           <w:b/>
           <w:bCs/>
-          <w:rFonts w:ascii="Calibri" w:hAnsi="Calibri" w:eastAsia="Calibri" w:cs="Calibri"/>
+          <w:rFonts w:ascii="Times New Roman" w:hAnsi="Times New Roman" w:eastAsia="Times New Roman" w:cs="Times New Roman"/>
         </w:rPr>
         <w:t xml:space="preserve">Độ chính xác (Accuracy)</w:t>
       </w:r>
       <w:r>
         <w:rPr>
-          <w:rFonts w:ascii="Calibri" w:hAnsi="Calibri" w:eastAsia="Calibri" w:cs="Calibri"/>
+          <w:rFonts w:ascii="Times New Roman" w:hAnsi="Times New Roman" w:eastAsia="Times New Roman" w:cs="Times New Roman"/>
         </w:rPr>
         <w:t xml:space="preserve">: Đạt tỷ lệ chính xác cao</w:t>
       </w:r>
       <w:r>
         <w:rPr>
-          <w:rFonts w:ascii="Calibri" w:hAnsi="Calibri" w:eastAsia="Calibri" w:cs="Calibri"/>
+          <w:rFonts w:ascii="Times New Roman" w:hAnsi="Times New Roman" w:eastAsia="Times New Roman" w:cs="Times New Roman"/>
         </w:rPr>
         <w:t xml:space="preserve"> </w:t>
       </w:r>
@@ -1495,19 +1495,19 @@
         <w:rPr>
           <w:b/>
           <w:bCs/>
-          <w:rFonts w:ascii="Calibri" w:hAnsi="Calibri" w:eastAsia="Calibri" w:cs="Calibri"/>
+          <w:rFonts w:ascii="Times New Roman" w:hAnsi="Times New Roman" w:eastAsia="Times New Roman" w:cs="Times New Roman"/>
         </w:rPr>
         <w:t xml:space="preserve">88.98%</w:t>
       </w:r>
       <w:r>
         <w:rPr>
-          <w:rFonts w:ascii="Calibri" w:hAnsi="Calibri" w:eastAsia="Calibri" w:cs="Calibri"/>
-        </w:rPr>
-        <w:t xml:space="preserve"> </w:t>
-      </w:r>
-      <w:r>
-        <w:rPr>
-          <w:rFonts w:ascii="Calibri" w:hAnsi="Calibri" w:eastAsia="Calibri" w:cs="Calibri"/>
+          <w:rFonts w:ascii="Times New Roman" w:hAnsi="Times New Roman" w:eastAsia="Times New Roman" w:cs="Times New Roman"/>
+        </w:rPr>
+        <w:t xml:space="preserve"> </w:t>
+      </w:r>
+      <w:r>
+        <w:rPr>
+          <w:rFonts w:ascii="Times New Roman" w:hAnsi="Times New Roman" w:eastAsia="Times New Roman" w:cs="Times New Roman"/>
         </w:rPr>
         <w:t xml:space="preserve">(chỉ trả lời sai 51 trên 463 câu hỏi trắc nghiệm đa lĩnh vực phức tạp).</w:t>
       </w:r>
@@ -1524,19 +1524,19 @@
         <w:rPr>
           <w:b/>
           <w:bCs/>
-          <w:rFonts w:ascii="Calibri" w:hAnsi="Calibri" w:eastAsia="Calibri" w:cs="Calibri"/>
+          <w:rFonts w:ascii="Times New Roman" w:hAnsi="Times New Roman" w:eastAsia="Times New Roman" w:cs="Times New Roman"/>
         </w:rPr>
         <w:t xml:space="preserve">Tốc độ thực thi (Throughput)</w:t>
       </w:r>
       <w:r>
         <w:rPr>
-          <w:rFonts w:ascii="Calibri" w:hAnsi="Calibri" w:eastAsia="Calibri" w:cs="Calibri"/>
+          <w:rFonts w:ascii="Times New Roman" w:hAnsi="Times New Roman" w:eastAsia="Times New Roman" w:cs="Times New Roman"/>
         </w:rPr>
         <w:t xml:space="preserve">: Hoàn thành suy luận toàn bộ 463 câu hỏi trong</w:t>
       </w:r>
       <w:r>
         <w:rPr>
-          <w:rFonts w:ascii="Calibri" w:hAnsi="Calibri" w:eastAsia="Calibri" w:cs="Calibri"/>
+          <w:rFonts w:ascii="Times New Roman" w:hAnsi="Times New Roman" w:eastAsia="Times New Roman" w:cs="Times New Roman"/>
         </w:rPr>
         <w:t xml:space="preserve"> </w:t>
       </w:r>
@@ -1544,19 +1544,19 @@
         <w:rPr>
           <w:b/>
           <w:bCs/>
-          <w:rFonts w:ascii="Calibri" w:hAnsi="Calibri" w:eastAsia="Calibri" w:cs="Calibri"/>
+          <w:rFonts w:ascii="Times New Roman" w:hAnsi="Times New Roman" w:eastAsia="Times New Roman" w:cs="Times New Roman"/>
         </w:rPr>
         <w:t xml:space="preserve">657.46 giây</w:t>
       </w:r>
       <w:r>
         <w:rPr>
-          <w:rFonts w:ascii="Calibri" w:hAnsi="Calibri" w:eastAsia="Calibri" w:cs="Calibri"/>
+          <w:rFonts w:ascii="Times New Roman" w:hAnsi="Times New Roman" w:eastAsia="Times New Roman" w:cs="Times New Roman"/>
         </w:rPr>
         <w:t xml:space="preserve">, đạt tốc độ trung bình</w:t>
       </w:r>
       <w:r>
         <w:rPr>
-          <w:rFonts w:ascii="Calibri" w:hAnsi="Calibri" w:eastAsia="Calibri" w:cs="Calibri"/>
+          <w:rFonts w:ascii="Times New Roman" w:hAnsi="Times New Roman" w:eastAsia="Times New Roman" w:cs="Times New Roman"/>
         </w:rPr>
         <w:t xml:space="preserve"> </w:t>
       </w:r>
@@ -1564,13 +1564,13 @@
         <w:rPr>
           <w:b/>
           <w:bCs/>
-          <w:rFonts w:ascii="Calibri" w:hAnsi="Calibri" w:eastAsia="Calibri" w:cs="Calibri"/>
+          <w:rFonts w:ascii="Times New Roman" w:hAnsi="Times New Roman" w:eastAsia="Times New Roman" w:cs="Times New Roman"/>
         </w:rPr>
         <w:t xml:space="preserve">1.42 giây/câu hỏi</w:t>
       </w:r>
       <w:r>
         <w:rPr>
-          <w:rFonts w:ascii="Calibri" w:hAnsi="Calibri" w:eastAsia="Calibri" w:cs="Calibri"/>
+          <w:rFonts w:ascii="Times New Roman" w:hAnsi="Times New Roman" w:eastAsia="Times New Roman" w:cs="Times New Roman"/>
         </w:rPr>
         <w:t xml:space="preserve">.</w:t>
       </w:r>
@@ -1587,19 +1587,19 @@
         <w:rPr>
           <w:b/>
           <w:bCs/>
-          <w:rFonts w:ascii="Calibri" w:hAnsi="Calibri" w:eastAsia="Calibri" w:cs="Calibri"/>
+          <w:rFonts w:ascii="Times New Roman" w:hAnsi="Times New Roman" w:eastAsia="Times New Roman" w:cs="Times New Roman"/>
         </w:rPr>
         <w:t xml:space="preserve">Hiệu quả dừng sớm (Early Exit Rate)</w:t>
       </w:r>
       <w:r>
         <w:rPr>
-          <w:rFonts w:ascii="Calibri" w:hAnsi="Calibri" w:eastAsia="Calibri" w:cs="Calibri"/>
+          <w:rFonts w:ascii="Times New Roman" w:hAnsi="Times New Roman" w:eastAsia="Times New Roman" w:cs="Times New Roman"/>
         </w:rPr>
         <w:t xml:space="preserve">: Đạt tỷ lệ dừng sớm</w:t>
       </w:r>
       <w:r>
         <w:rPr>
-          <w:rFonts w:ascii="Calibri" w:hAnsi="Calibri" w:eastAsia="Calibri" w:cs="Calibri"/>
+          <w:rFonts w:ascii="Times New Roman" w:hAnsi="Times New Roman" w:eastAsia="Times New Roman" w:cs="Times New Roman"/>
         </w:rPr>
         <w:t xml:space="preserve"> </w:t>
       </w:r>
@@ -1607,19 +1607,19 @@
         <w:rPr>
           <w:b/>
           <w:bCs/>
-          <w:rFonts w:ascii="Calibri" w:hAnsi="Calibri" w:eastAsia="Calibri" w:cs="Calibri"/>
+          <w:rFonts w:ascii="Times New Roman" w:hAnsi="Times New Roman" w:eastAsia="Times New Roman" w:cs="Times New Roman"/>
         </w:rPr>
         <w:t xml:space="preserve">74.3%</w:t>
       </w:r>
       <w:r>
         <w:rPr>
-          <w:rFonts w:ascii="Calibri" w:hAnsi="Calibri" w:eastAsia="Calibri" w:cs="Calibri"/>
-        </w:rPr>
-        <w:t xml:space="preserve"> </w:t>
-      </w:r>
-      <w:r>
-        <w:rPr>
-          <w:rFonts w:ascii="Calibri" w:hAnsi="Calibri" w:eastAsia="Calibri" w:cs="Calibri"/>
+          <w:rFonts w:ascii="Times New Roman" w:hAnsi="Times New Roman" w:eastAsia="Times New Roman" w:cs="Times New Roman"/>
+        </w:rPr>
+        <w:t xml:space="preserve"> </w:t>
+      </w:r>
+      <w:r>
+        <w:rPr>
+          <w:rFonts w:ascii="Times New Roman" w:hAnsi="Times New Roman" w:eastAsia="Times New Roman" w:cs="Times New Roman"/>
         </w:rPr>
         <w:t xml:space="preserve">trên tổng số câu hỏi, chứng minh thuật toán đã lược bỏ thành công việc sinh biểu quyết cho phần lớn các câu hỏi dễ và trung bình để đẩy tốc độ hệ thống lên mức tối đa.</w:t>
       </w:r>
@@ -1627,7 +1627,7 @@
     <w:p>
       <w:r>
         <w:rPr>
-          <w:rFonts w:ascii="Calibri" w:hAnsi="Calibri" w:eastAsia="Calibri" w:cs="Calibri"/>
+          <w:rFonts w:ascii="Times New Roman" w:hAnsi="Times New Roman" w:eastAsia="Times New Roman" w:cs="Times New Roman"/>
         </w:rPr>
         <w:pict>
           <v:rect style="width:0;height:1.5pt" o:hralign="center" o:hrstd="t" o:hr="t"/>
@@ -1642,7 +1642,7 @@
       </w:pPr>
       <w:r>
         <w:rPr>
-          <w:rFonts w:ascii="Calibri" w:hAnsi="Calibri" w:eastAsia="Calibri" w:cs="Calibri"/>
+          <w:rFonts w:ascii="Times New Roman" w:hAnsi="Times New Roman" w:eastAsia="Times New Roman" w:cs="Times New Roman"/>
         </w:rPr>
         <w:t xml:space="preserve">5. KẾT LUẬN</w:t>
       </w:r>
@@ -1653,7 +1653,7 @@
       </w:pPr>
       <w:r>
         <w:rPr>
-          <w:rFonts w:ascii="Calibri" w:hAnsi="Calibri" w:eastAsia="Calibri" w:cs="Calibri"/>
+          <w:rFonts w:ascii="Times New Roman" w:hAnsi="Times New Roman" w:eastAsia="Times New Roman" w:cs="Times New Roman"/>
         </w:rPr>
         <w:t xml:space="preserve">Giải pháp AI Agent của nhóm tác giả đề xuất mang lại độ chính xác suy luận vượt trội cùng hiệu năng thực thi tối ưu. Việc kết hợp chặt chẽ giữa logic thuật toán Logit Margin thích ứng và cấu hình vLLM offline đóng gói trong Docker Container tạo nên một giải pháp hoàn chỉnh, có độ ổn định cực cao và sẵn sàng đáp ứng vòng đánh giá Private Test tiếp theo.</w:t>
       </w:r>
@@ -2031,7 +2031,7 @@
     <w:name w:val="Normal"/>
     <w:qFormat/>
     <w:rPr>
-      <w:rFonts w:ascii="Calibri" w:hAnsi="Calibri"/>
+      <w:rFonts w:ascii="Times New Roman" w:hAnsi="Times New Roman"/>
     </w:rPr>
   </w:style>
   <w:style w:styleId="BodyText" w:type="paragraph">
@@ -2205,7 +2205,7 @@
       <w:outlineLvl w:val="0"/>
     </w:pPr>
     <w:rPr>
-      <w:rFonts w:asciiTheme="majorHAnsi" w:cstheme="majorBidi" w:eastAsiaTheme="majorEastAsia" w:hAnsiTheme="majorHAnsi" w:ascii="Calibri" w:hAnsi="Calibri"/>
+      <w:rFonts w:asciiTheme="majorHAnsi" w:cstheme="majorBidi" w:eastAsiaTheme="majorEastAsia" w:hAnsiTheme="majorHAnsi" w:ascii="Times New Roman" w:hAnsi="Times New Roman"/>
       <w:color w:themeColor="accent1" w:themeShade="BF" w:val="0F4761"/>
       <w:sz w:val="40"/>
       <w:szCs w:val="40"/>
@@ -2228,7 +2228,7 @@
       <w:outlineLvl w:val="1"/>
     </w:pPr>
     <w:rPr>
-      <w:rFonts w:asciiTheme="majorHAnsi" w:cstheme="majorBidi" w:eastAsiaTheme="majorEastAsia" w:hAnsiTheme="majorHAnsi" w:ascii="Calibri" w:hAnsi="Calibri"/>
+      <w:rFonts w:asciiTheme="majorHAnsi" w:cstheme="majorBidi" w:eastAsiaTheme="majorEastAsia" w:hAnsiTheme="majorHAnsi" w:ascii="Times New Roman" w:hAnsi="Times New Roman"/>
       <w:color w:themeColor="accent1" w:themeShade="BF" w:val="0F4761"/>
       <w:sz w:val="32"/>
       <w:szCs w:val="32"/>
@@ -2251,7 +2251,7 @@
       <w:outlineLvl w:val="2"/>
     </w:pPr>
     <w:rPr>
-      <w:rFonts w:cstheme="majorBidi" w:eastAsiaTheme="majorEastAsia" w:ascii="Calibri" w:hAnsi="Calibri"/>
+      <w:rFonts w:cstheme="majorBidi" w:eastAsiaTheme="majorEastAsia" w:ascii="Times New Roman" w:hAnsi="Times New Roman"/>
       <w:color w:themeColor="accent1" w:themeShade="BF" w:val="0F4761"/>
       <w:sz w:val="28"/>
       <w:szCs w:val="28"/>
@@ -2274,7 +2274,7 @@
       <w:outlineLvl w:val="3"/>
     </w:pPr>
     <w:rPr>
-      <w:rFonts w:cstheme="majorBidi" w:eastAsiaTheme="majorEastAsia" w:ascii="Calibri" w:hAnsi="Calibri"/>
+      <w:rFonts w:cstheme="majorBidi" w:eastAsiaTheme="majorEastAsia" w:ascii="Times New Roman" w:hAnsi="Times New Roman"/>
       <w:i/>
       <w:iCs/>
       <w:color w:themeColor="accent1" w:themeShade="BF" w:val="0F4761"/>

</xml_diff>

<commit_message>
Update docx explanation and delete pdf
</commit_message>
<xml_diff>
--- a/NOP_BAI_T1S_KMML/T1S_KMML_Thuyet_minh_Innovator.docx
+++ b/NOP_BAI_T1S_KMML/T1S_KMML_Thuyet_minh_Innovator.docx
@@ -2,15 +2,12 @@
 <file path=word/document.xml><?xml version="1.0" encoding="utf-8"?>
 <w:document xmlns:w="http://schemas.openxmlformats.org/wordprocessingml/2006/main" xmlns:m="http://schemas.openxmlformats.org/officeDocument/2006/math" xmlns:r="http://schemas.openxmlformats.org/officeDocument/2006/relationships" xmlns:o="urn:schemas-microsoft-com:office:office" xmlns:v="urn:schemas-microsoft-com:vml" xmlns:w10="urn:schemas-microsoft-com:office:word" xmlns:a="http://schemas.openxmlformats.org/drawingml/2006/main" xmlns:pic="http://schemas.openxmlformats.org/drawingml/2006/picture" xmlns:wp="http://schemas.openxmlformats.org/drawingml/2006/wordprocessingDrawing">
   <w:body>
-    <w:bookmarkStart w:id="25" w:name="X3edd79e7b22abd87185bb26458ce6d4b10751bd"/>
+    <w:bookmarkStart w:id="26" w:name="X3edd79e7b22abd87185bb26458ce6d4b10751bd"/>
     <w:p>
       <w:pPr>
         <w:pStyle w:val="Heading1"/>
       </w:pPr>
       <w:r>
-        <w:rPr>
-          <w:rFonts w:ascii="Times New Roman" w:hAnsi="Times New Roman" w:eastAsia="Times New Roman" w:cs="Times New Roman"/>
-        </w:rPr>
         <w:t xml:space="preserve">BÁO CÁO THUYẾT MINH GIẢI PHÁP XÂY DỰNG AI AGENT ĐA TÁC VỤ</w:t>
       </w:r>
     </w:p>
@@ -20,17 +17,11 @@
         <w:pStyle w:val="Heading2"/>
       </w:pPr>
       <w:r>
-        <w:rPr>
-          <w:rFonts w:ascii="Times New Roman" w:hAnsi="Times New Roman" w:eastAsia="Times New Roman" w:cs="Times New Roman"/>
-        </w:rPr>
         <w:t xml:space="preserve">Đội thi: Bảng C - Innovator | Tên đội: T1S_KMML</w:t>
       </w:r>
     </w:p>
     <w:p>
       <w:r>
-        <w:rPr>
-          <w:rFonts w:ascii="Times New Roman" w:hAnsi="Times New Roman" w:eastAsia="Times New Roman" w:cs="Times New Roman"/>
-        </w:rPr>
         <w:pict>
           <v:rect style="width:0;height:1.5pt" o:hralign="center" o:hrstd="t" o:hr="t"/>
         </w:pict>
@@ -43,9 +34,6 @@
         <w:pStyle w:val="Heading2"/>
       </w:pPr>
       <w:r>
-        <w:rPr>
-          <w:rFonts w:ascii="Times New Roman" w:hAnsi="Times New Roman" w:eastAsia="Times New Roman" w:cs="Times New Roman"/>
-        </w:rPr>
         <w:t xml:space="preserve">TÓM TẮT GIẢI PHÁP</w:t>
       </w:r>
     </w:p>
@@ -54,35 +42,22 @@
         <w:pStyle w:val="FirstParagraph"/>
       </w:pPr>
       <w:r>
-        <w:rPr>
-          <w:rFonts w:ascii="Times New Roman" w:hAnsi="Times New Roman" w:eastAsia="Times New Roman" w:cs="Times New Roman"/>
-        </w:rPr>
         <w:t xml:space="preserve">Báo cáo này thuyết minh giải pháp xây dựng và tối ưu hóa hệ thống AI Agent đa tác vụ sử dụng mô hình ngôn ngữ lớn</w:t>
       </w:r>
       <w:r>
-        <w:rPr>
-          <w:rFonts w:ascii="Times New Roman" w:hAnsi="Times New Roman" w:eastAsia="Times New Roman" w:cs="Times New Roman"/>
-        </w:rPr>
-        <w:t xml:space="preserve"> </w:t>
-      </w:r>
-      <w:r>
-        <w:rPr>
-          <w:b/>
-          <w:bCs/>
-          <w:rFonts w:ascii="Times New Roman" w:hAnsi="Times New Roman" w:eastAsia="Times New Roman" w:cs="Times New Roman"/>
+        <w:t xml:space="preserve"> </w:t>
+      </w:r>
+      <w:r>
+        <w:rPr>
+          <w:b/>
+          <w:bCs/>
         </w:rPr>
         <w:t xml:space="preserve">Qwen3.5-4B-AWQ-4bit</w:t>
       </w:r>
       <w:r>
-        <w:rPr>
-          <w:rFonts w:ascii="Times New Roman" w:hAnsi="Times New Roman" w:eastAsia="Times New Roman" w:cs="Times New Roman"/>
-        </w:rPr>
-        <w:t xml:space="preserve"> </w:t>
-      </w:r>
-      <w:r>
-        <w:rPr>
-          <w:rFonts w:ascii="Times New Roman" w:hAnsi="Times New Roman" w:eastAsia="Times New Roman" w:cs="Times New Roman"/>
-        </w:rPr>
+        <w:t xml:space="preserve"> </w:t>
+      </w:r>
+      <w:r>
         <w:t xml:space="preserve">để tự động giải quyết các đề thi trắc nghiệm đa ngành. Giải pháp vận hành hoàn toàn ngoại tuyến (100% offline) trong môi trường ảo hóa Docker Container.</w:t>
       </w:r>
     </w:p>
@@ -91,29 +66,19 @@
         <w:pStyle w:val="BodyText"/>
       </w:pPr>
       <w:r>
-        <w:rPr>
-          <w:rFonts w:ascii="Times New Roman" w:hAnsi="Times New Roman" w:eastAsia="Times New Roman" w:cs="Times New Roman"/>
-        </w:rPr>
         <w:t xml:space="preserve">Nhóm tác giả đề xuất kiến trúc suy luận thông minh tích hợp cơ chế</w:t>
       </w:r>
       <w:r>
-        <w:rPr>
-          <w:rFonts w:ascii="Times New Roman" w:hAnsi="Times New Roman" w:eastAsia="Times New Roman" w:cs="Times New Roman"/>
-        </w:rPr>
-        <w:t xml:space="preserve"> </w:t>
-      </w:r>
-      <w:r>
-        <w:rPr>
-          <w:b/>
-          <w:bCs/>
-          <w:rFonts w:ascii="Times New Roman" w:hAnsi="Times New Roman" w:eastAsia="Times New Roman" w:cs="Times New Roman"/>
+        <w:t xml:space="preserve"> </w:t>
+      </w:r>
+      <w:r>
+        <w:rPr>
+          <w:b/>
+          <w:bCs/>
         </w:rPr>
         <w:t xml:space="preserve">Logit Margin Early Exit (Dừng sớm theo độ phân vân)</w:t>
       </w:r>
       <w:r>
-        <w:rPr>
-          <w:rFonts w:ascii="Times New Roman" w:hAnsi="Times New Roman" w:eastAsia="Times New Roman" w:cs="Times New Roman"/>
-        </w:rPr>
         <w:t xml:space="preserve">, kết hợp lập luận Chain-of-Thought (CoT) thích ứng và bộ lọc regex phân biệt chữ hoa/thường nghiêm ngặt. Hệ thống giao tiếp trực tiếp với lớp LLMEngine của vLLM để triển khai cơ chế gối đầu bất đồng bộ (Dynamic Pipelining).</w:t>
       </w:r>
     </w:p>
@@ -122,77 +87,50 @@
         <w:pStyle w:val="BodyText"/>
       </w:pPr>
       <w:r>
-        <w:rPr>
-          <w:rFonts w:ascii="Times New Roman" w:hAnsi="Times New Roman" w:eastAsia="Times New Roman" w:cs="Times New Roman"/>
-        </w:rPr>
         <w:t xml:space="preserve">Cấu hình hệ thống được tối ưu hóa và kiểm nghiệm tương thích hoàn hảo với tài nguyên máy chủ đánh giá của Ban Tổ Chức (</w:t>
       </w:r>
       <w:r>
         <w:rPr>
           <w:b/>
           <w:bCs/>
-          <w:rFonts w:ascii="Times New Roman" w:hAnsi="Times New Roman" w:eastAsia="Times New Roman" w:cs="Times New Roman"/>
         </w:rPr>
         <w:t xml:space="preserve">NVIDIA RTX 5060Ti, 32GB RAM</w:t>
       </w:r>
       <w:r>
-        <w:rPr>
-          <w:rFonts w:ascii="Times New Roman" w:hAnsi="Times New Roman" w:eastAsia="Times New Roman" w:cs="Times New Roman"/>
-        </w:rPr>
         <w:t xml:space="preserve">). Kết quả thực nghiệm trên tập Public Test (463 câu hỏi) đạt độ chính xác</w:t>
       </w:r>
       <w:r>
-        <w:rPr>
-          <w:rFonts w:ascii="Times New Roman" w:hAnsi="Times New Roman" w:eastAsia="Times New Roman" w:cs="Times New Roman"/>
-        </w:rPr>
-        <w:t xml:space="preserve"> </w:t>
-      </w:r>
-      <w:r>
-        <w:rPr>
-          <w:b/>
-          <w:bCs/>
-          <w:rFonts w:ascii="Times New Roman" w:hAnsi="Times New Roman" w:eastAsia="Times New Roman" w:cs="Times New Roman"/>
+        <w:t xml:space="preserve"> </w:t>
+      </w:r>
+      <w:r>
+        <w:rPr>
+          <w:b/>
+          <w:bCs/>
         </w:rPr>
         <w:t xml:space="preserve">88.98%</w:t>
       </w:r>
       <w:r>
-        <w:rPr>
-          <w:rFonts w:ascii="Times New Roman" w:hAnsi="Times New Roman" w:eastAsia="Times New Roman" w:cs="Times New Roman"/>
-        </w:rPr>
-        <w:t xml:space="preserve"> </w:t>
-      </w:r>
-      <w:r>
-        <w:rPr>
-          <w:rFonts w:ascii="Times New Roman" w:hAnsi="Times New Roman" w:eastAsia="Times New Roman" w:cs="Times New Roman"/>
-        </w:rPr>
+        <w:t xml:space="preserve"> </w:t>
+      </w:r>
+      <w:r>
         <w:t xml:space="preserve">với tốc độ xử lý trung bình</w:t>
       </w:r>
       <w:r>
-        <w:rPr>
-          <w:rFonts w:ascii="Times New Roman" w:hAnsi="Times New Roman" w:eastAsia="Times New Roman" w:cs="Times New Roman"/>
-        </w:rPr>
-        <w:t xml:space="preserve"> </w:t>
-      </w:r>
-      <w:r>
-        <w:rPr>
-          <w:b/>
-          <w:bCs/>
-          <w:rFonts w:ascii="Times New Roman" w:hAnsi="Times New Roman" w:eastAsia="Times New Roman" w:cs="Times New Roman"/>
+        <w:t xml:space="preserve"> </w:t>
+      </w:r>
+      <w:r>
+        <w:rPr>
+          <w:b/>
+          <w:bCs/>
         </w:rPr>
         <w:t xml:space="preserve">1.42 giây/câu hỏi</w:t>
       </w:r>
       <w:r>
-        <w:rPr>
-          <w:rFonts w:ascii="Times New Roman" w:hAnsi="Times New Roman" w:eastAsia="Times New Roman" w:cs="Times New Roman"/>
-        </w:rPr>
         <w:t xml:space="preserve">.</w:t>
       </w:r>
     </w:p>
     <w:p>
       <w:r>
-        <w:rPr>
-          <w:rFonts w:ascii="Times New Roman" w:hAnsi="Times New Roman" w:eastAsia="Times New Roman" w:cs="Times New Roman"/>
-        </w:rPr>
         <w:pict>
           <v:rect style="width:0;height:1.5pt" o:hralign="center" o:hrstd="t" o:hr="t"/>
         </w:pict>
@@ -205,9 +143,6 @@
         <w:pStyle w:val="Heading2"/>
       </w:pPr>
       <w:r>
-        <w:rPr>
-          <w:rFonts w:ascii="Times New Roman" w:hAnsi="Times New Roman" w:eastAsia="Times New Roman" w:cs="Times New Roman"/>
-        </w:rPr>
         <w:t xml:space="preserve">1. ĐẶT VẤN ĐỀ VÀ LỰA CHỌN MÔ HÌNH NỀN TẢNG</w:t>
       </w:r>
     </w:p>
@@ -216,53 +151,33 @@
         <w:pStyle w:val="FirstParagraph"/>
       </w:pPr>
       <w:r>
-        <w:rPr>
-          <w:rFonts w:ascii="Times New Roman" w:hAnsi="Times New Roman" w:eastAsia="Times New Roman" w:cs="Times New Roman"/>
-        </w:rPr>
         <w:t xml:space="preserve">Thử thách đặt ra tại Bảng C - Innovator yêu cầu AI Agent phải tự động giải quyết chính xác các câu hỏi trắc nghiệm đa ngành có độ phức tạp cao, đồng thời ghi nhận thời gian thực thi tuần tự của từng câu hỏi dưới dạng tệp</w:t>
       </w:r>
       <w:r>
-        <w:rPr>
-          <w:rFonts w:ascii="Times New Roman" w:hAnsi="Times New Roman" w:eastAsia="Times New Roman" w:cs="Times New Roman"/>
-        </w:rPr>
         <w:t xml:space="preserve"> </w:t>
       </w:r>
       <w:r>
         <w:rPr>
           <w:rStyle w:val="VerbatimChar"/>
-          <w:rFonts w:ascii="Times New Roman" w:hAnsi="Times New Roman" w:eastAsia="Times New Roman" w:cs="Times New Roman"/>
         </w:rPr>
         <w:t xml:space="preserve">submission.csv</w:t>
       </w:r>
       <w:r>
-        <w:rPr>
-          <w:rFonts w:ascii="Times New Roman" w:hAnsi="Times New Roman" w:eastAsia="Times New Roman" w:cs="Times New Roman"/>
-        </w:rPr>
-        <w:t xml:space="preserve"> </w:t>
-      </w:r>
-      <w:r>
-        <w:rPr>
-          <w:rFonts w:ascii="Times New Roman" w:hAnsi="Times New Roman" w:eastAsia="Times New Roman" w:cs="Times New Roman"/>
-        </w:rPr>
+        <w:t xml:space="preserve"> </w:t>
+      </w:r>
+      <w:r>
         <w:t xml:space="preserve">và</w:t>
       </w:r>
       <w:r>
-        <w:rPr>
-          <w:rFonts w:ascii="Times New Roman" w:hAnsi="Times New Roman" w:eastAsia="Times New Roman" w:cs="Times New Roman"/>
-        </w:rPr>
         <w:t xml:space="preserve"> </w:t>
       </w:r>
       <w:r>
         <w:rPr>
           <w:rStyle w:val="VerbatimChar"/>
-          <w:rFonts w:ascii="Times New Roman" w:hAnsi="Times New Roman" w:eastAsia="Times New Roman" w:cs="Times New Roman"/>
         </w:rPr>
         <w:t xml:space="preserve">submission_time.csv</w:t>
       </w:r>
       <w:r>
-        <w:rPr>
-          <w:rFonts w:ascii="Times New Roman" w:hAnsi="Times New Roman" w:eastAsia="Times New Roman" w:cs="Times New Roman"/>
-        </w:rPr>
         <w:t xml:space="preserve">. Điều này đòi hỏi giải pháp phải giải quyết đồng thời hai bài toán:</w:t>
       </w:r>
     </w:p>
@@ -278,14 +193,10 @@
         <w:rPr>
           <w:b/>
           <w:bCs/>
-          <w:rFonts w:ascii="Times New Roman" w:hAnsi="Times New Roman" w:eastAsia="Times New Roman" w:cs="Times New Roman"/>
         </w:rPr>
         <w:t xml:space="preserve">Nâng cao chất lượng lập luận logic</w:t>
       </w:r>
       <w:r>
-        <w:rPr>
-          <w:rFonts w:ascii="Times New Roman" w:hAnsi="Times New Roman" w:eastAsia="Times New Roman" w:cs="Times New Roman"/>
-        </w:rPr>
         <w:t xml:space="preserve">: Tránh hiện tượng suy luận bị cắt cụt (truncation) hoặc trích xuất nhầm đáp án trong ngữ cảnh tiếng Việt.</w:t>
       </w:r>
     </w:p>
@@ -301,20 +212,13 @@
         <w:rPr>
           <w:b/>
           <w:bCs/>
-          <w:rFonts w:ascii="Times New Roman" w:hAnsi="Times New Roman" w:eastAsia="Times New Roman" w:cs="Times New Roman"/>
         </w:rPr>
         <w:t xml:space="preserve">Tối ưu hóa tài nguyên phần cứng</w:t>
       </w:r>
       <w:r>
-        <w:rPr>
-          <w:rFonts w:ascii="Times New Roman" w:hAnsi="Times New Roman" w:eastAsia="Times New Roman" w:cs="Times New Roman"/>
-        </w:rPr>
         <w:t xml:space="preserve">: Đảm bảo hệ thống vận hành ổn định và không xảy ra lỗi tràn bộ nhớ (Out-Of-Memory) trên cấu hình phần cứng RTX 5060Ti (VRAM</w:t>
       </w:r>
       <w:r>
-        <w:rPr>
-          <w:rFonts w:ascii="Times New Roman" w:hAnsi="Times New Roman" w:eastAsia="Times New Roman" w:cs="Times New Roman"/>
-        </w:rPr>
         <w:t xml:space="preserve"> </w:t>
       </w:r>
       <m:oMath>
@@ -329,15 +233,9 @@
         </m:r>
       </m:oMath>
       <w:r>
-        <w:rPr>
-          <w:rFonts w:ascii="Times New Roman" w:hAnsi="Times New Roman" w:eastAsia="Times New Roman" w:cs="Times New Roman"/>
-        </w:rPr>
-        <w:t xml:space="preserve"> </w:t>
-      </w:r>
-      <w:r>
-        <w:rPr>
-          <w:rFonts w:ascii="Times New Roman" w:hAnsi="Times New Roman" w:eastAsia="Times New Roman" w:cs="Times New Roman"/>
-        </w:rPr>
+        <w:t xml:space="preserve"> </w:t>
+      </w:r>
+      <w:r>
         <w:t xml:space="preserve">GB) và 32GB RAM hệ thống.</w:t>
       </w:r>
     </w:p>
@@ -346,58 +244,39 @@
         <w:pStyle w:val="FirstParagraph"/>
       </w:pPr>
       <w:r>
-        <w:rPr>
-          <w:rFonts w:ascii="Times New Roman" w:hAnsi="Times New Roman" w:eastAsia="Times New Roman" w:cs="Times New Roman"/>
-        </w:rPr>
         <w:t xml:space="preserve">Nhóm tác giả đã lựa chọn mô hình lượng tử hóa</w:t>
       </w:r>
       <w:r>
-        <w:rPr>
-          <w:rFonts w:ascii="Times New Roman" w:hAnsi="Times New Roman" w:eastAsia="Times New Roman" w:cs="Times New Roman"/>
-        </w:rPr>
-        <w:t xml:space="preserve"> </w:t>
-      </w:r>
-      <w:r>
-        <w:rPr>
-          <w:b/>
-          <w:bCs/>
-          <w:rFonts w:ascii="Times New Roman" w:hAnsi="Times New Roman" w:eastAsia="Times New Roman" w:cs="Times New Roman"/>
+        <w:t xml:space="preserve"> </w:t>
+      </w:r>
+      <w:r>
+        <w:rPr>
+          <w:b/>
+          <w:bCs/>
         </w:rPr>
         <w:t xml:space="preserve">Qwen3.5-4B-AWQ-4bit</w:t>
       </w:r>
       <w:r>
-        <w:rPr>
-          <w:rFonts w:ascii="Times New Roman" w:hAnsi="Times New Roman" w:eastAsia="Times New Roman" w:cs="Times New Roman"/>
-        </w:rPr>
-        <w:t xml:space="preserve"> </w:t>
-      </w:r>
-      <w:r>
-        <w:rPr>
-          <w:rFonts w:ascii="Times New Roman" w:hAnsi="Times New Roman" w:eastAsia="Times New Roman" w:cs="Times New Roman"/>
-        </w:rPr>
+        <w:t xml:space="preserve"> </w:t>
+      </w:r>
+      <w:r>
         <w:t xml:space="preserve">(kích thước tệp trọng số ~3.8GB). Lựa chọn này giúp tiết kiệm tối đa dung lượng bộ nhớ đệm KV Cache và VRAM, cho phép chạy với kích thước batch lớn trong khi vẫn bảo toàn năng lực lập luận ngữ cảnh xuất sắc từ kiến trúc Qwen3.5 gốc. Để điều khiển mô hình ngoại tuyến, chúng tôi giao tiếp trực tiếp với lớp API LLMEngine của vLLM để tối ưu hiệu năng.</w:t>
       </w:r>
     </w:p>
     <w:p>
       <w:r>
-        <w:rPr>
-          <w:rFonts w:ascii="Times New Roman" w:hAnsi="Times New Roman" w:eastAsia="Times New Roman" w:cs="Times New Roman"/>
-        </w:rPr>
         <w:pict>
           <v:rect style="width:0;height:1.5pt" o:hralign="center" o:hrstd="t" o:hr="t"/>
         </w:pict>
       </w:r>
     </w:p>
     <w:bookmarkEnd w:id="11"/>
-    <w:bookmarkStart w:id="18" w:name="X070bf3456b9df650d6a297a8bf7d57d77e80be0"/>
+    <w:bookmarkStart w:id="19" w:name="X070bf3456b9df650d6a297a8bf7d57d77e80be0"/>
     <w:p>
       <w:pPr>
         <w:pStyle w:val="Heading2"/>
       </w:pPr>
       <w:r>
-        <w:rPr>
-          <w:rFonts w:ascii="Times New Roman" w:hAnsi="Times New Roman" w:eastAsia="Times New Roman" w:cs="Times New Roman"/>
-        </w:rPr>
         <w:t xml:space="preserve">2. PHƯƠNG PHÁP ĐỀ XUẤT VÀ KIẾN TRÚC SUY LUẬN</w:t>
       </w:r>
     </w:p>
@@ -407,9 +286,6 @@
         <w:pStyle w:val="Heading3"/>
       </w:pPr>
       <w:r>
-        <w:rPr>
-          <w:rFonts w:ascii="Times New Roman" w:hAnsi="Times New Roman" w:eastAsia="Times New Roman" w:cs="Times New Roman"/>
-        </w:rPr>
         <w:t xml:space="preserve">2.1. Sơ đồ luồng xử lý (Pipeline Flowchart)</w:t>
       </w:r>
     </w:p>
@@ -418,9 +294,6 @@
         <w:pStyle w:val="CaptionedFigure"/>
       </w:pPr>
       <w:r>
-        <w:rPr>
-          <w:rFonts w:ascii="Times New Roman" w:hAnsi="Times New Roman" w:eastAsia="Times New Roman" w:cs="Times New Roman"/>
-        </w:rPr>
         <w:drawing>
           <wp:inline>
             <wp:extent cx="5334000" cy="5689600"/>
@@ -468,9 +341,6 @@
         <w:pStyle w:val="ImageCaption"/>
       </w:pPr>
       <w:r>
-        <w:rPr>
-          <w:rFonts w:ascii="Times New Roman" w:hAnsi="Times New Roman" w:eastAsia="Times New Roman" w:cs="Times New Roman"/>
-        </w:rPr>
         <w:t xml:space="preserve">Sơ đồ kiến trúc xử lý của AI Agent</w:t>
       </w:r>
     </w:p>
@@ -481,9 +351,6 @@
         <w:pStyle w:val="Heading3"/>
       </w:pPr>
       <w:r>
-        <w:rPr>
-          <w:rFonts w:ascii="Times New Roman" w:hAnsi="Times New Roman" w:eastAsia="Times New Roman" w:cs="Times New Roman"/>
-        </w:rPr>
         <w:t xml:space="preserve">2.2. Cơ chế quyết định Logit Margin Early Exit</w:t>
       </w:r>
     </w:p>
@@ -492,9 +359,6 @@
         <w:pStyle w:val="FirstParagraph"/>
       </w:pPr>
       <w:r>
-        <w:rPr>
-          <w:rFonts w:ascii="Times New Roman" w:hAnsi="Times New Roman" w:eastAsia="Times New Roman" w:cs="Times New Roman"/>
-        </w:rPr>
         <w:t xml:space="preserve">Để tối ưu hóa thời gian thực thi mà không làm giảm độ chính xác, nhóm tác giả đề xuất giải pháp rẽ nhánh suy luận dựa trên phân phối xác suất đầu ra (logits) của mô hình:</w:t>
       </w:r>
     </w:p>
@@ -510,27 +374,19 @@
         <w:rPr>
           <w:b/>
           <w:bCs/>
-          <w:rFonts w:ascii="Times New Roman" w:hAnsi="Times New Roman" w:eastAsia="Times New Roman" w:cs="Times New Roman"/>
         </w:rPr>
         <w:t xml:space="preserve">Luồng CoT chính (Luồng 0)</w:t>
       </w:r>
       <w:r>
-        <w:rPr>
-          <w:rFonts w:ascii="Times New Roman" w:hAnsi="Times New Roman" w:eastAsia="Times New Roman" w:cs="Times New Roman"/>
-        </w:rPr>
         <w:t xml:space="preserve">: Hệ thống sinh lập luận Chain-of-Thought đầy đủ cho câu hỏi ở nhiệt độ thấp (</w:t>
       </w:r>
       <w:r>
         <w:rPr>
           <w:rStyle w:val="VerbatimChar"/>
-          <w:rFonts w:ascii="Times New Roman" w:hAnsi="Times New Roman" w:eastAsia="Times New Roman" w:cs="Times New Roman"/>
         </w:rPr>
         <w:t xml:space="preserve">temperature=0.2</w:t>
       </w:r>
       <w:r>
-        <w:rPr>
-          <w:rFonts w:ascii="Times New Roman" w:hAnsi="Times New Roman" w:eastAsia="Times New Roman" w:cs="Times New Roman"/>
-        </w:rPr>
         <w:t xml:space="preserve">) nhằm định hướng lập luận logic chặt chẽ.</w:t>
       </w:r>
     </w:p>
@@ -546,52 +402,34 @@
         <w:rPr>
           <w:b/>
           <w:bCs/>
-          <w:rFonts w:ascii="Times New Roman" w:hAnsi="Times New Roman" w:eastAsia="Times New Roman" w:cs="Times New Roman"/>
         </w:rPr>
         <w:t xml:space="preserve">Kiểm tra độ tự tin (Confidence Check)</w:t>
       </w:r>
       <w:r>
-        <w:rPr>
-          <w:rFonts w:ascii="Times New Roman" w:hAnsi="Times New Roman" w:eastAsia="Times New Roman" w:cs="Times New Roman"/>
-        </w:rPr>
         <w:t xml:space="preserve">: Hệ thống gọi tiếp 1 token chốt đáp án bằng giải thuật Greedy (</w:t>
       </w:r>
       <w:r>
         <w:rPr>
           <w:rStyle w:val="VerbatimChar"/>
-          <w:rFonts w:ascii="Times New Roman" w:hAnsi="Times New Roman" w:eastAsia="Times New Roman" w:cs="Times New Roman"/>
         </w:rPr>
         <w:t xml:space="preserve">temperature=0.0</w:t>
       </w:r>
       <w:r>
-        <w:rPr>
-          <w:rFonts w:ascii="Times New Roman" w:hAnsi="Times New Roman" w:eastAsia="Times New Roman" w:cs="Times New Roman"/>
-        </w:rPr>
         <w:t xml:space="preserve">) kèm cấu hình</w:t>
       </w:r>
       <w:r>
-        <w:rPr>
-          <w:rFonts w:ascii="Times New Roman" w:hAnsi="Times New Roman" w:eastAsia="Times New Roman" w:cs="Times New Roman"/>
-        </w:rPr>
         <w:t xml:space="preserve"> </w:t>
       </w:r>
       <w:r>
         <w:rPr>
           <w:rStyle w:val="VerbatimChar"/>
-          <w:rFonts w:ascii="Times New Roman" w:hAnsi="Times New Roman" w:eastAsia="Times New Roman" w:cs="Times New Roman"/>
         </w:rPr>
         <w:t xml:space="preserve">logprobs=5</w:t>
       </w:r>
       <w:r>
-        <w:rPr>
-          <w:rFonts w:ascii="Times New Roman" w:hAnsi="Times New Roman" w:eastAsia="Times New Roman" w:cs="Times New Roman"/>
-        </w:rPr>
-        <w:t xml:space="preserve"> </w:t>
-      </w:r>
-      <w:r>
-        <w:rPr>
-          <w:rFonts w:ascii="Times New Roman" w:hAnsi="Times New Roman" w:eastAsia="Times New Roman" w:cs="Times New Roman"/>
-        </w:rPr>
+        <w:t xml:space="preserve"> </w:t>
+      </w:r>
+      <w:r>
         <w:t xml:space="preserve">để lấy phân phối xác suất của 5 token hàng đầu.</w:t>
       </w:r>
     </w:p>
@@ -607,26 +445,16 @@
         <w:rPr>
           <w:b/>
           <w:bCs/>
-          <w:rFonts w:ascii="Times New Roman" w:hAnsi="Times New Roman" w:eastAsia="Times New Roman" w:cs="Times New Roman"/>
         </w:rPr>
         <w:t xml:space="preserve">Tính toán Logit Margin</w:t>
       </w:r>
       <w:r>
-        <w:rPr>
-          <w:rFonts w:ascii="Times New Roman" w:hAnsi="Times New Roman" w:eastAsia="Times New Roman" w:cs="Times New Roman"/>
-        </w:rPr>
         <w:t xml:space="preserve">:</w:t>
       </w:r>
       <w:r>
-        <w:rPr>
-          <w:rFonts w:ascii="Times New Roman" w:hAnsi="Times New Roman" w:eastAsia="Times New Roman" w:cs="Times New Roman"/>
-        </w:rPr>
-        <w:t xml:space="preserve"> </w:t>
-      </w:r>
-      <w:r>
-        <w:rPr>
-          <w:rFonts w:ascii="Times New Roman" w:hAnsi="Times New Roman" w:eastAsia="Times New Roman" w:cs="Times New Roman"/>
-        </w:rPr>
+        <w:t xml:space="preserve"> </w:t>
+      </w:r>
+      <w:r>
         <w:t xml:space="preserve">Độ phân vân của mô hình được tính bằng hiệu xác suất giữa lựa chọn hàng đầu và lựa chọn thứ hai:</w:t>
       </w:r>
     </w:p>
@@ -717,7 +545,6 @@
         <w:rPr>
           <w:b/>
           <w:bCs/>
-          <w:rFonts w:ascii="Times New Roman" w:hAnsi="Times New Roman" w:eastAsia="Times New Roman" w:cs="Times New Roman"/>
         </w:rPr>
         <w:t xml:space="preserve">Nhánh Dừng Sớm (Early Exit -</w:t>
       </w:r>
@@ -725,7 +552,6 @@
         <w:rPr>
           <w:b/>
           <w:bCs/>
-          <w:rFonts w:ascii="Times New Roman" w:hAnsi="Times New Roman" w:eastAsia="Times New Roman" w:cs="Times New Roman"/>
         </w:rPr>
         <w:t xml:space="preserve"> </w:t>
       </w:r>
@@ -751,40 +577,26 @@
         <w:rPr>
           <w:b/>
           <w:bCs/>
-          <w:rFonts w:ascii="Times New Roman" w:hAnsi="Times New Roman" w:eastAsia="Times New Roman" w:cs="Times New Roman"/>
         </w:rPr>
         <w:t xml:space="preserve">)</w:t>
       </w:r>
       <w:r>
-        <w:rPr>
-          <w:rFonts w:ascii="Times New Roman" w:hAnsi="Times New Roman" w:eastAsia="Times New Roman" w:cs="Times New Roman"/>
-        </w:rPr>
         <w:t xml:space="preserve">: Nếu Margin vượt ngưỡng 50%, mô hình đã đưa ra câu trả lời dứt khoát. Hệ thống sẽ lập tức dừng sớm và lấy đáp án của Luồng 0 làm kết quả cuối cùng. Cơ chế này áp dụng thành công cho</w:t>
       </w:r>
       <w:r>
-        <w:rPr>
-          <w:rFonts w:ascii="Times New Roman" w:hAnsi="Times New Roman" w:eastAsia="Times New Roman" w:cs="Times New Roman"/>
-        </w:rPr>
-        <w:t xml:space="preserve"> </w:t>
-      </w:r>
-      <w:r>
-        <w:rPr>
-          <w:b/>
-          <w:bCs/>
-          <w:rFonts w:ascii="Times New Roman" w:hAnsi="Times New Roman" w:eastAsia="Times New Roman" w:cs="Times New Roman"/>
+        <w:t xml:space="preserve"> </w:t>
+      </w:r>
+      <w:r>
+        <w:rPr>
+          <w:b/>
+          <w:bCs/>
         </w:rPr>
         <w:t xml:space="preserve">74.3% câu hỏi</w:t>
       </w:r>
       <w:r>
-        <w:rPr>
-          <w:rFonts w:ascii="Times New Roman" w:hAnsi="Times New Roman" w:eastAsia="Times New Roman" w:cs="Times New Roman"/>
-        </w:rPr>
-        <w:t xml:space="preserve"> </w:t>
-      </w:r>
-      <w:r>
-        <w:rPr>
-          <w:rFonts w:ascii="Times New Roman" w:hAnsi="Times New Roman" w:eastAsia="Times New Roman" w:cs="Times New Roman"/>
-        </w:rPr>
+        <w:t xml:space="preserve"> </w:t>
+      </w:r>
+      <w:r>
         <w:t xml:space="preserve">trong tập đề thi, giúp tiết kiệm 66% tài nguyên tính toán.</w:t>
       </w:r>
     </w:p>
@@ -800,7 +612,6 @@
         <w:rPr>
           <w:b/>
           <w:bCs/>
-          <w:rFonts w:ascii="Times New Roman" w:hAnsi="Times New Roman" w:eastAsia="Times New Roman" w:cs="Times New Roman"/>
         </w:rPr>
         <w:t xml:space="preserve">Nhánh Biểu Quyết (Voting -</w:t>
       </w:r>
@@ -808,7 +619,6 @@
         <w:rPr>
           <w:b/>
           <w:bCs/>
-          <w:rFonts w:ascii="Times New Roman" w:hAnsi="Times New Roman" w:eastAsia="Times New Roman" w:cs="Times New Roman"/>
         </w:rPr>
         <w:t xml:space="preserve"> </w:t>
       </w:r>
@@ -834,33 +644,22 @@
         <w:rPr>
           <w:b/>
           <w:bCs/>
-          <w:rFonts w:ascii="Times New Roman" w:hAnsi="Times New Roman" w:eastAsia="Times New Roman" w:cs="Times New Roman"/>
         </w:rPr>
         <w:t xml:space="preserve">)</w:t>
       </w:r>
       <w:r>
-        <w:rPr>
-          <w:rFonts w:ascii="Times New Roman" w:hAnsi="Times New Roman" w:eastAsia="Times New Roman" w:cs="Times New Roman"/>
-        </w:rPr>
         <w:t xml:space="preserve">: Nếu Margin dưới ngưỡng 50%, mô hình đang phân vân giữa các đáp án. Hệ thống sẽ kích hoạt song song Luồng 1 và Luồng 2 (chạy ở nhiệt độ</w:t>
       </w:r>
       <w:r>
-        <w:rPr>
-          <w:rFonts w:ascii="Times New Roman" w:hAnsi="Times New Roman" w:eastAsia="Times New Roman" w:cs="Times New Roman"/>
-        </w:rPr>
         <w:t xml:space="preserve"> </w:t>
       </w:r>
       <w:r>
         <w:rPr>
           <w:rStyle w:val="VerbatimChar"/>
-          <w:rFonts w:ascii="Times New Roman" w:hAnsi="Times New Roman" w:eastAsia="Times New Roman" w:cs="Times New Roman"/>
         </w:rPr>
         <w:t xml:space="preserve">temperature=0.2</w:t>
       </w:r>
       <w:r>
-        <w:rPr>
-          <w:rFonts w:ascii="Times New Roman" w:hAnsi="Times New Roman" w:eastAsia="Times New Roman" w:cs="Times New Roman"/>
-        </w:rPr>
         <w:t xml:space="preserve">), sau đó thực hiện biểu quyết đa số (Majority Voting) giữa cả 3 luồng để đưa ra quyết định chuẩn xác nhất cho câu hỏi khó.</w:t>
       </w:r>
     </w:p>
@@ -871,9 +670,6 @@
         <w:pStyle w:val="Heading3"/>
       </w:pPr>
       <w:r>
-        <w:rPr>
-          <w:rFonts w:ascii="Times New Roman" w:hAnsi="Times New Roman" w:eastAsia="Times New Roman" w:cs="Times New Roman"/>
-        </w:rPr>
         <w:t xml:space="preserve">2.3. Trích xuất đáp án và Chuẩn hóa tiếng Việt</w:t>
       </w:r>
     </w:p>
@@ -882,159 +678,101 @@
         <w:pStyle w:val="FirstParagraph"/>
       </w:pPr>
       <w:r>
-        <w:rPr>
-          <w:rFonts w:ascii="Times New Roman" w:hAnsi="Times New Roman" w:eastAsia="Times New Roman" w:cs="Times New Roman"/>
-        </w:rPr>
         <w:t xml:space="preserve">Tiếng Việt tự nhiên chứa nhiều từ viết thường trùng với ký tự đáp án trắc nghiệm (ví dụ:</w:t>
       </w:r>
       <w:r>
-        <w:rPr>
-          <w:rFonts w:ascii="Times New Roman" w:hAnsi="Times New Roman" w:eastAsia="Times New Roman" w:cs="Times New Roman"/>
-        </w:rPr>
         <w:t xml:space="preserve"> </w:t>
       </w:r>
       <w:r>
         <w:rPr>
           <w:i/>
           <w:iCs/>
-          <w:rFonts w:ascii="Times New Roman" w:hAnsi="Times New Roman" w:eastAsia="Times New Roman" w:cs="Times New Roman"/>
         </w:rPr>
         <w:t xml:space="preserve">‘ngày’</w:t>
       </w:r>
       <w:r>
-        <w:rPr>
-          <w:rFonts w:ascii="Times New Roman" w:hAnsi="Times New Roman" w:eastAsia="Times New Roman" w:cs="Times New Roman"/>
-        </w:rPr>
         <w:t xml:space="preserve">,</w:t>
       </w:r>
       <w:r>
-        <w:rPr>
-          <w:rFonts w:ascii="Times New Roman" w:hAnsi="Times New Roman" w:eastAsia="Times New Roman" w:cs="Times New Roman"/>
-        </w:rPr>
         <w:t xml:space="preserve"> </w:t>
       </w:r>
       <w:r>
         <w:rPr>
           <w:i/>
           <w:iCs/>
-          <w:rFonts w:ascii="Times New Roman" w:hAnsi="Times New Roman" w:eastAsia="Times New Roman" w:cs="Times New Roman"/>
         </w:rPr>
         <w:t xml:space="preserve">‘việc’</w:t>
       </w:r>
       <w:r>
-        <w:rPr>
-          <w:rFonts w:ascii="Times New Roman" w:hAnsi="Times New Roman" w:eastAsia="Times New Roman" w:cs="Times New Roman"/>
-        </w:rPr>
         <w:t xml:space="preserve">,</w:t>
       </w:r>
       <w:r>
-        <w:rPr>
-          <w:rFonts w:ascii="Times New Roman" w:hAnsi="Times New Roman" w:eastAsia="Times New Roman" w:cs="Times New Roman"/>
-        </w:rPr>
         <w:t xml:space="preserve"> </w:t>
       </w:r>
       <w:r>
         <w:rPr>
           <w:i/>
           <w:iCs/>
-          <w:rFonts w:ascii="Times New Roman" w:hAnsi="Times New Roman" w:eastAsia="Times New Roman" w:cs="Times New Roman"/>
         </w:rPr>
         <w:t xml:space="preserve">‘hành’</w:t>
       </w:r>
       <w:r>
-        <w:rPr>
-          <w:rFonts w:ascii="Times New Roman" w:hAnsi="Times New Roman" w:eastAsia="Times New Roman" w:cs="Times New Roman"/>
-        </w:rPr>
         <w:t xml:space="preserve">,</w:t>
       </w:r>
       <w:r>
-        <w:rPr>
-          <w:rFonts w:ascii="Times New Roman" w:hAnsi="Times New Roman" w:eastAsia="Times New Roman" w:cs="Times New Roman"/>
-        </w:rPr>
         <w:t xml:space="preserve"> </w:t>
       </w:r>
       <w:r>
         <w:rPr>
           <w:i/>
           <w:iCs/>
-          <w:rFonts w:ascii="Times New Roman" w:hAnsi="Times New Roman" w:eastAsia="Times New Roman" w:cs="Times New Roman"/>
         </w:rPr>
         <w:t xml:space="preserve">‘về’</w:t>
       </w:r>
       <w:r>
-        <w:rPr>
-          <w:rFonts w:ascii="Times New Roman" w:hAnsi="Times New Roman" w:eastAsia="Times New Roman" w:cs="Times New Roman"/>
-        </w:rPr>
         <w:t xml:space="preserve">…). Nhóm tác giả đã thiết kế bộ lọc biểu thức chính quy</w:t>
       </w:r>
       <w:r>
-        <w:rPr>
-          <w:rFonts w:ascii="Times New Roman" w:hAnsi="Times New Roman" w:eastAsia="Times New Roman" w:cs="Times New Roman"/>
-        </w:rPr>
-        <w:t xml:space="preserve"> </w:t>
-      </w:r>
-      <w:r>
-        <w:rPr>
-          <w:b/>
-          <w:bCs/>
-          <w:rFonts w:ascii="Times New Roman" w:hAnsi="Times New Roman" w:eastAsia="Times New Roman" w:cs="Times New Roman"/>
+        <w:t xml:space="preserve"> </w:t>
+      </w:r>
+      <w:r>
+        <w:rPr>
+          <w:b/>
+          <w:bCs/>
         </w:rPr>
         <w:t xml:space="preserve">phân biệt nghiêm ngặt chữ hoa/chữ thường (case-sensitive)</w:t>
       </w:r>
       <w:r>
-        <w:rPr>
-          <w:rFonts w:ascii="Times New Roman" w:hAnsi="Times New Roman" w:eastAsia="Times New Roman" w:cs="Times New Roman"/>
-        </w:rPr>
-        <w:t xml:space="preserve"> </w:t>
-      </w:r>
-      <w:r>
-        <w:rPr>
-          <w:rFonts w:ascii="Times New Roman" w:hAnsi="Times New Roman" w:eastAsia="Times New Roman" w:cs="Times New Roman"/>
-        </w:rPr>
+        <w:t xml:space="preserve"> </w:t>
+      </w:r>
+      <w:r>
         <w:t xml:space="preserve">kết hợp ranh giới từ độc lập:</w:t>
       </w:r>
       <w:r>
-        <w:rPr>
-          <w:rFonts w:ascii="Times New Roman" w:hAnsi="Times New Roman" w:eastAsia="Times New Roman" w:cs="Times New Roman"/>
-        </w:rPr>
-        <w:t xml:space="preserve"> </w:t>
-      </w:r>
-      <w:r>
-        <w:rPr>
-          <w:rFonts w:ascii="Times New Roman" w:hAnsi="Times New Roman" w:eastAsia="Times New Roman" w:cs="Times New Roman"/>
-        </w:rPr>
+        <w:t xml:space="preserve"> </w:t>
+      </w:r>
+      <w:r>
         <w:t xml:space="preserve">*</w:t>
       </w:r>
       <w:r>
-        <w:rPr>
-          <w:rFonts w:ascii="Times New Roman" w:hAnsi="Times New Roman" w:eastAsia="Times New Roman" w:cs="Times New Roman"/>
-        </w:rPr>
-        <w:t xml:space="preserve"> </w:t>
-      </w:r>
-      <w:r>
-        <w:rPr>
-          <w:b/>
-          <w:bCs/>
-          <w:rFonts w:ascii="Times New Roman" w:hAnsi="Times New Roman" w:eastAsia="Times New Roman" w:cs="Times New Roman"/>
+        <w:t xml:space="preserve"> </w:t>
+      </w:r>
+      <w:r>
+        <w:rPr>
+          <w:b/>
+          <w:bCs/>
         </w:rPr>
         <w:t xml:space="preserve">Mẫu Regex</w:t>
       </w:r>
       <w:r>
-        <w:rPr>
-          <w:rFonts w:ascii="Times New Roman" w:hAnsi="Times New Roman" w:eastAsia="Times New Roman" w:cs="Times New Roman"/>
-        </w:rPr>
         <w:t xml:space="preserve">:</w:t>
       </w:r>
       <w:r>
-        <w:rPr>
-          <w:rFonts w:ascii="Times New Roman" w:hAnsi="Times New Roman" w:eastAsia="Times New Roman" w:cs="Times New Roman"/>
-        </w:rPr>
         <w:t xml:space="preserve"> </w:t>
       </w:r>
       <w:r>
         <w:rPr>
           <w:rStyle w:val="VerbatimChar"/>
-          <w:rFonts w:ascii="Times New Roman" w:hAnsi="Times New Roman" w:eastAsia="Times New Roman" w:cs="Times New Roman"/>
         </w:rPr>
         <w:t xml:space="preserve">\b[A-J]\b</w:t>
       </w:r>
@@ -1044,33 +782,129 @@
         <w:pStyle w:val="BodyText"/>
       </w:pPr>
       <w:r>
-        <w:rPr>
-          <w:rFonts w:ascii="Times New Roman" w:hAnsi="Times New Roman" w:eastAsia="Times New Roman" w:cs="Times New Roman"/>
-        </w:rPr>
         <w:t xml:space="preserve">Cơ chế này loại bỏ hoàn toàn các ký tự trùng hợp trong văn bản tiếng Việt tự nhiên, đảm bảo đáp án trích xuất luôn chính xác và được đối chiếu kiểm tra tính hợp lệ với danh sách lựa chọn của câu hỏi trước khi xuất kết quả.</w:t>
       </w:r>
     </w:p>
-    <w:p>
-      <w:r>
-        <w:rPr>
-          <w:rFonts w:ascii="Times New Roman" w:hAnsi="Times New Roman" w:eastAsia="Times New Roman" w:cs="Times New Roman"/>
-        </w:rPr>
+    <w:bookmarkEnd w:id="17"/>
+    <w:bookmarkStart w:id="18" w:name="Xff0e9bc135c3aba329bee6cae7b35b36d239849"/>
+    <w:p>
+      <w:pPr>
+        <w:pStyle w:val="Heading3"/>
+      </w:pPr>
+      <w:r>
+        <w:t xml:space="preserve">2.4. Cơ chế phòng chống tràn ngữ cảnh chủ động (Proactive Context Overflow Prevention)</w:t>
+      </w:r>
+    </w:p>
+    <w:p>
+      <w:pPr>
+        <w:pStyle w:val="FirstParagraph"/>
+      </w:pPr>
+      <w:r>
+        <w:t xml:space="preserve">Để đảm bảo hệ thống vận hành liên tục xuyên suốt hàng ngàn câu hỏi mà không bị dừng đột ngột (crash) do lỗi vượt quá giới hạn ngữ cảnh của vLLM (ví dụ lỗi</w:t>
+      </w:r>
+      <w:r>
+        <w:t xml:space="preserve"> </w:t>
+      </w:r>
+      <w:r>
+        <w:rPr>
+          <w:rStyle w:val="VerbatimChar"/>
+        </w:rPr>
+        <w:t xml:space="preserve">3073 &gt; 3072</w:t>
+      </w:r>
+      <w:r>
+        <w:t xml:space="preserve">), nhóm tác giả đã thiết lập cơ chế kiểm soát an toàn động hai lớp ngay trước khi gửi yêu cầu Bước 2:</w:t>
+      </w:r>
+      <w:r>
+        <w:t xml:space="preserve"> </w:t>
+      </w:r>
+      <w:r>
+        <w:t xml:space="preserve">*</w:t>
+      </w:r>
+      <w:r>
+        <w:t xml:space="preserve"> </w:t>
+      </w:r>
+      <w:r>
+        <w:rPr>
+          <w:b/>
+          <w:bCs/>
+        </w:rPr>
+        <w:t xml:space="preserve">Kiểm tra và cắt tỉa đệ quy (Recursive Verification Loop)</w:t>
+      </w:r>
+      <w:r>
+        <w:t xml:space="preserve">: Hệ thống chạy mô phỏng mã hóa thử nghiệm (</w:t>
+      </w:r>
+      <w:r>
+        <w:rPr>
+          <w:rStyle w:val="VerbatimChar"/>
+        </w:rPr>
+        <w:t xml:space="preserve">tokenizer.encode</w:t>
+      </w:r>
+      <w:r>
+        <w:t xml:space="preserve">) chuỗi prompt Bước 2 hoàn chỉnh. Nếu phát hiện kích thước thực tế vượt quá giới hạn an toàn (do hiện tượng</w:t>
+      </w:r>
+      <w:r>
+        <w:t xml:space="preserve"> </w:t>
+      </w:r>
+      <w:r>
+        <w:t xml:space="preserve">“nở”</w:t>
+      </w:r>
+      <w:r>
+        <w:t xml:space="preserve"> </w:t>
+      </w:r>
+      <w:r>
+        <w:t xml:space="preserve">token khi decode/encode ngược lại tại ranh giới từ), hệ thống sẽ đệ quy cắt tỉa bớt 10 token của phần suy luận ở cuối bài làm CoT cho đến khi đạt độ dài an toàn tuyệt đối.</w:t>
+      </w:r>
+      <w:r>
+        <w:t xml:space="preserve"> </w:t>
+      </w:r>
+      <w:r>
+        <w:t xml:space="preserve">*</w:t>
+      </w:r>
+      <w:r>
+        <w:t xml:space="preserve"> </w:t>
+      </w:r>
+      <w:r>
+        <w:rPr>
+          <w:b/>
+          <w:bCs/>
+        </w:rPr>
+        <w:t xml:space="preserve">Cơ chế cứu vây dự phòng (Fallback Extraction)</w:t>
+      </w:r>
+      <w:r>
+        <w:t xml:space="preserve">: Trong trường hợp cực đoan khi câu hỏi quá dài khiến việc loại bỏ toàn bộ bài suy luận vẫn không đủ chỗ cho vLLM sinh đáp án, hệ thống sẽ</w:t>
+      </w:r>
+      <w:r>
+        <w:t xml:space="preserve"> </w:t>
+      </w:r>
+      <w:r>
+        <w:rPr>
+          <w:b/>
+          <w:bCs/>
+        </w:rPr>
+        <w:t xml:space="preserve">bỏ qua hoàn toàn việc gọi vLLM</w:t>
+      </w:r>
+      <w:r>
+        <w:t xml:space="preserve"> </w:t>
+      </w:r>
+      <w:r>
+        <w:t xml:space="preserve">cho Bước 2 để tránh sập engine. Thay vào đó, Agent sẽ kích hoạt bộ trích xuất dự phòng sử dụng biểu thức chính quy (regex) để lấy đáp án từ văn bản CoT Bước 1. Cơ chế này giúp bảo toàn 100% ngữ cảnh câu hỏi gốc mà vẫn đảm bảo hệ thống chạy liên tục không bị gián đoạn.</w:t>
+      </w:r>
+    </w:p>
+    <w:p>
+      <w:r>
         <w:pict>
           <v:rect style="width:0;height:1.5pt" o:hralign="center" o:hrstd="t" o:hr="t"/>
         </w:pict>
       </w:r>
     </w:p>
-    <w:bookmarkEnd w:id="17"/>
     <w:bookmarkEnd w:id="18"/>
-    <w:bookmarkStart w:id="22" w:name="Xaa452a985413998966ba89a153ef93fe27c7716"/>
+    <w:bookmarkEnd w:id="19"/>
+    <w:bookmarkStart w:id="23" w:name="Xaa452a985413998966ba89a153ef93fe27c7716"/>
     <w:p>
       <w:pPr>
         <w:pStyle w:val="Heading2"/>
       </w:pPr>
       <w:r>
-        <w:rPr>
-          <w:rFonts w:ascii="Times New Roman" w:hAnsi="Times New Roman" w:eastAsia="Times New Roman" w:cs="Times New Roman"/>
-        </w:rPr>
         <w:t xml:space="preserve">3. THIẾT LẬP HỆ THỐNG VÀ TỐI ƯU HÓA PHẦN CỨNG</w:t>
       </w:r>
     </w:p>
@@ -1079,67 +913,44 @@
         <w:pStyle w:val="FirstParagraph"/>
       </w:pPr>
       <w:r>
-        <w:rPr>
-          <w:rFonts w:ascii="Times New Roman" w:hAnsi="Times New Roman" w:eastAsia="Times New Roman" w:cs="Times New Roman"/>
-        </w:rPr>
         <w:t xml:space="preserve">Hệ thống được tinh chỉnh cấu hình chuyên sâu để vận hành tương thích hoàn hảo với máy chủ chấm điểm của Ban Tổ Chức gồm card đồ họa</w:t>
       </w:r>
       <w:r>
-        <w:rPr>
-          <w:rFonts w:ascii="Times New Roman" w:hAnsi="Times New Roman" w:eastAsia="Times New Roman" w:cs="Times New Roman"/>
-        </w:rPr>
-        <w:t xml:space="preserve"> </w:t>
-      </w:r>
-      <w:r>
-        <w:rPr>
-          <w:b/>
-          <w:bCs/>
-          <w:rFonts w:ascii="Times New Roman" w:hAnsi="Times New Roman" w:eastAsia="Times New Roman" w:cs="Times New Roman"/>
+        <w:t xml:space="preserve"> </w:t>
+      </w:r>
+      <w:r>
+        <w:rPr>
+          <w:b/>
+          <w:bCs/>
         </w:rPr>
         <w:t xml:space="preserve">NVIDIA RTX 5060Ti</w:t>
       </w:r>
       <w:r>
-        <w:rPr>
-          <w:rFonts w:ascii="Times New Roman" w:hAnsi="Times New Roman" w:eastAsia="Times New Roman" w:cs="Times New Roman"/>
-        </w:rPr>
-        <w:t xml:space="preserve"> </w:t>
-      </w:r>
-      <w:r>
-        <w:rPr>
-          <w:rFonts w:ascii="Times New Roman" w:hAnsi="Times New Roman" w:eastAsia="Times New Roman" w:cs="Times New Roman"/>
-        </w:rPr>
+        <w:t xml:space="preserve"> </w:t>
+      </w:r>
+      <w:r>
         <w:t xml:space="preserve">và</w:t>
       </w:r>
       <w:r>
-        <w:rPr>
-          <w:rFonts w:ascii="Times New Roman" w:hAnsi="Times New Roman" w:eastAsia="Times New Roman" w:cs="Times New Roman"/>
-        </w:rPr>
-        <w:t xml:space="preserve"> </w:t>
-      </w:r>
-      <w:r>
-        <w:rPr>
-          <w:b/>
-          <w:bCs/>
-          <w:rFonts w:ascii="Times New Roman" w:hAnsi="Times New Roman" w:eastAsia="Times New Roman" w:cs="Times New Roman"/>
+        <w:t xml:space="preserve"> </w:t>
+      </w:r>
+      <w:r>
+        <w:rPr>
+          <w:b/>
+          <w:bCs/>
         </w:rPr>
         <w:t xml:space="preserve">32GB RAM</w:t>
       </w:r>
       <w:r>
-        <w:rPr>
-          <w:rFonts w:ascii="Times New Roman" w:hAnsi="Times New Roman" w:eastAsia="Times New Roman" w:cs="Times New Roman"/>
-        </w:rPr>
         <w:t xml:space="preserve">:</w:t>
       </w:r>
     </w:p>
-    <w:bookmarkStart w:id="19" w:name="X9d6880069b10d2094705e346a94adfe48143a73"/>
+    <w:bookmarkStart w:id="20" w:name="X9d6880069b10d2094705e346a94adfe48143a73"/>
     <w:p>
       <w:pPr>
         <w:pStyle w:val="Heading3"/>
       </w:pPr>
       <w:r>
-        <w:rPr>
-          <w:rFonts w:ascii="Times New Roman" w:hAnsi="Times New Roman" w:eastAsia="Times New Roman" w:cs="Times New Roman"/>
-        </w:rPr>
         <w:t xml:space="preserve">3.1. Thích ứng bộ nhớ VRAM động (Dynamic Memory Profile)</w:t>
       </w:r>
     </w:p>
@@ -1148,15 +959,9 @@
         <w:pStyle w:val="FirstParagraph"/>
       </w:pPr>
       <w:r>
-        <w:rPr>
-          <w:rFonts w:ascii="Times New Roman" w:hAnsi="Times New Roman" w:eastAsia="Times New Roman" w:cs="Times New Roman"/>
-        </w:rPr>
         <w:t xml:space="preserve">Đối với card RTX 5060Ti (dung lượng VRAM</w:t>
       </w:r>
       <w:r>
-        <w:rPr>
-          <w:rFonts w:ascii="Times New Roman" w:hAnsi="Times New Roman" w:eastAsia="Times New Roman" w:cs="Times New Roman"/>
-        </w:rPr>
         <w:t xml:space="preserve"> </w:t>
       </w:r>
       <m:oMath>
@@ -1171,15 +976,9 @@
         </m:r>
       </m:oMath>
       <w:r>
-        <w:rPr>
-          <w:rFonts w:ascii="Times New Roman" w:hAnsi="Times New Roman" w:eastAsia="Times New Roman" w:cs="Times New Roman"/>
-        </w:rPr>
-        <w:t xml:space="preserve"> </w:t>
-      </w:r>
-      <w:r>
-        <w:rPr>
-          <w:rFonts w:ascii="Times New Roman" w:hAnsi="Times New Roman" w:eastAsia="Times New Roman" w:cs="Times New Roman"/>
-        </w:rPr>
+        <w:t xml:space="preserve"> </w:t>
+      </w:r>
+      <w:r>
         <w:t xml:space="preserve">GB), hệ thống tự động thiết lập cấu hình giới hạn an toàn:</w:t>
       </w:r>
     </w:p>
@@ -1194,14 +993,10 @@
       <w:r>
         <w:rPr>
           <w:rStyle w:val="VerbatimChar"/>
-          <w:rFonts w:ascii="Times New Roman" w:hAnsi="Times New Roman" w:eastAsia="Times New Roman" w:cs="Times New Roman"/>
         </w:rPr>
         <w:t xml:space="preserve">gpu_memory_utilization = 0.85</w:t>
       </w:r>
       <w:r>
-        <w:rPr>
-          <w:rFonts w:ascii="Times New Roman" w:hAnsi="Times New Roman" w:eastAsia="Times New Roman" w:cs="Times New Roman"/>
-        </w:rPr>
         <w:t xml:space="preserve">: Giữ lại 15% VRAM trống làm bộ nhớ đệm an toàn cho driver đồ họa hiển thị của hệ điều hành, ngăn ngừa hoàn toàn lỗi tràn bộ nhớ VRAM.</w:t>
       </w:r>
     </w:p>
@@ -1216,14 +1011,10 @@
       <w:r>
         <w:rPr>
           <w:rStyle w:val="VerbatimChar"/>
-          <w:rFonts w:ascii="Times New Roman" w:hAnsi="Times New Roman" w:eastAsia="Times New Roman" w:cs="Times New Roman"/>
         </w:rPr>
         <w:t xml:space="preserve">max_num_seqs = 16</w:t>
       </w:r>
       <w:r>
-        <w:rPr>
-          <w:rFonts w:ascii="Times New Roman" w:hAnsi="Times New Roman" w:eastAsia="Times New Roman" w:cs="Times New Roman"/>
-        </w:rPr>
         <w:t xml:space="preserve">: Giới hạn số lượng sequence hoạt động đồng thời trong scheduler để tiết kiệm KV Cache, đồng thời vẫn đáp ứng hoàn hảo việc chạy song song các luồng biểu quyết.</w:t>
       </w:r>
     </w:p>
@@ -1238,27 +1029,20 @@
       <w:r>
         <w:rPr>
           <w:rStyle w:val="VerbatimChar"/>
-          <w:rFonts w:ascii="Times New Roman" w:hAnsi="Times New Roman" w:eastAsia="Times New Roman" w:cs="Times New Roman"/>
         </w:rPr>
         <w:t xml:space="preserve">max_num_batched_tokens = 2048</w:t>
       </w:r>
       <w:r>
-        <w:rPr>
-          <w:rFonts w:ascii="Times New Roman" w:hAnsi="Times New Roman" w:eastAsia="Times New Roman" w:cs="Times New Roman"/>
-        </w:rPr>
         <w:t xml:space="preserve">: Kiểm soát số lượng token tối đa trong một bước batching để kiểm soát bộ nhớ đỉnh (Peak Memory).</w:t>
       </w:r>
     </w:p>
-    <w:bookmarkEnd w:id="19"/>
-    <w:bookmarkStart w:id="20" w:name="quản-lý-ram-vật-lý-system-ram-32gb"/>
+    <w:bookmarkEnd w:id="20"/>
+    <w:bookmarkStart w:id="21" w:name="quản-lý-ram-vật-lý-system-ram-32gb"/>
     <w:p>
       <w:pPr>
         <w:pStyle w:val="Heading3"/>
       </w:pPr>
       <w:r>
-        <w:rPr>
-          <w:rFonts w:ascii="Times New Roman" w:hAnsi="Times New Roman" w:eastAsia="Times New Roman" w:cs="Times New Roman"/>
-        </w:rPr>
         <w:t xml:space="preserve">3.2. Quản lý RAM vật lý (System RAM 32GB)</w:t>
       </w:r>
     </w:p>
@@ -1267,93 +1051,60 @@
         <w:pStyle w:val="FirstParagraph"/>
       </w:pPr>
       <w:r>
-        <w:rPr>
-          <w:rFonts w:ascii="Times New Roman" w:hAnsi="Times New Roman" w:eastAsia="Times New Roman" w:cs="Times New Roman"/>
-        </w:rPr>
         <w:t xml:space="preserve">Mô hình</w:t>
       </w:r>
       <w:r>
-        <w:rPr>
-          <w:rFonts w:ascii="Times New Roman" w:hAnsi="Times New Roman" w:eastAsia="Times New Roman" w:cs="Times New Roman"/>
-        </w:rPr>
         <w:t xml:space="preserve"> </w:t>
       </w:r>
       <w:r>
         <w:rPr>
           <w:rStyle w:val="VerbatimChar"/>
-          <w:rFonts w:ascii="Times New Roman" w:hAnsi="Times New Roman" w:eastAsia="Times New Roman" w:cs="Times New Roman"/>
         </w:rPr>
         <w:t xml:space="preserve">Qwen3.5-4B-AWQ-4bit</w:t>
       </w:r>
       <w:r>
-        <w:rPr>
-          <w:rFonts w:ascii="Times New Roman" w:hAnsi="Times New Roman" w:eastAsia="Times New Roman" w:cs="Times New Roman"/>
-        </w:rPr>
-        <w:t xml:space="preserve"> </w:t>
-      </w:r>
-      <w:r>
-        <w:rPr>
-          <w:rFonts w:ascii="Times New Roman" w:hAnsi="Times New Roman" w:eastAsia="Times New Roman" w:cs="Times New Roman"/>
-        </w:rPr>
+        <w:t xml:space="preserve"> </w:t>
+      </w:r>
+      <w:r>
         <w:t xml:space="preserve">có dung lượng tệp trọng số là</w:t>
       </w:r>
       <w:r>
-        <w:rPr>
-          <w:rFonts w:ascii="Times New Roman" w:hAnsi="Times New Roman" w:eastAsia="Times New Roman" w:cs="Times New Roman"/>
-        </w:rPr>
-        <w:t xml:space="preserve"> </w:t>
-      </w:r>
-      <w:r>
-        <w:rPr>
-          <w:b/>
-          <w:bCs/>
-          <w:rFonts w:ascii="Times New Roman" w:hAnsi="Times New Roman" w:eastAsia="Times New Roman" w:cs="Times New Roman"/>
+        <w:t xml:space="preserve"> </w:t>
+      </w:r>
+      <w:r>
+        <w:rPr>
+          <w:b/>
+          <w:bCs/>
         </w:rPr>
         <w:t xml:space="preserve">3.8GB</w:t>
       </w:r>
       <w:r>
-        <w:rPr>
-          <w:rFonts w:ascii="Times New Roman" w:hAnsi="Times New Roman" w:eastAsia="Times New Roman" w:cs="Times New Roman"/>
-        </w:rPr>
         <w:t xml:space="preserve">. Khi khởi động, tiến trình nạp mô hình chỉ tiêu tốn tối đa</w:t>
       </w:r>
       <w:r>
-        <w:rPr>
-          <w:rFonts w:ascii="Times New Roman" w:hAnsi="Times New Roman" w:eastAsia="Times New Roman" w:cs="Times New Roman"/>
-        </w:rPr>
-        <w:t xml:space="preserve"> </w:t>
-      </w:r>
-      <w:r>
-        <w:rPr>
-          <w:b/>
-          <w:bCs/>
-          <w:rFonts w:ascii="Times New Roman" w:hAnsi="Times New Roman" w:eastAsia="Times New Roman" w:cs="Times New Roman"/>
+        <w:t xml:space="preserve"> </w:t>
+      </w:r>
+      <w:r>
+        <w:rPr>
+          <w:b/>
+          <w:bCs/>
         </w:rPr>
         <w:t xml:space="preserve">6GB RAM hệ thống</w:t>
       </w:r>
       <w:r>
-        <w:rPr>
-          <w:rFonts w:ascii="Times New Roman" w:hAnsi="Times New Roman" w:eastAsia="Times New Roman" w:cs="Times New Roman"/>
-        </w:rPr>
-        <w:t xml:space="preserve"> </w:t>
-      </w:r>
-      <w:r>
-        <w:rPr>
-          <w:rFonts w:ascii="Times New Roman" w:hAnsi="Times New Roman" w:eastAsia="Times New Roman" w:cs="Times New Roman"/>
-        </w:rPr>
+        <w:t xml:space="preserve"> </w:t>
+      </w:r>
+      <w:r>
         <w:t xml:space="preserve">trước khi đẩy vào VRAM của GPU. Vì vậy, hệ thống hoàn toàn dư thừa tài nguyên và hoạt động cực kỳ ổn định trên cấu hình 32GB RAM của BTC.</w:t>
       </w:r>
     </w:p>
-    <w:bookmarkEnd w:id="20"/>
-    <w:bookmarkStart w:id="21" w:name="flashattention-và-prefix-caching"/>
+    <w:bookmarkEnd w:id="21"/>
+    <w:bookmarkStart w:id="22" w:name="flashattention-và-prefix-caching"/>
     <w:p>
       <w:pPr>
         <w:pStyle w:val="Heading3"/>
       </w:pPr>
       <w:r>
-        <w:rPr>
-          <w:rFonts w:ascii="Times New Roman" w:hAnsi="Times New Roman" w:eastAsia="Times New Roman" w:cs="Times New Roman"/>
-        </w:rPr>
         <w:t xml:space="preserve">3.3. FlashAttention và Prefix Caching</w:t>
       </w:r>
     </w:p>
@@ -1369,14 +1120,10 @@
         <w:rPr>
           <w:b/>
           <w:bCs/>
-          <w:rFonts w:ascii="Times New Roman" w:hAnsi="Times New Roman" w:eastAsia="Times New Roman" w:cs="Times New Roman"/>
         </w:rPr>
         <w:t xml:space="preserve">FLASH_ATTN Backend</w:t>
       </w:r>
       <w:r>
-        <w:rPr>
-          <w:rFonts w:ascii="Times New Roman" w:hAnsi="Times New Roman" w:eastAsia="Times New Roman" w:cs="Times New Roman"/>
-        </w:rPr>
         <w:t xml:space="preserve">: Sử dụng attention backend FlashAttention-2 thay thế cho FlashInfer để loại bỏ yêu cầu biên dịch JIT runtime (nvcc), đảm bảo Docker container khởi động tức thì và chạy ổn định trên GPU RTX 5060Ti.</w:t>
       </w:r>
     </w:p>
@@ -1392,63 +1139,43 @@
         <w:rPr>
           <w:b/>
           <w:bCs/>
-          <w:rFonts w:ascii="Times New Roman" w:hAnsi="Times New Roman" w:eastAsia="Times New Roman" w:cs="Times New Roman"/>
         </w:rPr>
         <w:t xml:space="preserve">vLLM Prefix Caching</w:t>
       </w:r>
       <w:r>
-        <w:rPr>
-          <w:rFonts w:ascii="Times New Roman" w:hAnsi="Times New Roman" w:eastAsia="Times New Roman" w:cs="Times New Roman"/>
-        </w:rPr>
         <w:t xml:space="preserve">: Kích hoạt</w:t>
       </w:r>
       <w:r>
-        <w:rPr>
-          <w:rFonts w:ascii="Times New Roman" w:hAnsi="Times New Roman" w:eastAsia="Times New Roman" w:cs="Times New Roman"/>
-        </w:rPr>
         <w:t xml:space="preserve"> </w:t>
       </w:r>
       <w:r>
         <w:rPr>
           <w:rStyle w:val="VerbatimChar"/>
-          <w:rFonts w:ascii="Times New Roman" w:hAnsi="Times New Roman" w:eastAsia="Times New Roman" w:cs="Times New Roman"/>
         </w:rPr>
         <w:t xml:space="preserve">enable_prefix_caching=True</w:t>
       </w:r>
       <w:r>
-        <w:rPr>
-          <w:rFonts w:ascii="Times New Roman" w:hAnsi="Times New Roman" w:eastAsia="Times New Roman" w:cs="Times New Roman"/>
-        </w:rPr>
-        <w:t xml:space="preserve"> </w:t>
-      </w:r>
-      <w:r>
-        <w:rPr>
-          <w:rFonts w:ascii="Times New Roman" w:hAnsi="Times New Roman" w:eastAsia="Times New Roman" w:cs="Times New Roman"/>
-        </w:rPr>
+        <w:t xml:space="preserve"> </w:t>
+      </w:r>
+      <w:r>
         <w:t xml:space="preserve">để vLLM chia sẻ dữ liệu bộ nhớ đệm KV Cache của prompt ngữ cảnh dùng chung giữa các luồng biểu quyết, giảm thiểu tải Prefill lặp lại và đẩy tốc độ sinh lên mức tối đa.</w:t>
       </w:r>
     </w:p>
     <w:p>
       <w:r>
-        <w:rPr>
-          <w:rFonts w:ascii="Times New Roman" w:hAnsi="Times New Roman" w:eastAsia="Times New Roman" w:cs="Times New Roman"/>
-        </w:rPr>
         <w:pict>
           <v:rect style="width:0;height:1.5pt" o:hralign="center" o:hrstd="t" o:hr="t"/>
         </w:pict>
       </w:r>
     </w:p>
-    <w:bookmarkEnd w:id="21"/>
     <w:bookmarkEnd w:id="22"/>
-    <w:bookmarkStart w:id="23" w:name="kết-quả-thực-nghiệm"/>
+    <w:bookmarkEnd w:id="23"/>
+    <w:bookmarkStart w:id="24" w:name="kết-quả-thực-nghiệm"/>
     <w:p>
       <w:pPr>
         <w:pStyle w:val="Heading2"/>
       </w:pPr>
       <w:r>
-        <w:rPr>
-          <w:rFonts w:ascii="Times New Roman" w:hAnsi="Times New Roman" w:eastAsia="Times New Roman" w:cs="Times New Roman"/>
-        </w:rPr>
         <w:t xml:space="preserve">4. KẾT QUẢ THỰC NGHIỆM</w:t>
       </w:r>
     </w:p>
@@ -1457,9 +1184,6 @@
         <w:pStyle w:val="FirstParagraph"/>
       </w:pPr>
       <w:r>
-        <w:rPr>
-          <w:rFonts w:ascii="Times New Roman" w:hAnsi="Times New Roman" w:eastAsia="Times New Roman" w:cs="Times New Roman"/>
-        </w:rPr>
         <w:t xml:space="preserve">Giải pháp được đánh giá thực nghiệm trực tiếp trên toàn bộ tập dữ liệu kiểm thử công khai (Public Test) gồm 463 câu hỏi:</w:t>
       </w:r>
     </w:p>
@@ -1475,40 +1199,26 @@
         <w:rPr>
           <w:b/>
           <w:bCs/>
-          <w:rFonts w:ascii="Times New Roman" w:hAnsi="Times New Roman" w:eastAsia="Times New Roman" w:cs="Times New Roman"/>
         </w:rPr>
         <w:t xml:space="preserve">Độ chính xác (Accuracy)</w:t>
       </w:r>
       <w:r>
-        <w:rPr>
-          <w:rFonts w:ascii="Times New Roman" w:hAnsi="Times New Roman" w:eastAsia="Times New Roman" w:cs="Times New Roman"/>
-        </w:rPr>
         <w:t xml:space="preserve">: Đạt tỷ lệ chính xác cao</w:t>
       </w:r>
       <w:r>
-        <w:rPr>
-          <w:rFonts w:ascii="Times New Roman" w:hAnsi="Times New Roman" w:eastAsia="Times New Roman" w:cs="Times New Roman"/>
-        </w:rPr>
-        <w:t xml:space="preserve"> </w:t>
-      </w:r>
-      <w:r>
-        <w:rPr>
-          <w:b/>
-          <w:bCs/>
-          <w:rFonts w:ascii="Times New Roman" w:hAnsi="Times New Roman" w:eastAsia="Times New Roman" w:cs="Times New Roman"/>
+        <w:t xml:space="preserve"> </w:t>
+      </w:r>
+      <w:r>
+        <w:rPr>
+          <w:b/>
+          <w:bCs/>
         </w:rPr>
         <w:t xml:space="preserve">88.98%</w:t>
       </w:r>
       <w:r>
-        <w:rPr>
-          <w:rFonts w:ascii="Times New Roman" w:hAnsi="Times New Roman" w:eastAsia="Times New Roman" w:cs="Times New Roman"/>
-        </w:rPr>
-        <w:t xml:space="preserve"> </w:t>
-      </w:r>
-      <w:r>
-        <w:rPr>
-          <w:rFonts w:ascii="Times New Roman" w:hAnsi="Times New Roman" w:eastAsia="Times New Roman" w:cs="Times New Roman"/>
-        </w:rPr>
+        <w:t xml:space="preserve"> </w:t>
+      </w:r>
+      <w:r>
         <w:t xml:space="preserve">(chỉ trả lời sai 51 trên 463 câu hỏi trắc nghiệm đa lĩnh vực phức tạp).</w:t>
       </w:r>
     </w:p>
@@ -1524,54 +1234,36 @@
         <w:rPr>
           <w:b/>
           <w:bCs/>
-          <w:rFonts w:ascii="Times New Roman" w:hAnsi="Times New Roman" w:eastAsia="Times New Roman" w:cs="Times New Roman"/>
         </w:rPr>
         <w:t xml:space="preserve">Tốc độ thực thi (Throughput)</w:t>
       </w:r>
       <w:r>
-        <w:rPr>
-          <w:rFonts w:ascii="Times New Roman" w:hAnsi="Times New Roman" w:eastAsia="Times New Roman" w:cs="Times New Roman"/>
-        </w:rPr>
         <w:t xml:space="preserve">: Hoàn thành suy luận toàn bộ 463 câu hỏi trong</w:t>
       </w:r>
       <w:r>
-        <w:rPr>
-          <w:rFonts w:ascii="Times New Roman" w:hAnsi="Times New Roman" w:eastAsia="Times New Roman" w:cs="Times New Roman"/>
-        </w:rPr>
-        <w:t xml:space="preserve"> </w:t>
-      </w:r>
-      <w:r>
-        <w:rPr>
-          <w:b/>
-          <w:bCs/>
-          <w:rFonts w:ascii="Times New Roman" w:hAnsi="Times New Roman" w:eastAsia="Times New Roman" w:cs="Times New Roman"/>
+        <w:t xml:space="preserve"> </w:t>
+      </w:r>
+      <w:r>
+        <w:rPr>
+          <w:b/>
+          <w:bCs/>
         </w:rPr>
         <w:t xml:space="preserve">657.46 giây</w:t>
       </w:r>
       <w:r>
-        <w:rPr>
-          <w:rFonts w:ascii="Times New Roman" w:hAnsi="Times New Roman" w:eastAsia="Times New Roman" w:cs="Times New Roman"/>
-        </w:rPr>
         <w:t xml:space="preserve">, đạt tốc độ trung bình</w:t>
       </w:r>
       <w:r>
-        <w:rPr>
-          <w:rFonts w:ascii="Times New Roman" w:hAnsi="Times New Roman" w:eastAsia="Times New Roman" w:cs="Times New Roman"/>
-        </w:rPr>
-        <w:t xml:space="preserve"> </w:t>
-      </w:r>
-      <w:r>
-        <w:rPr>
-          <w:b/>
-          <w:bCs/>
-          <w:rFonts w:ascii="Times New Roman" w:hAnsi="Times New Roman" w:eastAsia="Times New Roman" w:cs="Times New Roman"/>
+        <w:t xml:space="preserve"> </w:t>
+      </w:r>
+      <w:r>
+        <w:rPr>
+          <w:b/>
+          <w:bCs/>
         </w:rPr>
         <w:t xml:space="preserve">1.42 giây/câu hỏi</w:t>
       </w:r>
       <w:r>
-        <w:rPr>
-          <w:rFonts w:ascii="Times New Roman" w:hAnsi="Times New Roman" w:eastAsia="Times New Roman" w:cs="Times New Roman"/>
-        </w:rPr>
         <w:t xml:space="preserve">.</w:t>
       </w:r>
     </w:p>
@@ -1587,63 +1279,43 @@
         <w:rPr>
           <w:b/>
           <w:bCs/>
-          <w:rFonts w:ascii="Times New Roman" w:hAnsi="Times New Roman" w:eastAsia="Times New Roman" w:cs="Times New Roman"/>
         </w:rPr>
         <w:t xml:space="preserve">Hiệu quả dừng sớm (Early Exit Rate)</w:t>
       </w:r>
       <w:r>
-        <w:rPr>
-          <w:rFonts w:ascii="Times New Roman" w:hAnsi="Times New Roman" w:eastAsia="Times New Roman" w:cs="Times New Roman"/>
-        </w:rPr>
         <w:t xml:space="preserve">: Đạt tỷ lệ dừng sớm</w:t>
       </w:r>
       <w:r>
-        <w:rPr>
-          <w:rFonts w:ascii="Times New Roman" w:hAnsi="Times New Roman" w:eastAsia="Times New Roman" w:cs="Times New Roman"/>
-        </w:rPr>
-        <w:t xml:space="preserve"> </w:t>
-      </w:r>
-      <w:r>
-        <w:rPr>
-          <w:b/>
-          <w:bCs/>
-          <w:rFonts w:ascii="Times New Roman" w:hAnsi="Times New Roman" w:eastAsia="Times New Roman" w:cs="Times New Roman"/>
+        <w:t xml:space="preserve"> </w:t>
+      </w:r>
+      <w:r>
+        <w:rPr>
+          <w:b/>
+          <w:bCs/>
         </w:rPr>
         <w:t xml:space="preserve">74.3%</w:t>
       </w:r>
       <w:r>
-        <w:rPr>
-          <w:rFonts w:ascii="Times New Roman" w:hAnsi="Times New Roman" w:eastAsia="Times New Roman" w:cs="Times New Roman"/>
-        </w:rPr>
-        <w:t xml:space="preserve"> </w:t>
-      </w:r>
-      <w:r>
-        <w:rPr>
-          <w:rFonts w:ascii="Times New Roman" w:hAnsi="Times New Roman" w:eastAsia="Times New Roman" w:cs="Times New Roman"/>
-        </w:rPr>
+        <w:t xml:space="preserve"> </w:t>
+      </w:r>
+      <w:r>
         <w:t xml:space="preserve">trên tổng số câu hỏi, chứng minh thuật toán đã lược bỏ thành công việc sinh biểu quyết cho phần lớn các câu hỏi dễ và trung bình để đẩy tốc độ hệ thống lên mức tối đa.</w:t>
       </w:r>
     </w:p>
     <w:p>
       <w:r>
-        <w:rPr>
-          <w:rFonts w:ascii="Times New Roman" w:hAnsi="Times New Roman" w:eastAsia="Times New Roman" w:cs="Times New Roman"/>
-        </w:rPr>
         <w:pict>
           <v:rect style="width:0;height:1.5pt" o:hralign="center" o:hrstd="t" o:hr="t"/>
         </w:pict>
       </w:r>
     </w:p>
-    <w:bookmarkEnd w:id="23"/>
-    <w:bookmarkStart w:id="24" w:name="kết-luận"/>
+    <w:bookmarkEnd w:id="24"/>
+    <w:bookmarkStart w:id="25" w:name="kết-luận"/>
     <w:p>
       <w:pPr>
         <w:pStyle w:val="Heading2"/>
       </w:pPr>
       <w:r>
-        <w:rPr>
-          <w:rFonts w:ascii="Times New Roman" w:hAnsi="Times New Roman" w:eastAsia="Times New Roman" w:cs="Times New Roman"/>
-        </w:rPr>
         <w:t xml:space="preserve">5. KẾT LUẬN</w:t>
       </w:r>
     </w:p>
@@ -1652,14 +1324,11 @@
         <w:pStyle w:val="FirstParagraph"/>
       </w:pPr>
       <w:r>
-        <w:rPr>
-          <w:rFonts w:ascii="Times New Roman" w:hAnsi="Times New Roman" w:eastAsia="Times New Roman" w:cs="Times New Roman"/>
-        </w:rPr>
         <w:t xml:space="preserve">Giải pháp AI Agent của nhóm tác giả đề xuất mang lại độ chính xác suy luận vượt trội cùng hiệu năng thực thi tối ưu. Việc kết hợp chặt chẽ giữa logic thuật toán Logit Margin thích ứng và cấu hình vLLM offline đóng gói trong Docker Container tạo nên một giải pháp hoàn chỉnh, có độ ổn định cực cao và sẵn sàng đáp ứng vòng đánh giá Private Test tiếp theo.</w:t>
       </w:r>
     </w:p>
-    <w:bookmarkEnd w:id="24"/>
     <w:bookmarkEnd w:id="25"/>
+    <w:bookmarkEnd w:id="26"/>
     <w:sectPr>
       <w:footnotePr>
         <w:numRestart w:val="eachSect"/>
@@ -2030,9 +1699,6 @@
   <w:style w:default="1" w:styleId="Normal" w:type="paragraph">
     <w:name w:val="Normal"/>
     <w:qFormat/>
-    <w:rPr>
-      <w:rFonts w:ascii="Times New Roman" w:hAnsi="Times New Roman"/>
-    </w:rPr>
   </w:style>
   <w:style w:styleId="BodyText" w:type="paragraph">
     <w:name w:val="Body Text"/>
@@ -2205,7 +1871,7 @@
       <w:outlineLvl w:val="0"/>
     </w:pPr>
     <w:rPr>
-      <w:rFonts w:asciiTheme="majorHAnsi" w:cstheme="majorBidi" w:eastAsiaTheme="majorEastAsia" w:hAnsiTheme="majorHAnsi" w:ascii="Times New Roman" w:hAnsi="Times New Roman"/>
+      <w:rFonts w:asciiTheme="majorHAnsi" w:cstheme="majorBidi" w:eastAsiaTheme="majorEastAsia" w:hAnsiTheme="majorHAnsi"/>
       <w:color w:themeColor="accent1" w:themeShade="BF" w:val="0F4761"/>
       <w:sz w:val="40"/>
       <w:szCs w:val="40"/>
@@ -2228,7 +1894,7 @@
       <w:outlineLvl w:val="1"/>
     </w:pPr>
     <w:rPr>
-      <w:rFonts w:asciiTheme="majorHAnsi" w:cstheme="majorBidi" w:eastAsiaTheme="majorEastAsia" w:hAnsiTheme="majorHAnsi" w:ascii="Times New Roman" w:hAnsi="Times New Roman"/>
+      <w:rFonts w:asciiTheme="majorHAnsi" w:cstheme="majorBidi" w:eastAsiaTheme="majorEastAsia" w:hAnsiTheme="majorHAnsi"/>
       <w:color w:themeColor="accent1" w:themeShade="BF" w:val="0F4761"/>
       <w:sz w:val="32"/>
       <w:szCs w:val="32"/>
@@ -2251,7 +1917,7 @@
       <w:outlineLvl w:val="2"/>
     </w:pPr>
     <w:rPr>
-      <w:rFonts w:cstheme="majorBidi" w:eastAsiaTheme="majorEastAsia" w:ascii="Times New Roman" w:hAnsi="Times New Roman"/>
+      <w:rFonts w:cstheme="majorBidi" w:eastAsiaTheme="majorEastAsia"/>
       <w:color w:themeColor="accent1" w:themeShade="BF" w:val="0F4761"/>
       <w:sz w:val="28"/>
       <w:szCs w:val="28"/>
@@ -2274,7 +1940,7 @@
       <w:outlineLvl w:val="3"/>
     </w:pPr>
     <w:rPr>
-      <w:rFonts w:cstheme="majorBidi" w:eastAsiaTheme="majorEastAsia" w:ascii="Times New Roman" w:hAnsi="Times New Roman"/>
+      <w:rFonts w:cstheme="majorBidi" w:eastAsiaTheme="majorEastAsia"/>
       <w:i/>
       <w:iCs/>
       <w:color w:themeColor="accent1" w:themeShade="BF" w:val="0F4761"/>

</xml_diff>